<commit_message>
Alignment with architectural documentation
</commit_message>
<xml_diff>
--- a/frontend/summer-booking-front-office/docs/API_CONTRACTS.docx
+++ b/frontend/summer-booking-front-office/docs/API_CONTRACTS.docx
@@ -20,7 +20,7 @@
     </w:p>
     <w:p>
       <w:r>
-        <w:t>Aggiornato al 01/10/2026 (errori: formato Problem Details con code, errori possibili per API e catalogo dei codici). Oggi tutte le API sono simulate dai mock del frontend (services/mocks).</w:t>
+        <w:t>Aggiornato al 01/10/2026 (errori: formato Problem Details con code, errori possibili per API e catalogo dei codici; header Accept-Language). Oggi tutte le API sono simulate dai mock del frontend (services/mocks).</w:t>
       </w:r>
     </w:p>
     <w:p>
@@ -308,7 +308,7 @@
                 <w:color w:val="233C7D"/>
                 <w:sz w:val="19"/>
               </w:rPr>
-              <w:t>Content-Type</w:t>
+              <w:t>Accept-Language</w:t>
             </w:r>
           </w:p>
         </w:tc>
@@ -332,6 +332,67 @@
         <w:tc>
           <w:tcPr>
             <w:tcW w:type="dxa" w:w="4876"/>
+          </w:tcPr>
+          <w:p>
+            <w:pPr>
+              <w:spacing w:after="0"/>
+            </w:pPr>
+            <w:r>
+              <w:rPr>
+                <w:b w:val="0"/>
+                <w:sz w:val="19"/>
+              </w:rPr>
+              <w:t>Lingua scelta nell'app (it, en), non quella del browser. In ogni chiamata alle nostre API: serve al backend solo se deve scrivere testi; gli errori li traduce il frontend dal code.</w:t>
+            </w:r>
+          </w:p>
+        </w:tc>
+      </w:tr>
+      <w:tr>
+        <w:trPr>
+          <w:cantSplit w:val="true"/>
+        </w:trPr>
+        <w:tc>
+          <w:tcPr>
+            <w:tcW w:type="dxa" w:w="2381"/>
+            <w:shd w:val="clear" w:color="auto" w:fill="F1F3F8"/>
+          </w:tcPr>
+          <w:p>
+            <w:pPr>
+              <w:spacing w:after="0"/>
+            </w:pPr>
+            <w:r>
+              <w:rPr>
+                <w:rFonts w:ascii="Consolas" w:hAnsi="Consolas"/>
+                <w:b w:val="0"/>
+                <w:color w:val="233C7D"/>
+                <w:sz w:val="19"/>
+              </w:rPr>
+              <w:t>Content-Type</w:t>
+            </w:r>
+          </w:p>
+        </w:tc>
+        <w:tc>
+          <w:tcPr>
+            <w:tcW w:type="dxa" w:w="2608"/>
+            <w:shd w:val="clear" w:color="auto" w:fill="F1F3F8"/>
+          </w:tcPr>
+          <w:p>
+            <w:pPr>
+              <w:spacing w:after="0"/>
+            </w:pPr>
+            <w:r>
+              <w:rPr>
+                <w:b w:val="0"/>
+                <w:sz w:val="19"/>
+              </w:rPr>
+              <w:t>string</w:t>
+            </w:r>
+          </w:p>
+        </w:tc>
+        <w:tc>
+          <w:tcPr>
+            <w:tcW w:type="dxa" w:w="4876"/>
+            <w:shd w:val="clear" w:color="auto" w:fill="F1F3F8"/>
           </w:tcPr>
           <w:p>
             <w:pPr>

</xml_diff>

<commit_message>
Added custom system to manage plural, dates, standard types and values
</commit_message>
<xml_diff>
--- a/frontend/summer-booking-front-office/docs/API_CONTRACTS.docx
+++ b/frontend/summer-booking-front-office/docs/API_CONTRACTS.docx
@@ -20,7 +20,7 @@
     </w:p>
     <w:p>
       <w:r>
-        <w:t>Aggiornato al 01/10/2026 (errori: formato Problem Details con code, errori possibili per API e catalogo dei codici; header Accept-Language). Oggi tutte le API sono simulate dai mock del frontend (services/mocks).</w:t>
+        <w:t>Aggiornato al 01/10/2026 (errori: formato Problem Details con code, errori possibili per API e catalogo dei codici; header Accept-Language; formato dei valori in args). Oggi tutte le API sono simulate dai mock del frontend (services/mocks).</w:t>
       </w:r>
     </w:p>
     <w:p>
@@ -435,7 +435,7 @@
         <w:pStyle w:val="ListBullet"/>
       </w:pPr>
       <w:r>
-        <w:t>code è la chiave di traduzione del messaggio, così com'è, sotto il gruppo error dei file di traduzione: auth.invalid_credentials → error.auth.invalid_credentials. args riempie i segnaposto {{nome}} del testo. Lo stesso vale per i code dentro errors[].</w:t>
+        <w:t>code è la chiave di traduzione del messaggio, così com'è, sotto il gruppo error dei file di traduzione: auth.invalid_credentials → error.auth.invalid_credentials. args riempie i segnaposto del testo: {{nome}} nei testi semplici, argomenti tipizzati (sintassi ICU MessageFormat) quando servono date, numeri, importi o plurali, es. {date, date, long} o {count, plural, one {# posto} other {# posti}}. Lo stesso vale per i code dentro errors[].</w:t>
       </w:r>
     </w:p>
     <w:p>
@@ -460,6 +460,14 @@
       </w:pPr>
       <w:r>
         <w:t>I testi mostrati all'utente vengono solo dal frontend (it/en): il backend non manda messaggi né dettagli interni (stack, SQL, percorsi).</w:t>
+      </w:r>
+    </w:p>
+    <w:p>
+      <w:pPr>
+        <w:pStyle w:val="ListBullet"/>
+      </w:pPr>
+      <w:r>
+        <w:t>args contiene valori grezzi che il frontend formatta nella lingua dell'utente (date, numeri, importi e plurali): date ISO 8601 (un istante in UTC con Z, es. 2026-08-01T10:00:00Z; un giorno senza ora come 2026-08-01, mostrato senza spostamenti di fuso), numeri come numeri JSON (3, non "3"), importi come numero con accanto "currency" (codice ISO 4217, es. { "amount": 280, "currency": "EUR" }). Mai testo già formattato o tradotto.</w:t>
       </w:r>
     </w:p>
     <w:p>
@@ -804,7 +812,7 @@
                 <w:b w:val="0"/>
                 <w:sz w:val="19"/>
               </w:rPr>
-              <w:t>Valori per i segnaposto del messaggio, es. { "umbrellaId": "42" } per {{umbrellaId}}.</w:t>
+              <w:t>Valori per i segnaposto del messaggio: {{umbrellaId}} nei testi semplici; {umbrellaId}, {date, date, long}, {amount, number, currency} o {count, plural, …} nei testi con date, numeri, importi o plurali. Sempre valori grezzi, mai già formattati o tradotti: date ISO 8601 (istante in UTC con Z, giorno come 2026-08-01), numeri come numeri JSON, importi come numero più "currency" con il codice ISO 4217 (es. "EUR"). Li formatta il frontend nella lingua dell'utente.</w:t>
             </w:r>
           </w:p>
         </w:tc>
@@ -1301,7 +1309,7 @@
         <w:keepNext/>
       </w:pPr>
       <w:r>
-        <w:t>Esempio generico con args (codice illustrativo, non usato oggi): il testo error.booking.umbrella_overlap "L'ombrellone {{umbrellaId}} è già prenotato" diventa "L'ombrellone 42 è già prenotato".</w:t>
+        <w:t>Esempio generico con args (codice illustrativo, non usato oggi): il testo error.booking.umbrella_overlap "L'ombrellone {umbrellaId} è già prenotato per il {date, date, long}" diventa "L'ombrellone 42 è già prenotato per il 1 agosto 2026" (in inglese "Umbrella 42 is already booked on August 1, 2026").</w:t>
       </w:r>
     </w:p>
     <w:p>
@@ -1413,7 +1421,23 @@
           <w:color w:val="233C7D"/>
           <w:sz w:val="19"/>
         </w:rPr>
-        <w:t xml:space="preserve">    "umbrellaId": "42"</w:t>
+        <w:t xml:space="preserve">    "umbrellaId": "42",</w:t>
+      </w:r>
+    </w:p>
+    <w:p>
+      <w:pPr>
+        <w:keepNext/>
+        <w:spacing w:after="0"/>
+        <w:shd w:val="clear" w:color="auto" w:fill="F1F3F8"/>
+      </w:pPr>
+      <w:r>
+        <w:rPr>
+          <w:rFonts w:ascii="Consolas" w:hAnsi="Consolas"/>
+          <w:b w:val="0"/>
+          <w:color w:val="233C7D"/>
+          <w:sz w:val="19"/>
+        </w:rPr>
+        <w:t xml:space="preserve">    "date": "2026-08-01"</w:t>
       </w:r>
     </w:p>
     <w:p>

</xml_diff>

<commit_message>
Added styles folder to avoid duplicated css
</commit_message>
<xml_diff>
--- a/frontend/summer-booking-front-office/docs/API_CONTRACTS.docx
+++ b/frontend/summer-booking-front-office/docs/API_CONTRACTS.docx
@@ -6796,6 +6796,22 @@
       </w:pPr>
       <w:r>
         <w:t>La tabella rifà la chiamata, tornando a pagina 1, quando cambiano i filtri dell'header, la ricerca o l'ordinamento; cambiando pagina cambia solo page.</w:t>
+      </w:r>
+    </w:p>
+    <w:p>
+      <w:pPr>
+        <w:pStyle w:val="ListBullet"/>
+      </w:pPr>
+      <w:r>
+        <w:t>La usano due pagine, con la stessa richiesta: Magazzino (colonne Articoli, Totale, Disponibili) e Impostazioni magazzino (Articoli, Totale, Soglia).</w:t>
+      </w:r>
+    </w:p>
+    <w:p>
+      <w:pPr>
+        <w:pStyle w:val="ListBullet"/>
+      </w:pPr>
+      <w:r>
+        <w:t>Ogni riga contiene sempre tutti i campi di WarehouseItem, compresi available e thresholdNumber, qualunque pagina faccia la richiesta: è il frontend a decidere quali mostrare. Il backend non toglie campi in base alla pagina.</w:t>
       </w:r>
     </w:p>
     <w:p>
@@ -8183,7 +8199,7 @@
                 <w:b w:val="0"/>
                 <w:sz w:val="19"/>
               </w:rPr>
-              <w:t>Quantità posseduta dallo stabilimento.</w:t>
+              <w:t>Quantità posseduta dallo stabilimento. Sempre presente, in ogni riga, e sempre un numero (mai null).</w:t>
             </w:r>
           </w:p>
         </w:tc>
@@ -8246,7 +8262,7 @@
                 <w:b w:val="0"/>
                 <w:sz w:val="19"/>
               </w:rPr>
-              <w:t>Quantità ancora libera nel periodo scelto.</w:t>
+              <w:t>Quantità ancora libera nel periodo scelto. Sempre presente, in ogni riga, e sempre un numero (mai null).</w:t>
             </w:r>
           </w:p>
         </w:tc>
@@ -8306,7 +8322,7 @@
                 <w:b w:val="0"/>
                 <w:sz w:val="19"/>
               </w:rPr>
-              <w:t>Soglia sotto la quale l'articolo è in esaurimento; null se non impostata.</w:t>
+              <w:t>Soglia sotto la quale l'articolo è in esaurimento. Sempre presente, in ogni riga; vale null se la soglia non è impostata.</w:t>
             </w:r>
           </w:p>
         </w:tc>

</xml_diff>

<commit_message>
Added select to add warehouse item
</commit_message>
<xml_diff>
--- a/frontend/summer-booking-front-office/docs/API_CONTRACTS.docx
+++ b/frontend/summer-booking-front-office/docs/API_CONTRACTS.docx
@@ -20,7 +20,7 @@
     </w:p>
     <w:p>
       <w:r>
-        <w:t>Aggiornato al 01/10/2026 (errori: formato Problem Details con code, errori possibili per API e catalogo dei codici; header Accept-Language; formato dei valori in args). Oggi tutte le API sono simulate dai mock del frontend (services/mocks).</w:t>
+        <w:t>Aggiornato al 05/10/2026 (nuova API warehouse/combobox-list per la tendina degli articoli; in warehouse/list available e thresholdNumber sempre presenti). Prima, il 01/10/2026 (errori: formato Problem Details con code, errori possibili per API e catalogo dei codici; header Accept-Language; formato dei valori in args). Oggi tutte le API sono simulate dai mock del frontend (services/mocks).</w:t>
       </w:r>
     </w:p>
     <w:p>
@@ -2161,6 +2161,66 @@
                 <w:sz w:val="19"/>
               </w:rPr>
               <w:t>Magazzino: elenco articoli</w:t>
+            </w:r>
+          </w:p>
+        </w:tc>
+      </w:tr>
+      <w:tr>
+        <w:trPr>
+          <w:cantSplit w:val="true"/>
+        </w:trPr>
+        <w:tc>
+          <w:tcPr>
+            <w:tcW w:type="dxa" w:w="2381"/>
+          </w:tcPr>
+          <w:p>
+            <w:pPr>
+              <w:spacing w:after="0"/>
+            </w:pPr>
+            <w:r>
+              <w:rPr>
+                <w:rFonts w:ascii="Consolas" w:hAnsi="Consolas"/>
+                <w:b w:val="0"/>
+                <w:color w:val="233C7D"/>
+                <w:sz w:val="19"/>
+              </w:rPr>
+              <w:t>POST</w:t>
+            </w:r>
+          </w:p>
+        </w:tc>
+        <w:tc>
+          <w:tcPr>
+            <w:tcW w:type="dxa" w:w="2608"/>
+          </w:tcPr>
+          <w:p>
+            <w:pPr>
+              <w:spacing w:after="0"/>
+            </w:pPr>
+            <w:r>
+              <w:rPr>
+                <w:rFonts w:ascii="Consolas" w:hAnsi="Consolas"/>
+                <w:b w:val="0"/>
+                <w:color w:val="233C7D"/>
+                <w:sz w:val="19"/>
+              </w:rPr>
+              <w:t>/api/warehouse/combobox-list</w:t>
+            </w:r>
+          </w:p>
+        </w:tc>
+        <w:tc>
+          <w:tcPr>
+            <w:tcW w:type="dxa" w:w="4876"/>
+          </w:tcPr>
+          <w:p>
+            <w:pPr>
+              <w:spacing w:after="0"/>
+            </w:pPr>
+            <w:r>
+              <w:rPr>
+                <w:b w:val="0"/>
+                <w:sz w:val="19"/>
+              </w:rPr>
+              <w:t>Magazzino: articoli per la tendina</w:t>
             </w:r>
           </w:p>
         </w:tc>
@@ -9163,6 +9223,1422 @@
         <w:pageBreakBefore/>
       </w:pPr>
       <w:r>
+        <w:rPr>
+          <w:b w:val="0"/>
+        </w:rPr>
+        <w:t xml:space="preserve">POST </w:t>
+      </w:r>
+      <w:r>
+        <w:rPr>
+          <w:rFonts w:ascii="Consolas" w:hAnsi="Consolas"/>
+          <w:b w:val="0"/>
+        </w:rPr>
+        <w:t>/api/warehouse/combobox-list</w:t>
+      </w:r>
+    </w:p>
+    <w:p>
+      <w:r>
+        <w:t>Magazzino: articoli per la tendina</w:t>
+      </w:r>
+    </w:p>
+    <w:p>
+      <w:pPr>
+        <w:spacing w:after="40"/>
+      </w:pPr>
+      <w:r>
+        <w:rPr>
+          <w:b/>
+        </w:rPr>
+        <w:t xml:space="preserve">Metodo: </w:t>
+      </w:r>
+      <w:r>
+        <w:rPr>
+          <w:rFonts w:ascii="Consolas" w:hAnsi="Consolas"/>
+          <w:b w:val="0"/>
+          <w:color w:val="233C7D"/>
+        </w:rPr>
+        <w:t>POST</w:t>
+      </w:r>
+    </w:p>
+    <w:p>
+      <w:pPr>
+        <w:spacing w:after="40"/>
+      </w:pPr>
+      <w:r>
+        <w:rPr>
+          <w:b/>
+        </w:rPr>
+        <w:t xml:space="preserve">Route: </w:t>
+      </w:r>
+      <w:r>
+        <w:rPr>
+          <w:rFonts w:ascii="Consolas" w:hAnsi="Consolas"/>
+          <w:b w:val="0"/>
+          <w:color w:val="233C7D"/>
+        </w:rPr>
+        <w:t>/api/warehouse/combobox-list</w:t>
+      </w:r>
+    </w:p>
+    <w:p>
+      <w:pPr>
+        <w:spacing w:after="40"/>
+      </w:pPr>
+      <w:r>
+        <w:rPr>
+          <w:b/>
+        </w:rPr>
+        <w:t xml:space="preserve">Nel frontend: </w:t>
+      </w:r>
+      <w:r>
+        <w:rPr>
+          <w:rFonts w:ascii="Consolas" w:hAnsi="Consolas"/>
+          <w:b w:val="0"/>
+          <w:color w:val="233C7D"/>
+        </w:rPr>
+        <w:t>WarehouseService.comboboxList</w:t>
+      </w:r>
+    </w:p>
+    <w:p>
+      <w:pPr>
+        <w:spacing w:after="40"/>
+      </w:pPr>
+      <w:r>
+        <w:rPr>
+          <w:b/>
+        </w:rPr>
+        <w:t xml:space="preserve">Autenticazione: </w:t>
+      </w:r>
+      <w:r>
+        <w:rPr>
+          <w:b w:val="0"/>
+        </w:rPr>
+        <w:t>Header Authorization: Bearer &lt;accessToken&gt;.</w:t>
+      </w:r>
+    </w:p>
+    <w:p>
+      <w:pPr>
+        <w:pStyle w:val="ListBullet"/>
+      </w:pPr>
+      <w:r>
+        <w:t>Serve alla tendina "Articolo" del popup "Aggiungi articolo" delle Impostazioni magazzino, che la richiede a ogni apertura.</w:t>
+      </w:r>
+    </w:p>
+    <w:p>
+      <w:pPr>
+        <w:pStyle w:val="ListBullet"/>
+      </w:pPr>
+      <w:r>
+        <w:t>Metodo POST e corpo { idProperty } sono una proposta del frontend, come per warehouse/list: da confermare col backend.</w:t>
+      </w:r>
+    </w:p>
+    <w:p>
+      <w:pPr>
+        <w:pStyle w:val="ListBullet"/>
+      </w:pPr>
+      <w:r>
+        <w:t>Nessuna paginazione: la risposta è l'elenco completo degli articoli attivi dello stabilimento, ordinato per nome.</w:t>
+      </w:r>
+    </w:p>
+    <w:p>
+      <w:pPr>
+        <w:pStyle w:val="Heading2"/>
+      </w:pPr>
+      <w:r>
+        <w:t>Payload inviato al backend</w:t>
+      </w:r>
+    </w:p>
+    <w:p>
+      <w:pPr>
+        <w:pStyle w:val="Heading3"/>
+      </w:pPr>
+      <w:r>
+        <w:rPr>
+          <w:b w:val="0"/>
+        </w:rPr>
+        <w:t xml:space="preserve">Corpo JSON: </w:t>
+      </w:r>
+      <w:r>
+        <w:rPr>
+          <w:rFonts w:ascii="Consolas" w:hAnsi="Consolas"/>
+          <w:b w:val="0"/>
+        </w:rPr>
+        <w:t>Pick&lt;ManagementRequest, 'idProperty'&gt;</w:t>
+      </w:r>
+    </w:p>
+    <w:tbl>
+      <w:tblPr>
+        <w:tblW w:type="auto" w:w="0"/>
+        <w:jc w:val="center"/>
+        <w:tblLayout w:type="fixed"/>
+        <w:tblLook w:firstColumn="1" w:firstRow="1" w:lastColumn="0" w:lastRow="0" w:noHBand="0" w:noVBand="1" w:val="04A0"/>
+        <w:tblBorders>
+          <w:top w:val="single" w:sz="4" w:color="C9CED8"/>
+          <w:left w:val="single" w:sz="4" w:color="C9CED8"/>
+          <w:bottom w:val="single" w:sz="4" w:color="C9CED8"/>
+          <w:right w:val="single" w:sz="4" w:color="C9CED8"/>
+          <w:insideH w:val="single" w:sz="4" w:color="C9CED8"/>
+          <w:insideV w:val="single" w:sz="4" w:color="C9CED8"/>
+        </w:tblBorders>
+      </w:tblPr>
+      <w:tblGrid>
+        <w:gridCol w:w="3289"/>
+        <w:gridCol w:w="3289"/>
+        <w:gridCol w:w="3289"/>
+      </w:tblGrid>
+      <w:tr>
+        <w:trPr>
+          <w:cantSplit w:val="true"/>
+          <w:tblHeader w:val="true"/>
+        </w:trPr>
+        <w:tc>
+          <w:tcPr>
+            <w:tcW w:type="dxa" w:w="2381"/>
+            <w:shd w:val="clear" w:color="auto" w:fill="233C7D"/>
+          </w:tcPr>
+          <w:p>
+            <w:pPr>
+              <w:spacing w:after="0"/>
+            </w:pPr>
+            <w:r>
+              <w:rPr>
+                <w:b/>
+                <w:color w:val="FFFFFF"/>
+                <w:sz w:val="20"/>
+              </w:rPr>
+              <w:t>Parametro</w:t>
+            </w:r>
+          </w:p>
+        </w:tc>
+        <w:tc>
+          <w:tcPr>
+            <w:tcW w:type="dxa" w:w="2608"/>
+            <w:shd w:val="clear" w:color="auto" w:fill="233C7D"/>
+          </w:tcPr>
+          <w:p>
+            <w:pPr>
+              <w:spacing w:after="0"/>
+            </w:pPr>
+            <w:r>
+              <w:rPr>
+                <w:b/>
+                <w:color w:val="FFFFFF"/>
+                <w:sz w:val="20"/>
+              </w:rPr>
+              <w:t>Tipo</w:t>
+            </w:r>
+          </w:p>
+        </w:tc>
+        <w:tc>
+          <w:tcPr>
+            <w:tcW w:type="dxa" w:w="4876"/>
+            <w:shd w:val="clear" w:color="auto" w:fill="233C7D"/>
+          </w:tcPr>
+          <w:p>
+            <w:pPr>
+              <w:spacing w:after="0"/>
+            </w:pPr>
+            <w:r>
+              <w:rPr>
+                <w:b/>
+                <w:color w:val="FFFFFF"/>
+                <w:sz w:val="20"/>
+              </w:rPr>
+              <w:t>Descrizione</w:t>
+            </w:r>
+          </w:p>
+        </w:tc>
+      </w:tr>
+      <w:tr>
+        <w:trPr>
+          <w:cantSplit w:val="true"/>
+        </w:trPr>
+        <w:tc>
+          <w:tcPr>
+            <w:tcW w:type="dxa" w:w="2381"/>
+          </w:tcPr>
+          <w:p>
+            <w:pPr>
+              <w:spacing w:after="0"/>
+            </w:pPr>
+            <w:r>
+              <w:rPr>
+                <w:rFonts w:ascii="Consolas" w:hAnsi="Consolas"/>
+                <w:b w:val="0"/>
+                <w:color w:val="233C7D"/>
+                <w:sz w:val="19"/>
+              </w:rPr>
+              <w:t>idProperty</w:t>
+            </w:r>
+          </w:p>
+        </w:tc>
+        <w:tc>
+          <w:tcPr>
+            <w:tcW w:type="dxa" w:w="2608"/>
+          </w:tcPr>
+          <w:p>
+            <w:pPr>
+              <w:spacing w:after="0"/>
+            </w:pPr>
+            <w:r>
+              <w:rPr>
+                <w:rFonts w:ascii="Consolas" w:hAnsi="Consolas"/>
+                <w:b w:val="0"/>
+                <w:color w:val="233C7D"/>
+                <w:sz w:val="19"/>
+              </w:rPr>
+              <w:t>string (UUID)</w:t>
+            </w:r>
+          </w:p>
+        </w:tc>
+        <w:tc>
+          <w:tcPr>
+            <w:tcW w:type="dxa" w:w="4876"/>
+          </w:tcPr>
+          <w:p>
+            <w:pPr>
+              <w:spacing w:after="0"/>
+            </w:pPr>
+            <w:r>
+              <w:rPr>
+                <w:b w:val="0"/>
+                <w:sz w:val="19"/>
+              </w:rPr>
+              <w:t>Stabilimento dell'utente (da AuthUser.idProperty): la risposta contiene solo i suoi articoli.</w:t>
+            </w:r>
+          </w:p>
+        </w:tc>
+      </w:tr>
+    </w:tbl>
+    <w:p>
+      <w:pPr>
+        <w:spacing w:after="40"/>
+      </w:pPr>
+    </w:p>
+    <w:p>
+      <w:pPr>
+        <w:pStyle w:val="Heading3"/>
+      </w:pPr>
+      <w:r>
+        <w:t>Esempio di richiesta (JSON)</w:t>
+      </w:r>
+    </w:p>
+    <w:p>
+      <w:pPr>
+        <w:keepNext/>
+        <w:spacing w:after="0"/>
+        <w:shd w:val="clear" w:color="auto" w:fill="F1F3F8"/>
+      </w:pPr>
+      <w:r>
+        <w:rPr>
+          <w:rFonts w:ascii="Consolas" w:hAnsi="Consolas"/>
+          <w:b w:val="0"/>
+          <w:color w:val="233C7D"/>
+          <w:sz w:val="19"/>
+        </w:rPr>
+        <w:t>{</w:t>
+      </w:r>
+    </w:p>
+    <w:p>
+      <w:pPr>
+        <w:keepNext/>
+        <w:spacing w:after="0"/>
+        <w:shd w:val="clear" w:color="auto" w:fill="F1F3F8"/>
+      </w:pPr>
+      <w:r>
+        <w:rPr>
+          <w:rFonts w:ascii="Consolas" w:hAnsi="Consolas"/>
+          <w:b w:val="0"/>
+          <w:color w:val="233C7D"/>
+          <w:sz w:val="19"/>
+        </w:rPr>
+        <w:t xml:space="preserve">  "idProperty": "5b1f3c7e-2d4a-4e8b-9c1d-7a6e5f4b3c2d"</w:t>
+      </w:r>
+    </w:p>
+    <w:p>
+      <w:pPr>
+        <w:keepNext w:val="0"/>
+        <w:spacing w:after="120"/>
+        <w:shd w:val="clear" w:color="auto" w:fill="F1F3F8"/>
+      </w:pPr>
+      <w:r>
+        <w:rPr>
+          <w:rFonts w:ascii="Consolas" w:hAnsi="Consolas"/>
+          <w:b w:val="0"/>
+          <w:color w:val="233C7D"/>
+          <w:sz w:val="19"/>
+        </w:rPr>
+        <w:t>}</w:t>
+      </w:r>
+    </w:p>
+    <w:p>
+      <w:pPr>
+        <w:pStyle w:val="Heading2"/>
+      </w:pPr>
+      <w:r>
+        <w:t>Risposta attesa dal server</w:t>
+      </w:r>
+    </w:p>
+    <w:p>
+      <w:pPr>
+        <w:spacing w:after="40"/>
+      </w:pPr>
+      <w:r>
+        <w:rPr>
+          <w:b/>
+        </w:rPr>
+        <w:t xml:space="preserve">Stato: </w:t>
+      </w:r>
+      <w:r>
+        <w:rPr>
+          <w:b w:val="0"/>
+        </w:rPr>
+        <w:t>200 OK</w:t>
+      </w:r>
+    </w:p>
+    <w:p>
+      <w:pPr>
+        <w:pStyle w:val="Heading3"/>
+      </w:pPr>
+      <w:r>
+        <w:rPr>
+          <w:b w:val="0"/>
+        </w:rPr>
+        <w:t xml:space="preserve">Corpo JSON: </w:t>
+      </w:r>
+      <w:r>
+        <w:rPr>
+          <w:rFonts w:ascii="Consolas" w:hAnsi="Consolas"/>
+          <w:b w:val="0"/>
+        </w:rPr>
+        <w:t>ComboboxItem[]</w:t>
+      </w:r>
+    </w:p>
+    <w:tbl>
+      <w:tblPr>
+        <w:tblW w:type="auto" w:w="0"/>
+        <w:jc w:val="center"/>
+        <w:tblLayout w:type="fixed"/>
+        <w:tblLook w:firstColumn="1" w:firstRow="1" w:lastColumn="0" w:lastRow="0" w:noHBand="0" w:noVBand="1" w:val="04A0"/>
+        <w:tblBorders>
+          <w:top w:val="single" w:sz="4" w:color="C9CED8"/>
+          <w:left w:val="single" w:sz="4" w:color="C9CED8"/>
+          <w:bottom w:val="single" w:sz="4" w:color="C9CED8"/>
+          <w:right w:val="single" w:sz="4" w:color="C9CED8"/>
+          <w:insideH w:val="single" w:sz="4" w:color="C9CED8"/>
+          <w:insideV w:val="single" w:sz="4" w:color="C9CED8"/>
+        </w:tblBorders>
+      </w:tblPr>
+      <w:tblGrid>
+        <w:gridCol w:w="3289"/>
+        <w:gridCol w:w="3289"/>
+        <w:gridCol w:w="3289"/>
+      </w:tblGrid>
+      <w:tr>
+        <w:trPr>
+          <w:cantSplit w:val="true"/>
+          <w:tblHeader w:val="true"/>
+        </w:trPr>
+        <w:tc>
+          <w:tcPr>
+            <w:tcW w:type="dxa" w:w="2381"/>
+            <w:shd w:val="clear" w:color="auto" w:fill="233C7D"/>
+          </w:tcPr>
+          <w:p>
+            <w:pPr>
+              <w:spacing w:after="0"/>
+            </w:pPr>
+            <w:r>
+              <w:rPr>
+                <w:b/>
+                <w:color w:val="FFFFFF"/>
+                <w:sz w:val="20"/>
+              </w:rPr>
+              <w:t>Parametro</w:t>
+            </w:r>
+          </w:p>
+        </w:tc>
+        <w:tc>
+          <w:tcPr>
+            <w:tcW w:type="dxa" w:w="2608"/>
+            <w:shd w:val="clear" w:color="auto" w:fill="233C7D"/>
+          </w:tcPr>
+          <w:p>
+            <w:pPr>
+              <w:spacing w:after="0"/>
+            </w:pPr>
+            <w:r>
+              <w:rPr>
+                <w:b/>
+                <w:color w:val="FFFFFF"/>
+                <w:sz w:val="20"/>
+              </w:rPr>
+              <w:t>Tipo</w:t>
+            </w:r>
+          </w:p>
+        </w:tc>
+        <w:tc>
+          <w:tcPr>
+            <w:tcW w:type="dxa" w:w="4876"/>
+            <w:shd w:val="clear" w:color="auto" w:fill="233C7D"/>
+          </w:tcPr>
+          <w:p>
+            <w:pPr>
+              <w:spacing w:after="0"/>
+            </w:pPr>
+            <w:r>
+              <w:rPr>
+                <w:b/>
+                <w:color w:val="FFFFFF"/>
+                <w:sz w:val="20"/>
+              </w:rPr>
+              <w:t>Descrizione</w:t>
+            </w:r>
+          </w:p>
+        </w:tc>
+      </w:tr>
+      <w:tr>
+        <w:trPr>
+          <w:cantSplit w:val="true"/>
+        </w:trPr>
+        <w:tc>
+          <w:tcPr>
+            <w:tcW w:type="dxa" w:w="2381"/>
+          </w:tcPr>
+          <w:p>
+            <w:pPr>
+              <w:spacing w:after="0"/>
+            </w:pPr>
+            <w:r>
+              <w:rPr>
+                <w:rFonts w:ascii="Consolas" w:hAnsi="Consolas"/>
+                <w:b w:val="0"/>
+                <w:color w:val="233C7D"/>
+                <w:sz w:val="19"/>
+              </w:rPr>
+              <w:t>id</w:t>
+            </w:r>
+          </w:p>
+        </w:tc>
+        <w:tc>
+          <w:tcPr>
+            <w:tcW w:type="dxa" w:w="2608"/>
+          </w:tcPr>
+          <w:p>
+            <w:pPr>
+              <w:spacing w:after="0"/>
+            </w:pPr>
+            <w:r>
+              <w:rPr>
+                <w:rFonts w:ascii="Consolas" w:hAnsi="Consolas"/>
+                <w:b w:val="0"/>
+                <w:color w:val="233C7D"/>
+                <w:sz w:val="19"/>
+              </w:rPr>
+              <w:t>string (UUID)</w:t>
+            </w:r>
+          </w:p>
+        </w:tc>
+        <w:tc>
+          <w:tcPr>
+            <w:tcW w:type="dxa" w:w="4876"/>
+          </w:tcPr>
+          <w:p>
+            <w:pPr>
+              <w:spacing w:after="0"/>
+            </w:pPr>
+            <w:r>
+              <w:rPr>
+                <w:b w:val="0"/>
+                <w:sz w:val="19"/>
+              </w:rPr>
+              <w:t>Identificativo dell'articolo, lo stesso idArticle di warehouse/list. È il valore scelto nella tendina.</w:t>
+            </w:r>
+          </w:p>
+        </w:tc>
+      </w:tr>
+      <w:tr>
+        <w:trPr>
+          <w:cantSplit w:val="true"/>
+        </w:trPr>
+        <w:tc>
+          <w:tcPr>
+            <w:tcW w:type="dxa" w:w="2381"/>
+            <w:shd w:val="clear" w:color="auto" w:fill="F1F3F8"/>
+          </w:tcPr>
+          <w:p>
+            <w:pPr>
+              <w:spacing w:after="0"/>
+            </w:pPr>
+            <w:r>
+              <w:rPr>
+                <w:rFonts w:ascii="Consolas" w:hAnsi="Consolas"/>
+                <w:b w:val="0"/>
+                <w:color w:val="233C7D"/>
+                <w:sz w:val="19"/>
+              </w:rPr>
+              <w:t>value</w:t>
+            </w:r>
+          </w:p>
+        </w:tc>
+        <w:tc>
+          <w:tcPr>
+            <w:tcW w:type="dxa" w:w="2608"/>
+            <w:shd w:val="clear" w:color="auto" w:fill="F1F3F8"/>
+          </w:tcPr>
+          <w:p>
+            <w:pPr>
+              <w:spacing w:after="0"/>
+            </w:pPr>
+            <w:r>
+              <w:rPr>
+                <w:rFonts w:ascii="Consolas" w:hAnsi="Consolas"/>
+                <w:b w:val="0"/>
+                <w:color w:val="233C7D"/>
+                <w:sz w:val="19"/>
+              </w:rPr>
+              <w:t>string</w:t>
+            </w:r>
+          </w:p>
+        </w:tc>
+        <w:tc>
+          <w:tcPr>
+            <w:tcW w:type="dxa" w:w="4876"/>
+            <w:shd w:val="clear" w:color="auto" w:fill="F1F3F8"/>
+          </w:tcPr>
+          <w:p>
+            <w:pPr>
+              <w:spacing w:after="0"/>
+            </w:pPr>
+            <w:r>
+              <w:rPr>
+                <w:b w:val="0"/>
+                <w:sz w:val="19"/>
+              </w:rPr>
+              <w:t>Nome dell'articolo, il testo mostrato nella tendina (es. Lettino).</w:t>
+            </w:r>
+          </w:p>
+        </w:tc>
+      </w:tr>
+    </w:tbl>
+    <w:p>
+      <w:pPr>
+        <w:spacing w:after="40"/>
+      </w:pPr>
+    </w:p>
+    <w:p>
+      <w:pPr>
+        <w:pStyle w:val="Heading3"/>
+      </w:pPr>
+      <w:r>
+        <w:t>Esempio di risposta (JSON)</w:t>
+      </w:r>
+    </w:p>
+    <w:p>
+      <w:pPr>
+        <w:keepNext/>
+      </w:pPr>
+      <w:r>
+        <w:t>La risposta è un array, senza un oggetto che lo contiene: ogni elemento ha solo id e value. Array vuoto se lo stabilimento non ha articoli.</w:t>
+      </w:r>
+    </w:p>
+    <w:p>
+      <w:pPr>
+        <w:keepNext/>
+        <w:spacing w:after="0"/>
+        <w:shd w:val="clear" w:color="auto" w:fill="F1F3F8"/>
+      </w:pPr>
+      <w:r>
+        <w:rPr>
+          <w:rFonts w:ascii="Consolas" w:hAnsi="Consolas"/>
+          <w:b w:val="0"/>
+          <w:color w:val="233C7D"/>
+          <w:sz w:val="19"/>
+        </w:rPr>
+        <w:t>[</w:t>
+      </w:r>
+    </w:p>
+    <w:p>
+      <w:pPr>
+        <w:keepNext/>
+        <w:spacing w:after="0"/>
+        <w:shd w:val="clear" w:color="auto" w:fill="F1F3F8"/>
+      </w:pPr>
+      <w:r>
+        <w:rPr>
+          <w:rFonts w:ascii="Consolas" w:hAnsi="Consolas"/>
+          <w:b w:val="0"/>
+          <w:color w:val="233C7D"/>
+          <w:sz w:val="19"/>
+        </w:rPr>
+        <w:t xml:space="preserve">  {</w:t>
+      </w:r>
+    </w:p>
+    <w:p>
+      <w:pPr>
+        <w:keepNext/>
+        <w:spacing w:after="0"/>
+        <w:shd w:val="clear" w:color="auto" w:fill="F1F3F8"/>
+      </w:pPr>
+      <w:r>
+        <w:rPr>
+          <w:rFonts w:ascii="Consolas" w:hAnsi="Consolas"/>
+          <w:b w:val="0"/>
+          <w:color w:val="233C7D"/>
+          <w:sz w:val="19"/>
+        </w:rPr>
+        <w:t xml:space="preserve">    "id": "4a9e2c1f-7b3d-4e8a-9c6b-2d1f5e7a8b9c",</w:t>
+      </w:r>
+    </w:p>
+    <w:p>
+      <w:pPr>
+        <w:keepNext/>
+        <w:spacing w:after="0"/>
+        <w:shd w:val="clear" w:color="auto" w:fill="F1F3F8"/>
+      </w:pPr>
+      <w:r>
+        <w:rPr>
+          <w:rFonts w:ascii="Consolas" w:hAnsi="Consolas"/>
+          <w:b w:val="0"/>
+          <w:color w:val="233C7D"/>
+          <w:sz w:val="19"/>
+        </w:rPr>
+        <w:t xml:space="preserve">    "value": "Cabina"</w:t>
+      </w:r>
+    </w:p>
+    <w:p>
+      <w:pPr>
+        <w:keepNext/>
+        <w:spacing w:after="0"/>
+        <w:shd w:val="clear" w:color="auto" w:fill="F1F3F8"/>
+      </w:pPr>
+      <w:r>
+        <w:rPr>
+          <w:rFonts w:ascii="Consolas" w:hAnsi="Consolas"/>
+          <w:b w:val="0"/>
+          <w:color w:val="233C7D"/>
+          <w:sz w:val="19"/>
+        </w:rPr>
+        <w:t xml:space="preserve">  },</w:t>
+      </w:r>
+    </w:p>
+    <w:p>
+      <w:pPr>
+        <w:keepNext/>
+        <w:spacing w:after="0"/>
+        <w:shd w:val="clear" w:color="auto" w:fill="F1F3F8"/>
+      </w:pPr>
+      <w:r>
+        <w:rPr>
+          <w:rFonts w:ascii="Consolas" w:hAnsi="Consolas"/>
+          <w:b w:val="0"/>
+          <w:color w:val="233C7D"/>
+          <w:sz w:val="19"/>
+        </w:rPr>
+        <w:t xml:space="preserve">  {</w:t>
+      </w:r>
+    </w:p>
+    <w:p>
+      <w:pPr>
+        <w:keepNext/>
+        <w:spacing w:after="0"/>
+        <w:shd w:val="clear" w:color="auto" w:fill="F1F3F8"/>
+      </w:pPr>
+      <w:r>
+        <w:rPr>
+          <w:rFonts w:ascii="Consolas" w:hAnsi="Consolas"/>
+          <w:b w:val="0"/>
+          <w:color w:val="233C7D"/>
+          <w:sz w:val="19"/>
+        </w:rPr>
+        <w:t xml:space="preserve">    "id": "8c2e4a1b-6f3d-4b7e-a9c5-1d2e3f4a5b6c",</w:t>
+      </w:r>
+    </w:p>
+    <w:p>
+      <w:pPr>
+        <w:keepNext/>
+        <w:spacing w:after="0"/>
+        <w:shd w:val="clear" w:color="auto" w:fill="F1F3F8"/>
+      </w:pPr>
+      <w:r>
+        <w:rPr>
+          <w:rFonts w:ascii="Consolas" w:hAnsi="Consolas"/>
+          <w:b w:val="0"/>
+          <w:color w:val="233C7D"/>
+          <w:sz w:val="19"/>
+        </w:rPr>
+        <w:t xml:space="preserve">    "value": "Lettino"</w:t>
+      </w:r>
+    </w:p>
+    <w:p>
+      <w:pPr>
+        <w:keepNext/>
+        <w:spacing w:after="0"/>
+        <w:shd w:val="clear" w:color="auto" w:fill="F1F3F8"/>
+      </w:pPr>
+      <w:r>
+        <w:rPr>
+          <w:rFonts w:ascii="Consolas" w:hAnsi="Consolas"/>
+          <w:b w:val="0"/>
+          <w:color w:val="233C7D"/>
+          <w:sz w:val="19"/>
+        </w:rPr>
+        <w:t xml:space="preserve">  },</w:t>
+      </w:r>
+    </w:p>
+    <w:p>
+      <w:pPr>
+        <w:keepNext/>
+        <w:spacing w:after="0"/>
+        <w:shd w:val="clear" w:color="auto" w:fill="F1F3F8"/>
+      </w:pPr>
+      <w:r>
+        <w:rPr>
+          <w:rFonts w:ascii="Consolas" w:hAnsi="Consolas"/>
+          <w:b w:val="0"/>
+          <w:color w:val="233C7D"/>
+          <w:sz w:val="19"/>
+        </w:rPr>
+        <w:t xml:space="preserve">  {</w:t>
+      </w:r>
+    </w:p>
+    <w:p>
+      <w:pPr>
+        <w:keepNext/>
+        <w:spacing w:after="0"/>
+        <w:shd w:val="clear" w:color="auto" w:fill="F1F3F8"/>
+      </w:pPr>
+      <w:r>
+        <w:rPr>
+          <w:rFonts w:ascii="Consolas" w:hAnsi="Consolas"/>
+          <w:b w:val="0"/>
+          <w:color w:val="233C7D"/>
+          <w:sz w:val="19"/>
+        </w:rPr>
+        <w:t xml:space="preserve">    "id": "2f7d9b3e-1a4c-4e6f-8b2d-5c6a7e8f9a0b",</w:t>
+      </w:r>
+    </w:p>
+    <w:p>
+      <w:pPr>
+        <w:keepNext/>
+        <w:spacing w:after="0"/>
+        <w:shd w:val="clear" w:color="auto" w:fill="F1F3F8"/>
+      </w:pPr>
+      <w:r>
+        <w:rPr>
+          <w:rFonts w:ascii="Consolas" w:hAnsi="Consolas"/>
+          <w:b w:val="0"/>
+          <w:color w:val="233C7D"/>
+          <w:sz w:val="19"/>
+        </w:rPr>
+        <w:t xml:space="preserve">    "value": "Lettino XL"</w:t>
+      </w:r>
+    </w:p>
+    <w:p>
+      <w:pPr>
+        <w:keepNext/>
+        <w:spacing w:after="0"/>
+        <w:shd w:val="clear" w:color="auto" w:fill="F1F3F8"/>
+      </w:pPr>
+      <w:r>
+        <w:rPr>
+          <w:rFonts w:ascii="Consolas" w:hAnsi="Consolas"/>
+          <w:b w:val="0"/>
+          <w:color w:val="233C7D"/>
+          <w:sz w:val="19"/>
+        </w:rPr>
+        <w:t xml:space="preserve">  },</w:t>
+      </w:r>
+    </w:p>
+    <w:p>
+      <w:pPr>
+        <w:keepNext/>
+        <w:spacing w:after="0"/>
+        <w:shd w:val="clear" w:color="auto" w:fill="F1F3F8"/>
+      </w:pPr>
+      <w:r>
+        <w:rPr>
+          <w:rFonts w:ascii="Consolas" w:hAnsi="Consolas"/>
+          <w:b w:val="0"/>
+          <w:color w:val="233C7D"/>
+          <w:sz w:val="19"/>
+        </w:rPr>
+        <w:t xml:space="preserve">  {</w:t>
+      </w:r>
+    </w:p>
+    <w:p>
+      <w:pPr>
+        <w:keepNext/>
+        <w:spacing w:after="0"/>
+        <w:shd w:val="clear" w:color="auto" w:fill="F1F3F8"/>
+      </w:pPr>
+      <w:r>
+        <w:rPr>
+          <w:rFonts w:ascii="Consolas" w:hAnsi="Consolas"/>
+          <w:b w:val="0"/>
+          <w:color w:val="233C7D"/>
+          <w:sz w:val="19"/>
+        </w:rPr>
+        <w:t xml:space="preserve">    "id": "6d1b8e4f-3c2a-4f9e-b7a5-9e8d7c6b5a4f",</w:t>
+      </w:r>
+    </w:p>
+    <w:p>
+      <w:pPr>
+        <w:keepNext/>
+        <w:spacing w:after="0"/>
+        <w:shd w:val="clear" w:color="auto" w:fill="F1F3F8"/>
+      </w:pPr>
+      <w:r>
+        <w:rPr>
+          <w:rFonts w:ascii="Consolas" w:hAnsi="Consolas"/>
+          <w:b w:val="0"/>
+          <w:color w:val="233C7D"/>
+          <w:sz w:val="19"/>
+        </w:rPr>
+        <w:t xml:space="preserve">    "value": "Ombrellone"</w:t>
+      </w:r>
+    </w:p>
+    <w:p>
+      <w:pPr>
+        <w:keepNext/>
+        <w:spacing w:after="0"/>
+        <w:shd w:val="clear" w:color="auto" w:fill="F1F3F8"/>
+      </w:pPr>
+      <w:r>
+        <w:rPr>
+          <w:rFonts w:ascii="Consolas" w:hAnsi="Consolas"/>
+          <w:b w:val="0"/>
+          <w:color w:val="233C7D"/>
+          <w:sz w:val="19"/>
+        </w:rPr>
+        <w:t xml:space="preserve">  }</w:t>
+      </w:r>
+    </w:p>
+    <w:p>
+      <w:pPr>
+        <w:keepNext w:val="0"/>
+        <w:spacing w:after="120"/>
+        <w:shd w:val="clear" w:color="auto" w:fill="F1F3F8"/>
+      </w:pPr>
+      <w:r>
+        <w:rPr>
+          <w:rFonts w:ascii="Consolas" w:hAnsi="Consolas"/>
+          <w:b w:val="0"/>
+          <w:color w:val="233C7D"/>
+          <w:sz w:val="19"/>
+        </w:rPr>
+        <w:t>]</w:t>
+      </w:r>
+    </w:p>
+    <w:p>
+      <w:pPr>
+        <w:pStyle w:val="Heading2"/>
+      </w:pPr>
+      <w:r>
+        <w:t>Errori possibili</w:t>
+      </w:r>
+    </w:p>
+    <w:tbl>
+      <w:tblPr>
+        <w:tblW w:type="auto" w:w="0"/>
+        <w:jc w:val="center"/>
+        <w:tblLayout w:type="fixed"/>
+        <w:tblLook w:firstColumn="1" w:firstRow="1" w:lastColumn="0" w:lastRow="0" w:noHBand="0" w:noVBand="1" w:val="04A0"/>
+        <w:tblBorders>
+          <w:top w:val="single" w:sz="4" w:color="C9CED8"/>
+          <w:left w:val="single" w:sz="4" w:color="C9CED8"/>
+          <w:bottom w:val="single" w:sz="4" w:color="C9CED8"/>
+          <w:right w:val="single" w:sz="4" w:color="C9CED8"/>
+          <w:insideH w:val="single" w:sz="4" w:color="C9CED8"/>
+          <w:insideV w:val="single" w:sz="4" w:color="C9CED8"/>
+        </w:tblBorders>
+      </w:tblPr>
+      <w:tblGrid>
+        <w:gridCol w:w="3289"/>
+        <w:gridCol w:w="3289"/>
+        <w:gridCol w:w="3289"/>
+      </w:tblGrid>
+      <w:tr>
+        <w:trPr>
+          <w:cantSplit w:val="true"/>
+          <w:tblHeader w:val="true"/>
+        </w:trPr>
+        <w:tc>
+          <w:tcPr>
+            <w:tcW w:type="dxa" w:w="907"/>
+            <w:shd w:val="clear" w:color="auto" w:fill="233C7D"/>
+          </w:tcPr>
+          <w:p>
+            <w:pPr>
+              <w:spacing w:after="0"/>
+            </w:pPr>
+            <w:r>
+              <w:rPr>
+                <w:b/>
+                <w:color w:val="FFFFFF"/>
+                <w:sz w:val="20"/>
+              </w:rPr>
+              <w:t>Status</w:t>
+            </w:r>
+          </w:p>
+        </w:tc>
+        <w:tc>
+          <w:tcPr>
+            <w:tcW w:type="dxa" w:w="3061"/>
+            <w:shd w:val="clear" w:color="auto" w:fill="233C7D"/>
+          </w:tcPr>
+          <w:p>
+            <w:pPr>
+              <w:spacing w:after="0"/>
+            </w:pPr>
+            <w:r>
+              <w:rPr>
+                <w:b/>
+                <w:color w:val="FFFFFF"/>
+                <w:sz w:val="20"/>
+              </w:rPr>
+              <w:t>Codice</w:t>
+            </w:r>
+          </w:p>
+        </w:tc>
+        <w:tc>
+          <w:tcPr>
+            <w:tcW w:type="dxa" w:w="5896"/>
+            <w:shd w:val="clear" w:color="auto" w:fill="233C7D"/>
+          </w:tcPr>
+          <w:p>
+            <w:pPr>
+              <w:spacing w:after="0"/>
+            </w:pPr>
+            <w:r>
+              <w:rPr>
+                <w:b/>
+                <w:color w:val="FFFFFF"/>
+                <w:sz w:val="20"/>
+              </w:rPr>
+              <w:t>Quando</w:t>
+            </w:r>
+          </w:p>
+        </w:tc>
+      </w:tr>
+      <w:tr>
+        <w:trPr>
+          <w:cantSplit w:val="true"/>
+        </w:trPr>
+        <w:tc>
+          <w:tcPr>
+            <w:tcW w:type="dxa" w:w="907"/>
+          </w:tcPr>
+          <w:p>
+            <w:pPr>
+              <w:spacing w:after="0"/>
+            </w:pPr>
+            <w:r>
+              <w:rPr>
+                <w:rFonts w:ascii="Consolas" w:hAnsi="Consolas"/>
+                <w:b w:val="0"/>
+                <w:color w:val="233C7D"/>
+                <w:sz w:val="19"/>
+              </w:rPr>
+              <w:t>400</w:t>
+            </w:r>
+          </w:p>
+        </w:tc>
+        <w:tc>
+          <w:tcPr>
+            <w:tcW w:type="dxa" w:w="3061"/>
+          </w:tcPr>
+          <w:p>
+            <w:pPr>
+              <w:spacing w:after="0"/>
+            </w:pPr>
+            <w:r>
+              <w:rPr>
+                <w:rFonts w:ascii="Consolas" w:hAnsi="Consolas"/>
+                <w:b w:val="0"/>
+                <w:color w:val="233C7D"/>
+                <w:sz w:val="19"/>
+              </w:rPr>
+              <w:t>validation.invalid_request</w:t>
+            </w:r>
+          </w:p>
+        </w:tc>
+        <w:tc>
+          <w:tcPr>
+            <w:tcW w:type="dxa" w:w="5896"/>
+          </w:tcPr>
+          <w:p>
+            <w:pPr>
+              <w:spacing w:after="0"/>
+            </w:pPr>
+            <w:r>
+              <w:rPr>
+                <w:b w:val="0"/>
+                <w:sz w:val="19"/>
+              </w:rPr>
+              <w:t>idProperty assente o vuoto: in errors[] validation.invalid_value (idProperty).</w:t>
+            </w:r>
+          </w:p>
+        </w:tc>
+      </w:tr>
+      <w:tr>
+        <w:trPr>
+          <w:cantSplit w:val="true"/>
+        </w:trPr>
+        <w:tc>
+          <w:tcPr>
+            <w:tcW w:type="dxa" w:w="907"/>
+            <w:shd w:val="clear" w:color="auto" w:fill="F1F3F8"/>
+          </w:tcPr>
+          <w:p>
+            <w:pPr>
+              <w:spacing w:after="0"/>
+            </w:pPr>
+            <w:r>
+              <w:rPr>
+                <w:rFonts w:ascii="Consolas" w:hAnsi="Consolas"/>
+                <w:b w:val="0"/>
+                <w:color w:val="233C7D"/>
+                <w:sz w:val="19"/>
+              </w:rPr>
+              <w:t>401</w:t>
+            </w:r>
+          </w:p>
+        </w:tc>
+        <w:tc>
+          <w:tcPr>
+            <w:tcW w:type="dxa" w:w="3061"/>
+            <w:shd w:val="clear" w:color="auto" w:fill="F1F3F8"/>
+          </w:tcPr>
+          <w:p>
+            <w:pPr>
+              <w:spacing w:after="0"/>
+            </w:pPr>
+            <w:r>
+              <w:rPr>
+                <w:rFonts w:ascii="Consolas" w:hAnsi="Consolas"/>
+                <w:b w:val="0"/>
+                <w:color w:val="233C7D"/>
+                <w:sz w:val="19"/>
+              </w:rPr>
+              <w:t>auth.invalid_token</w:t>
+            </w:r>
+          </w:p>
+        </w:tc>
+        <w:tc>
+          <w:tcPr>
+            <w:tcW w:type="dxa" w:w="5896"/>
+            <w:shd w:val="clear" w:color="auto" w:fill="F1F3F8"/>
+          </w:tcPr>
+          <w:p>
+            <w:pPr>
+              <w:spacing w:after="0"/>
+            </w:pPr>
+            <w:r>
+              <w:rPr>
+                <w:b w:val="0"/>
+                <w:sz w:val="19"/>
+              </w:rPr>
+              <w:t>Access token assente, scaduto o non valido: il frontend rinnova il token e ripete la chiamata una volta.</w:t>
+            </w:r>
+          </w:p>
+        </w:tc>
+      </w:tr>
+      <w:tr>
+        <w:trPr>
+          <w:cantSplit w:val="true"/>
+        </w:trPr>
+        <w:tc>
+          <w:tcPr>
+            <w:tcW w:type="dxa" w:w="907"/>
+          </w:tcPr>
+          <w:p>
+            <w:pPr>
+              <w:spacing w:after="0"/>
+            </w:pPr>
+            <w:r>
+              <w:rPr>
+                <w:rFonts w:ascii="Consolas" w:hAnsi="Consolas"/>
+                <w:b w:val="0"/>
+                <w:color w:val="233C7D"/>
+                <w:sz w:val="19"/>
+              </w:rPr>
+              <w:t>500</w:t>
+            </w:r>
+          </w:p>
+        </w:tc>
+        <w:tc>
+          <w:tcPr>
+            <w:tcW w:type="dxa" w:w="3061"/>
+          </w:tcPr>
+          <w:p>
+            <w:pPr>
+              <w:spacing w:after="0"/>
+            </w:pPr>
+            <w:r>
+              <w:rPr>
+                <w:rFonts w:ascii="Consolas" w:hAnsi="Consolas"/>
+                <w:b w:val="0"/>
+                <w:color w:val="233C7D"/>
+                <w:sz w:val="19"/>
+              </w:rPr>
+              <w:t>server.unexpected</w:t>
+            </w:r>
+          </w:p>
+        </w:tc>
+        <w:tc>
+          <w:tcPr>
+            <w:tcW w:type="dxa" w:w="5896"/>
+          </w:tcPr>
+          <w:p>
+            <w:pPr>
+              <w:spacing w:after="0"/>
+            </w:pPr>
+            <w:r>
+              <w:rPr>
+                <w:b w:val="0"/>
+                <w:sz w:val="19"/>
+              </w:rPr>
+              <w:t>Errore non gestito del server (vale per ogni API).</w:t>
+            </w:r>
+          </w:p>
+        </w:tc>
+      </w:tr>
+    </w:tbl>
+    <w:p>
+      <w:pPr>
+        <w:spacing w:after="40"/>
+      </w:pPr>
+    </w:p>
+    <w:p>
+      <w:pPr>
+        <w:pStyle w:val="Heading3"/>
+      </w:pPr>
+      <w:r>
+        <w:t>Esempio di errore (JSON)</w:t>
+      </w:r>
+    </w:p>
+    <w:p>
+      <w:pPr>
+        <w:keepNext/>
+      </w:pPr>
+      <w:r>
+        <w:t>Risposta a una richiesta senza idProperty:</w:t>
+      </w:r>
+    </w:p>
+    <w:p>
+      <w:pPr>
+        <w:keepNext/>
+        <w:spacing w:after="0"/>
+        <w:shd w:val="clear" w:color="auto" w:fill="F1F3F8"/>
+      </w:pPr>
+      <w:r>
+        <w:rPr>
+          <w:rFonts w:ascii="Consolas" w:hAnsi="Consolas"/>
+          <w:b w:val="0"/>
+          <w:color w:val="233C7D"/>
+          <w:sz w:val="19"/>
+        </w:rPr>
+        <w:t>{</w:t>
+      </w:r>
+    </w:p>
+    <w:p>
+      <w:pPr>
+        <w:keepNext/>
+        <w:spacing w:after="0"/>
+        <w:shd w:val="clear" w:color="auto" w:fill="F1F3F8"/>
+      </w:pPr>
+      <w:r>
+        <w:rPr>
+          <w:rFonts w:ascii="Consolas" w:hAnsi="Consolas"/>
+          <w:b w:val="0"/>
+          <w:color w:val="233C7D"/>
+          <w:sz w:val="19"/>
+        </w:rPr>
+        <w:t xml:space="preserve">  "type": "https://errors.summerbooking/validation/invalid-request",</w:t>
+      </w:r>
+    </w:p>
+    <w:p>
+      <w:pPr>
+        <w:keepNext/>
+        <w:spacing w:after="0"/>
+        <w:shd w:val="clear" w:color="auto" w:fill="F1F3F8"/>
+      </w:pPr>
+      <w:r>
+        <w:rPr>
+          <w:rFonts w:ascii="Consolas" w:hAnsi="Consolas"/>
+          <w:b w:val="0"/>
+          <w:color w:val="233C7D"/>
+          <w:sz w:val="19"/>
+        </w:rPr>
+        <w:t xml:space="preserve">  "status": 400,</w:t>
+      </w:r>
+    </w:p>
+    <w:p>
+      <w:pPr>
+        <w:keepNext/>
+        <w:spacing w:after="0"/>
+        <w:shd w:val="clear" w:color="auto" w:fill="F1F3F8"/>
+      </w:pPr>
+      <w:r>
+        <w:rPr>
+          <w:rFonts w:ascii="Consolas" w:hAnsi="Consolas"/>
+          <w:b w:val="0"/>
+          <w:color w:val="233C7D"/>
+          <w:sz w:val="19"/>
+        </w:rPr>
+        <w:t xml:space="preserve">  "code": "validation.invalid_request",</w:t>
+      </w:r>
+    </w:p>
+    <w:p>
+      <w:pPr>
+        <w:keepNext/>
+        <w:spacing w:after="0"/>
+        <w:shd w:val="clear" w:color="auto" w:fill="F1F3F8"/>
+      </w:pPr>
+      <w:r>
+        <w:rPr>
+          <w:rFonts w:ascii="Consolas" w:hAnsi="Consolas"/>
+          <w:b w:val="0"/>
+          <w:color w:val="233C7D"/>
+          <w:sz w:val="19"/>
+        </w:rPr>
+        <w:t xml:space="preserve">  "title": "Invalid request",</w:t>
+      </w:r>
+    </w:p>
+    <w:p>
+      <w:pPr>
+        <w:keepNext/>
+        <w:spacing w:after="0"/>
+        <w:shd w:val="clear" w:color="auto" w:fill="F1F3F8"/>
+      </w:pPr>
+      <w:r>
+        <w:rPr>
+          <w:rFonts w:ascii="Consolas" w:hAnsi="Consolas"/>
+          <w:b w:val="0"/>
+          <w:color w:val="233C7D"/>
+          <w:sz w:val="19"/>
+        </w:rPr>
+        <w:t xml:space="preserve">  "errors": [</w:t>
+      </w:r>
+    </w:p>
+    <w:p>
+      <w:pPr>
+        <w:keepNext/>
+        <w:spacing w:after="0"/>
+        <w:shd w:val="clear" w:color="auto" w:fill="F1F3F8"/>
+      </w:pPr>
+      <w:r>
+        <w:rPr>
+          <w:rFonts w:ascii="Consolas" w:hAnsi="Consolas"/>
+          <w:b w:val="0"/>
+          <w:color w:val="233C7D"/>
+          <w:sz w:val="19"/>
+        </w:rPr>
+        <w:t xml:space="preserve">    {</w:t>
+      </w:r>
+    </w:p>
+    <w:p>
+      <w:pPr>
+        <w:keepNext/>
+        <w:spacing w:after="0"/>
+        <w:shd w:val="clear" w:color="auto" w:fill="F1F3F8"/>
+      </w:pPr>
+      <w:r>
+        <w:rPr>
+          <w:rFonts w:ascii="Consolas" w:hAnsi="Consolas"/>
+          <w:b w:val="0"/>
+          <w:color w:val="233C7D"/>
+          <w:sz w:val="19"/>
+        </w:rPr>
+        <w:t xml:space="preserve">      "field": "idProperty",</w:t>
+      </w:r>
+    </w:p>
+    <w:p>
+      <w:pPr>
+        <w:keepNext/>
+        <w:spacing w:after="0"/>
+        <w:shd w:val="clear" w:color="auto" w:fill="F1F3F8"/>
+      </w:pPr>
+      <w:r>
+        <w:rPr>
+          <w:rFonts w:ascii="Consolas" w:hAnsi="Consolas"/>
+          <w:b w:val="0"/>
+          <w:color w:val="233C7D"/>
+          <w:sz w:val="19"/>
+        </w:rPr>
+        <w:t xml:space="preserve">      "code": "validation.invalid_value"</w:t>
+      </w:r>
+    </w:p>
+    <w:p>
+      <w:pPr>
+        <w:keepNext/>
+        <w:spacing w:after="0"/>
+        <w:shd w:val="clear" w:color="auto" w:fill="F1F3F8"/>
+      </w:pPr>
+      <w:r>
+        <w:rPr>
+          <w:rFonts w:ascii="Consolas" w:hAnsi="Consolas"/>
+          <w:b w:val="0"/>
+          <w:color w:val="233C7D"/>
+          <w:sz w:val="19"/>
+        </w:rPr>
+        <w:t xml:space="preserve">    }</w:t>
+      </w:r>
+    </w:p>
+    <w:p>
+      <w:pPr>
+        <w:keepNext/>
+        <w:spacing w:after="0"/>
+        <w:shd w:val="clear" w:color="auto" w:fill="F1F3F8"/>
+      </w:pPr>
+      <w:r>
+        <w:rPr>
+          <w:rFonts w:ascii="Consolas" w:hAnsi="Consolas"/>
+          <w:b w:val="0"/>
+          <w:color w:val="233C7D"/>
+          <w:sz w:val="19"/>
+        </w:rPr>
+        <w:t xml:space="preserve">  ],</w:t>
+      </w:r>
+    </w:p>
+    <w:p>
+      <w:pPr>
+        <w:keepNext/>
+        <w:spacing w:after="0"/>
+        <w:shd w:val="clear" w:color="auto" w:fill="F1F3F8"/>
+      </w:pPr>
+      <w:r>
+        <w:rPr>
+          <w:rFonts w:ascii="Consolas" w:hAnsi="Consolas"/>
+          <w:b w:val="0"/>
+          <w:color w:val="233C7D"/>
+          <w:sz w:val="19"/>
+        </w:rPr>
+        <w:t xml:space="preserve">  "traceId": "00-4bf92f3577b34da6a3ce929d0e0e4736-00f067aa0ba902b7-01"</w:t>
+      </w:r>
+    </w:p>
+    <w:p>
+      <w:pPr>
+        <w:keepNext w:val="0"/>
+        <w:spacing w:after="120"/>
+        <w:shd w:val="clear" w:color="auto" w:fill="F1F3F8"/>
+      </w:pPr>
+      <w:r>
+        <w:rPr>
+          <w:rFonts w:ascii="Consolas" w:hAnsi="Consolas"/>
+          <w:b w:val="0"/>
+          <w:color w:val="233C7D"/>
+          <w:sz w:val="19"/>
+        </w:rPr>
+        <w:t>}</w:t>
+      </w:r>
+    </w:p>
+    <w:p>
+      <w:pPr>
+        <w:pStyle w:val="Heading1"/>
+        <w:pageBreakBefore/>
+      </w:pPr>
+      <w:r>
         <w:t>Catalogo dei codici di errore</w:t>
       </w:r>
     </w:p>
@@ -9664,7 +11140,7 @@
                 <w:b w:val="0"/>
                 <w:sz w:val="19"/>
               </w:rPr>
-              <w:t>Valore non ammesso (es. un bookingDayType inesistente).</w:t>
+              <w:t>Valore non ammesso o assente (es. un bookingDayType inesistente, un idProperty mancante).</w:t>
             </w:r>
           </w:p>
         </w:tc>

</xml_diff>

<commit_message>
Add edit popup warehouse item
</commit_message>
<xml_diff>
--- a/frontend/summer-booking-front-office/docs/API_CONTRACTS.docx
+++ b/frontend/summer-booking-front-office/docs/API_CONTRACTS.docx
@@ -20,7 +20,7 @@
     </w:p>
     <w:p>
       <w:r>
-        <w:t>Aggiornato al 05/10/2026 (nuova API warehouse/combobox-list per la tendina degli articoli; in warehouse/list available e thresholdNumber sempre presenti). Prima, il 01/10/2026 (errori: formato Problem Details con code, errori possibili per API e catalogo dei codici; header Accept-Language; formato dei valori in args). Oggi tutte le API sono simulate dai mock del frontend (services/mocks).</w:t>
+        <w:t>Aggiornato al 05/10/2026 (nuova API warehouse/edit-warehouse-item per il popup "Modifica articolo" e, in warehouse/list, nuovo campo isThresholdWarningActive; quantità sempre maggiore di 0; nuova API warehouse/add-warehouse-item per il bottone Aggiungi del popup "Aggiungi articolo"; nuova API warehouse/combobox-list per la tendina degli articoli; in warehouse/list available e thresholdNumber sempre presenti). Prima, il 01/10/2026 (errori: formato Problem Details con code, errori possibili per API e catalogo dei codici; header Accept-Language; formato dei valori in args). Oggi tutte le API sono simulate dai mock del frontend (services/mocks).</w:t>
       </w:r>
     </w:p>
     <w:p>
@@ -2225,6 +2225,129 @@
           </w:p>
         </w:tc>
       </w:tr>
+      <w:tr>
+        <w:trPr>
+          <w:cantSplit w:val="true"/>
+        </w:trPr>
+        <w:tc>
+          <w:tcPr>
+            <w:tcW w:type="dxa" w:w="2381"/>
+            <w:shd w:val="clear" w:color="auto" w:fill="F1F3F8"/>
+          </w:tcPr>
+          <w:p>
+            <w:pPr>
+              <w:spacing w:after="0"/>
+            </w:pPr>
+            <w:r>
+              <w:rPr>
+                <w:rFonts w:ascii="Consolas" w:hAnsi="Consolas"/>
+                <w:b w:val="0"/>
+                <w:color w:val="233C7D"/>
+                <w:sz w:val="19"/>
+              </w:rPr>
+              <w:t>POST</w:t>
+            </w:r>
+          </w:p>
+        </w:tc>
+        <w:tc>
+          <w:tcPr>
+            <w:tcW w:type="dxa" w:w="2608"/>
+            <w:shd w:val="clear" w:color="auto" w:fill="F1F3F8"/>
+          </w:tcPr>
+          <w:p>
+            <w:pPr>
+              <w:spacing w:after="0"/>
+            </w:pPr>
+            <w:r>
+              <w:rPr>
+                <w:rFonts w:ascii="Consolas" w:hAnsi="Consolas"/>
+                <w:b w:val="0"/>
+                <w:color w:val="233C7D"/>
+                <w:sz w:val="19"/>
+              </w:rPr>
+              <w:t>/api/warehouse/add-warehouse-item</w:t>
+            </w:r>
+          </w:p>
+        </w:tc>
+        <w:tc>
+          <w:tcPr>
+            <w:tcW w:type="dxa" w:w="4876"/>
+            <w:shd w:val="clear" w:color="auto" w:fill="F1F3F8"/>
+          </w:tcPr>
+          <w:p>
+            <w:pPr>
+              <w:spacing w:after="0"/>
+            </w:pPr>
+            <w:r>
+              <w:rPr>
+                <w:b w:val="0"/>
+                <w:sz w:val="19"/>
+              </w:rPr>
+              <w:t>Magazzino: aggiunta di un articolo</w:t>
+            </w:r>
+          </w:p>
+        </w:tc>
+      </w:tr>
+      <w:tr>
+        <w:trPr>
+          <w:cantSplit w:val="true"/>
+        </w:trPr>
+        <w:tc>
+          <w:tcPr>
+            <w:tcW w:type="dxa" w:w="2381"/>
+          </w:tcPr>
+          <w:p>
+            <w:pPr>
+              <w:spacing w:after="0"/>
+            </w:pPr>
+            <w:r>
+              <w:rPr>
+                <w:rFonts w:ascii="Consolas" w:hAnsi="Consolas"/>
+                <w:b w:val="0"/>
+                <w:color w:val="233C7D"/>
+                <w:sz w:val="19"/>
+              </w:rPr>
+              <w:t>POST</w:t>
+            </w:r>
+          </w:p>
+        </w:tc>
+        <w:tc>
+          <w:tcPr>
+            <w:tcW w:type="dxa" w:w="2608"/>
+          </w:tcPr>
+          <w:p>
+            <w:pPr>
+              <w:spacing w:after="0"/>
+            </w:pPr>
+            <w:r>
+              <w:rPr>
+                <w:rFonts w:ascii="Consolas" w:hAnsi="Consolas"/>
+                <w:b w:val="0"/>
+                <w:color w:val="233C7D"/>
+                <w:sz w:val="19"/>
+              </w:rPr>
+              <w:t>/api/warehouse/edit-warehouse-item</w:t>
+            </w:r>
+          </w:p>
+        </w:tc>
+        <w:tc>
+          <w:tcPr>
+            <w:tcW w:type="dxa" w:w="4876"/>
+          </w:tcPr>
+          <w:p>
+            <w:pPr>
+              <w:spacing w:after="0"/>
+            </w:pPr>
+            <w:r>
+              <w:rPr>
+                <w:b w:val="0"/>
+                <w:sz w:val="19"/>
+              </w:rPr>
+              <w:t>Magazzino: modifica di un articolo</w:t>
+            </w:r>
+          </w:p>
+        </w:tc>
+      </w:tr>
     </w:tbl>
     <w:p>
       <w:pPr>
@@ -6871,7 +6994,7 @@
         <w:pStyle w:val="ListBullet"/>
       </w:pPr>
       <w:r>
-        <w:t>Ogni riga contiene sempre tutti i campi di WarehouseItem, compresi available e thresholdNumber, qualunque pagina faccia la richiesta: è il frontend a decidere quali mostrare. Il backend non toglie campi in base alla pagina.</w:t>
+        <w:t>Ogni riga contiene sempre tutti i campi di WarehouseItem, compresi available, thresholdNumber e isThresholdWarningActive, qualunque pagina faccia la richiesta: è il frontend a decidere quali mostrare. Il backend non toglie campi in base alla pagina.</w:t>
       </w:r>
     </w:p>
     <w:p>
@@ -8387,6 +8510,69 @@
           </w:p>
         </w:tc>
       </w:tr>
+      <w:tr>
+        <w:trPr>
+          <w:cantSplit w:val="true"/>
+        </w:trPr>
+        <w:tc>
+          <w:tcPr>
+            <w:tcW w:type="dxa" w:w="2381"/>
+            <w:shd w:val="clear" w:color="auto" w:fill="F1F3F8"/>
+          </w:tcPr>
+          <w:p>
+            <w:pPr>
+              <w:spacing w:after="0"/>
+            </w:pPr>
+            <w:r>
+              <w:rPr>
+                <w:rFonts w:ascii="Consolas" w:hAnsi="Consolas"/>
+                <w:b w:val="0"/>
+                <w:color w:val="233C7D"/>
+                <w:sz w:val="19"/>
+              </w:rPr>
+              <w:t>isThresholdWarningActive</w:t>
+            </w:r>
+          </w:p>
+        </w:tc>
+        <w:tc>
+          <w:tcPr>
+            <w:tcW w:type="dxa" w:w="2608"/>
+            <w:shd w:val="clear" w:color="auto" w:fill="F1F3F8"/>
+          </w:tcPr>
+          <w:p>
+            <w:pPr>
+              <w:spacing w:after="0"/>
+            </w:pPr>
+            <w:r>
+              <w:rPr>
+                <w:rFonts w:ascii="Consolas" w:hAnsi="Consolas"/>
+                <w:b w:val="0"/>
+                <w:color w:val="233C7D"/>
+                <w:sz w:val="19"/>
+              </w:rPr>
+              <w:t>boolean</w:t>
+            </w:r>
+          </w:p>
+        </w:tc>
+        <w:tc>
+          <w:tcPr>
+            <w:tcW w:type="dxa" w:w="4876"/>
+            <w:shd w:val="clear" w:color="auto" w:fill="F1F3F8"/>
+          </w:tcPr>
+          <w:p>
+            <w:pPr>
+              <w:spacing w:after="0"/>
+            </w:pPr>
+            <w:r>
+              <w:rPr>
+                <w:b w:val="0"/>
+                <w:sz w:val="19"/>
+              </w:rPr>
+              <w:t>Avviso di soglia acceso. Sempre presente, in ogni riga; può essere true solo con thresholdNumber maggiore di 0. Non è una colonna della tabella: serve al popup "Modifica articolo".</w:t>
+            </w:r>
+          </w:p>
+        </w:tc>
+      </w:tr>
     </w:tbl>
     <w:p>
       <w:pPr>
@@ -8550,7 +8736,23 @@
           <w:color w:val="233C7D"/>
           <w:sz w:val="19"/>
         </w:rPr>
-        <w:t xml:space="preserve">      "thresholdNumber": 10</w:t>
+        <w:t xml:space="preserve">      "thresholdNumber": 10,</w:t>
+      </w:r>
+    </w:p>
+    <w:p>
+      <w:pPr>
+        <w:keepNext/>
+        <w:spacing w:after="0"/>
+        <w:shd w:val="clear" w:color="auto" w:fill="F1F3F8"/>
+      </w:pPr>
+      <w:r>
+        <w:rPr>
+          <w:rFonts w:ascii="Consolas" w:hAnsi="Consolas"/>
+          <w:b w:val="0"/>
+          <w:color w:val="233C7D"/>
+          <w:sz w:val="19"/>
+        </w:rPr>
+        <w:t xml:space="preserve">      "isThresholdWarningActive": true</w:t>
       </w:r>
     </w:p>
     <w:p>
@@ -8662,7 +8864,23 @@
           <w:color w:val="233C7D"/>
           <w:sz w:val="19"/>
         </w:rPr>
-        <w:t xml:space="preserve">      "thresholdNumber": null</w:t>
+        <w:t xml:space="preserve">      "thresholdNumber": null,</w:t>
+      </w:r>
+    </w:p>
+    <w:p>
+      <w:pPr>
+        <w:keepNext/>
+        <w:spacing w:after="0"/>
+        <w:shd w:val="clear" w:color="auto" w:fill="F1F3F8"/>
+      </w:pPr>
+      <w:r>
+        <w:rPr>
+          <w:rFonts w:ascii="Consolas" w:hAnsi="Consolas"/>
+          <w:b w:val="0"/>
+          <w:color w:val="233C7D"/>
+          <w:sz w:val="19"/>
+        </w:rPr>
+        <w:t xml:space="preserve">      "isThresholdWarningActive": false</w:t>
       </w:r>
     </w:p>
     <w:p>
@@ -10639,12 +10857,146 @@
         <w:pageBreakBefore/>
       </w:pPr>
       <w:r>
-        <w:t>Catalogo dei codici di errore</w:t>
+        <w:rPr>
+          <w:b w:val="0"/>
+        </w:rPr>
+        <w:t xml:space="preserve">POST </w:t>
+      </w:r>
+      <w:r>
+        <w:rPr>
+          <w:rFonts w:ascii="Consolas" w:hAnsi="Consolas"/>
+          <w:b w:val="0"/>
+        </w:rPr>
+        <w:t>/api/warehouse/add-warehouse-item</w:t>
       </w:r>
     </w:p>
     <w:p>
       <w:r>
-        <w:t>Tutti i codici che il frontend gestisce oggi. Ognuno è anche la chiave di traduzione error.&lt;codice&gt; nei file it.json ed en.json. Da confermare o correggere col backend: una volta rilasciati non cambiano. I codici marcati "dal frontend" non li invia il backend.</w:t>
+        <w:t>Magazzino: aggiunta di un articolo</w:t>
+      </w:r>
+    </w:p>
+    <w:p>
+      <w:pPr>
+        <w:spacing w:after="40"/>
+      </w:pPr>
+      <w:r>
+        <w:rPr>
+          <w:b/>
+        </w:rPr>
+        <w:t xml:space="preserve">Metodo: </w:t>
+      </w:r>
+      <w:r>
+        <w:rPr>
+          <w:rFonts w:ascii="Consolas" w:hAnsi="Consolas"/>
+          <w:b w:val="0"/>
+          <w:color w:val="233C7D"/>
+        </w:rPr>
+        <w:t>POST</w:t>
+      </w:r>
+    </w:p>
+    <w:p>
+      <w:pPr>
+        <w:spacing w:after="40"/>
+      </w:pPr>
+      <w:r>
+        <w:rPr>
+          <w:b/>
+        </w:rPr>
+        <w:t xml:space="preserve">Route: </w:t>
+      </w:r>
+      <w:r>
+        <w:rPr>
+          <w:rFonts w:ascii="Consolas" w:hAnsi="Consolas"/>
+          <w:b w:val="0"/>
+          <w:color w:val="233C7D"/>
+        </w:rPr>
+        <w:t>/api/warehouse/add-warehouse-item</w:t>
+      </w:r>
+    </w:p>
+    <w:p>
+      <w:pPr>
+        <w:spacing w:after="40"/>
+      </w:pPr>
+      <w:r>
+        <w:rPr>
+          <w:b/>
+        </w:rPr>
+        <w:t xml:space="preserve">Nel frontend: </w:t>
+      </w:r>
+      <w:r>
+        <w:rPr>
+          <w:rFonts w:ascii="Consolas" w:hAnsi="Consolas"/>
+          <w:b w:val="0"/>
+          <w:color w:val="233C7D"/>
+        </w:rPr>
+        <w:t>WarehouseService.addWarehouseItem</w:t>
+      </w:r>
+    </w:p>
+    <w:p>
+      <w:pPr>
+        <w:spacing w:after="40"/>
+      </w:pPr>
+      <w:r>
+        <w:rPr>
+          <w:b/>
+        </w:rPr>
+        <w:t xml:space="preserve">Autenticazione: </w:t>
+      </w:r>
+      <w:r>
+        <w:rPr>
+          <w:b w:val="0"/>
+        </w:rPr>
+        <w:t>Header Authorization: Bearer &lt;accessToken&gt;.</w:t>
+      </w:r>
+    </w:p>
+    <w:p>
+      <w:pPr>
+        <w:pStyle w:val="ListBullet"/>
+      </w:pPr>
+      <w:r>
+        <w:t>La chiama il bottone Aggiungi del popup "Aggiungi articolo" delle Impostazioni magazzino. Il bottone funziona solo con un articolo scelto e una quantità maggiore di 0; l'avviso di soglia si può accendere solo con una soglia maggiore di 0.</w:t>
+      </w:r>
+    </w:p>
+    <w:p>
+      <w:pPr>
+        <w:pStyle w:val="ListBullet"/>
+      </w:pPr>
+      <w:r>
+        <w:t>Durante la chiamata il bottone mostra uno spinner e il popup non si può modificare né chiudere. Se la chiamata riesce, il popup si chiude e la tabella rifà warehouse/list; se fallisce, il popup resta aperto con i dati inseriti e mostra il messaggio del code.</w:t>
+      </w:r>
+    </w:p>
+    <w:p>
+      <w:pPr>
+        <w:pStyle w:val="ListBullet"/>
+      </w:pPr>
+      <w:r>
+        <w:t>Metodo POST, risposta 204 senza corpo e significato della quantità sono una proposta del frontend, da confermare col backend: oggi il mock somma articleQuantity al totale dell'articolo e imposta la soglia (warehouse/list li mostra aggiornati).</w:t>
+      </w:r>
+    </w:p>
+    <w:p>
+      <w:pPr>
+        <w:pStyle w:val="Heading2"/>
+      </w:pPr>
+      <w:r>
+        <w:t>Payload inviato al backend</w:t>
+      </w:r>
+    </w:p>
+    <w:p>
+      <w:pPr>
+        <w:pStyle w:val="Heading3"/>
+      </w:pPr>
+      <w:r>
+        <w:rPr>
+          <w:b w:val="0"/>
+        </w:rPr>
+        <w:t xml:space="preserve">Corpo JSON: </w:t>
+      </w:r>
+      <w:r>
+        <w:rPr>
+          <w:rFonts w:ascii="Consolas" w:hAnsi="Consolas"/>
+          <w:b w:val="0"/>
+        </w:rPr>
+        <w:t>AddWarehouseItemRequest</w:t>
       </w:r>
     </w:p>
     <w:tbl>
@@ -10674,7 +11026,7 @@
         </w:trPr>
         <w:tc>
           <w:tcPr>
-            <w:tcW w:type="dxa" w:w="3288"/>
+            <w:tcW w:type="dxa" w:w="2381"/>
             <w:shd w:val="clear" w:color="auto" w:fill="233C7D"/>
           </w:tcPr>
           <w:p>
@@ -10687,13 +11039,13 @@
                 <w:color w:val="FFFFFF"/>
                 <w:sz w:val="20"/>
               </w:rPr>
-              <w:t>Codice</w:t>
-            </w:r>
-          </w:p>
-        </w:tc>
-        <w:tc>
-          <w:tcPr>
-            <w:tcW w:type="dxa" w:w="1928"/>
+              <w:t>Parametro</w:t>
+            </w:r>
+          </w:p>
+        </w:tc>
+        <w:tc>
+          <w:tcPr>
+            <w:tcW w:type="dxa" w:w="2608"/>
             <w:shd w:val="clear" w:color="auto" w:fill="233C7D"/>
           </w:tcPr>
           <w:p>
@@ -10706,13 +11058,13 @@
                 <w:color w:val="FFFFFF"/>
                 <w:sz w:val="20"/>
               </w:rPr>
-              <w:t>Status</w:t>
-            </w:r>
-          </w:p>
-        </w:tc>
-        <w:tc>
-          <w:tcPr>
-            <w:tcW w:type="dxa" w:w="4649"/>
+              <w:t>Tipo</w:t>
+            </w:r>
+          </w:p>
+        </w:tc>
+        <w:tc>
+          <w:tcPr>
+            <w:tcW w:type="dxa" w:w="4876"/>
             <w:shd w:val="clear" w:color="auto" w:fill="233C7D"/>
           </w:tcPr>
           <w:p>
@@ -10725,7 +11077,7 @@
                 <w:color w:val="FFFFFF"/>
                 <w:sz w:val="20"/>
               </w:rPr>
-              <w:t>Significato</w:t>
+              <w:t>Descrizione</w:t>
             </w:r>
           </w:p>
         </w:tc>
@@ -10736,7 +11088,7 @@
         </w:trPr>
         <w:tc>
           <w:tcPr>
-            <w:tcW w:type="dxa" w:w="3288"/>
+            <w:tcW w:type="dxa" w:w="2381"/>
           </w:tcPr>
           <w:p>
             <w:pPr>
@@ -10749,13 +11101,32 @@
                 <w:color w:val="233C7D"/>
                 <w:sz w:val="19"/>
               </w:rPr>
-              <w:t>auth.invalid_credentials</w:t>
-            </w:r>
-          </w:p>
-        </w:tc>
-        <w:tc>
-          <w:tcPr>
-            <w:tcW w:type="dxa" w:w="1928"/>
+              <w:t>idProperty</w:t>
+            </w:r>
+          </w:p>
+        </w:tc>
+        <w:tc>
+          <w:tcPr>
+            <w:tcW w:type="dxa" w:w="2608"/>
+          </w:tcPr>
+          <w:p>
+            <w:pPr>
+              <w:spacing w:after="0"/>
+            </w:pPr>
+            <w:r>
+              <w:rPr>
+                <w:rFonts w:ascii="Consolas" w:hAnsi="Consolas"/>
+                <w:b w:val="0"/>
+                <w:color w:val="233C7D"/>
+                <w:sz w:val="19"/>
+              </w:rPr>
+              <w:t>string (UUID)</w:t>
+            </w:r>
+          </w:p>
+        </w:tc>
+        <w:tc>
+          <w:tcPr>
+            <w:tcW w:type="dxa" w:w="4876"/>
           </w:tcPr>
           <w:p>
             <w:pPr>
@@ -10766,24 +11137,7 @@
                 <w:b w:val="0"/>
                 <w:sz w:val="19"/>
               </w:rPr>
-              <w:t>401</w:t>
-            </w:r>
-          </w:p>
-        </w:tc>
-        <w:tc>
-          <w:tcPr>
-            <w:tcW w:type="dxa" w:w="4649"/>
-          </w:tcPr>
-          <w:p>
-            <w:pPr>
-              <w:spacing w:after="0"/>
-            </w:pPr>
-            <w:r>
-              <w:rPr>
-                <w:b w:val="0"/>
-                <w:sz w:val="19"/>
-              </w:rPr>
-              <w:t>Email o password non corrette (signin).</w:t>
+              <w:t>Stabilimento dell'utente (da AuthUser.idProperty).</w:t>
             </w:r>
           </w:p>
         </w:tc>
@@ -10794,7 +11148,7 @@
         </w:trPr>
         <w:tc>
           <w:tcPr>
-            <w:tcW w:type="dxa" w:w="3288"/>
+            <w:tcW w:type="dxa" w:w="2381"/>
             <w:shd w:val="clear" w:color="auto" w:fill="F1F3F8"/>
           </w:tcPr>
           <w:p>
@@ -10808,13 +11162,33 @@
                 <w:color w:val="233C7D"/>
                 <w:sz w:val="19"/>
               </w:rPr>
-              <w:t>auth.invalid_token</w:t>
-            </w:r>
-          </w:p>
-        </w:tc>
-        <w:tc>
-          <w:tcPr>
-            <w:tcW w:type="dxa" w:w="1928"/>
+              <w:t>idArticle</w:t>
+            </w:r>
+          </w:p>
+        </w:tc>
+        <w:tc>
+          <w:tcPr>
+            <w:tcW w:type="dxa" w:w="2608"/>
+            <w:shd w:val="clear" w:color="auto" w:fill="F1F3F8"/>
+          </w:tcPr>
+          <w:p>
+            <w:pPr>
+              <w:spacing w:after="0"/>
+            </w:pPr>
+            <w:r>
+              <w:rPr>
+                <w:rFonts w:ascii="Consolas" w:hAnsi="Consolas"/>
+                <w:b w:val="0"/>
+                <w:color w:val="233C7D"/>
+                <w:sz w:val="19"/>
+              </w:rPr>
+              <w:t>string (UUID)</w:t>
+            </w:r>
+          </w:p>
+        </w:tc>
+        <w:tc>
+          <w:tcPr>
+            <w:tcW w:type="dxa" w:w="4876"/>
             <w:shd w:val="clear" w:color="auto" w:fill="F1F3F8"/>
           </w:tcPr>
           <w:p>
@@ -10826,25 +11200,7 @@
                 <w:b w:val="0"/>
                 <w:sz w:val="19"/>
               </w:rPr>
-              <w:t>401</w:t>
-            </w:r>
-          </w:p>
-        </w:tc>
-        <w:tc>
-          <w:tcPr>
-            <w:tcW w:type="dxa" w:w="4649"/>
-            <w:shd w:val="clear" w:color="auto" w:fill="F1F3F8"/>
-          </w:tcPr>
-          <w:p>
-            <w:pPr>
-              <w:spacing w:after="0"/>
-            </w:pPr>
-            <w:r>
-              <w:rPr>
-                <w:b w:val="0"/>
-                <w:sz w:val="19"/>
-              </w:rPr>
-              <w:t>Access token assente, scaduto o non valido su un'API protetta.</w:t>
+              <w:t>Articolo scelto nella tendina: l'id di warehouse/combobox-list, lo stesso idArticle di warehouse/list. Deve essere un articolo attivo dello stabilimento.</w:t>
             </w:r>
           </w:p>
         </w:tc>
@@ -10855,7 +11211,7 @@
         </w:trPr>
         <w:tc>
           <w:tcPr>
-            <w:tcW w:type="dxa" w:w="3288"/>
+            <w:tcW w:type="dxa" w:w="2381"/>
           </w:tcPr>
           <w:p>
             <w:pPr>
@@ -10868,13 +11224,32 @@
                 <w:color w:val="233C7D"/>
                 <w:sz w:val="19"/>
               </w:rPr>
-              <w:t>auth.session_expired</w:t>
-            </w:r>
-          </w:p>
-        </w:tc>
-        <w:tc>
-          <w:tcPr>
-            <w:tcW w:type="dxa" w:w="1928"/>
+              <w:t>articleQuantity</w:t>
+            </w:r>
+          </w:p>
+        </w:tc>
+        <w:tc>
+          <w:tcPr>
+            <w:tcW w:type="dxa" w:w="2608"/>
+          </w:tcPr>
+          <w:p>
+            <w:pPr>
+              <w:spacing w:after="0"/>
+            </w:pPr>
+            <w:r>
+              <w:rPr>
+                <w:rFonts w:ascii="Consolas" w:hAnsi="Consolas"/>
+                <w:b w:val="0"/>
+                <w:color w:val="233C7D"/>
+                <w:sz w:val="19"/>
+              </w:rPr>
+              <w:t>number (intero &gt; 0)</w:t>
+            </w:r>
+          </w:p>
+        </w:tc>
+        <w:tc>
+          <w:tcPr>
+            <w:tcW w:type="dxa" w:w="4876"/>
           </w:tcPr>
           <w:p>
             <w:pPr>
@@ -10885,24 +11260,7 @@
                 <w:b w:val="0"/>
                 <w:sz w:val="19"/>
               </w:rPr>
-              <w:t>401</w:t>
-            </w:r>
-          </w:p>
-        </w:tc>
-        <w:tc>
-          <w:tcPr>
-            <w:tcW w:type="dxa" w:w="4649"/>
-          </w:tcPr>
-          <w:p>
-            <w:pPr>
-              <w:spacing w:after="0"/>
-            </w:pPr>
-            <w:r>
-              <w:rPr>
-                <w:b w:val="0"/>
-                <w:sz w:val="19"/>
-              </w:rPr>
-              <w:t>Nessuna sessione valida: cookie del refresh token assente, scaduto o revocato (refresh, logout).</w:t>
+              <w:t>Quantità aggiunta, numero intero maggiore di 0.</w:t>
             </w:r>
           </w:p>
         </w:tc>
@@ -10913,7 +11271,7 @@
         </w:trPr>
         <w:tc>
           <w:tcPr>
-            <w:tcW w:type="dxa" w:w="3288"/>
+            <w:tcW w:type="dxa" w:w="2381"/>
             <w:shd w:val="clear" w:color="auto" w:fill="F1F3F8"/>
           </w:tcPr>
           <w:p>
@@ -10927,13 +11285,33 @@
                 <w:color w:val="233C7D"/>
                 <w:sz w:val="19"/>
               </w:rPr>
-              <w:t>validation.invalid_request</w:t>
-            </w:r>
-          </w:p>
-        </w:tc>
-        <w:tc>
-          <w:tcPr>
-            <w:tcW w:type="dxa" w:w="1928"/>
+              <w:t>thresholdQuantity</w:t>
+            </w:r>
+          </w:p>
+        </w:tc>
+        <w:tc>
+          <w:tcPr>
+            <w:tcW w:type="dxa" w:w="2608"/>
+            <w:shd w:val="clear" w:color="auto" w:fill="F1F3F8"/>
+          </w:tcPr>
+          <w:p>
+            <w:pPr>
+              <w:spacing w:after="0"/>
+            </w:pPr>
+            <w:r>
+              <w:rPr>
+                <w:rFonts w:ascii="Consolas" w:hAnsi="Consolas"/>
+                <w:b w:val="0"/>
+                <w:color w:val="233C7D"/>
+                <w:sz w:val="19"/>
+              </w:rPr>
+              <w:t>number (intero ≥ 0) | null</w:t>
+            </w:r>
+          </w:p>
+        </w:tc>
+        <w:tc>
+          <w:tcPr>
+            <w:tcW w:type="dxa" w:w="4876"/>
             <w:shd w:val="clear" w:color="auto" w:fill="F1F3F8"/>
           </w:tcPr>
           <w:p>
@@ -10945,25 +11323,7 @@
                 <w:b w:val="0"/>
                 <w:sz w:val="19"/>
               </w:rPr>
-              <w:t>400</w:t>
-            </w:r>
-          </w:p>
-        </w:tc>
-        <w:tc>
-          <w:tcPr>
-            <w:tcW w:type="dxa" w:w="4649"/>
-            <w:shd w:val="clear" w:color="auto" w:fill="F1F3F8"/>
-          </w:tcPr>
-          <w:p>
-            <w:pPr>
-              <w:spacing w:after="0"/>
-            </w:pPr>
-            <w:r>
-              <w:rPr>
-                <w:b w:val="0"/>
-                <w:sz w:val="19"/>
-              </w:rPr>
-              <w:t>Corpo della richiesta non valido; il dettaglio per campo è in errors[].</w:t>
+              <w:t>Soglia sotto la quale l'articolo sta finendo, numero intero; null se la soglia non è indicata. Il campo c'è sempre.</w:t>
             </w:r>
           </w:p>
         </w:tc>
@@ -10974,7 +11334,7 @@
         </w:trPr>
         <w:tc>
           <w:tcPr>
-            <w:tcW w:type="dxa" w:w="3288"/>
+            <w:tcW w:type="dxa" w:w="2381"/>
           </w:tcPr>
           <w:p>
             <w:pPr>
@@ -10987,13 +11347,32 @@
                 <w:color w:val="233C7D"/>
                 <w:sz w:val="19"/>
               </w:rPr>
-              <w:t>validation.invalid_date</w:t>
-            </w:r>
-          </w:p>
-        </w:tc>
-        <w:tc>
-          <w:tcPr>
-            <w:tcW w:type="dxa" w:w="1928"/>
+              <w:t>isThresholdWarningActive</w:t>
+            </w:r>
+          </w:p>
+        </w:tc>
+        <w:tc>
+          <w:tcPr>
+            <w:tcW w:type="dxa" w:w="2608"/>
+          </w:tcPr>
+          <w:p>
+            <w:pPr>
+              <w:spacing w:after="0"/>
+            </w:pPr>
+            <w:r>
+              <w:rPr>
+                <w:rFonts w:ascii="Consolas" w:hAnsi="Consolas"/>
+                <w:b w:val="0"/>
+                <w:color w:val="233C7D"/>
+                <w:sz w:val="19"/>
+              </w:rPr>
+              <w:t>boolean</w:t>
+            </w:r>
+          </w:p>
+        </w:tc>
+        <w:tc>
+          <w:tcPr>
+            <w:tcW w:type="dxa" w:w="4876"/>
           </w:tcPr>
           <w:p>
             <w:pPr>
@@ -11004,24 +11383,254 @@
                 <w:b w:val="0"/>
                 <w:sz w:val="19"/>
               </w:rPr>
-              <w:t>400 (in errors[])</w:t>
-            </w:r>
-          </w:p>
-        </w:tc>
-        <w:tc>
-          <w:tcPr>
-            <w:tcW w:type="dxa" w:w="4649"/>
-          </w:tcPr>
-          <w:p>
-            <w:pPr>
-              <w:spacing w:after="0"/>
-            </w:pPr>
-            <w:r>
-              <w:rPr>
-                <w:b w:val="0"/>
-                <w:sz w:val="19"/>
-              </w:rPr>
-              <w:t>Data assente o non leggibile come ISO 8601.</w:t>
+              <w:t>Avviso di soglia acceso. Può essere true solo con thresholdQuantity maggiore di 0.</w:t>
+            </w:r>
+          </w:p>
+        </w:tc>
+      </w:tr>
+    </w:tbl>
+    <w:p>
+      <w:pPr>
+        <w:spacing w:after="40"/>
+      </w:pPr>
+    </w:p>
+    <w:p>
+      <w:pPr>
+        <w:pStyle w:val="Heading3"/>
+      </w:pPr>
+      <w:r>
+        <w:t>Esempio di richiesta (JSON)</w:t>
+      </w:r>
+    </w:p>
+    <w:p>
+      <w:pPr>
+        <w:keepNext/>
+        <w:spacing w:after="0"/>
+        <w:shd w:val="clear" w:color="auto" w:fill="F1F3F8"/>
+      </w:pPr>
+      <w:r>
+        <w:rPr>
+          <w:rFonts w:ascii="Consolas" w:hAnsi="Consolas"/>
+          <w:b w:val="0"/>
+          <w:color w:val="233C7D"/>
+          <w:sz w:val="19"/>
+        </w:rPr>
+        <w:t>{</w:t>
+      </w:r>
+    </w:p>
+    <w:p>
+      <w:pPr>
+        <w:keepNext/>
+        <w:spacing w:after="0"/>
+        <w:shd w:val="clear" w:color="auto" w:fill="F1F3F8"/>
+      </w:pPr>
+      <w:r>
+        <w:rPr>
+          <w:rFonts w:ascii="Consolas" w:hAnsi="Consolas"/>
+          <w:b w:val="0"/>
+          <w:color w:val="233C7D"/>
+          <w:sz w:val="19"/>
+        </w:rPr>
+        <w:t xml:space="preserve">  "idProperty": "5b1f3c7e-2d4a-4e8b-9c1d-7a6e5f4b3c2d",</w:t>
+      </w:r>
+    </w:p>
+    <w:p>
+      <w:pPr>
+        <w:keepNext/>
+        <w:spacing w:after="0"/>
+        <w:shd w:val="clear" w:color="auto" w:fill="F1F3F8"/>
+      </w:pPr>
+      <w:r>
+        <w:rPr>
+          <w:rFonts w:ascii="Consolas" w:hAnsi="Consolas"/>
+          <w:b w:val="0"/>
+          <w:color w:val="233C7D"/>
+          <w:sz w:val="19"/>
+        </w:rPr>
+        <w:t xml:space="preserve">  "idArticle": "8c2e4a1b-6f3d-4b7e-a9c5-1d2e3f4a5b6c",</w:t>
+      </w:r>
+    </w:p>
+    <w:p>
+      <w:pPr>
+        <w:keepNext/>
+        <w:spacing w:after="0"/>
+        <w:shd w:val="clear" w:color="auto" w:fill="F1F3F8"/>
+      </w:pPr>
+      <w:r>
+        <w:rPr>
+          <w:rFonts w:ascii="Consolas" w:hAnsi="Consolas"/>
+          <w:b w:val="0"/>
+          <w:color w:val="233C7D"/>
+          <w:sz w:val="19"/>
+        </w:rPr>
+        <w:t xml:space="preserve">  "articleQuantity": 10,</w:t>
+      </w:r>
+    </w:p>
+    <w:p>
+      <w:pPr>
+        <w:keepNext/>
+        <w:spacing w:after="0"/>
+        <w:shd w:val="clear" w:color="auto" w:fill="F1F3F8"/>
+      </w:pPr>
+      <w:r>
+        <w:rPr>
+          <w:rFonts w:ascii="Consolas" w:hAnsi="Consolas"/>
+          <w:b w:val="0"/>
+          <w:color w:val="233C7D"/>
+          <w:sz w:val="19"/>
+        </w:rPr>
+        <w:t xml:space="preserve">  "thresholdQuantity": 5,</w:t>
+      </w:r>
+    </w:p>
+    <w:p>
+      <w:pPr>
+        <w:keepNext/>
+        <w:spacing w:after="0"/>
+        <w:shd w:val="clear" w:color="auto" w:fill="F1F3F8"/>
+      </w:pPr>
+      <w:r>
+        <w:rPr>
+          <w:rFonts w:ascii="Consolas" w:hAnsi="Consolas"/>
+          <w:b w:val="0"/>
+          <w:color w:val="233C7D"/>
+          <w:sz w:val="19"/>
+        </w:rPr>
+        <w:t xml:space="preserve">  "isThresholdWarningActive": true</w:t>
+      </w:r>
+    </w:p>
+    <w:p>
+      <w:pPr>
+        <w:keepNext w:val="0"/>
+        <w:spacing w:after="120"/>
+        <w:shd w:val="clear" w:color="auto" w:fill="F1F3F8"/>
+      </w:pPr>
+      <w:r>
+        <w:rPr>
+          <w:rFonts w:ascii="Consolas" w:hAnsi="Consolas"/>
+          <w:b w:val="0"/>
+          <w:color w:val="233C7D"/>
+          <w:sz w:val="19"/>
+        </w:rPr>
+        <w:t>}</w:t>
+      </w:r>
+    </w:p>
+    <w:p>
+      <w:pPr>
+        <w:pStyle w:val="Heading2"/>
+      </w:pPr>
+      <w:r>
+        <w:t>Risposta attesa dal server</w:t>
+      </w:r>
+    </w:p>
+    <w:p>
+      <w:pPr>
+        <w:spacing w:after="40"/>
+      </w:pPr>
+      <w:r>
+        <w:rPr>
+          <w:b/>
+        </w:rPr>
+        <w:t xml:space="preserve">Stato: </w:t>
+      </w:r>
+      <w:r>
+        <w:rPr>
+          <w:b w:val="0"/>
+        </w:rPr>
+        <w:t>204 No Content (nessun corpo)</w:t>
+      </w:r>
+    </w:p>
+    <w:p>
+      <w:r>
+        <w:t>Nessun corpo nella risposta, quindi nessun JSON.</w:t>
+      </w:r>
+    </w:p>
+    <w:p>
+      <w:pPr>
+        <w:pStyle w:val="Heading2"/>
+      </w:pPr>
+      <w:r>
+        <w:t>Errori possibili</w:t>
+      </w:r>
+    </w:p>
+    <w:tbl>
+      <w:tblPr>
+        <w:tblW w:type="auto" w:w="0"/>
+        <w:jc w:val="center"/>
+        <w:tblLayout w:type="fixed"/>
+        <w:tblLook w:firstColumn="1" w:firstRow="1" w:lastColumn="0" w:lastRow="0" w:noHBand="0" w:noVBand="1" w:val="04A0"/>
+        <w:tblBorders>
+          <w:top w:val="single" w:sz="4" w:color="C9CED8"/>
+          <w:left w:val="single" w:sz="4" w:color="C9CED8"/>
+          <w:bottom w:val="single" w:sz="4" w:color="C9CED8"/>
+          <w:right w:val="single" w:sz="4" w:color="C9CED8"/>
+          <w:insideH w:val="single" w:sz="4" w:color="C9CED8"/>
+          <w:insideV w:val="single" w:sz="4" w:color="C9CED8"/>
+        </w:tblBorders>
+      </w:tblPr>
+      <w:tblGrid>
+        <w:gridCol w:w="3289"/>
+        <w:gridCol w:w="3289"/>
+        <w:gridCol w:w="3289"/>
+      </w:tblGrid>
+      <w:tr>
+        <w:trPr>
+          <w:cantSplit w:val="true"/>
+          <w:tblHeader w:val="true"/>
+        </w:trPr>
+        <w:tc>
+          <w:tcPr>
+            <w:tcW w:type="dxa" w:w="907"/>
+            <w:shd w:val="clear" w:color="auto" w:fill="233C7D"/>
+          </w:tcPr>
+          <w:p>
+            <w:pPr>
+              <w:spacing w:after="0"/>
+            </w:pPr>
+            <w:r>
+              <w:rPr>
+                <w:b/>
+                <w:color w:val="FFFFFF"/>
+                <w:sz w:val="20"/>
+              </w:rPr>
+              <w:t>Status</w:t>
+            </w:r>
+          </w:p>
+        </w:tc>
+        <w:tc>
+          <w:tcPr>
+            <w:tcW w:type="dxa" w:w="3061"/>
+            <w:shd w:val="clear" w:color="auto" w:fill="233C7D"/>
+          </w:tcPr>
+          <w:p>
+            <w:pPr>
+              <w:spacing w:after="0"/>
+            </w:pPr>
+            <w:r>
+              <w:rPr>
+                <w:b/>
+                <w:color w:val="FFFFFF"/>
+                <w:sz w:val="20"/>
+              </w:rPr>
+              <w:t>Codice</w:t>
+            </w:r>
+          </w:p>
+        </w:tc>
+        <w:tc>
+          <w:tcPr>
+            <w:tcW w:type="dxa" w:w="5896"/>
+            <w:shd w:val="clear" w:color="auto" w:fill="233C7D"/>
+          </w:tcPr>
+          <w:p>
+            <w:pPr>
+              <w:spacing w:after="0"/>
+            </w:pPr>
+            <w:r>
+              <w:rPr>
+                <w:b/>
+                <w:color w:val="FFFFFF"/>
+                <w:sz w:val="20"/>
+              </w:rPr>
+              <w:t>Quando</w:t>
             </w:r>
           </w:p>
         </w:tc>
@@ -11032,8 +11641,7 @@
         </w:trPr>
         <w:tc>
           <w:tcPr>
-            <w:tcW w:type="dxa" w:w="3288"/>
-            <w:shd w:val="clear" w:color="auto" w:fill="F1F3F8"/>
+            <w:tcW w:type="dxa" w:w="907"/>
           </w:tcPr>
           <w:p>
             <w:pPr>
@@ -11046,14 +11654,32 @@
                 <w:color w:val="233C7D"/>
                 <w:sz w:val="19"/>
               </w:rPr>
-              <w:t>validation.end_before_start</w:t>
-            </w:r>
-          </w:p>
-        </w:tc>
-        <w:tc>
-          <w:tcPr>
-            <w:tcW w:type="dxa" w:w="1928"/>
-            <w:shd w:val="clear" w:color="auto" w:fill="F1F3F8"/>
+              <w:t>400</w:t>
+            </w:r>
+          </w:p>
+        </w:tc>
+        <w:tc>
+          <w:tcPr>
+            <w:tcW w:type="dxa" w:w="3061"/>
+          </w:tcPr>
+          <w:p>
+            <w:pPr>
+              <w:spacing w:after="0"/>
+            </w:pPr>
+            <w:r>
+              <w:rPr>
+                <w:rFonts w:ascii="Consolas" w:hAnsi="Consolas"/>
+                <w:b w:val="0"/>
+                <w:color w:val="233C7D"/>
+                <w:sz w:val="19"/>
+              </w:rPr>
+              <w:t>validation.invalid_request</w:t>
+            </w:r>
+          </w:p>
+        </w:tc>
+        <w:tc>
+          <w:tcPr>
+            <w:tcW w:type="dxa" w:w="5896"/>
           </w:tcPr>
           <w:p>
             <w:pPr>
@@ -11064,25 +11690,7 @@
                 <w:b w:val="0"/>
                 <w:sz w:val="19"/>
               </w:rPr>
-              <w:t>400 (in errors[])</w:t>
-            </w:r>
-          </w:p>
-        </w:tc>
-        <w:tc>
-          <w:tcPr>
-            <w:tcW w:type="dxa" w:w="4649"/>
-            <w:shd w:val="clear" w:color="auto" w:fill="F1F3F8"/>
-          </w:tcPr>
-          <w:p>
-            <w:pPr>
-              <w:spacing w:after="0"/>
-            </w:pPr>
-            <w:r>
-              <w:rPr>
-                <w:b w:val="0"/>
-                <w:sz w:val="19"/>
-              </w:rPr>
-              <w:t>La data di fine viene prima di quella di inizio.</w:t>
+              <w:t>Uno o più campi non validi: in errors[] validation.invalid_value per ognuno (idProperty, idArticle, articleQuantity, thresholdQuantity, isThresholdWarningActive).</w:t>
             </w:r>
           </w:p>
         </w:tc>
@@ -11093,7 +11701,8 @@
         </w:trPr>
         <w:tc>
           <w:tcPr>
-            <w:tcW w:type="dxa" w:w="3288"/>
+            <w:tcW w:type="dxa" w:w="907"/>
+            <w:shd w:val="clear" w:color="auto" w:fill="F1F3F8"/>
           </w:tcPr>
           <w:p>
             <w:pPr>
@@ -11106,13 +11715,34 @@
                 <w:color w:val="233C7D"/>
                 <w:sz w:val="19"/>
               </w:rPr>
-              <w:t>validation.invalid_value</w:t>
-            </w:r>
-          </w:p>
-        </w:tc>
-        <w:tc>
-          <w:tcPr>
-            <w:tcW w:type="dxa" w:w="1928"/>
+              <w:t>401</w:t>
+            </w:r>
+          </w:p>
+        </w:tc>
+        <w:tc>
+          <w:tcPr>
+            <w:tcW w:type="dxa" w:w="3061"/>
+            <w:shd w:val="clear" w:color="auto" w:fill="F1F3F8"/>
+          </w:tcPr>
+          <w:p>
+            <w:pPr>
+              <w:spacing w:after="0"/>
+            </w:pPr>
+            <w:r>
+              <w:rPr>
+                <w:rFonts w:ascii="Consolas" w:hAnsi="Consolas"/>
+                <w:b w:val="0"/>
+                <w:color w:val="233C7D"/>
+                <w:sz w:val="19"/>
+              </w:rPr>
+              <w:t>auth.invalid_token</w:t>
+            </w:r>
+          </w:p>
+        </w:tc>
+        <w:tc>
+          <w:tcPr>
+            <w:tcW w:type="dxa" w:w="5896"/>
+            <w:shd w:val="clear" w:color="auto" w:fill="F1F3F8"/>
           </w:tcPr>
           <w:p>
             <w:pPr>
@@ -11123,13 +11753,56 @@
                 <w:b w:val="0"/>
                 <w:sz w:val="19"/>
               </w:rPr>
-              <w:t>400 (in errors[])</w:t>
-            </w:r>
-          </w:p>
-        </w:tc>
-        <w:tc>
-          <w:tcPr>
-            <w:tcW w:type="dxa" w:w="4649"/>
+              <w:t>Access token assente, scaduto o non valido: il frontend rinnova il token e ripete la chiamata una volta.</w:t>
+            </w:r>
+          </w:p>
+        </w:tc>
+      </w:tr>
+      <w:tr>
+        <w:trPr>
+          <w:cantSplit w:val="true"/>
+        </w:trPr>
+        <w:tc>
+          <w:tcPr>
+            <w:tcW w:type="dxa" w:w="907"/>
+          </w:tcPr>
+          <w:p>
+            <w:pPr>
+              <w:spacing w:after="0"/>
+            </w:pPr>
+            <w:r>
+              <w:rPr>
+                <w:rFonts w:ascii="Consolas" w:hAnsi="Consolas"/>
+                <w:b w:val="0"/>
+                <w:color w:val="233C7D"/>
+                <w:sz w:val="19"/>
+              </w:rPr>
+              <w:t>500</w:t>
+            </w:r>
+          </w:p>
+        </w:tc>
+        <w:tc>
+          <w:tcPr>
+            <w:tcW w:type="dxa" w:w="3061"/>
+          </w:tcPr>
+          <w:p>
+            <w:pPr>
+              <w:spacing w:after="0"/>
+            </w:pPr>
+            <w:r>
+              <w:rPr>
+                <w:rFonts w:ascii="Consolas" w:hAnsi="Consolas"/>
+                <w:b w:val="0"/>
+                <w:color w:val="233C7D"/>
+                <w:sz w:val="19"/>
+              </w:rPr>
+              <w:t>server.unexpected</w:t>
+            </w:r>
+          </w:p>
+        </w:tc>
+        <w:tc>
+          <w:tcPr>
+            <w:tcW w:type="dxa" w:w="5896"/>
           </w:tcPr>
           <w:p>
             <w:pPr>
@@ -11140,7 +11813,2018 @@
                 <w:b w:val="0"/>
                 <w:sz w:val="19"/>
               </w:rPr>
-              <w:t>Valore non ammesso o assente (es. un bookingDayType inesistente, un idProperty mancante).</w:t>
+              <w:t>Errore non gestito del server (vale per ogni API).</w:t>
+            </w:r>
+          </w:p>
+        </w:tc>
+      </w:tr>
+    </w:tbl>
+    <w:p>
+      <w:pPr>
+        <w:spacing w:after="40"/>
+      </w:pPr>
+    </w:p>
+    <w:p>
+      <w:pPr>
+        <w:pStyle w:val="Heading3"/>
+      </w:pPr>
+      <w:r>
+        <w:t>Esempio di errore (JSON)</w:t>
+      </w:r>
+    </w:p>
+    <w:p>
+      <w:pPr>
+        <w:keepNext/>
+      </w:pPr>
+      <w:r>
+        <w:t>Risposta a una richiesta con un articolo che non è dello stabilimento e l'avviso di soglia acceso senza soglia:</w:t>
+      </w:r>
+    </w:p>
+    <w:p>
+      <w:pPr>
+        <w:keepNext/>
+        <w:spacing w:after="0"/>
+        <w:shd w:val="clear" w:color="auto" w:fill="F1F3F8"/>
+      </w:pPr>
+      <w:r>
+        <w:rPr>
+          <w:rFonts w:ascii="Consolas" w:hAnsi="Consolas"/>
+          <w:b w:val="0"/>
+          <w:color w:val="233C7D"/>
+          <w:sz w:val="19"/>
+        </w:rPr>
+        <w:t>{</w:t>
+      </w:r>
+    </w:p>
+    <w:p>
+      <w:pPr>
+        <w:keepNext/>
+        <w:spacing w:after="0"/>
+        <w:shd w:val="clear" w:color="auto" w:fill="F1F3F8"/>
+      </w:pPr>
+      <w:r>
+        <w:rPr>
+          <w:rFonts w:ascii="Consolas" w:hAnsi="Consolas"/>
+          <w:b w:val="0"/>
+          <w:color w:val="233C7D"/>
+          <w:sz w:val="19"/>
+        </w:rPr>
+        <w:t xml:space="preserve">  "type": "https://errors.summerbooking/validation/invalid-request",</w:t>
+      </w:r>
+    </w:p>
+    <w:p>
+      <w:pPr>
+        <w:keepNext/>
+        <w:spacing w:after="0"/>
+        <w:shd w:val="clear" w:color="auto" w:fill="F1F3F8"/>
+      </w:pPr>
+      <w:r>
+        <w:rPr>
+          <w:rFonts w:ascii="Consolas" w:hAnsi="Consolas"/>
+          <w:b w:val="0"/>
+          <w:color w:val="233C7D"/>
+          <w:sz w:val="19"/>
+        </w:rPr>
+        <w:t xml:space="preserve">  "status": 400,</w:t>
+      </w:r>
+    </w:p>
+    <w:p>
+      <w:pPr>
+        <w:keepNext/>
+        <w:spacing w:after="0"/>
+        <w:shd w:val="clear" w:color="auto" w:fill="F1F3F8"/>
+      </w:pPr>
+      <w:r>
+        <w:rPr>
+          <w:rFonts w:ascii="Consolas" w:hAnsi="Consolas"/>
+          <w:b w:val="0"/>
+          <w:color w:val="233C7D"/>
+          <w:sz w:val="19"/>
+        </w:rPr>
+        <w:t xml:space="preserve">  "code": "validation.invalid_request",</w:t>
+      </w:r>
+    </w:p>
+    <w:p>
+      <w:pPr>
+        <w:keepNext/>
+        <w:spacing w:after="0"/>
+        <w:shd w:val="clear" w:color="auto" w:fill="F1F3F8"/>
+      </w:pPr>
+      <w:r>
+        <w:rPr>
+          <w:rFonts w:ascii="Consolas" w:hAnsi="Consolas"/>
+          <w:b w:val="0"/>
+          <w:color w:val="233C7D"/>
+          <w:sz w:val="19"/>
+        </w:rPr>
+        <w:t xml:space="preserve">  "title": "Invalid request",</w:t>
+      </w:r>
+    </w:p>
+    <w:p>
+      <w:pPr>
+        <w:keepNext/>
+        <w:spacing w:after="0"/>
+        <w:shd w:val="clear" w:color="auto" w:fill="F1F3F8"/>
+      </w:pPr>
+      <w:r>
+        <w:rPr>
+          <w:rFonts w:ascii="Consolas" w:hAnsi="Consolas"/>
+          <w:b w:val="0"/>
+          <w:color w:val="233C7D"/>
+          <w:sz w:val="19"/>
+        </w:rPr>
+        <w:t xml:space="preserve">  "errors": [</w:t>
+      </w:r>
+    </w:p>
+    <w:p>
+      <w:pPr>
+        <w:keepNext/>
+        <w:spacing w:after="0"/>
+        <w:shd w:val="clear" w:color="auto" w:fill="F1F3F8"/>
+      </w:pPr>
+      <w:r>
+        <w:rPr>
+          <w:rFonts w:ascii="Consolas" w:hAnsi="Consolas"/>
+          <w:b w:val="0"/>
+          <w:color w:val="233C7D"/>
+          <w:sz w:val="19"/>
+        </w:rPr>
+        <w:t xml:space="preserve">    {</w:t>
+      </w:r>
+    </w:p>
+    <w:p>
+      <w:pPr>
+        <w:keepNext/>
+        <w:spacing w:after="0"/>
+        <w:shd w:val="clear" w:color="auto" w:fill="F1F3F8"/>
+      </w:pPr>
+      <w:r>
+        <w:rPr>
+          <w:rFonts w:ascii="Consolas" w:hAnsi="Consolas"/>
+          <w:b w:val="0"/>
+          <w:color w:val="233C7D"/>
+          <w:sz w:val="19"/>
+        </w:rPr>
+        <w:t xml:space="preserve">      "field": "idArticle",</w:t>
+      </w:r>
+    </w:p>
+    <w:p>
+      <w:pPr>
+        <w:keepNext/>
+        <w:spacing w:after="0"/>
+        <w:shd w:val="clear" w:color="auto" w:fill="F1F3F8"/>
+      </w:pPr>
+      <w:r>
+        <w:rPr>
+          <w:rFonts w:ascii="Consolas" w:hAnsi="Consolas"/>
+          <w:b w:val="0"/>
+          <w:color w:val="233C7D"/>
+          <w:sz w:val="19"/>
+        </w:rPr>
+        <w:t xml:space="preserve">      "code": "validation.invalid_value"</w:t>
+      </w:r>
+    </w:p>
+    <w:p>
+      <w:pPr>
+        <w:keepNext/>
+        <w:spacing w:after="0"/>
+        <w:shd w:val="clear" w:color="auto" w:fill="F1F3F8"/>
+      </w:pPr>
+      <w:r>
+        <w:rPr>
+          <w:rFonts w:ascii="Consolas" w:hAnsi="Consolas"/>
+          <w:b w:val="0"/>
+          <w:color w:val="233C7D"/>
+          <w:sz w:val="19"/>
+        </w:rPr>
+        <w:t xml:space="preserve">    },</w:t>
+      </w:r>
+    </w:p>
+    <w:p>
+      <w:pPr>
+        <w:keepNext/>
+        <w:spacing w:after="0"/>
+        <w:shd w:val="clear" w:color="auto" w:fill="F1F3F8"/>
+      </w:pPr>
+      <w:r>
+        <w:rPr>
+          <w:rFonts w:ascii="Consolas" w:hAnsi="Consolas"/>
+          <w:b w:val="0"/>
+          <w:color w:val="233C7D"/>
+          <w:sz w:val="19"/>
+        </w:rPr>
+        <w:t xml:space="preserve">    {</w:t>
+      </w:r>
+    </w:p>
+    <w:p>
+      <w:pPr>
+        <w:keepNext/>
+        <w:spacing w:after="0"/>
+        <w:shd w:val="clear" w:color="auto" w:fill="F1F3F8"/>
+      </w:pPr>
+      <w:r>
+        <w:rPr>
+          <w:rFonts w:ascii="Consolas" w:hAnsi="Consolas"/>
+          <w:b w:val="0"/>
+          <w:color w:val="233C7D"/>
+          <w:sz w:val="19"/>
+        </w:rPr>
+        <w:t xml:space="preserve">      "field": "isThresholdWarningActive",</w:t>
+      </w:r>
+    </w:p>
+    <w:p>
+      <w:pPr>
+        <w:keepNext/>
+        <w:spacing w:after="0"/>
+        <w:shd w:val="clear" w:color="auto" w:fill="F1F3F8"/>
+      </w:pPr>
+      <w:r>
+        <w:rPr>
+          <w:rFonts w:ascii="Consolas" w:hAnsi="Consolas"/>
+          <w:b w:val="0"/>
+          <w:color w:val="233C7D"/>
+          <w:sz w:val="19"/>
+        </w:rPr>
+        <w:t xml:space="preserve">      "code": "validation.invalid_value"</w:t>
+      </w:r>
+    </w:p>
+    <w:p>
+      <w:pPr>
+        <w:keepNext/>
+        <w:spacing w:after="0"/>
+        <w:shd w:val="clear" w:color="auto" w:fill="F1F3F8"/>
+      </w:pPr>
+      <w:r>
+        <w:rPr>
+          <w:rFonts w:ascii="Consolas" w:hAnsi="Consolas"/>
+          <w:b w:val="0"/>
+          <w:color w:val="233C7D"/>
+          <w:sz w:val="19"/>
+        </w:rPr>
+        <w:t xml:space="preserve">    }</w:t>
+      </w:r>
+    </w:p>
+    <w:p>
+      <w:pPr>
+        <w:keepNext/>
+        <w:spacing w:after="0"/>
+        <w:shd w:val="clear" w:color="auto" w:fill="F1F3F8"/>
+      </w:pPr>
+      <w:r>
+        <w:rPr>
+          <w:rFonts w:ascii="Consolas" w:hAnsi="Consolas"/>
+          <w:b w:val="0"/>
+          <w:color w:val="233C7D"/>
+          <w:sz w:val="19"/>
+        </w:rPr>
+        <w:t xml:space="preserve">  ],</w:t>
+      </w:r>
+    </w:p>
+    <w:p>
+      <w:pPr>
+        <w:keepNext/>
+        <w:spacing w:after="0"/>
+        <w:shd w:val="clear" w:color="auto" w:fill="F1F3F8"/>
+      </w:pPr>
+      <w:r>
+        <w:rPr>
+          <w:rFonts w:ascii="Consolas" w:hAnsi="Consolas"/>
+          <w:b w:val="0"/>
+          <w:color w:val="233C7D"/>
+          <w:sz w:val="19"/>
+        </w:rPr>
+        <w:t xml:space="preserve">  "traceId": "00-4bf92f3577b34da6a3ce929d0e0e4736-00f067aa0ba902b7-01"</w:t>
+      </w:r>
+    </w:p>
+    <w:p>
+      <w:pPr>
+        <w:keepNext w:val="0"/>
+        <w:spacing w:after="120"/>
+        <w:shd w:val="clear" w:color="auto" w:fill="F1F3F8"/>
+      </w:pPr>
+      <w:r>
+        <w:rPr>
+          <w:rFonts w:ascii="Consolas" w:hAnsi="Consolas"/>
+          <w:b w:val="0"/>
+          <w:color w:val="233C7D"/>
+          <w:sz w:val="19"/>
+        </w:rPr>
+        <w:t>}</w:t>
+      </w:r>
+    </w:p>
+    <w:p>
+      <w:pPr>
+        <w:pStyle w:val="Heading1"/>
+        <w:pageBreakBefore/>
+      </w:pPr>
+      <w:r>
+        <w:rPr>
+          <w:b w:val="0"/>
+        </w:rPr>
+        <w:t xml:space="preserve">POST </w:t>
+      </w:r>
+      <w:r>
+        <w:rPr>
+          <w:rFonts w:ascii="Consolas" w:hAnsi="Consolas"/>
+          <w:b w:val="0"/>
+        </w:rPr>
+        <w:t>/api/warehouse/edit-warehouse-item</w:t>
+      </w:r>
+    </w:p>
+    <w:p>
+      <w:r>
+        <w:t>Magazzino: modifica di un articolo</w:t>
+      </w:r>
+    </w:p>
+    <w:p>
+      <w:pPr>
+        <w:spacing w:after="40"/>
+      </w:pPr>
+      <w:r>
+        <w:rPr>
+          <w:b/>
+        </w:rPr>
+        <w:t xml:space="preserve">Metodo: </w:t>
+      </w:r>
+      <w:r>
+        <w:rPr>
+          <w:rFonts w:ascii="Consolas" w:hAnsi="Consolas"/>
+          <w:b w:val="0"/>
+          <w:color w:val="233C7D"/>
+        </w:rPr>
+        <w:t>POST</w:t>
+      </w:r>
+    </w:p>
+    <w:p>
+      <w:pPr>
+        <w:spacing w:after="40"/>
+      </w:pPr>
+      <w:r>
+        <w:rPr>
+          <w:b/>
+        </w:rPr>
+        <w:t xml:space="preserve">Route: </w:t>
+      </w:r>
+      <w:r>
+        <w:rPr>
+          <w:rFonts w:ascii="Consolas" w:hAnsi="Consolas"/>
+          <w:b w:val="0"/>
+          <w:color w:val="233C7D"/>
+        </w:rPr>
+        <w:t>/api/warehouse/edit-warehouse-item</w:t>
+      </w:r>
+    </w:p>
+    <w:p>
+      <w:pPr>
+        <w:spacing w:after="40"/>
+      </w:pPr>
+      <w:r>
+        <w:rPr>
+          <w:b/>
+        </w:rPr>
+        <w:t xml:space="preserve">Nel frontend: </w:t>
+      </w:r>
+      <w:r>
+        <w:rPr>
+          <w:rFonts w:ascii="Consolas" w:hAnsi="Consolas"/>
+          <w:b w:val="0"/>
+          <w:color w:val="233C7D"/>
+        </w:rPr>
+        <w:t>WarehouseService.editWarehouseItem</w:t>
+      </w:r>
+    </w:p>
+    <w:p>
+      <w:pPr>
+        <w:spacing w:after="40"/>
+      </w:pPr>
+      <w:r>
+        <w:rPr>
+          <w:b/>
+        </w:rPr>
+        <w:t xml:space="preserve">Autenticazione: </w:t>
+      </w:r>
+      <w:r>
+        <w:rPr>
+          <w:b w:val="0"/>
+        </w:rPr>
+        <w:t>Header Authorization: Bearer &lt;accessToken&gt;.</w:t>
+      </w:r>
+    </w:p>
+    <w:p>
+      <w:pPr>
+        <w:pStyle w:val="ListBullet"/>
+      </w:pPr>
+      <w:r>
+        <w:t>La chiama il bottone Salva del popup "Modifica articolo", che si apre con la matita di una riga delle Impostazioni magazzino. Il popup parte dai valori della riga (total, thresholdNumber, isThresholdWarningActive di warehouse/list); l'articolo è mostrato ma non si può cambiare.</w:t>
+      </w:r>
+    </w:p>
+    <w:p>
+      <w:pPr>
+        <w:pStyle w:val="ListBullet"/>
+      </w:pPr>
+      <w:r>
+        <w:t>Il bottone funziona solo con un totale maggiore di 0; l'avviso di soglia si può accendere solo con una soglia maggiore di 0.</w:t>
+      </w:r>
+    </w:p>
+    <w:p>
+      <w:pPr>
+        <w:pStyle w:val="ListBullet"/>
+      </w:pPr>
+      <w:r>
+        <w:t>Durante la chiamata il bottone mostra uno spinner e il popup non si può modificare né chiudere. Se la chiamata riesce, il popup si chiude e la tabella rifà warehouse/list; se fallisce, il popup resta aperto con i dati inseriti e mostra il messaggio del code.</w:t>
+      </w:r>
+    </w:p>
+    <w:p>
+      <w:pPr>
+        <w:pStyle w:val="ListBullet"/>
+      </w:pPr>
+      <w:r>
+        <w:t>Il corpo è quello dell'aggiunta con idItem al posto di idArticle. Metodo POST e risposta 204 senza corpo sono una proposta del frontend, da confermare col backend: oggi il mock sostituisce totale, soglia e avviso dell'articolo.</w:t>
+      </w:r>
+    </w:p>
+    <w:p>
+      <w:pPr>
+        <w:pStyle w:val="Heading2"/>
+      </w:pPr>
+      <w:r>
+        <w:t>Payload inviato al backend</w:t>
+      </w:r>
+    </w:p>
+    <w:p>
+      <w:pPr>
+        <w:pStyle w:val="Heading3"/>
+      </w:pPr>
+      <w:r>
+        <w:rPr>
+          <w:b w:val="0"/>
+        </w:rPr>
+        <w:t xml:space="preserve">Corpo JSON: </w:t>
+      </w:r>
+      <w:r>
+        <w:rPr>
+          <w:rFonts w:ascii="Consolas" w:hAnsi="Consolas"/>
+          <w:b w:val="0"/>
+        </w:rPr>
+        <w:t>EditWarehouseItemRequest</w:t>
+      </w:r>
+    </w:p>
+    <w:tbl>
+      <w:tblPr>
+        <w:tblW w:type="auto" w:w="0"/>
+        <w:jc w:val="center"/>
+        <w:tblLayout w:type="fixed"/>
+        <w:tblLook w:firstColumn="1" w:firstRow="1" w:lastColumn="0" w:lastRow="0" w:noHBand="0" w:noVBand="1" w:val="04A0"/>
+        <w:tblBorders>
+          <w:top w:val="single" w:sz="4" w:color="C9CED8"/>
+          <w:left w:val="single" w:sz="4" w:color="C9CED8"/>
+          <w:bottom w:val="single" w:sz="4" w:color="C9CED8"/>
+          <w:right w:val="single" w:sz="4" w:color="C9CED8"/>
+          <w:insideH w:val="single" w:sz="4" w:color="C9CED8"/>
+          <w:insideV w:val="single" w:sz="4" w:color="C9CED8"/>
+        </w:tblBorders>
+      </w:tblPr>
+      <w:tblGrid>
+        <w:gridCol w:w="3289"/>
+        <w:gridCol w:w="3289"/>
+        <w:gridCol w:w="3289"/>
+      </w:tblGrid>
+      <w:tr>
+        <w:trPr>
+          <w:cantSplit w:val="true"/>
+          <w:tblHeader w:val="true"/>
+        </w:trPr>
+        <w:tc>
+          <w:tcPr>
+            <w:tcW w:type="dxa" w:w="2381"/>
+            <w:shd w:val="clear" w:color="auto" w:fill="233C7D"/>
+          </w:tcPr>
+          <w:p>
+            <w:pPr>
+              <w:spacing w:after="0"/>
+            </w:pPr>
+            <w:r>
+              <w:rPr>
+                <w:b/>
+                <w:color w:val="FFFFFF"/>
+                <w:sz w:val="20"/>
+              </w:rPr>
+              <w:t>Parametro</w:t>
+            </w:r>
+          </w:p>
+        </w:tc>
+        <w:tc>
+          <w:tcPr>
+            <w:tcW w:type="dxa" w:w="2608"/>
+            <w:shd w:val="clear" w:color="auto" w:fill="233C7D"/>
+          </w:tcPr>
+          <w:p>
+            <w:pPr>
+              <w:spacing w:after="0"/>
+            </w:pPr>
+            <w:r>
+              <w:rPr>
+                <w:b/>
+                <w:color w:val="FFFFFF"/>
+                <w:sz w:val="20"/>
+              </w:rPr>
+              <w:t>Tipo</w:t>
+            </w:r>
+          </w:p>
+        </w:tc>
+        <w:tc>
+          <w:tcPr>
+            <w:tcW w:type="dxa" w:w="4876"/>
+            <w:shd w:val="clear" w:color="auto" w:fill="233C7D"/>
+          </w:tcPr>
+          <w:p>
+            <w:pPr>
+              <w:spacing w:after="0"/>
+            </w:pPr>
+            <w:r>
+              <w:rPr>
+                <w:b/>
+                <w:color w:val="FFFFFF"/>
+                <w:sz w:val="20"/>
+              </w:rPr>
+              <w:t>Descrizione</w:t>
+            </w:r>
+          </w:p>
+        </w:tc>
+      </w:tr>
+      <w:tr>
+        <w:trPr>
+          <w:cantSplit w:val="true"/>
+        </w:trPr>
+        <w:tc>
+          <w:tcPr>
+            <w:tcW w:type="dxa" w:w="2381"/>
+          </w:tcPr>
+          <w:p>
+            <w:pPr>
+              <w:spacing w:after="0"/>
+            </w:pPr>
+            <w:r>
+              <w:rPr>
+                <w:rFonts w:ascii="Consolas" w:hAnsi="Consolas"/>
+                <w:b w:val="0"/>
+                <w:color w:val="233C7D"/>
+                <w:sz w:val="19"/>
+              </w:rPr>
+              <w:t>idProperty</w:t>
+            </w:r>
+          </w:p>
+        </w:tc>
+        <w:tc>
+          <w:tcPr>
+            <w:tcW w:type="dxa" w:w="2608"/>
+          </w:tcPr>
+          <w:p>
+            <w:pPr>
+              <w:spacing w:after="0"/>
+            </w:pPr>
+            <w:r>
+              <w:rPr>
+                <w:rFonts w:ascii="Consolas" w:hAnsi="Consolas"/>
+                <w:b w:val="0"/>
+                <w:color w:val="233C7D"/>
+                <w:sz w:val="19"/>
+              </w:rPr>
+              <w:t>string (UUID)</w:t>
+            </w:r>
+          </w:p>
+        </w:tc>
+        <w:tc>
+          <w:tcPr>
+            <w:tcW w:type="dxa" w:w="4876"/>
+          </w:tcPr>
+          <w:p>
+            <w:pPr>
+              <w:spacing w:after="0"/>
+            </w:pPr>
+            <w:r>
+              <w:rPr>
+                <w:b w:val="0"/>
+                <w:sz w:val="19"/>
+              </w:rPr>
+              <w:t>Stabilimento dell'utente (da AuthUser.idProperty).</w:t>
+            </w:r>
+          </w:p>
+        </w:tc>
+      </w:tr>
+      <w:tr>
+        <w:trPr>
+          <w:cantSplit w:val="true"/>
+        </w:trPr>
+        <w:tc>
+          <w:tcPr>
+            <w:tcW w:type="dxa" w:w="2381"/>
+            <w:shd w:val="clear" w:color="auto" w:fill="F1F3F8"/>
+          </w:tcPr>
+          <w:p>
+            <w:pPr>
+              <w:spacing w:after="0"/>
+            </w:pPr>
+            <w:r>
+              <w:rPr>
+                <w:rFonts w:ascii="Consolas" w:hAnsi="Consolas"/>
+                <w:b w:val="0"/>
+                <w:color w:val="233C7D"/>
+                <w:sz w:val="19"/>
+              </w:rPr>
+              <w:t>idItem</w:t>
+            </w:r>
+          </w:p>
+        </w:tc>
+        <w:tc>
+          <w:tcPr>
+            <w:tcW w:type="dxa" w:w="2608"/>
+            <w:shd w:val="clear" w:color="auto" w:fill="F1F3F8"/>
+          </w:tcPr>
+          <w:p>
+            <w:pPr>
+              <w:spacing w:after="0"/>
+            </w:pPr>
+            <w:r>
+              <w:rPr>
+                <w:rFonts w:ascii="Consolas" w:hAnsi="Consolas"/>
+                <w:b w:val="0"/>
+                <w:color w:val="233C7D"/>
+                <w:sz w:val="19"/>
+              </w:rPr>
+              <w:t>string (UUID)</w:t>
+            </w:r>
+          </w:p>
+        </w:tc>
+        <w:tc>
+          <w:tcPr>
+            <w:tcW w:type="dxa" w:w="4876"/>
+            <w:shd w:val="clear" w:color="auto" w:fill="F1F3F8"/>
+          </w:tcPr>
+          <w:p>
+            <w:pPr>
+              <w:spacing w:after="0"/>
+            </w:pPr>
+            <w:r>
+              <w:rPr>
+                <w:b w:val="0"/>
+                <w:sz w:val="19"/>
+              </w:rPr>
+              <w:t>Articolo da modificare: l'idArticle della sua riga in warehouse/list. Deve essere un articolo attivo dello stabilimento; l'articolo non si può cambiare.</w:t>
+            </w:r>
+          </w:p>
+        </w:tc>
+      </w:tr>
+      <w:tr>
+        <w:trPr>
+          <w:cantSplit w:val="true"/>
+        </w:trPr>
+        <w:tc>
+          <w:tcPr>
+            <w:tcW w:type="dxa" w:w="2381"/>
+          </w:tcPr>
+          <w:p>
+            <w:pPr>
+              <w:spacing w:after="0"/>
+            </w:pPr>
+            <w:r>
+              <w:rPr>
+                <w:rFonts w:ascii="Consolas" w:hAnsi="Consolas"/>
+                <w:b w:val="0"/>
+                <w:color w:val="233C7D"/>
+                <w:sz w:val="19"/>
+              </w:rPr>
+              <w:t>articleQuantity</w:t>
+            </w:r>
+          </w:p>
+        </w:tc>
+        <w:tc>
+          <w:tcPr>
+            <w:tcW w:type="dxa" w:w="2608"/>
+          </w:tcPr>
+          <w:p>
+            <w:pPr>
+              <w:spacing w:after="0"/>
+            </w:pPr>
+            <w:r>
+              <w:rPr>
+                <w:rFonts w:ascii="Consolas" w:hAnsi="Consolas"/>
+                <w:b w:val="0"/>
+                <w:color w:val="233C7D"/>
+                <w:sz w:val="19"/>
+              </w:rPr>
+              <w:t>number (intero &gt; 0)</w:t>
+            </w:r>
+          </w:p>
+        </w:tc>
+        <w:tc>
+          <w:tcPr>
+            <w:tcW w:type="dxa" w:w="4876"/>
+          </w:tcPr>
+          <w:p>
+            <w:pPr>
+              <w:spacing w:after="0"/>
+            </w:pPr>
+            <w:r>
+              <w:rPr>
+                <w:b w:val="0"/>
+                <w:sz w:val="19"/>
+              </w:rPr>
+              <w:t>Nuovo totale, numero intero maggiore di 0.</w:t>
+            </w:r>
+          </w:p>
+        </w:tc>
+      </w:tr>
+      <w:tr>
+        <w:trPr>
+          <w:cantSplit w:val="true"/>
+        </w:trPr>
+        <w:tc>
+          <w:tcPr>
+            <w:tcW w:type="dxa" w:w="2381"/>
+            <w:shd w:val="clear" w:color="auto" w:fill="F1F3F8"/>
+          </w:tcPr>
+          <w:p>
+            <w:pPr>
+              <w:spacing w:after="0"/>
+            </w:pPr>
+            <w:r>
+              <w:rPr>
+                <w:rFonts w:ascii="Consolas" w:hAnsi="Consolas"/>
+                <w:b w:val="0"/>
+                <w:color w:val="233C7D"/>
+                <w:sz w:val="19"/>
+              </w:rPr>
+              <w:t>thresholdQuantity</w:t>
+            </w:r>
+          </w:p>
+        </w:tc>
+        <w:tc>
+          <w:tcPr>
+            <w:tcW w:type="dxa" w:w="2608"/>
+            <w:shd w:val="clear" w:color="auto" w:fill="F1F3F8"/>
+          </w:tcPr>
+          <w:p>
+            <w:pPr>
+              <w:spacing w:after="0"/>
+            </w:pPr>
+            <w:r>
+              <w:rPr>
+                <w:rFonts w:ascii="Consolas" w:hAnsi="Consolas"/>
+                <w:b w:val="0"/>
+                <w:color w:val="233C7D"/>
+                <w:sz w:val="19"/>
+              </w:rPr>
+              <w:t>number (intero ≥ 0) | null</w:t>
+            </w:r>
+          </w:p>
+        </w:tc>
+        <w:tc>
+          <w:tcPr>
+            <w:tcW w:type="dxa" w:w="4876"/>
+            <w:shd w:val="clear" w:color="auto" w:fill="F1F3F8"/>
+          </w:tcPr>
+          <w:p>
+            <w:pPr>
+              <w:spacing w:after="0"/>
+            </w:pPr>
+            <w:r>
+              <w:rPr>
+                <w:b w:val="0"/>
+                <w:sz w:val="19"/>
+              </w:rPr>
+              <w:t>Nuova soglia, numero intero; null se la soglia non è indicata. Il campo c'è sempre.</w:t>
+            </w:r>
+          </w:p>
+        </w:tc>
+      </w:tr>
+      <w:tr>
+        <w:trPr>
+          <w:cantSplit w:val="true"/>
+        </w:trPr>
+        <w:tc>
+          <w:tcPr>
+            <w:tcW w:type="dxa" w:w="2381"/>
+          </w:tcPr>
+          <w:p>
+            <w:pPr>
+              <w:spacing w:after="0"/>
+            </w:pPr>
+            <w:r>
+              <w:rPr>
+                <w:rFonts w:ascii="Consolas" w:hAnsi="Consolas"/>
+                <w:b w:val="0"/>
+                <w:color w:val="233C7D"/>
+                <w:sz w:val="19"/>
+              </w:rPr>
+              <w:t>isThresholdWarningActive</w:t>
+            </w:r>
+          </w:p>
+        </w:tc>
+        <w:tc>
+          <w:tcPr>
+            <w:tcW w:type="dxa" w:w="2608"/>
+          </w:tcPr>
+          <w:p>
+            <w:pPr>
+              <w:spacing w:after="0"/>
+            </w:pPr>
+            <w:r>
+              <w:rPr>
+                <w:rFonts w:ascii="Consolas" w:hAnsi="Consolas"/>
+                <w:b w:val="0"/>
+                <w:color w:val="233C7D"/>
+                <w:sz w:val="19"/>
+              </w:rPr>
+              <w:t>boolean</w:t>
+            </w:r>
+          </w:p>
+        </w:tc>
+        <w:tc>
+          <w:tcPr>
+            <w:tcW w:type="dxa" w:w="4876"/>
+          </w:tcPr>
+          <w:p>
+            <w:pPr>
+              <w:spacing w:after="0"/>
+            </w:pPr>
+            <w:r>
+              <w:rPr>
+                <w:b w:val="0"/>
+                <w:sz w:val="19"/>
+              </w:rPr>
+              <w:t>Avviso di soglia acceso. Può essere true solo con thresholdQuantity maggiore di 0.</w:t>
+            </w:r>
+          </w:p>
+        </w:tc>
+      </w:tr>
+    </w:tbl>
+    <w:p>
+      <w:pPr>
+        <w:spacing w:after="40"/>
+      </w:pPr>
+    </w:p>
+    <w:p>
+      <w:pPr>
+        <w:pStyle w:val="Heading3"/>
+      </w:pPr>
+      <w:r>
+        <w:t>Esempio di richiesta (JSON)</w:t>
+      </w:r>
+    </w:p>
+    <w:p>
+      <w:pPr>
+        <w:keepNext/>
+        <w:spacing w:after="0"/>
+        <w:shd w:val="clear" w:color="auto" w:fill="F1F3F8"/>
+      </w:pPr>
+      <w:r>
+        <w:rPr>
+          <w:rFonts w:ascii="Consolas" w:hAnsi="Consolas"/>
+          <w:b w:val="0"/>
+          <w:color w:val="233C7D"/>
+          <w:sz w:val="19"/>
+        </w:rPr>
+        <w:t>{</w:t>
+      </w:r>
+    </w:p>
+    <w:p>
+      <w:pPr>
+        <w:keepNext/>
+        <w:spacing w:after="0"/>
+        <w:shd w:val="clear" w:color="auto" w:fill="F1F3F8"/>
+      </w:pPr>
+      <w:r>
+        <w:rPr>
+          <w:rFonts w:ascii="Consolas" w:hAnsi="Consolas"/>
+          <w:b w:val="0"/>
+          <w:color w:val="233C7D"/>
+          <w:sz w:val="19"/>
+        </w:rPr>
+        <w:t xml:space="preserve">  "idProperty": "5b1f3c7e-2d4a-4e8b-9c1d-7a6e5f4b3c2d",</w:t>
+      </w:r>
+    </w:p>
+    <w:p>
+      <w:pPr>
+        <w:keepNext/>
+        <w:spacing w:after="0"/>
+        <w:shd w:val="clear" w:color="auto" w:fill="F1F3F8"/>
+      </w:pPr>
+      <w:r>
+        <w:rPr>
+          <w:rFonts w:ascii="Consolas" w:hAnsi="Consolas"/>
+          <w:b w:val="0"/>
+          <w:color w:val="233C7D"/>
+          <w:sz w:val="19"/>
+        </w:rPr>
+        <w:t xml:space="preserve">  "idItem": "8c2e4a1b-6f3d-4b7e-a9c5-1d2e3f4a5b6c",</w:t>
+      </w:r>
+    </w:p>
+    <w:p>
+      <w:pPr>
+        <w:keepNext/>
+        <w:spacing w:after="0"/>
+        <w:shd w:val="clear" w:color="auto" w:fill="F1F3F8"/>
+      </w:pPr>
+      <w:r>
+        <w:rPr>
+          <w:rFonts w:ascii="Consolas" w:hAnsi="Consolas"/>
+          <w:b w:val="0"/>
+          <w:color w:val="233C7D"/>
+          <w:sz w:val="19"/>
+        </w:rPr>
+        <w:t xml:space="preserve">  "articleQuantity": 110,</w:t>
+      </w:r>
+    </w:p>
+    <w:p>
+      <w:pPr>
+        <w:keepNext/>
+        <w:spacing w:after="0"/>
+        <w:shd w:val="clear" w:color="auto" w:fill="F1F3F8"/>
+      </w:pPr>
+      <w:r>
+        <w:rPr>
+          <w:rFonts w:ascii="Consolas" w:hAnsi="Consolas"/>
+          <w:b w:val="0"/>
+          <w:color w:val="233C7D"/>
+          <w:sz w:val="19"/>
+        </w:rPr>
+        <w:t xml:space="preserve">  "thresholdQuantity": 8,</w:t>
+      </w:r>
+    </w:p>
+    <w:p>
+      <w:pPr>
+        <w:keepNext/>
+        <w:spacing w:after="0"/>
+        <w:shd w:val="clear" w:color="auto" w:fill="F1F3F8"/>
+      </w:pPr>
+      <w:r>
+        <w:rPr>
+          <w:rFonts w:ascii="Consolas" w:hAnsi="Consolas"/>
+          <w:b w:val="0"/>
+          <w:color w:val="233C7D"/>
+          <w:sz w:val="19"/>
+        </w:rPr>
+        <w:t xml:space="preserve">  "isThresholdWarningActive": true</w:t>
+      </w:r>
+    </w:p>
+    <w:p>
+      <w:pPr>
+        <w:keepNext w:val="0"/>
+        <w:spacing w:after="120"/>
+        <w:shd w:val="clear" w:color="auto" w:fill="F1F3F8"/>
+      </w:pPr>
+      <w:r>
+        <w:rPr>
+          <w:rFonts w:ascii="Consolas" w:hAnsi="Consolas"/>
+          <w:b w:val="0"/>
+          <w:color w:val="233C7D"/>
+          <w:sz w:val="19"/>
+        </w:rPr>
+        <w:t>}</w:t>
+      </w:r>
+    </w:p>
+    <w:p>
+      <w:pPr>
+        <w:pStyle w:val="Heading2"/>
+      </w:pPr>
+      <w:r>
+        <w:t>Risposta attesa dal server</w:t>
+      </w:r>
+    </w:p>
+    <w:p>
+      <w:pPr>
+        <w:spacing w:after="40"/>
+      </w:pPr>
+      <w:r>
+        <w:rPr>
+          <w:b/>
+        </w:rPr>
+        <w:t xml:space="preserve">Stato: </w:t>
+      </w:r>
+      <w:r>
+        <w:rPr>
+          <w:b w:val="0"/>
+        </w:rPr>
+        <w:t>204 No Content (nessun corpo)</w:t>
+      </w:r>
+    </w:p>
+    <w:p>
+      <w:r>
+        <w:t>Nessun corpo nella risposta, quindi nessun JSON.</w:t>
+      </w:r>
+    </w:p>
+    <w:p>
+      <w:pPr>
+        <w:pStyle w:val="Heading2"/>
+      </w:pPr>
+      <w:r>
+        <w:t>Errori possibili</w:t>
+      </w:r>
+    </w:p>
+    <w:tbl>
+      <w:tblPr>
+        <w:tblW w:type="auto" w:w="0"/>
+        <w:jc w:val="center"/>
+        <w:tblLayout w:type="fixed"/>
+        <w:tblLook w:firstColumn="1" w:firstRow="1" w:lastColumn="0" w:lastRow="0" w:noHBand="0" w:noVBand="1" w:val="04A0"/>
+        <w:tblBorders>
+          <w:top w:val="single" w:sz="4" w:color="C9CED8"/>
+          <w:left w:val="single" w:sz="4" w:color="C9CED8"/>
+          <w:bottom w:val="single" w:sz="4" w:color="C9CED8"/>
+          <w:right w:val="single" w:sz="4" w:color="C9CED8"/>
+          <w:insideH w:val="single" w:sz="4" w:color="C9CED8"/>
+          <w:insideV w:val="single" w:sz="4" w:color="C9CED8"/>
+        </w:tblBorders>
+      </w:tblPr>
+      <w:tblGrid>
+        <w:gridCol w:w="3289"/>
+        <w:gridCol w:w="3289"/>
+        <w:gridCol w:w="3289"/>
+      </w:tblGrid>
+      <w:tr>
+        <w:trPr>
+          <w:cantSplit w:val="true"/>
+          <w:tblHeader w:val="true"/>
+        </w:trPr>
+        <w:tc>
+          <w:tcPr>
+            <w:tcW w:type="dxa" w:w="907"/>
+            <w:shd w:val="clear" w:color="auto" w:fill="233C7D"/>
+          </w:tcPr>
+          <w:p>
+            <w:pPr>
+              <w:spacing w:after="0"/>
+            </w:pPr>
+            <w:r>
+              <w:rPr>
+                <w:b/>
+                <w:color w:val="FFFFFF"/>
+                <w:sz w:val="20"/>
+              </w:rPr>
+              <w:t>Status</w:t>
+            </w:r>
+          </w:p>
+        </w:tc>
+        <w:tc>
+          <w:tcPr>
+            <w:tcW w:type="dxa" w:w="3061"/>
+            <w:shd w:val="clear" w:color="auto" w:fill="233C7D"/>
+          </w:tcPr>
+          <w:p>
+            <w:pPr>
+              <w:spacing w:after="0"/>
+            </w:pPr>
+            <w:r>
+              <w:rPr>
+                <w:b/>
+                <w:color w:val="FFFFFF"/>
+                <w:sz w:val="20"/>
+              </w:rPr>
+              <w:t>Codice</w:t>
+            </w:r>
+          </w:p>
+        </w:tc>
+        <w:tc>
+          <w:tcPr>
+            <w:tcW w:type="dxa" w:w="5896"/>
+            <w:shd w:val="clear" w:color="auto" w:fill="233C7D"/>
+          </w:tcPr>
+          <w:p>
+            <w:pPr>
+              <w:spacing w:after="0"/>
+            </w:pPr>
+            <w:r>
+              <w:rPr>
+                <w:b/>
+                <w:color w:val="FFFFFF"/>
+                <w:sz w:val="20"/>
+              </w:rPr>
+              <w:t>Quando</w:t>
+            </w:r>
+          </w:p>
+        </w:tc>
+      </w:tr>
+      <w:tr>
+        <w:trPr>
+          <w:cantSplit w:val="true"/>
+        </w:trPr>
+        <w:tc>
+          <w:tcPr>
+            <w:tcW w:type="dxa" w:w="907"/>
+          </w:tcPr>
+          <w:p>
+            <w:pPr>
+              <w:spacing w:after="0"/>
+            </w:pPr>
+            <w:r>
+              <w:rPr>
+                <w:rFonts w:ascii="Consolas" w:hAnsi="Consolas"/>
+                <w:b w:val="0"/>
+                <w:color w:val="233C7D"/>
+                <w:sz w:val="19"/>
+              </w:rPr>
+              <w:t>400</w:t>
+            </w:r>
+          </w:p>
+        </w:tc>
+        <w:tc>
+          <w:tcPr>
+            <w:tcW w:type="dxa" w:w="3061"/>
+          </w:tcPr>
+          <w:p>
+            <w:pPr>
+              <w:spacing w:after="0"/>
+            </w:pPr>
+            <w:r>
+              <w:rPr>
+                <w:rFonts w:ascii="Consolas" w:hAnsi="Consolas"/>
+                <w:b w:val="0"/>
+                <w:color w:val="233C7D"/>
+                <w:sz w:val="19"/>
+              </w:rPr>
+              <w:t>validation.invalid_request</w:t>
+            </w:r>
+          </w:p>
+        </w:tc>
+        <w:tc>
+          <w:tcPr>
+            <w:tcW w:type="dxa" w:w="5896"/>
+          </w:tcPr>
+          <w:p>
+            <w:pPr>
+              <w:spacing w:after="0"/>
+            </w:pPr>
+            <w:r>
+              <w:rPr>
+                <w:b w:val="0"/>
+                <w:sz w:val="19"/>
+              </w:rPr>
+              <w:t>Uno o più campi non validi: in errors[] validation.invalid_value per ognuno (idProperty, idItem, articleQuantity, thresholdQuantity, isThresholdWarningActive).</w:t>
+            </w:r>
+          </w:p>
+        </w:tc>
+      </w:tr>
+      <w:tr>
+        <w:trPr>
+          <w:cantSplit w:val="true"/>
+        </w:trPr>
+        <w:tc>
+          <w:tcPr>
+            <w:tcW w:type="dxa" w:w="907"/>
+            <w:shd w:val="clear" w:color="auto" w:fill="F1F3F8"/>
+          </w:tcPr>
+          <w:p>
+            <w:pPr>
+              <w:spacing w:after="0"/>
+            </w:pPr>
+            <w:r>
+              <w:rPr>
+                <w:rFonts w:ascii="Consolas" w:hAnsi="Consolas"/>
+                <w:b w:val="0"/>
+                <w:color w:val="233C7D"/>
+                <w:sz w:val="19"/>
+              </w:rPr>
+              <w:t>401</w:t>
+            </w:r>
+          </w:p>
+        </w:tc>
+        <w:tc>
+          <w:tcPr>
+            <w:tcW w:type="dxa" w:w="3061"/>
+            <w:shd w:val="clear" w:color="auto" w:fill="F1F3F8"/>
+          </w:tcPr>
+          <w:p>
+            <w:pPr>
+              <w:spacing w:after="0"/>
+            </w:pPr>
+            <w:r>
+              <w:rPr>
+                <w:rFonts w:ascii="Consolas" w:hAnsi="Consolas"/>
+                <w:b w:val="0"/>
+                <w:color w:val="233C7D"/>
+                <w:sz w:val="19"/>
+              </w:rPr>
+              <w:t>auth.invalid_token</w:t>
+            </w:r>
+          </w:p>
+        </w:tc>
+        <w:tc>
+          <w:tcPr>
+            <w:tcW w:type="dxa" w:w="5896"/>
+            <w:shd w:val="clear" w:color="auto" w:fill="F1F3F8"/>
+          </w:tcPr>
+          <w:p>
+            <w:pPr>
+              <w:spacing w:after="0"/>
+            </w:pPr>
+            <w:r>
+              <w:rPr>
+                <w:b w:val="0"/>
+                <w:sz w:val="19"/>
+              </w:rPr>
+              <w:t>Access token assente, scaduto o non valido: il frontend rinnova il token e ripete la chiamata una volta.</w:t>
+            </w:r>
+          </w:p>
+        </w:tc>
+      </w:tr>
+      <w:tr>
+        <w:trPr>
+          <w:cantSplit w:val="true"/>
+        </w:trPr>
+        <w:tc>
+          <w:tcPr>
+            <w:tcW w:type="dxa" w:w="907"/>
+          </w:tcPr>
+          <w:p>
+            <w:pPr>
+              <w:spacing w:after="0"/>
+            </w:pPr>
+            <w:r>
+              <w:rPr>
+                <w:rFonts w:ascii="Consolas" w:hAnsi="Consolas"/>
+                <w:b w:val="0"/>
+                <w:color w:val="233C7D"/>
+                <w:sz w:val="19"/>
+              </w:rPr>
+              <w:t>500</w:t>
+            </w:r>
+          </w:p>
+        </w:tc>
+        <w:tc>
+          <w:tcPr>
+            <w:tcW w:type="dxa" w:w="3061"/>
+          </w:tcPr>
+          <w:p>
+            <w:pPr>
+              <w:spacing w:after="0"/>
+            </w:pPr>
+            <w:r>
+              <w:rPr>
+                <w:rFonts w:ascii="Consolas" w:hAnsi="Consolas"/>
+                <w:b w:val="0"/>
+                <w:color w:val="233C7D"/>
+                <w:sz w:val="19"/>
+              </w:rPr>
+              <w:t>server.unexpected</w:t>
+            </w:r>
+          </w:p>
+        </w:tc>
+        <w:tc>
+          <w:tcPr>
+            <w:tcW w:type="dxa" w:w="5896"/>
+          </w:tcPr>
+          <w:p>
+            <w:pPr>
+              <w:spacing w:after="0"/>
+            </w:pPr>
+            <w:r>
+              <w:rPr>
+                <w:b w:val="0"/>
+                <w:sz w:val="19"/>
+              </w:rPr>
+              <w:t>Errore non gestito del server (vale per ogni API).</w:t>
+            </w:r>
+          </w:p>
+        </w:tc>
+      </w:tr>
+    </w:tbl>
+    <w:p>
+      <w:pPr>
+        <w:spacing w:after="40"/>
+      </w:pPr>
+    </w:p>
+    <w:p>
+      <w:pPr>
+        <w:pStyle w:val="Heading3"/>
+      </w:pPr>
+      <w:r>
+        <w:t>Esempio di errore (JSON)</w:t>
+      </w:r>
+    </w:p>
+    <w:p>
+      <w:pPr>
+        <w:keepNext/>
+      </w:pPr>
+      <w:r>
+        <w:t>Risposta a una richiesta con il totale a 0:</w:t>
+      </w:r>
+    </w:p>
+    <w:p>
+      <w:pPr>
+        <w:keepNext/>
+        <w:spacing w:after="0"/>
+        <w:shd w:val="clear" w:color="auto" w:fill="F1F3F8"/>
+      </w:pPr>
+      <w:r>
+        <w:rPr>
+          <w:rFonts w:ascii="Consolas" w:hAnsi="Consolas"/>
+          <w:b w:val="0"/>
+          <w:color w:val="233C7D"/>
+          <w:sz w:val="19"/>
+        </w:rPr>
+        <w:t>{</w:t>
+      </w:r>
+    </w:p>
+    <w:p>
+      <w:pPr>
+        <w:keepNext/>
+        <w:spacing w:after="0"/>
+        <w:shd w:val="clear" w:color="auto" w:fill="F1F3F8"/>
+      </w:pPr>
+      <w:r>
+        <w:rPr>
+          <w:rFonts w:ascii="Consolas" w:hAnsi="Consolas"/>
+          <w:b w:val="0"/>
+          <w:color w:val="233C7D"/>
+          <w:sz w:val="19"/>
+        </w:rPr>
+        <w:t xml:space="preserve">  "type": "https://errors.summerbooking/validation/invalid-request",</w:t>
+      </w:r>
+    </w:p>
+    <w:p>
+      <w:pPr>
+        <w:keepNext/>
+        <w:spacing w:after="0"/>
+        <w:shd w:val="clear" w:color="auto" w:fill="F1F3F8"/>
+      </w:pPr>
+      <w:r>
+        <w:rPr>
+          <w:rFonts w:ascii="Consolas" w:hAnsi="Consolas"/>
+          <w:b w:val="0"/>
+          <w:color w:val="233C7D"/>
+          <w:sz w:val="19"/>
+        </w:rPr>
+        <w:t xml:space="preserve">  "status": 400,</w:t>
+      </w:r>
+    </w:p>
+    <w:p>
+      <w:pPr>
+        <w:keepNext/>
+        <w:spacing w:after="0"/>
+        <w:shd w:val="clear" w:color="auto" w:fill="F1F3F8"/>
+      </w:pPr>
+      <w:r>
+        <w:rPr>
+          <w:rFonts w:ascii="Consolas" w:hAnsi="Consolas"/>
+          <w:b w:val="0"/>
+          <w:color w:val="233C7D"/>
+          <w:sz w:val="19"/>
+        </w:rPr>
+        <w:t xml:space="preserve">  "code": "validation.invalid_request",</w:t>
+      </w:r>
+    </w:p>
+    <w:p>
+      <w:pPr>
+        <w:keepNext/>
+        <w:spacing w:after="0"/>
+        <w:shd w:val="clear" w:color="auto" w:fill="F1F3F8"/>
+      </w:pPr>
+      <w:r>
+        <w:rPr>
+          <w:rFonts w:ascii="Consolas" w:hAnsi="Consolas"/>
+          <w:b w:val="0"/>
+          <w:color w:val="233C7D"/>
+          <w:sz w:val="19"/>
+        </w:rPr>
+        <w:t xml:space="preserve">  "title": "Invalid request",</w:t>
+      </w:r>
+    </w:p>
+    <w:p>
+      <w:pPr>
+        <w:keepNext/>
+        <w:spacing w:after="0"/>
+        <w:shd w:val="clear" w:color="auto" w:fill="F1F3F8"/>
+      </w:pPr>
+      <w:r>
+        <w:rPr>
+          <w:rFonts w:ascii="Consolas" w:hAnsi="Consolas"/>
+          <w:b w:val="0"/>
+          <w:color w:val="233C7D"/>
+          <w:sz w:val="19"/>
+        </w:rPr>
+        <w:t xml:space="preserve">  "errors": [</w:t>
+      </w:r>
+    </w:p>
+    <w:p>
+      <w:pPr>
+        <w:keepNext/>
+        <w:spacing w:after="0"/>
+        <w:shd w:val="clear" w:color="auto" w:fill="F1F3F8"/>
+      </w:pPr>
+      <w:r>
+        <w:rPr>
+          <w:rFonts w:ascii="Consolas" w:hAnsi="Consolas"/>
+          <w:b w:val="0"/>
+          <w:color w:val="233C7D"/>
+          <w:sz w:val="19"/>
+        </w:rPr>
+        <w:t xml:space="preserve">    {</w:t>
+      </w:r>
+    </w:p>
+    <w:p>
+      <w:pPr>
+        <w:keepNext/>
+        <w:spacing w:after="0"/>
+        <w:shd w:val="clear" w:color="auto" w:fill="F1F3F8"/>
+      </w:pPr>
+      <w:r>
+        <w:rPr>
+          <w:rFonts w:ascii="Consolas" w:hAnsi="Consolas"/>
+          <w:b w:val="0"/>
+          <w:color w:val="233C7D"/>
+          <w:sz w:val="19"/>
+        </w:rPr>
+        <w:t xml:space="preserve">      "field": "articleQuantity",</w:t>
+      </w:r>
+    </w:p>
+    <w:p>
+      <w:pPr>
+        <w:keepNext/>
+        <w:spacing w:after="0"/>
+        <w:shd w:val="clear" w:color="auto" w:fill="F1F3F8"/>
+      </w:pPr>
+      <w:r>
+        <w:rPr>
+          <w:rFonts w:ascii="Consolas" w:hAnsi="Consolas"/>
+          <w:b w:val="0"/>
+          <w:color w:val="233C7D"/>
+          <w:sz w:val="19"/>
+        </w:rPr>
+        <w:t xml:space="preserve">      "code": "validation.invalid_value"</w:t>
+      </w:r>
+    </w:p>
+    <w:p>
+      <w:pPr>
+        <w:keepNext/>
+        <w:spacing w:after="0"/>
+        <w:shd w:val="clear" w:color="auto" w:fill="F1F3F8"/>
+      </w:pPr>
+      <w:r>
+        <w:rPr>
+          <w:rFonts w:ascii="Consolas" w:hAnsi="Consolas"/>
+          <w:b w:val="0"/>
+          <w:color w:val="233C7D"/>
+          <w:sz w:val="19"/>
+        </w:rPr>
+        <w:t xml:space="preserve">    }</w:t>
+      </w:r>
+    </w:p>
+    <w:p>
+      <w:pPr>
+        <w:keepNext/>
+        <w:spacing w:after="0"/>
+        <w:shd w:val="clear" w:color="auto" w:fill="F1F3F8"/>
+      </w:pPr>
+      <w:r>
+        <w:rPr>
+          <w:rFonts w:ascii="Consolas" w:hAnsi="Consolas"/>
+          <w:b w:val="0"/>
+          <w:color w:val="233C7D"/>
+          <w:sz w:val="19"/>
+        </w:rPr>
+        <w:t xml:space="preserve">  ],</w:t>
+      </w:r>
+    </w:p>
+    <w:p>
+      <w:pPr>
+        <w:keepNext/>
+        <w:spacing w:after="0"/>
+        <w:shd w:val="clear" w:color="auto" w:fill="F1F3F8"/>
+      </w:pPr>
+      <w:r>
+        <w:rPr>
+          <w:rFonts w:ascii="Consolas" w:hAnsi="Consolas"/>
+          <w:b w:val="0"/>
+          <w:color w:val="233C7D"/>
+          <w:sz w:val="19"/>
+        </w:rPr>
+        <w:t xml:space="preserve">  "traceId": "00-4bf92f3577b34da6a3ce929d0e0e4736-00f067aa0ba902b7-01"</w:t>
+      </w:r>
+    </w:p>
+    <w:p>
+      <w:pPr>
+        <w:keepNext w:val="0"/>
+        <w:spacing w:after="120"/>
+        <w:shd w:val="clear" w:color="auto" w:fill="F1F3F8"/>
+      </w:pPr>
+      <w:r>
+        <w:rPr>
+          <w:rFonts w:ascii="Consolas" w:hAnsi="Consolas"/>
+          <w:b w:val="0"/>
+          <w:color w:val="233C7D"/>
+          <w:sz w:val="19"/>
+        </w:rPr>
+        <w:t>}</w:t>
+      </w:r>
+    </w:p>
+    <w:p>
+      <w:pPr>
+        <w:pStyle w:val="Heading1"/>
+        <w:pageBreakBefore/>
+      </w:pPr>
+      <w:r>
+        <w:t>Catalogo dei codici di errore</w:t>
+      </w:r>
+    </w:p>
+    <w:p>
+      <w:r>
+        <w:t>Tutti i codici che il frontend gestisce oggi. Ognuno è anche la chiave di traduzione error.&lt;codice&gt; nei file it.json ed en.json. Da confermare o correggere col backend: una volta rilasciati non cambiano. I codici marcati "dal frontend" non li invia il backend.</w:t>
+      </w:r>
+    </w:p>
+    <w:tbl>
+      <w:tblPr>
+        <w:tblW w:type="auto" w:w="0"/>
+        <w:jc w:val="center"/>
+        <w:tblLayout w:type="fixed"/>
+        <w:tblLook w:firstColumn="1" w:firstRow="1" w:lastColumn="0" w:lastRow="0" w:noHBand="0" w:noVBand="1" w:val="04A0"/>
+        <w:tblBorders>
+          <w:top w:val="single" w:sz="4" w:color="C9CED8"/>
+          <w:left w:val="single" w:sz="4" w:color="C9CED8"/>
+          <w:bottom w:val="single" w:sz="4" w:color="C9CED8"/>
+          <w:right w:val="single" w:sz="4" w:color="C9CED8"/>
+          <w:insideH w:val="single" w:sz="4" w:color="C9CED8"/>
+          <w:insideV w:val="single" w:sz="4" w:color="C9CED8"/>
+        </w:tblBorders>
+      </w:tblPr>
+      <w:tblGrid>
+        <w:gridCol w:w="3289"/>
+        <w:gridCol w:w="3289"/>
+        <w:gridCol w:w="3289"/>
+      </w:tblGrid>
+      <w:tr>
+        <w:trPr>
+          <w:cantSplit w:val="true"/>
+          <w:tblHeader w:val="true"/>
+        </w:trPr>
+        <w:tc>
+          <w:tcPr>
+            <w:tcW w:type="dxa" w:w="3288"/>
+            <w:shd w:val="clear" w:color="auto" w:fill="233C7D"/>
+          </w:tcPr>
+          <w:p>
+            <w:pPr>
+              <w:spacing w:after="0"/>
+            </w:pPr>
+            <w:r>
+              <w:rPr>
+                <w:b/>
+                <w:color w:val="FFFFFF"/>
+                <w:sz w:val="20"/>
+              </w:rPr>
+              <w:t>Codice</w:t>
+            </w:r>
+          </w:p>
+        </w:tc>
+        <w:tc>
+          <w:tcPr>
+            <w:tcW w:type="dxa" w:w="1928"/>
+            <w:shd w:val="clear" w:color="auto" w:fill="233C7D"/>
+          </w:tcPr>
+          <w:p>
+            <w:pPr>
+              <w:spacing w:after="0"/>
+            </w:pPr>
+            <w:r>
+              <w:rPr>
+                <w:b/>
+                <w:color w:val="FFFFFF"/>
+                <w:sz w:val="20"/>
+              </w:rPr>
+              <w:t>Status</w:t>
+            </w:r>
+          </w:p>
+        </w:tc>
+        <w:tc>
+          <w:tcPr>
+            <w:tcW w:type="dxa" w:w="4649"/>
+            <w:shd w:val="clear" w:color="auto" w:fill="233C7D"/>
+          </w:tcPr>
+          <w:p>
+            <w:pPr>
+              <w:spacing w:after="0"/>
+            </w:pPr>
+            <w:r>
+              <w:rPr>
+                <w:b/>
+                <w:color w:val="FFFFFF"/>
+                <w:sz w:val="20"/>
+              </w:rPr>
+              <w:t>Significato</w:t>
+            </w:r>
+          </w:p>
+        </w:tc>
+      </w:tr>
+      <w:tr>
+        <w:trPr>
+          <w:cantSplit w:val="true"/>
+        </w:trPr>
+        <w:tc>
+          <w:tcPr>
+            <w:tcW w:type="dxa" w:w="3288"/>
+          </w:tcPr>
+          <w:p>
+            <w:pPr>
+              <w:spacing w:after="0"/>
+            </w:pPr>
+            <w:r>
+              <w:rPr>
+                <w:rFonts w:ascii="Consolas" w:hAnsi="Consolas"/>
+                <w:b w:val="0"/>
+                <w:color w:val="233C7D"/>
+                <w:sz w:val="19"/>
+              </w:rPr>
+              <w:t>auth.invalid_credentials</w:t>
+            </w:r>
+          </w:p>
+        </w:tc>
+        <w:tc>
+          <w:tcPr>
+            <w:tcW w:type="dxa" w:w="1928"/>
+          </w:tcPr>
+          <w:p>
+            <w:pPr>
+              <w:spacing w:after="0"/>
+            </w:pPr>
+            <w:r>
+              <w:rPr>
+                <w:b w:val="0"/>
+                <w:sz w:val="19"/>
+              </w:rPr>
+              <w:t>401</w:t>
+            </w:r>
+          </w:p>
+        </w:tc>
+        <w:tc>
+          <w:tcPr>
+            <w:tcW w:type="dxa" w:w="4649"/>
+          </w:tcPr>
+          <w:p>
+            <w:pPr>
+              <w:spacing w:after="0"/>
+            </w:pPr>
+            <w:r>
+              <w:rPr>
+                <w:b w:val="0"/>
+                <w:sz w:val="19"/>
+              </w:rPr>
+              <w:t>Email o password non corrette (signin).</w:t>
+            </w:r>
+          </w:p>
+        </w:tc>
+      </w:tr>
+      <w:tr>
+        <w:trPr>
+          <w:cantSplit w:val="true"/>
+        </w:trPr>
+        <w:tc>
+          <w:tcPr>
+            <w:tcW w:type="dxa" w:w="3288"/>
+            <w:shd w:val="clear" w:color="auto" w:fill="F1F3F8"/>
+          </w:tcPr>
+          <w:p>
+            <w:pPr>
+              <w:spacing w:after="0"/>
+            </w:pPr>
+            <w:r>
+              <w:rPr>
+                <w:rFonts w:ascii="Consolas" w:hAnsi="Consolas"/>
+                <w:b w:val="0"/>
+                <w:color w:val="233C7D"/>
+                <w:sz w:val="19"/>
+              </w:rPr>
+              <w:t>auth.invalid_token</w:t>
+            </w:r>
+          </w:p>
+        </w:tc>
+        <w:tc>
+          <w:tcPr>
+            <w:tcW w:type="dxa" w:w="1928"/>
+            <w:shd w:val="clear" w:color="auto" w:fill="F1F3F8"/>
+          </w:tcPr>
+          <w:p>
+            <w:pPr>
+              <w:spacing w:after="0"/>
+            </w:pPr>
+            <w:r>
+              <w:rPr>
+                <w:b w:val="0"/>
+                <w:sz w:val="19"/>
+              </w:rPr>
+              <w:t>401</w:t>
+            </w:r>
+          </w:p>
+        </w:tc>
+        <w:tc>
+          <w:tcPr>
+            <w:tcW w:type="dxa" w:w="4649"/>
+            <w:shd w:val="clear" w:color="auto" w:fill="F1F3F8"/>
+          </w:tcPr>
+          <w:p>
+            <w:pPr>
+              <w:spacing w:after="0"/>
+            </w:pPr>
+            <w:r>
+              <w:rPr>
+                <w:b w:val="0"/>
+                <w:sz w:val="19"/>
+              </w:rPr>
+              <w:t>Access token assente, scaduto o non valido su un'API protetta.</w:t>
+            </w:r>
+          </w:p>
+        </w:tc>
+      </w:tr>
+      <w:tr>
+        <w:trPr>
+          <w:cantSplit w:val="true"/>
+        </w:trPr>
+        <w:tc>
+          <w:tcPr>
+            <w:tcW w:type="dxa" w:w="3288"/>
+          </w:tcPr>
+          <w:p>
+            <w:pPr>
+              <w:spacing w:after="0"/>
+            </w:pPr>
+            <w:r>
+              <w:rPr>
+                <w:rFonts w:ascii="Consolas" w:hAnsi="Consolas"/>
+                <w:b w:val="0"/>
+                <w:color w:val="233C7D"/>
+                <w:sz w:val="19"/>
+              </w:rPr>
+              <w:t>auth.session_expired</w:t>
+            </w:r>
+          </w:p>
+        </w:tc>
+        <w:tc>
+          <w:tcPr>
+            <w:tcW w:type="dxa" w:w="1928"/>
+          </w:tcPr>
+          <w:p>
+            <w:pPr>
+              <w:spacing w:after="0"/>
+            </w:pPr>
+            <w:r>
+              <w:rPr>
+                <w:b w:val="0"/>
+                <w:sz w:val="19"/>
+              </w:rPr>
+              <w:t>401</w:t>
+            </w:r>
+          </w:p>
+        </w:tc>
+        <w:tc>
+          <w:tcPr>
+            <w:tcW w:type="dxa" w:w="4649"/>
+          </w:tcPr>
+          <w:p>
+            <w:pPr>
+              <w:spacing w:after="0"/>
+            </w:pPr>
+            <w:r>
+              <w:rPr>
+                <w:b w:val="0"/>
+                <w:sz w:val="19"/>
+              </w:rPr>
+              <w:t>Nessuna sessione valida: cookie del refresh token assente, scaduto o revocato (refresh, logout).</w:t>
+            </w:r>
+          </w:p>
+        </w:tc>
+      </w:tr>
+      <w:tr>
+        <w:trPr>
+          <w:cantSplit w:val="true"/>
+        </w:trPr>
+        <w:tc>
+          <w:tcPr>
+            <w:tcW w:type="dxa" w:w="3288"/>
+            <w:shd w:val="clear" w:color="auto" w:fill="F1F3F8"/>
+          </w:tcPr>
+          <w:p>
+            <w:pPr>
+              <w:spacing w:after="0"/>
+            </w:pPr>
+            <w:r>
+              <w:rPr>
+                <w:rFonts w:ascii="Consolas" w:hAnsi="Consolas"/>
+                <w:b w:val="0"/>
+                <w:color w:val="233C7D"/>
+                <w:sz w:val="19"/>
+              </w:rPr>
+              <w:t>validation.invalid_request</w:t>
+            </w:r>
+          </w:p>
+        </w:tc>
+        <w:tc>
+          <w:tcPr>
+            <w:tcW w:type="dxa" w:w="1928"/>
+            <w:shd w:val="clear" w:color="auto" w:fill="F1F3F8"/>
+          </w:tcPr>
+          <w:p>
+            <w:pPr>
+              <w:spacing w:after="0"/>
+            </w:pPr>
+            <w:r>
+              <w:rPr>
+                <w:b w:val="0"/>
+                <w:sz w:val="19"/>
+              </w:rPr>
+              <w:t>400</w:t>
+            </w:r>
+          </w:p>
+        </w:tc>
+        <w:tc>
+          <w:tcPr>
+            <w:tcW w:type="dxa" w:w="4649"/>
+            <w:shd w:val="clear" w:color="auto" w:fill="F1F3F8"/>
+          </w:tcPr>
+          <w:p>
+            <w:pPr>
+              <w:spacing w:after="0"/>
+            </w:pPr>
+            <w:r>
+              <w:rPr>
+                <w:b w:val="0"/>
+                <w:sz w:val="19"/>
+              </w:rPr>
+              <w:t>Corpo della richiesta non valido; il dettaglio per campo è in errors[].</w:t>
+            </w:r>
+          </w:p>
+        </w:tc>
+      </w:tr>
+      <w:tr>
+        <w:trPr>
+          <w:cantSplit w:val="true"/>
+        </w:trPr>
+        <w:tc>
+          <w:tcPr>
+            <w:tcW w:type="dxa" w:w="3288"/>
+          </w:tcPr>
+          <w:p>
+            <w:pPr>
+              <w:spacing w:after="0"/>
+            </w:pPr>
+            <w:r>
+              <w:rPr>
+                <w:rFonts w:ascii="Consolas" w:hAnsi="Consolas"/>
+                <w:b w:val="0"/>
+                <w:color w:val="233C7D"/>
+                <w:sz w:val="19"/>
+              </w:rPr>
+              <w:t>validation.invalid_date</w:t>
+            </w:r>
+          </w:p>
+        </w:tc>
+        <w:tc>
+          <w:tcPr>
+            <w:tcW w:type="dxa" w:w="1928"/>
+          </w:tcPr>
+          <w:p>
+            <w:pPr>
+              <w:spacing w:after="0"/>
+            </w:pPr>
+            <w:r>
+              <w:rPr>
+                <w:b w:val="0"/>
+                <w:sz w:val="19"/>
+              </w:rPr>
+              <w:t>400 (in errors[])</w:t>
+            </w:r>
+          </w:p>
+        </w:tc>
+        <w:tc>
+          <w:tcPr>
+            <w:tcW w:type="dxa" w:w="4649"/>
+          </w:tcPr>
+          <w:p>
+            <w:pPr>
+              <w:spacing w:after="0"/>
+            </w:pPr>
+            <w:r>
+              <w:rPr>
+                <w:b w:val="0"/>
+                <w:sz w:val="19"/>
+              </w:rPr>
+              <w:t>Data assente o non leggibile come ISO 8601.</w:t>
+            </w:r>
+          </w:p>
+        </w:tc>
+      </w:tr>
+      <w:tr>
+        <w:trPr>
+          <w:cantSplit w:val="true"/>
+        </w:trPr>
+        <w:tc>
+          <w:tcPr>
+            <w:tcW w:type="dxa" w:w="3288"/>
+            <w:shd w:val="clear" w:color="auto" w:fill="F1F3F8"/>
+          </w:tcPr>
+          <w:p>
+            <w:pPr>
+              <w:spacing w:after="0"/>
+            </w:pPr>
+            <w:r>
+              <w:rPr>
+                <w:rFonts w:ascii="Consolas" w:hAnsi="Consolas"/>
+                <w:b w:val="0"/>
+                <w:color w:val="233C7D"/>
+                <w:sz w:val="19"/>
+              </w:rPr>
+              <w:t>validation.end_before_start</w:t>
+            </w:r>
+          </w:p>
+        </w:tc>
+        <w:tc>
+          <w:tcPr>
+            <w:tcW w:type="dxa" w:w="1928"/>
+            <w:shd w:val="clear" w:color="auto" w:fill="F1F3F8"/>
+          </w:tcPr>
+          <w:p>
+            <w:pPr>
+              <w:spacing w:after="0"/>
+            </w:pPr>
+            <w:r>
+              <w:rPr>
+                <w:b w:val="0"/>
+                <w:sz w:val="19"/>
+              </w:rPr>
+              <w:t>400 (in errors[])</w:t>
+            </w:r>
+          </w:p>
+        </w:tc>
+        <w:tc>
+          <w:tcPr>
+            <w:tcW w:type="dxa" w:w="4649"/>
+            <w:shd w:val="clear" w:color="auto" w:fill="F1F3F8"/>
+          </w:tcPr>
+          <w:p>
+            <w:pPr>
+              <w:spacing w:after="0"/>
+            </w:pPr>
+            <w:r>
+              <w:rPr>
+                <w:b w:val="0"/>
+                <w:sz w:val="19"/>
+              </w:rPr>
+              <w:t>La data di fine viene prima di quella di inizio.</w:t>
+            </w:r>
+          </w:p>
+        </w:tc>
+      </w:tr>
+      <w:tr>
+        <w:trPr>
+          <w:cantSplit w:val="true"/>
+        </w:trPr>
+        <w:tc>
+          <w:tcPr>
+            <w:tcW w:type="dxa" w:w="3288"/>
+          </w:tcPr>
+          <w:p>
+            <w:pPr>
+              <w:spacing w:after="0"/>
+            </w:pPr>
+            <w:r>
+              <w:rPr>
+                <w:rFonts w:ascii="Consolas" w:hAnsi="Consolas"/>
+                <w:b w:val="0"/>
+                <w:color w:val="233C7D"/>
+                <w:sz w:val="19"/>
+              </w:rPr>
+              <w:t>validation.invalid_value</w:t>
+            </w:r>
+          </w:p>
+        </w:tc>
+        <w:tc>
+          <w:tcPr>
+            <w:tcW w:type="dxa" w:w="1928"/>
+          </w:tcPr>
+          <w:p>
+            <w:pPr>
+              <w:spacing w:after="0"/>
+            </w:pPr>
+            <w:r>
+              <w:rPr>
+                <w:b w:val="0"/>
+                <w:sz w:val="19"/>
+              </w:rPr>
+              <w:t>400 (in errors[])</w:t>
+            </w:r>
+          </w:p>
+        </w:tc>
+        <w:tc>
+          <w:tcPr>
+            <w:tcW w:type="dxa" w:w="4649"/>
+          </w:tcPr>
+          <w:p>
+            <w:pPr>
+              <w:spacing w:after="0"/>
+            </w:pPr>
+            <w:r>
+              <w:rPr>
+                <w:b w:val="0"/>
+                <w:sz w:val="19"/>
+              </w:rPr>
+              <w:t>Valore non ammesso o assente (es. un bookingDayType inesistente, un idProperty mancante, un articolo che non è dello stabilimento, l'avviso di soglia acceso senza soglia maggiore di 0).</w:t>
             </w:r>
           </w:p>
         </w:tc>

</xml_diff>

<commit_message>
Added contact support page
</commit_message>
<xml_diff>
--- a/frontend/summer-booking-front-office/docs/API_CONTRACTS.docx
+++ b/frontend/summer-booking-front-office/docs/API_CONTRACTS.docx
@@ -20,7 +20,7 @@
     </w:p>
     <w:p>
       <w:r>
-        <w:t>Aggiornato al 05/10/2026 (nuova API warehouse/duplicate-warehouse-item, stessa forma dell'eliminazione, nomi delle copie scelti dal backend; nuova API warehouse/delete-warehouse-item, un solo id o più id insieme, tutto o niente; in warehouse/list i campi delle quantità finiscono con Quantity: totalQuantity, availableQuantity e thresholdQuantity, prima total, available e thresholdNumber; nuova API warehouse/edit-warehouse-item per il popup "Modifica articolo" e, in warehouse/list, nuovo campo isThresholdWarningActive; quantità sempre maggiore di 0; nuova API warehouse/add-warehouse-item per il bottone Aggiungi del popup "Aggiungi articolo"; nuova API warehouse/combobox-list per la tendina degli articoli; in warehouse/list availableQuantity e thresholdQuantity sempre presenti). Prima, il 01/10/2026 (errori: formato Problem Details con code, errori possibili per API e catalogo dei codici; header Accept-Language; formato dei valori in args). Oggi tutte le API sono simulate dai mock del frontend (services/mocks).</w:t>
+        <w:t>Aggiornato al 05/10/2026 (nuova API system/contact-support per il form della pagina Assistenza e guide; nuova API warehouse/duplicate-warehouse-item, stessa forma dell'eliminazione, nomi delle copie scelti dal backend; nuova API warehouse/delete-warehouse-item, un solo id o più id insieme, tutto o niente; in warehouse/list i campi delle quantità finiscono con Quantity: totalQuantity, availableQuantity e thresholdQuantity, prima total, available e thresholdNumber; nuova API warehouse/edit-warehouse-item per il popup "Modifica articolo" e, in warehouse/list, nuovo campo isThresholdWarningActive; quantità sempre maggiore di 0; nuova API warehouse/add-warehouse-item per il bottone Aggiungi del popup "Aggiungi articolo"; nuova API warehouse/combobox-list per la tendina degli articoli; in warehouse/list availableQuantity e thresholdQuantity sempre presenti). Prima, il 01/10/2026 (errori: formato Problem Details con code, errori possibili per API e catalogo dei codici; header Accept-Language; formato dei valori in args). Oggi tutte le API sono simulate dai mock del frontend (services/mocks).</w:t>
       </w:r>
     </w:p>
     <w:p>
@@ -2471,6 +2471,69 @@
           </w:p>
         </w:tc>
       </w:tr>
+      <w:tr>
+        <w:trPr>
+          <w:cantSplit w:val="true"/>
+        </w:trPr>
+        <w:tc>
+          <w:tcPr>
+            <w:tcW w:type="dxa" w:w="2381"/>
+            <w:shd w:val="clear" w:color="auto" w:fill="F1F3F8"/>
+          </w:tcPr>
+          <w:p>
+            <w:pPr>
+              <w:spacing w:after="0"/>
+            </w:pPr>
+            <w:r>
+              <w:rPr>
+                <w:rFonts w:ascii="Consolas" w:hAnsi="Consolas"/>
+                <w:b w:val="0"/>
+                <w:color w:val="233C7D"/>
+                <w:sz w:val="19"/>
+              </w:rPr>
+              <w:t>POST</w:t>
+            </w:r>
+          </w:p>
+        </w:tc>
+        <w:tc>
+          <w:tcPr>
+            <w:tcW w:type="dxa" w:w="2608"/>
+            <w:shd w:val="clear" w:color="auto" w:fill="F1F3F8"/>
+          </w:tcPr>
+          <w:p>
+            <w:pPr>
+              <w:spacing w:after="0"/>
+            </w:pPr>
+            <w:r>
+              <w:rPr>
+                <w:rFonts w:ascii="Consolas" w:hAnsi="Consolas"/>
+                <w:b w:val="0"/>
+                <w:color w:val="233C7D"/>
+                <w:sz w:val="19"/>
+              </w:rPr>
+              <w:t>/api/system/contact-support</w:t>
+            </w:r>
+          </w:p>
+        </w:tc>
+        <w:tc>
+          <w:tcPr>
+            <w:tcW w:type="dxa" w:w="4876"/>
+            <w:shd w:val="clear" w:color="auto" w:fill="F1F3F8"/>
+          </w:tcPr>
+          <w:p>
+            <w:pPr>
+              <w:spacing w:after="0"/>
+            </w:pPr>
+            <w:r>
+              <w:rPr>
+                <w:b w:val="0"/>
+                <w:sz w:val="19"/>
+              </w:rPr>
+              <w:t>Assistenza: messaggio al supporto</w:t>
+            </w:r>
+          </w:p>
+        </w:tc>
+      </w:tr>
     </w:tbl>
     <w:p>
       <w:pPr>
@@ -15402,6 +15465,1298 @@
           <w:sz w:val="19"/>
         </w:rPr>
         <w:t xml:space="preserve">      "field": "idItems",</w:t>
+      </w:r>
+    </w:p>
+    <w:p>
+      <w:pPr>
+        <w:keepNext/>
+        <w:spacing w:after="0"/>
+        <w:shd w:val="clear" w:color="auto" w:fill="F1F3F8"/>
+      </w:pPr>
+      <w:r>
+        <w:rPr>
+          <w:rFonts w:ascii="Consolas" w:hAnsi="Consolas"/>
+          <w:b w:val="0"/>
+          <w:color w:val="233C7D"/>
+          <w:sz w:val="19"/>
+        </w:rPr>
+        <w:t xml:space="preserve">      "code": "validation.invalid_value"</w:t>
+      </w:r>
+    </w:p>
+    <w:p>
+      <w:pPr>
+        <w:keepNext/>
+        <w:spacing w:after="0"/>
+        <w:shd w:val="clear" w:color="auto" w:fill="F1F3F8"/>
+      </w:pPr>
+      <w:r>
+        <w:rPr>
+          <w:rFonts w:ascii="Consolas" w:hAnsi="Consolas"/>
+          <w:b w:val="0"/>
+          <w:color w:val="233C7D"/>
+          <w:sz w:val="19"/>
+        </w:rPr>
+        <w:t xml:space="preserve">    }</w:t>
+      </w:r>
+    </w:p>
+    <w:p>
+      <w:pPr>
+        <w:keepNext/>
+        <w:spacing w:after="0"/>
+        <w:shd w:val="clear" w:color="auto" w:fill="F1F3F8"/>
+      </w:pPr>
+      <w:r>
+        <w:rPr>
+          <w:rFonts w:ascii="Consolas" w:hAnsi="Consolas"/>
+          <w:b w:val="0"/>
+          <w:color w:val="233C7D"/>
+          <w:sz w:val="19"/>
+        </w:rPr>
+        <w:t xml:space="preserve">  ],</w:t>
+      </w:r>
+    </w:p>
+    <w:p>
+      <w:pPr>
+        <w:keepNext/>
+        <w:spacing w:after="0"/>
+        <w:shd w:val="clear" w:color="auto" w:fill="F1F3F8"/>
+      </w:pPr>
+      <w:r>
+        <w:rPr>
+          <w:rFonts w:ascii="Consolas" w:hAnsi="Consolas"/>
+          <w:b w:val="0"/>
+          <w:color w:val="233C7D"/>
+          <w:sz w:val="19"/>
+        </w:rPr>
+        <w:t xml:space="preserve">  "traceId": "00-4bf92f3577b34da6a3ce929d0e0e4736-00f067aa0ba902b7-01"</w:t>
+      </w:r>
+    </w:p>
+    <w:p>
+      <w:pPr>
+        <w:keepNext w:val="0"/>
+        <w:spacing w:after="120"/>
+        <w:shd w:val="clear" w:color="auto" w:fill="F1F3F8"/>
+      </w:pPr>
+      <w:r>
+        <w:rPr>
+          <w:rFonts w:ascii="Consolas" w:hAnsi="Consolas"/>
+          <w:b w:val="0"/>
+          <w:color w:val="233C7D"/>
+          <w:sz w:val="19"/>
+        </w:rPr>
+        <w:t>}</w:t>
+      </w:r>
+    </w:p>
+    <w:p>
+      <w:pPr>
+        <w:pStyle w:val="Heading1"/>
+        <w:pageBreakBefore/>
+      </w:pPr>
+      <w:r>
+        <w:rPr>
+          <w:b w:val="0"/>
+        </w:rPr>
+        <w:t xml:space="preserve">POST </w:t>
+      </w:r>
+      <w:r>
+        <w:rPr>
+          <w:rFonts w:ascii="Consolas" w:hAnsi="Consolas"/>
+          <w:b w:val="0"/>
+        </w:rPr>
+        <w:t>/api/system/contact-support</w:t>
+      </w:r>
+    </w:p>
+    <w:p>
+      <w:r>
+        <w:t>Assistenza: messaggio al supporto</w:t>
+      </w:r>
+    </w:p>
+    <w:p>
+      <w:pPr>
+        <w:spacing w:after="40"/>
+      </w:pPr>
+      <w:r>
+        <w:rPr>
+          <w:b/>
+        </w:rPr>
+        <w:t xml:space="preserve">Metodo: </w:t>
+      </w:r>
+      <w:r>
+        <w:rPr>
+          <w:rFonts w:ascii="Consolas" w:hAnsi="Consolas"/>
+          <w:b w:val="0"/>
+          <w:color w:val="233C7D"/>
+        </w:rPr>
+        <w:t>POST</w:t>
+      </w:r>
+    </w:p>
+    <w:p>
+      <w:pPr>
+        <w:spacing w:after="40"/>
+      </w:pPr>
+      <w:r>
+        <w:rPr>
+          <w:b/>
+        </w:rPr>
+        <w:t xml:space="preserve">Route: </w:t>
+      </w:r>
+      <w:r>
+        <w:rPr>
+          <w:rFonts w:ascii="Consolas" w:hAnsi="Consolas"/>
+          <w:b w:val="0"/>
+          <w:color w:val="233C7D"/>
+        </w:rPr>
+        <w:t>/api/system/contact-support</w:t>
+      </w:r>
+    </w:p>
+    <w:p>
+      <w:pPr>
+        <w:spacing w:after="40"/>
+      </w:pPr>
+      <w:r>
+        <w:rPr>
+          <w:b/>
+        </w:rPr>
+        <w:t xml:space="preserve">Nel frontend: </w:t>
+      </w:r>
+      <w:r>
+        <w:rPr>
+          <w:rFonts w:ascii="Consolas" w:hAnsi="Consolas"/>
+          <w:b w:val="0"/>
+          <w:color w:val="233C7D"/>
+        </w:rPr>
+        <w:t>SystemService.contactSupport</w:t>
+      </w:r>
+    </w:p>
+    <w:p>
+      <w:pPr>
+        <w:spacing w:after="40"/>
+      </w:pPr>
+      <w:r>
+        <w:rPr>
+          <w:b/>
+        </w:rPr>
+        <w:t xml:space="preserve">Autenticazione: </w:t>
+      </w:r>
+      <w:r>
+        <w:rPr>
+          <w:b w:val="0"/>
+        </w:rPr>
+        <w:t>Header Authorization: Bearer &lt;accessToken&gt;.</w:t>
+      </w:r>
+    </w:p>
+    <w:p>
+      <w:pPr>
+        <w:pStyle w:val="ListBullet"/>
+      </w:pPr>
+      <w:r>
+        <w:t>La chiama il bottone "Invia messaggio" del form "Contattaci" della pagina Assistenza e guide (/settings/contact-support).</w:t>
+      </w:r>
+    </w:p>
+    <w:p>
+      <w:pPr>
+        <w:pStyle w:val="ListBullet"/>
+      </w:pPr>
+      <w:r>
+        <w:t>Il backend invia il messaggio all'assistenza (email o altro canale): il frontend non sa come.</w:t>
+      </w:r>
+    </w:p>
+    <w:p>
+      <w:pPr>
+        <w:pStyle w:val="ListBullet"/>
+      </w:pPr>
+      <w:r>
+        <w:t>Nome, cognome, email e messaggio sono obbligatori, il cellulare no. Il backend deve ricontrollare tutto: lunghezze massime, formato dell'email, e trattare i testi come dati (mai come HTML o intestazioni della mail).</w:t>
+      </w:r>
+    </w:p>
+    <w:p>
+      <w:pPr>
+        <w:pStyle w:val="ListBullet"/>
+      </w:pPr>
+      <w:r>
+        <w:t>Se la chiamata riesce, il form si svuota e compare il popup "Messaggio inviato con successo"; se fallisce, i dati restano e compare il messaggio del code.</w:t>
+      </w:r>
+    </w:p>
+    <w:p>
+      <w:pPr>
+        <w:pStyle w:val="ListBullet"/>
+      </w:pPr>
+      <w:r>
+        <w:t>Metodo POST e risposta 204 senza corpo sono una proposta del frontend, da confermare col backend.</w:t>
+      </w:r>
+    </w:p>
+    <w:p>
+      <w:pPr>
+        <w:pStyle w:val="Heading2"/>
+      </w:pPr>
+      <w:r>
+        <w:t>Payload inviato al backend</w:t>
+      </w:r>
+    </w:p>
+    <w:p>
+      <w:pPr>
+        <w:pStyle w:val="Heading3"/>
+      </w:pPr>
+      <w:r>
+        <w:rPr>
+          <w:b w:val="0"/>
+        </w:rPr>
+        <w:t xml:space="preserve">Corpo JSON: </w:t>
+      </w:r>
+      <w:r>
+        <w:rPr>
+          <w:rFonts w:ascii="Consolas" w:hAnsi="Consolas"/>
+          <w:b w:val="0"/>
+        </w:rPr>
+        <w:t>ContactSupportRequest</w:t>
+      </w:r>
+    </w:p>
+    <w:tbl>
+      <w:tblPr>
+        <w:tblW w:type="auto" w:w="0"/>
+        <w:jc w:val="center"/>
+        <w:tblLayout w:type="fixed"/>
+        <w:tblLook w:firstColumn="1" w:firstRow="1" w:lastColumn="0" w:lastRow="0" w:noHBand="0" w:noVBand="1" w:val="04A0"/>
+        <w:tblBorders>
+          <w:top w:val="single" w:sz="4" w:color="C9CED8"/>
+          <w:left w:val="single" w:sz="4" w:color="C9CED8"/>
+          <w:bottom w:val="single" w:sz="4" w:color="C9CED8"/>
+          <w:right w:val="single" w:sz="4" w:color="C9CED8"/>
+          <w:insideH w:val="single" w:sz="4" w:color="C9CED8"/>
+          <w:insideV w:val="single" w:sz="4" w:color="C9CED8"/>
+        </w:tblBorders>
+      </w:tblPr>
+      <w:tblGrid>
+        <w:gridCol w:w="3289"/>
+        <w:gridCol w:w="3289"/>
+        <w:gridCol w:w="3289"/>
+      </w:tblGrid>
+      <w:tr>
+        <w:trPr>
+          <w:cantSplit w:val="true"/>
+          <w:tblHeader w:val="true"/>
+        </w:trPr>
+        <w:tc>
+          <w:tcPr>
+            <w:tcW w:type="dxa" w:w="2381"/>
+            <w:shd w:val="clear" w:color="auto" w:fill="233C7D"/>
+          </w:tcPr>
+          <w:p>
+            <w:pPr>
+              <w:spacing w:after="0"/>
+            </w:pPr>
+            <w:r>
+              <w:rPr>
+                <w:b/>
+                <w:color w:val="FFFFFF"/>
+                <w:sz w:val="20"/>
+              </w:rPr>
+              <w:t>Parametro</w:t>
+            </w:r>
+          </w:p>
+        </w:tc>
+        <w:tc>
+          <w:tcPr>
+            <w:tcW w:type="dxa" w:w="2608"/>
+            <w:shd w:val="clear" w:color="auto" w:fill="233C7D"/>
+          </w:tcPr>
+          <w:p>
+            <w:pPr>
+              <w:spacing w:after="0"/>
+            </w:pPr>
+            <w:r>
+              <w:rPr>
+                <w:b/>
+                <w:color w:val="FFFFFF"/>
+                <w:sz w:val="20"/>
+              </w:rPr>
+              <w:t>Tipo</w:t>
+            </w:r>
+          </w:p>
+        </w:tc>
+        <w:tc>
+          <w:tcPr>
+            <w:tcW w:type="dxa" w:w="4876"/>
+            <w:shd w:val="clear" w:color="auto" w:fill="233C7D"/>
+          </w:tcPr>
+          <w:p>
+            <w:pPr>
+              <w:spacing w:after="0"/>
+            </w:pPr>
+            <w:r>
+              <w:rPr>
+                <w:b/>
+                <w:color w:val="FFFFFF"/>
+                <w:sz w:val="20"/>
+              </w:rPr>
+              <w:t>Descrizione</w:t>
+            </w:r>
+          </w:p>
+        </w:tc>
+      </w:tr>
+      <w:tr>
+        <w:trPr>
+          <w:cantSplit w:val="true"/>
+        </w:trPr>
+        <w:tc>
+          <w:tcPr>
+            <w:tcW w:type="dxa" w:w="2381"/>
+          </w:tcPr>
+          <w:p>
+            <w:pPr>
+              <w:spacing w:after="0"/>
+            </w:pPr>
+            <w:r>
+              <w:rPr>
+                <w:rFonts w:ascii="Consolas" w:hAnsi="Consolas"/>
+                <w:b w:val="0"/>
+                <w:color w:val="233C7D"/>
+                <w:sz w:val="19"/>
+              </w:rPr>
+              <w:t>idProperty</w:t>
+            </w:r>
+          </w:p>
+        </w:tc>
+        <w:tc>
+          <w:tcPr>
+            <w:tcW w:type="dxa" w:w="2608"/>
+          </w:tcPr>
+          <w:p>
+            <w:pPr>
+              <w:spacing w:after="0"/>
+            </w:pPr>
+            <w:r>
+              <w:rPr>
+                <w:rFonts w:ascii="Consolas" w:hAnsi="Consolas"/>
+                <w:b w:val="0"/>
+                <w:color w:val="233C7D"/>
+                <w:sz w:val="19"/>
+              </w:rPr>
+              <w:t>string (UUID)</w:t>
+            </w:r>
+          </w:p>
+        </w:tc>
+        <w:tc>
+          <w:tcPr>
+            <w:tcW w:type="dxa" w:w="4876"/>
+          </w:tcPr>
+          <w:p>
+            <w:pPr>
+              <w:spacing w:after="0"/>
+            </w:pPr>
+            <w:r>
+              <w:rPr>
+                <w:b w:val="0"/>
+                <w:sz w:val="19"/>
+              </w:rPr>
+              <w:t>Stabilimento dell'utente (da AuthUser.idProperty).</w:t>
+            </w:r>
+          </w:p>
+        </w:tc>
+      </w:tr>
+      <w:tr>
+        <w:trPr>
+          <w:cantSplit w:val="true"/>
+        </w:trPr>
+        <w:tc>
+          <w:tcPr>
+            <w:tcW w:type="dxa" w:w="2381"/>
+            <w:shd w:val="clear" w:color="auto" w:fill="F1F3F8"/>
+          </w:tcPr>
+          <w:p>
+            <w:pPr>
+              <w:spacing w:after="0"/>
+            </w:pPr>
+            <w:r>
+              <w:rPr>
+                <w:rFonts w:ascii="Consolas" w:hAnsi="Consolas"/>
+                <w:b w:val="0"/>
+                <w:color w:val="233C7D"/>
+                <w:sz w:val="19"/>
+              </w:rPr>
+              <w:t>firstName</w:t>
+            </w:r>
+          </w:p>
+        </w:tc>
+        <w:tc>
+          <w:tcPr>
+            <w:tcW w:type="dxa" w:w="2608"/>
+            <w:shd w:val="clear" w:color="auto" w:fill="F1F3F8"/>
+          </w:tcPr>
+          <w:p>
+            <w:pPr>
+              <w:spacing w:after="0"/>
+            </w:pPr>
+            <w:r>
+              <w:rPr>
+                <w:rFonts w:ascii="Consolas" w:hAnsi="Consolas"/>
+                <w:b w:val="0"/>
+                <w:color w:val="233C7D"/>
+                <w:sz w:val="19"/>
+              </w:rPr>
+              <w:t>string</w:t>
+            </w:r>
+          </w:p>
+        </w:tc>
+        <w:tc>
+          <w:tcPr>
+            <w:tcW w:type="dxa" w:w="4876"/>
+            <w:shd w:val="clear" w:color="auto" w:fill="F1F3F8"/>
+          </w:tcPr>
+          <w:p>
+            <w:pPr>
+              <w:spacing w:after="0"/>
+            </w:pPr>
+            <w:r>
+              <w:rPr>
+                <w:b w:val="0"/>
+                <w:sz w:val="19"/>
+              </w:rPr>
+              <w:t>Nome, obbligatorio. Il frontend toglie gli spazi ai lati.</w:t>
+            </w:r>
+          </w:p>
+        </w:tc>
+      </w:tr>
+      <w:tr>
+        <w:trPr>
+          <w:cantSplit w:val="true"/>
+        </w:trPr>
+        <w:tc>
+          <w:tcPr>
+            <w:tcW w:type="dxa" w:w="2381"/>
+          </w:tcPr>
+          <w:p>
+            <w:pPr>
+              <w:spacing w:after="0"/>
+            </w:pPr>
+            <w:r>
+              <w:rPr>
+                <w:rFonts w:ascii="Consolas" w:hAnsi="Consolas"/>
+                <w:b w:val="0"/>
+                <w:color w:val="233C7D"/>
+                <w:sz w:val="19"/>
+              </w:rPr>
+              <w:t>lastName</w:t>
+            </w:r>
+          </w:p>
+        </w:tc>
+        <w:tc>
+          <w:tcPr>
+            <w:tcW w:type="dxa" w:w="2608"/>
+          </w:tcPr>
+          <w:p>
+            <w:pPr>
+              <w:spacing w:after="0"/>
+            </w:pPr>
+            <w:r>
+              <w:rPr>
+                <w:rFonts w:ascii="Consolas" w:hAnsi="Consolas"/>
+                <w:b w:val="0"/>
+                <w:color w:val="233C7D"/>
+                <w:sz w:val="19"/>
+              </w:rPr>
+              <w:t>string</w:t>
+            </w:r>
+          </w:p>
+        </w:tc>
+        <w:tc>
+          <w:tcPr>
+            <w:tcW w:type="dxa" w:w="4876"/>
+          </w:tcPr>
+          <w:p>
+            <w:pPr>
+              <w:spacing w:after="0"/>
+            </w:pPr>
+            <w:r>
+              <w:rPr>
+                <w:b w:val="0"/>
+                <w:sz w:val="19"/>
+              </w:rPr>
+              <w:t>Cognome, obbligatorio.</w:t>
+            </w:r>
+          </w:p>
+        </w:tc>
+      </w:tr>
+      <w:tr>
+        <w:trPr>
+          <w:cantSplit w:val="true"/>
+        </w:trPr>
+        <w:tc>
+          <w:tcPr>
+            <w:tcW w:type="dxa" w:w="2381"/>
+            <w:shd w:val="clear" w:color="auto" w:fill="F1F3F8"/>
+          </w:tcPr>
+          <w:p>
+            <w:pPr>
+              <w:spacing w:after="0"/>
+            </w:pPr>
+            <w:r>
+              <w:rPr>
+                <w:rFonts w:ascii="Consolas" w:hAnsi="Consolas"/>
+                <w:b w:val="0"/>
+                <w:color w:val="233C7D"/>
+                <w:sz w:val="19"/>
+              </w:rPr>
+              <w:t>email</w:t>
+            </w:r>
+          </w:p>
+        </w:tc>
+        <w:tc>
+          <w:tcPr>
+            <w:tcW w:type="dxa" w:w="2608"/>
+            <w:shd w:val="clear" w:color="auto" w:fill="F1F3F8"/>
+          </w:tcPr>
+          <w:p>
+            <w:pPr>
+              <w:spacing w:after="0"/>
+            </w:pPr>
+            <w:r>
+              <w:rPr>
+                <w:rFonts w:ascii="Consolas" w:hAnsi="Consolas"/>
+                <w:b w:val="0"/>
+                <w:color w:val="233C7D"/>
+                <w:sz w:val="19"/>
+              </w:rPr>
+              <w:t>string</w:t>
+            </w:r>
+          </w:p>
+        </w:tc>
+        <w:tc>
+          <w:tcPr>
+            <w:tcW w:type="dxa" w:w="4876"/>
+            <w:shd w:val="clear" w:color="auto" w:fill="F1F3F8"/>
+          </w:tcPr>
+          <w:p>
+            <w:pPr>
+              <w:spacing w:after="0"/>
+            </w:pPr>
+            <w:r>
+              <w:rPr>
+                <w:b w:val="0"/>
+                <w:sz w:val="19"/>
+              </w:rPr>
+              <w:t>Email a cui rispondere, obbligatoria. Il frontend non ne controlla il formato.</w:t>
+            </w:r>
+          </w:p>
+        </w:tc>
+      </w:tr>
+      <w:tr>
+        <w:trPr>
+          <w:cantSplit w:val="true"/>
+        </w:trPr>
+        <w:tc>
+          <w:tcPr>
+            <w:tcW w:type="dxa" w:w="2381"/>
+          </w:tcPr>
+          <w:p>
+            <w:pPr>
+              <w:spacing w:after="0"/>
+            </w:pPr>
+            <w:r>
+              <w:rPr>
+                <w:rFonts w:ascii="Consolas" w:hAnsi="Consolas"/>
+                <w:b w:val="0"/>
+                <w:color w:val="233C7D"/>
+                <w:sz w:val="19"/>
+              </w:rPr>
+              <w:t>mobilePhone</w:t>
+            </w:r>
+          </w:p>
+        </w:tc>
+        <w:tc>
+          <w:tcPr>
+            <w:tcW w:type="dxa" w:w="2608"/>
+          </w:tcPr>
+          <w:p>
+            <w:pPr>
+              <w:spacing w:after="0"/>
+            </w:pPr>
+            <w:r>
+              <w:rPr>
+                <w:rFonts w:ascii="Consolas" w:hAnsi="Consolas"/>
+                <w:b w:val="0"/>
+                <w:color w:val="233C7D"/>
+                <w:sz w:val="19"/>
+              </w:rPr>
+              <w:t>string | null</w:t>
+            </w:r>
+          </w:p>
+        </w:tc>
+        <w:tc>
+          <w:tcPr>
+            <w:tcW w:type="dxa" w:w="4876"/>
+          </w:tcPr>
+          <w:p>
+            <w:pPr>
+              <w:spacing w:after="0"/>
+            </w:pPr>
+            <w:r>
+              <w:rPr>
+                <w:b w:val="0"/>
+                <w:sz w:val="19"/>
+              </w:rPr>
+              <w:t>Cellulare, facoltativo: null se non indicato. Testo libero (non un numero).</w:t>
+            </w:r>
+          </w:p>
+        </w:tc>
+      </w:tr>
+      <w:tr>
+        <w:trPr>
+          <w:cantSplit w:val="true"/>
+        </w:trPr>
+        <w:tc>
+          <w:tcPr>
+            <w:tcW w:type="dxa" w:w="2381"/>
+            <w:shd w:val="clear" w:color="auto" w:fill="F1F3F8"/>
+          </w:tcPr>
+          <w:p>
+            <w:pPr>
+              <w:spacing w:after="0"/>
+            </w:pPr>
+            <w:r>
+              <w:rPr>
+                <w:rFonts w:ascii="Consolas" w:hAnsi="Consolas"/>
+                <w:b w:val="0"/>
+                <w:color w:val="233C7D"/>
+                <w:sz w:val="19"/>
+              </w:rPr>
+              <w:t>message</w:t>
+            </w:r>
+          </w:p>
+        </w:tc>
+        <w:tc>
+          <w:tcPr>
+            <w:tcW w:type="dxa" w:w="2608"/>
+            <w:shd w:val="clear" w:color="auto" w:fill="F1F3F8"/>
+          </w:tcPr>
+          <w:p>
+            <w:pPr>
+              <w:spacing w:after="0"/>
+            </w:pPr>
+            <w:r>
+              <w:rPr>
+                <w:rFonts w:ascii="Consolas" w:hAnsi="Consolas"/>
+                <w:b w:val="0"/>
+                <w:color w:val="233C7D"/>
+                <w:sz w:val="19"/>
+              </w:rPr>
+              <w:t>string</w:t>
+            </w:r>
+          </w:p>
+        </w:tc>
+        <w:tc>
+          <w:tcPr>
+            <w:tcW w:type="dxa" w:w="4876"/>
+            <w:shd w:val="clear" w:color="auto" w:fill="F1F3F8"/>
+          </w:tcPr>
+          <w:p>
+            <w:pPr>
+              <w:spacing w:after="0"/>
+            </w:pPr>
+            <w:r>
+              <w:rPr>
+                <w:b w:val="0"/>
+                <w:sz w:val="19"/>
+              </w:rPr>
+              <w:t>Testo del messaggio, obbligatorio.</w:t>
+            </w:r>
+          </w:p>
+        </w:tc>
+      </w:tr>
+    </w:tbl>
+    <w:p>
+      <w:pPr>
+        <w:spacing w:after="40"/>
+      </w:pPr>
+    </w:p>
+    <w:p>
+      <w:pPr>
+        <w:pStyle w:val="Heading3"/>
+      </w:pPr>
+      <w:r>
+        <w:t>Esempio di richiesta (JSON)</w:t>
+      </w:r>
+    </w:p>
+    <w:p>
+      <w:pPr>
+        <w:keepNext/>
+        <w:spacing w:after="0"/>
+        <w:shd w:val="clear" w:color="auto" w:fill="F1F3F8"/>
+      </w:pPr>
+      <w:r>
+        <w:rPr>
+          <w:rFonts w:ascii="Consolas" w:hAnsi="Consolas"/>
+          <w:b w:val="0"/>
+          <w:color w:val="233C7D"/>
+          <w:sz w:val="19"/>
+        </w:rPr>
+        <w:t>{</w:t>
+      </w:r>
+    </w:p>
+    <w:p>
+      <w:pPr>
+        <w:keepNext/>
+        <w:spacing w:after="0"/>
+        <w:shd w:val="clear" w:color="auto" w:fill="F1F3F8"/>
+      </w:pPr>
+      <w:r>
+        <w:rPr>
+          <w:rFonts w:ascii="Consolas" w:hAnsi="Consolas"/>
+          <w:b w:val="0"/>
+          <w:color w:val="233C7D"/>
+          <w:sz w:val="19"/>
+        </w:rPr>
+        <w:t xml:space="preserve">  "idProperty": "5b1f3c7e-2d4a-4e8b-9c1d-7a6e5f4b3c2d",</w:t>
+      </w:r>
+    </w:p>
+    <w:p>
+      <w:pPr>
+        <w:keepNext/>
+        <w:spacing w:after="0"/>
+        <w:shd w:val="clear" w:color="auto" w:fill="F1F3F8"/>
+      </w:pPr>
+      <w:r>
+        <w:rPr>
+          <w:rFonts w:ascii="Consolas" w:hAnsi="Consolas"/>
+          <w:b w:val="0"/>
+          <w:color w:val="233C7D"/>
+          <w:sz w:val="19"/>
+        </w:rPr>
+        <w:t xml:space="preserve">  "firstName": "Mario",</w:t>
+      </w:r>
+    </w:p>
+    <w:p>
+      <w:pPr>
+        <w:keepNext/>
+        <w:spacing w:after="0"/>
+        <w:shd w:val="clear" w:color="auto" w:fill="F1F3F8"/>
+      </w:pPr>
+      <w:r>
+        <w:rPr>
+          <w:rFonts w:ascii="Consolas" w:hAnsi="Consolas"/>
+          <w:b w:val="0"/>
+          <w:color w:val="233C7D"/>
+          <w:sz w:val="19"/>
+        </w:rPr>
+        <w:t xml:space="preserve">  "lastName": "Rossi",</w:t>
+      </w:r>
+    </w:p>
+    <w:p>
+      <w:pPr>
+        <w:keepNext/>
+        <w:spacing w:after="0"/>
+        <w:shd w:val="clear" w:color="auto" w:fill="F1F3F8"/>
+      </w:pPr>
+      <w:r>
+        <w:rPr>
+          <w:rFonts w:ascii="Consolas" w:hAnsi="Consolas"/>
+          <w:b w:val="0"/>
+          <w:color w:val="233C7D"/>
+          <w:sz w:val="19"/>
+        </w:rPr>
+        <w:t xml:space="preserve">  "email": "mario.rossi@example.com",</w:t>
+      </w:r>
+    </w:p>
+    <w:p>
+      <w:pPr>
+        <w:keepNext/>
+        <w:spacing w:after="0"/>
+        <w:shd w:val="clear" w:color="auto" w:fill="F1F3F8"/>
+      </w:pPr>
+      <w:r>
+        <w:rPr>
+          <w:rFonts w:ascii="Consolas" w:hAnsi="Consolas"/>
+          <w:b w:val="0"/>
+          <w:color w:val="233C7D"/>
+          <w:sz w:val="19"/>
+        </w:rPr>
+        <w:t xml:space="preserve">  "mobilePhone": null,</w:t>
+      </w:r>
+    </w:p>
+    <w:p>
+      <w:pPr>
+        <w:keepNext/>
+        <w:spacing w:after="0"/>
+        <w:shd w:val="clear" w:color="auto" w:fill="F1F3F8"/>
+      </w:pPr>
+      <w:r>
+        <w:rPr>
+          <w:rFonts w:ascii="Consolas" w:hAnsi="Consolas"/>
+          <w:b w:val="0"/>
+          <w:color w:val="233C7D"/>
+          <w:sz w:val="19"/>
+        </w:rPr>
+        <w:t xml:space="preserve">  "message": "Buongiorno, vorrei sapere come esportare il listino."</w:t>
+      </w:r>
+    </w:p>
+    <w:p>
+      <w:pPr>
+        <w:keepNext w:val="0"/>
+        <w:spacing w:after="120"/>
+        <w:shd w:val="clear" w:color="auto" w:fill="F1F3F8"/>
+      </w:pPr>
+      <w:r>
+        <w:rPr>
+          <w:rFonts w:ascii="Consolas" w:hAnsi="Consolas"/>
+          <w:b w:val="0"/>
+          <w:color w:val="233C7D"/>
+          <w:sz w:val="19"/>
+        </w:rPr>
+        <w:t>}</w:t>
+      </w:r>
+    </w:p>
+    <w:p>
+      <w:pPr>
+        <w:pStyle w:val="Heading2"/>
+      </w:pPr>
+      <w:r>
+        <w:t>Risposta attesa dal server</w:t>
+      </w:r>
+    </w:p>
+    <w:p>
+      <w:pPr>
+        <w:spacing w:after="40"/>
+      </w:pPr>
+      <w:r>
+        <w:rPr>
+          <w:b/>
+        </w:rPr>
+        <w:t xml:space="preserve">Stato: </w:t>
+      </w:r>
+      <w:r>
+        <w:rPr>
+          <w:b w:val="0"/>
+        </w:rPr>
+        <w:t>204 No Content (nessun corpo)</w:t>
+      </w:r>
+    </w:p>
+    <w:p>
+      <w:r>
+        <w:t>Nessun corpo nella risposta, quindi nessun JSON.</w:t>
+      </w:r>
+    </w:p>
+    <w:p>
+      <w:pPr>
+        <w:pStyle w:val="Heading2"/>
+      </w:pPr>
+      <w:r>
+        <w:t>Errori possibili</w:t>
+      </w:r>
+    </w:p>
+    <w:tbl>
+      <w:tblPr>
+        <w:tblW w:type="auto" w:w="0"/>
+        <w:jc w:val="center"/>
+        <w:tblLayout w:type="fixed"/>
+        <w:tblLook w:firstColumn="1" w:firstRow="1" w:lastColumn="0" w:lastRow="0" w:noHBand="0" w:noVBand="1" w:val="04A0"/>
+        <w:tblBorders>
+          <w:top w:val="single" w:sz="4" w:color="C9CED8"/>
+          <w:left w:val="single" w:sz="4" w:color="C9CED8"/>
+          <w:bottom w:val="single" w:sz="4" w:color="C9CED8"/>
+          <w:right w:val="single" w:sz="4" w:color="C9CED8"/>
+          <w:insideH w:val="single" w:sz="4" w:color="C9CED8"/>
+          <w:insideV w:val="single" w:sz="4" w:color="C9CED8"/>
+        </w:tblBorders>
+      </w:tblPr>
+      <w:tblGrid>
+        <w:gridCol w:w="3289"/>
+        <w:gridCol w:w="3289"/>
+        <w:gridCol w:w="3289"/>
+      </w:tblGrid>
+      <w:tr>
+        <w:trPr>
+          <w:cantSplit w:val="true"/>
+          <w:tblHeader w:val="true"/>
+        </w:trPr>
+        <w:tc>
+          <w:tcPr>
+            <w:tcW w:type="dxa" w:w="907"/>
+            <w:shd w:val="clear" w:color="auto" w:fill="233C7D"/>
+          </w:tcPr>
+          <w:p>
+            <w:pPr>
+              <w:spacing w:after="0"/>
+            </w:pPr>
+            <w:r>
+              <w:rPr>
+                <w:b/>
+                <w:color w:val="FFFFFF"/>
+                <w:sz w:val="20"/>
+              </w:rPr>
+              <w:t>Status</w:t>
+            </w:r>
+          </w:p>
+        </w:tc>
+        <w:tc>
+          <w:tcPr>
+            <w:tcW w:type="dxa" w:w="3061"/>
+            <w:shd w:val="clear" w:color="auto" w:fill="233C7D"/>
+          </w:tcPr>
+          <w:p>
+            <w:pPr>
+              <w:spacing w:after="0"/>
+            </w:pPr>
+            <w:r>
+              <w:rPr>
+                <w:b/>
+                <w:color w:val="FFFFFF"/>
+                <w:sz w:val="20"/>
+              </w:rPr>
+              <w:t>Codice</w:t>
+            </w:r>
+          </w:p>
+        </w:tc>
+        <w:tc>
+          <w:tcPr>
+            <w:tcW w:type="dxa" w:w="5896"/>
+            <w:shd w:val="clear" w:color="auto" w:fill="233C7D"/>
+          </w:tcPr>
+          <w:p>
+            <w:pPr>
+              <w:spacing w:after="0"/>
+            </w:pPr>
+            <w:r>
+              <w:rPr>
+                <w:b/>
+                <w:color w:val="FFFFFF"/>
+                <w:sz w:val="20"/>
+              </w:rPr>
+              <w:t>Quando</w:t>
+            </w:r>
+          </w:p>
+        </w:tc>
+      </w:tr>
+      <w:tr>
+        <w:trPr>
+          <w:cantSplit w:val="true"/>
+        </w:trPr>
+        <w:tc>
+          <w:tcPr>
+            <w:tcW w:type="dxa" w:w="907"/>
+          </w:tcPr>
+          <w:p>
+            <w:pPr>
+              <w:spacing w:after="0"/>
+            </w:pPr>
+            <w:r>
+              <w:rPr>
+                <w:rFonts w:ascii="Consolas" w:hAnsi="Consolas"/>
+                <w:b w:val="0"/>
+                <w:color w:val="233C7D"/>
+                <w:sz w:val="19"/>
+              </w:rPr>
+              <w:t>400</w:t>
+            </w:r>
+          </w:p>
+        </w:tc>
+        <w:tc>
+          <w:tcPr>
+            <w:tcW w:type="dxa" w:w="3061"/>
+          </w:tcPr>
+          <w:p>
+            <w:pPr>
+              <w:spacing w:after="0"/>
+            </w:pPr>
+            <w:r>
+              <w:rPr>
+                <w:rFonts w:ascii="Consolas" w:hAnsi="Consolas"/>
+                <w:b w:val="0"/>
+                <w:color w:val="233C7D"/>
+                <w:sz w:val="19"/>
+              </w:rPr>
+              <w:t>validation.invalid_request</w:t>
+            </w:r>
+          </w:p>
+        </w:tc>
+        <w:tc>
+          <w:tcPr>
+            <w:tcW w:type="dxa" w:w="5896"/>
+          </w:tcPr>
+          <w:p>
+            <w:pPr>
+              <w:spacing w:after="0"/>
+            </w:pPr>
+            <w:r>
+              <w:rPr>
+                <w:b w:val="0"/>
+                <w:sz w:val="19"/>
+              </w:rPr>
+              <w:t>Un campo obbligatorio manca o è vuoto, o idProperty non è valido: in errors[] validation.invalid_value per ognuno.</w:t>
+            </w:r>
+          </w:p>
+        </w:tc>
+      </w:tr>
+      <w:tr>
+        <w:trPr>
+          <w:cantSplit w:val="true"/>
+        </w:trPr>
+        <w:tc>
+          <w:tcPr>
+            <w:tcW w:type="dxa" w:w="907"/>
+            <w:shd w:val="clear" w:color="auto" w:fill="F1F3F8"/>
+          </w:tcPr>
+          <w:p>
+            <w:pPr>
+              <w:spacing w:after="0"/>
+            </w:pPr>
+            <w:r>
+              <w:rPr>
+                <w:rFonts w:ascii="Consolas" w:hAnsi="Consolas"/>
+                <w:b w:val="0"/>
+                <w:color w:val="233C7D"/>
+                <w:sz w:val="19"/>
+              </w:rPr>
+              <w:t>401</w:t>
+            </w:r>
+          </w:p>
+        </w:tc>
+        <w:tc>
+          <w:tcPr>
+            <w:tcW w:type="dxa" w:w="3061"/>
+            <w:shd w:val="clear" w:color="auto" w:fill="F1F3F8"/>
+          </w:tcPr>
+          <w:p>
+            <w:pPr>
+              <w:spacing w:after="0"/>
+            </w:pPr>
+            <w:r>
+              <w:rPr>
+                <w:rFonts w:ascii="Consolas" w:hAnsi="Consolas"/>
+                <w:b w:val="0"/>
+                <w:color w:val="233C7D"/>
+                <w:sz w:val="19"/>
+              </w:rPr>
+              <w:t>auth.invalid_token</w:t>
+            </w:r>
+          </w:p>
+        </w:tc>
+        <w:tc>
+          <w:tcPr>
+            <w:tcW w:type="dxa" w:w="5896"/>
+            <w:shd w:val="clear" w:color="auto" w:fill="F1F3F8"/>
+          </w:tcPr>
+          <w:p>
+            <w:pPr>
+              <w:spacing w:after="0"/>
+            </w:pPr>
+            <w:r>
+              <w:rPr>
+                <w:b w:val="0"/>
+                <w:sz w:val="19"/>
+              </w:rPr>
+              <w:t>Access token assente, scaduto o non valido: il frontend rinnova il token e ripete la chiamata una volta.</w:t>
+            </w:r>
+          </w:p>
+        </w:tc>
+      </w:tr>
+      <w:tr>
+        <w:trPr>
+          <w:cantSplit w:val="true"/>
+        </w:trPr>
+        <w:tc>
+          <w:tcPr>
+            <w:tcW w:type="dxa" w:w="907"/>
+          </w:tcPr>
+          <w:p>
+            <w:pPr>
+              <w:spacing w:after="0"/>
+            </w:pPr>
+            <w:r>
+              <w:rPr>
+                <w:rFonts w:ascii="Consolas" w:hAnsi="Consolas"/>
+                <w:b w:val="0"/>
+                <w:color w:val="233C7D"/>
+                <w:sz w:val="19"/>
+              </w:rPr>
+              <w:t>500</w:t>
+            </w:r>
+          </w:p>
+        </w:tc>
+        <w:tc>
+          <w:tcPr>
+            <w:tcW w:type="dxa" w:w="3061"/>
+          </w:tcPr>
+          <w:p>
+            <w:pPr>
+              <w:spacing w:after="0"/>
+            </w:pPr>
+            <w:r>
+              <w:rPr>
+                <w:rFonts w:ascii="Consolas" w:hAnsi="Consolas"/>
+                <w:b w:val="0"/>
+                <w:color w:val="233C7D"/>
+                <w:sz w:val="19"/>
+              </w:rPr>
+              <w:t>server.unexpected</w:t>
+            </w:r>
+          </w:p>
+        </w:tc>
+        <w:tc>
+          <w:tcPr>
+            <w:tcW w:type="dxa" w:w="5896"/>
+          </w:tcPr>
+          <w:p>
+            <w:pPr>
+              <w:spacing w:after="0"/>
+            </w:pPr>
+            <w:r>
+              <w:rPr>
+                <w:b w:val="0"/>
+                <w:sz w:val="19"/>
+              </w:rPr>
+              <w:t>Errore non gestito del server (vale per ogni API).</w:t>
+            </w:r>
+          </w:p>
+        </w:tc>
+      </w:tr>
+    </w:tbl>
+    <w:p>
+      <w:pPr>
+        <w:spacing w:after="40"/>
+      </w:pPr>
+    </w:p>
+    <w:p>
+      <w:pPr>
+        <w:pStyle w:val="Heading3"/>
+      </w:pPr>
+      <w:r>
+        <w:t>Esempio di errore (JSON)</w:t>
+      </w:r>
+    </w:p>
+    <w:p>
+      <w:pPr>
+        <w:keepNext/>
+      </w:pPr>
+      <w:r>
+        <w:t>Risposta a una richiesta senza messaggio:</w:t>
+      </w:r>
+    </w:p>
+    <w:p>
+      <w:pPr>
+        <w:keepNext/>
+        <w:spacing w:after="0"/>
+        <w:shd w:val="clear" w:color="auto" w:fill="F1F3F8"/>
+      </w:pPr>
+      <w:r>
+        <w:rPr>
+          <w:rFonts w:ascii="Consolas" w:hAnsi="Consolas"/>
+          <w:b w:val="0"/>
+          <w:color w:val="233C7D"/>
+          <w:sz w:val="19"/>
+        </w:rPr>
+        <w:t>{</w:t>
+      </w:r>
+    </w:p>
+    <w:p>
+      <w:pPr>
+        <w:keepNext/>
+        <w:spacing w:after="0"/>
+        <w:shd w:val="clear" w:color="auto" w:fill="F1F3F8"/>
+      </w:pPr>
+      <w:r>
+        <w:rPr>
+          <w:rFonts w:ascii="Consolas" w:hAnsi="Consolas"/>
+          <w:b w:val="0"/>
+          <w:color w:val="233C7D"/>
+          <w:sz w:val="19"/>
+        </w:rPr>
+        <w:t xml:space="preserve">  "type": "https://errors.summerbooking/validation/invalid-request",</w:t>
+      </w:r>
+    </w:p>
+    <w:p>
+      <w:pPr>
+        <w:keepNext/>
+        <w:spacing w:after="0"/>
+        <w:shd w:val="clear" w:color="auto" w:fill="F1F3F8"/>
+      </w:pPr>
+      <w:r>
+        <w:rPr>
+          <w:rFonts w:ascii="Consolas" w:hAnsi="Consolas"/>
+          <w:b w:val="0"/>
+          <w:color w:val="233C7D"/>
+          <w:sz w:val="19"/>
+        </w:rPr>
+        <w:t xml:space="preserve">  "status": 400,</w:t>
+      </w:r>
+    </w:p>
+    <w:p>
+      <w:pPr>
+        <w:keepNext/>
+        <w:spacing w:after="0"/>
+        <w:shd w:val="clear" w:color="auto" w:fill="F1F3F8"/>
+      </w:pPr>
+      <w:r>
+        <w:rPr>
+          <w:rFonts w:ascii="Consolas" w:hAnsi="Consolas"/>
+          <w:b w:val="0"/>
+          <w:color w:val="233C7D"/>
+          <w:sz w:val="19"/>
+        </w:rPr>
+        <w:t xml:space="preserve">  "code": "validation.invalid_request",</w:t>
+      </w:r>
+    </w:p>
+    <w:p>
+      <w:pPr>
+        <w:keepNext/>
+        <w:spacing w:after="0"/>
+        <w:shd w:val="clear" w:color="auto" w:fill="F1F3F8"/>
+      </w:pPr>
+      <w:r>
+        <w:rPr>
+          <w:rFonts w:ascii="Consolas" w:hAnsi="Consolas"/>
+          <w:b w:val="0"/>
+          <w:color w:val="233C7D"/>
+          <w:sz w:val="19"/>
+        </w:rPr>
+        <w:t xml:space="preserve">  "title": "Invalid request",</w:t>
+      </w:r>
+    </w:p>
+    <w:p>
+      <w:pPr>
+        <w:keepNext/>
+        <w:spacing w:after="0"/>
+        <w:shd w:val="clear" w:color="auto" w:fill="F1F3F8"/>
+      </w:pPr>
+      <w:r>
+        <w:rPr>
+          <w:rFonts w:ascii="Consolas" w:hAnsi="Consolas"/>
+          <w:b w:val="0"/>
+          <w:color w:val="233C7D"/>
+          <w:sz w:val="19"/>
+        </w:rPr>
+        <w:t xml:space="preserve">  "errors": [</w:t>
+      </w:r>
+    </w:p>
+    <w:p>
+      <w:pPr>
+        <w:keepNext/>
+        <w:spacing w:after="0"/>
+        <w:shd w:val="clear" w:color="auto" w:fill="F1F3F8"/>
+      </w:pPr>
+      <w:r>
+        <w:rPr>
+          <w:rFonts w:ascii="Consolas" w:hAnsi="Consolas"/>
+          <w:b w:val="0"/>
+          <w:color w:val="233C7D"/>
+          <w:sz w:val="19"/>
+        </w:rPr>
+        <w:t xml:space="preserve">    {</w:t>
+      </w:r>
+    </w:p>
+    <w:p>
+      <w:pPr>
+        <w:keepNext/>
+        <w:spacing w:after="0"/>
+        <w:shd w:val="clear" w:color="auto" w:fill="F1F3F8"/>
+      </w:pPr>
+      <w:r>
+        <w:rPr>
+          <w:rFonts w:ascii="Consolas" w:hAnsi="Consolas"/>
+          <w:b w:val="0"/>
+          <w:color w:val="233C7D"/>
+          <w:sz w:val="19"/>
+        </w:rPr>
+        <w:t xml:space="preserve">      "field": "message",</w:t>
       </w:r>
     </w:p>
     <w:p>

</xml_diff>

<commit_message>
Completed email configuration page
</commit_message>
<xml_diff>
--- a/frontend/summer-booking-front-office/docs/API_CONTRACTS.docx
+++ b/frontend/summer-booking-front-office/docs/API_CONTRACTS.docx
@@ -20,7 +20,7 @@
     </w:p>
     <w:p>
       <w:r>
-        <w:t>Aggiornato al 06/10/2026 (nuova API GET system/email-configuration per la pagina Configurazione email; nuova API system/info-support con telefono, email e orari della pagina Assistenza e guide). Prima, il 05/10/2026 (nuova API system/contact-support per il form della pagina Assistenza e guide; nuova API warehouse/duplicate-warehouse-item, stessa forma dell'eliminazione, nomi delle copie scelti dal backend; nuova API warehouse/delete-warehouse-item, un solo id o più id insieme, tutto o niente; in warehouse/list i campi delle quantità finiscono con Quantity: totalQuantity, availableQuantity e thresholdQuantity, prima total, available e thresholdNumber; nuova API warehouse/edit-warehouse-item per il popup "Modifica articolo" e, in warehouse/list, nuovo campo isThresholdWarningActive; quantità sempre maggiore di 0; nuova API warehouse/add-warehouse-item per il bottone Aggiungi del popup "Aggiungi articolo"; nuova API warehouse/combobox-list per la tendina degli articoli; in warehouse/list availableQuantity e thresholdQuantity sempre presenti). Prima, il 01/10/2026 (errori: formato Problem Details con code, errori possibili per API e catalogo dei codici; header Accept-Language; formato dei valori in args). Oggi tutte le API sono simulate dai mock del frontend (services/mocks).</w:t>
+        <w:t>Aggiornato al 06/10/2026 (nuova API system/save-email-configuration per il bottone Salva, stesso corpo dell'invio di prova (EmailConfigurationRequest); nuova API system/send-test-email per il bottone Invia email test; nuova API GET system/email-configuration per la pagina Configurazione email; nuova API system/info-support con telefono, email e orari della pagina Assistenza e guide). Prima, il 05/10/2026 (nuova API system/contact-support per il form della pagina Assistenza e guide; nuova API warehouse/duplicate-warehouse-item, stessa forma dell'eliminazione, nomi delle copie scelti dal backend; nuova API warehouse/delete-warehouse-item, un solo id o più id insieme, tutto o niente; in warehouse/list i campi delle quantità finiscono con Quantity: totalQuantity, availableQuantity e thresholdQuantity, prima total, available e thresholdNumber; nuova API warehouse/edit-warehouse-item per il popup "Modifica articolo" e, in warehouse/list, nuovo campo isThresholdWarningActive; quantità sempre maggiore di 0; nuova API warehouse/add-warehouse-item per il bottone Aggiungi del popup "Aggiungi articolo"; nuova API warehouse/combobox-list per la tendina degli articoli; in warehouse/list availableQuantity e thresholdQuantity sempre presenti). Prima, il 01/10/2026 (errori: formato Problem Details con code, errori possibili per API e catalogo dei codici; header Accept-Language; formato dei valori in args). Oggi tutte le API sono simulate dai mock del frontend (services/mocks).</w:t>
       </w:r>
     </w:p>
     <w:p>
@@ -2572,6 +2572,129 @@
                 <w:color w:val="233C7D"/>
                 <w:sz w:val="19"/>
               </w:rPr>
+              <w:t>/api/system/send-test-email</w:t>
+            </w:r>
+          </w:p>
+        </w:tc>
+        <w:tc>
+          <w:tcPr>
+            <w:tcW w:type="dxa" w:w="4876"/>
+          </w:tcPr>
+          <w:p>
+            <w:pPr>
+              <w:spacing w:after="0"/>
+            </w:pPr>
+            <w:r>
+              <w:rPr>
+                <w:b w:val="0"/>
+                <w:sz w:val="19"/>
+              </w:rPr>
+              <w:t>Configurazione email: invio di prova</w:t>
+            </w:r>
+          </w:p>
+        </w:tc>
+      </w:tr>
+      <w:tr>
+        <w:trPr>
+          <w:cantSplit w:val="true"/>
+        </w:trPr>
+        <w:tc>
+          <w:tcPr>
+            <w:tcW w:type="dxa" w:w="2381"/>
+            <w:shd w:val="clear" w:color="auto" w:fill="F1F3F8"/>
+          </w:tcPr>
+          <w:p>
+            <w:pPr>
+              <w:spacing w:after="0"/>
+            </w:pPr>
+            <w:r>
+              <w:rPr>
+                <w:rFonts w:ascii="Consolas" w:hAnsi="Consolas"/>
+                <w:b w:val="0"/>
+                <w:color w:val="233C7D"/>
+                <w:sz w:val="19"/>
+              </w:rPr>
+              <w:t>POST</w:t>
+            </w:r>
+          </w:p>
+        </w:tc>
+        <w:tc>
+          <w:tcPr>
+            <w:tcW w:type="dxa" w:w="2608"/>
+            <w:shd w:val="clear" w:color="auto" w:fill="F1F3F8"/>
+          </w:tcPr>
+          <w:p>
+            <w:pPr>
+              <w:spacing w:after="0"/>
+            </w:pPr>
+            <w:r>
+              <w:rPr>
+                <w:rFonts w:ascii="Consolas" w:hAnsi="Consolas"/>
+                <w:b w:val="0"/>
+                <w:color w:val="233C7D"/>
+                <w:sz w:val="19"/>
+              </w:rPr>
+              <w:t>/api/system/save-email-configuration</w:t>
+            </w:r>
+          </w:p>
+        </w:tc>
+        <w:tc>
+          <w:tcPr>
+            <w:tcW w:type="dxa" w:w="4876"/>
+            <w:shd w:val="clear" w:color="auto" w:fill="F1F3F8"/>
+          </w:tcPr>
+          <w:p>
+            <w:pPr>
+              <w:spacing w:after="0"/>
+            </w:pPr>
+            <w:r>
+              <w:rPr>
+                <w:b w:val="0"/>
+                <w:sz w:val="19"/>
+              </w:rPr>
+              <w:t>Configurazione email: salvataggio</w:t>
+            </w:r>
+          </w:p>
+        </w:tc>
+      </w:tr>
+      <w:tr>
+        <w:trPr>
+          <w:cantSplit w:val="true"/>
+        </w:trPr>
+        <w:tc>
+          <w:tcPr>
+            <w:tcW w:type="dxa" w:w="2381"/>
+          </w:tcPr>
+          <w:p>
+            <w:pPr>
+              <w:spacing w:after="0"/>
+            </w:pPr>
+            <w:r>
+              <w:rPr>
+                <w:rFonts w:ascii="Consolas" w:hAnsi="Consolas"/>
+                <w:b w:val="0"/>
+                <w:color w:val="233C7D"/>
+                <w:sz w:val="19"/>
+              </w:rPr>
+              <w:t>POST</w:t>
+            </w:r>
+          </w:p>
+        </w:tc>
+        <w:tc>
+          <w:tcPr>
+            <w:tcW w:type="dxa" w:w="2608"/>
+          </w:tcPr>
+          <w:p>
+            <w:pPr>
+              <w:spacing w:after="0"/>
+            </w:pPr>
+            <w:r>
+              <w:rPr>
+                <w:rFonts w:ascii="Consolas" w:hAnsi="Consolas"/>
+                <w:b w:val="0"/>
+                <w:color w:val="233C7D"/>
+                <w:sz w:val="19"/>
+              </w:rPr>
               <w:t>/api/system/info-support</w:t>
             </w:r>
           </w:p>
@@ -17101,6 +17224,2892 @@
           <w:sz w:val="19"/>
         </w:rPr>
         <w:t xml:space="preserve">      "field": "idProperty",</w:t>
+      </w:r>
+    </w:p>
+    <w:p>
+      <w:pPr>
+        <w:keepNext/>
+        <w:spacing w:after="0"/>
+        <w:shd w:val="clear" w:color="auto" w:fill="F1F3F8"/>
+      </w:pPr>
+      <w:r>
+        <w:rPr>
+          <w:rFonts w:ascii="Consolas" w:hAnsi="Consolas"/>
+          <w:b w:val="0"/>
+          <w:color w:val="233C7D"/>
+          <w:sz w:val="19"/>
+        </w:rPr>
+        <w:t xml:space="preserve">      "code": "validation.invalid_value"</w:t>
+      </w:r>
+    </w:p>
+    <w:p>
+      <w:pPr>
+        <w:keepNext/>
+        <w:spacing w:after="0"/>
+        <w:shd w:val="clear" w:color="auto" w:fill="F1F3F8"/>
+      </w:pPr>
+      <w:r>
+        <w:rPr>
+          <w:rFonts w:ascii="Consolas" w:hAnsi="Consolas"/>
+          <w:b w:val="0"/>
+          <w:color w:val="233C7D"/>
+          <w:sz w:val="19"/>
+        </w:rPr>
+        <w:t xml:space="preserve">    }</w:t>
+      </w:r>
+    </w:p>
+    <w:p>
+      <w:pPr>
+        <w:keepNext/>
+        <w:spacing w:after="0"/>
+        <w:shd w:val="clear" w:color="auto" w:fill="F1F3F8"/>
+      </w:pPr>
+      <w:r>
+        <w:rPr>
+          <w:rFonts w:ascii="Consolas" w:hAnsi="Consolas"/>
+          <w:b w:val="0"/>
+          <w:color w:val="233C7D"/>
+          <w:sz w:val="19"/>
+        </w:rPr>
+        <w:t xml:space="preserve">  ],</w:t>
+      </w:r>
+    </w:p>
+    <w:p>
+      <w:pPr>
+        <w:keepNext/>
+        <w:spacing w:after="0"/>
+        <w:shd w:val="clear" w:color="auto" w:fill="F1F3F8"/>
+      </w:pPr>
+      <w:r>
+        <w:rPr>
+          <w:rFonts w:ascii="Consolas" w:hAnsi="Consolas"/>
+          <w:b w:val="0"/>
+          <w:color w:val="233C7D"/>
+          <w:sz w:val="19"/>
+        </w:rPr>
+        <w:t xml:space="preserve">  "traceId": "00-4bf92f3577b34da6a3ce929d0e0e4736-00f067aa0ba902b7-01"</w:t>
+      </w:r>
+    </w:p>
+    <w:p>
+      <w:pPr>
+        <w:keepNext w:val="0"/>
+        <w:spacing w:after="120"/>
+        <w:shd w:val="clear" w:color="auto" w:fill="F1F3F8"/>
+      </w:pPr>
+      <w:r>
+        <w:rPr>
+          <w:rFonts w:ascii="Consolas" w:hAnsi="Consolas"/>
+          <w:b w:val="0"/>
+          <w:color w:val="233C7D"/>
+          <w:sz w:val="19"/>
+        </w:rPr>
+        <w:t>}</w:t>
+      </w:r>
+    </w:p>
+    <w:p>
+      <w:pPr>
+        <w:pStyle w:val="Heading1"/>
+        <w:pageBreakBefore/>
+      </w:pPr>
+      <w:r>
+        <w:rPr>
+          <w:b w:val="0"/>
+        </w:rPr>
+        <w:t xml:space="preserve">POST </w:t>
+      </w:r>
+      <w:r>
+        <w:rPr>
+          <w:rFonts w:ascii="Consolas" w:hAnsi="Consolas"/>
+          <w:b w:val="0"/>
+        </w:rPr>
+        <w:t>/api/system/send-test-email</w:t>
+      </w:r>
+    </w:p>
+    <w:p>
+      <w:r>
+        <w:t>Configurazione email: invio di prova</w:t>
+      </w:r>
+    </w:p>
+    <w:p>
+      <w:pPr>
+        <w:spacing w:after="40"/>
+      </w:pPr>
+      <w:r>
+        <w:rPr>
+          <w:b/>
+        </w:rPr>
+        <w:t xml:space="preserve">Metodo: </w:t>
+      </w:r>
+      <w:r>
+        <w:rPr>
+          <w:rFonts w:ascii="Consolas" w:hAnsi="Consolas"/>
+          <w:b w:val="0"/>
+          <w:color w:val="233C7D"/>
+        </w:rPr>
+        <w:t>POST</w:t>
+      </w:r>
+    </w:p>
+    <w:p>
+      <w:pPr>
+        <w:spacing w:after="40"/>
+      </w:pPr>
+      <w:r>
+        <w:rPr>
+          <w:b/>
+        </w:rPr>
+        <w:t xml:space="preserve">Route: </w:t>
+      </w:r>
+      <w:r>
+        <w:rPr>
+          <w:rFonts w:ascii="Consolas" w:hAnsi="Consolas"/>
+          <w:b w:val="0"/>
+          <w:color w:val="233C7D"/>
+        </w:rPr>
+        <w:t>/api/system/send-test-email</w:t>
+      </w:r>
+    </w:p>
+    <w:p>
+      <w:pPr>
+        <w:spacing w:after="40"/>
+      </w:pPr>
+      <w:r>
+        <w:rPr>
+          <w:b/>
+        </w:rPr>
+        <w:t xml:space="preserve">Nel frontend: </w:t>
+      </w:r>
+      <w:r>
+        <w:rPr>
+          <w:rFonts w:ascii="Consolas" w:hAnsi="Consolas"/>
+          <w:b w:val="0"/>
+          <w:color w:val="233C7D"/>
+        </w:rPr>
+        <w:t>SystemService.sendTestEmail</w:t>
+      </w:r>
+    </w:p>
+    <w:p>
+      <w:pPr>
+        <w:spacing w:after="40"/>
+      </w:pPr>
+      <w:r>
+        <w:rPr>
+          <w:b/>
+        </w:rPr>
+        <w:t xml:space="preserve">Autenticazione: </w:t>
+      </w:r>
+      <w:r>
+        <w:rPr>
+          <w:b w:val="0"/>
+        </w:rPr>
+        <w:t>Header Authorization: Bearer &lt;accessToken&gt;.</w:t>
+      </w:r>
+    </w:p>
+    <w:p>
+      <w:pPr>
+        <w:pStyle w:val="ListBullet"/>
+      </w:pPr>
+      <w:r>
+        <w:t>La chiama il bottone "Invia email test" della pagina Configurazione email, con i valori presenti nei campi in quel momento, anche se non ancora salvati: serve a provare una configurazione prima di salvarla.</w:t>
+      </w:r>
+    </w:p>
+    <w:p>
+      <w:pPr>
+        <w:pStyle w:val="ListBullet"/>
+      </w:pPr>
+      <w:r>
+        <w:t>Il backend invia un'email di prova con quei dati (destinatario a sua scelta, es. l'indirizzo mittente). Se il server SMTP rifiuta la connessione o le credenziali, conviene un code specifico (da definire) invece di un errore generico.</w:t>
+      </w:r>
+    </w:p>
+    <w:p>
+      <w:pPr>
+        <w:pStyle w:val="ListBullet"/>
+      </w:pPr>
+      <w:r>
+        <w:t>Durante la chiamata il bottone mostra lo spinner; se riesce compare il popup "Email di test inviata", se fallisce il messaggio del code sotto il riquadro.</w:t>
+      </w:r>
+    </w:p>
+    <w:p>
+      <w:pPr>
+        <w:pStyle w:val="ListBullet"/>
+      </w:pPr>
+      <w:r>
+        <w:t>Metodo POST e risposta 204 senza corpo sono una proposta del frontend, da confermare col backend.</w:t>
+      </w:r>
+    </w:p>
+    <w:p>
+      <w:pPr>
+        <w:pStyle w:val="Heading2"/>
+      </w:pPr>
+      <w:r>
+        <w:t>Payload inviato al backend</w:t>
+      </w:r>
+    </w:p>
+    <w:p>
+      <w:pPr>
+        <w:pStyle w:val="Heading3"/>
+      </w:pPr>
+      <w:r>
+        <w:rPr>
+          <w:b w:val="0"/>
+        </w:rPr>
+        <w:t xml:space="preserve">Corpo JSON: </w:t>
+      </w:r>
+      <w:r>
+        <w:rPr>
+          <w:rFonts w:ascii="Consolas" w:hAnsi="Consolas"/>
+          <w:b w:val="0"/>
+        </w:rPr>
+        <w:t>EmailConfigurationRequest</w:t>
+      </w:r>
+    </w:p>
+    <w:tbl>
+      <w:tblPr>
+        <w:tblW w:type="auto" w:w="0"/>
+        <w:jc w:val="center"/>
+        <w:tblLayout w:type="fixed"/>
+        <w:tblLook w:firstColumn="1" w:firstRow="1" w:lastColumn="0" w:lastRow="0" w:noHBand="0" w:noVBand="1" w:val="04A0"/>
+        <w:tblBorders>
+          <w:top w:val="single" w:sz="4" w:color="C9CED8"/>
+          <w:left w:val="single" w:sz="4" w:color="C9CED8"/>
+          <w:bottom w:val="single" w:sz="4" w:color="C9CED8"/>
+          <w:right w:val="single" w:sz="4" w:color="C9CED8"/>
+          <w:insideH w:val="single" w:sz="4" w:color="C9CED8"/>
+          <w:insideV w:val="single" w:sz="4" w:color="C9CED8"/>
+        </w:tblBorders>
+      </w:tblPr>
+      <w:tblGrid>
+        <w:gridCol w:w="3289"/>
+        <w:gridCol w:w="3289"/>
+        <w:gridCol w:w="3289"/>
+      </w:tblGrid>
+      <w:tr>
+        <w:trPr>
+          <w:cantSplit w:val="true"/>
+          <w:tblHeader w:val="true"/>
+        </w:trPr>
+        <w:tc>
+          <w:tcPr>
+            <w:tcW w:type="dxa" w:w="2381"/>
+            <w:shd w:val="clear" w:color="auto" w:fill="233C7D"/>
+          </w:tcPr>
+          <w:p>
+            <w:pPr>
+              <w:spacing w:after="0"/>
+            </w:pPr>
+            <w:r>
+              <w:rPr>
+                <w:b/>
+                <w:color w:val="FFFFFF"/>
+                <w:sz w:val="20"/>
+              </w:rPr>
+              <w:t>Parametro</w:t>
+            </w:r>
+          </w:p>
+        </w:tc>
+        <w:tc>
+          <w:tcPr>
+            <w:tcW w:type="dxa" w:w="2608"/>
+            <w:shd w:val="clear" w:color="auto" w:fill="233C7D"/>
+          </w:tcPr>
+          <w:p>
+            <w:pPr>
+              <w:spacing w:after="0"/>
+            </w:pPr>
+            <w:r>
+              <w:rPr>
+                <w:b/>
+                <w:color w:val="FFFFFF"/>
+                <w:sz w:val="20"/>
+              </w:rPr>
+              <w:t>Tipo</w:t>
+            </w:r>
+          </w:p>
+        </w:tc>
+        <w:tc>
+          <w:tcPr>
+            <w:tcW w:type="dxa" w:w="4876"/>
+            <w:shd w:val="clear" w:color="auto" w:fill="233C7D"/>
+          </w:tcPr>
+          <w:p>
+            <w:pPr>
+              <w:spacing w:after="0"/>
+            </w:pPr>
+            <w:r>
+              <w:rPr>
+                <w:b/>
+                <w:color w:val="FFFFFF"/>
+                <w:sz w:val="20"/>
+              </w:rPr>
+              <w:t>Descrizione</w:t>
+            </w:r>
+          </w:p>
+        </w:tc>
+      </w:tr>
+      <w:tr>
+        <w:trPr>
+          <w:cantSplit w:val="true"/>
+        </w:trPr>
+        <w:tc>
+          <w:tcPr>
+            <w:tcW w:type="dxa" w:w="2381"/>
+          </w:tcPr>
+          <w:p>
+            <w:pPr>
+              <w:spacing w:after="0"/>
+            </w:pPr>
+            <w:r>
+              <w:rPr>
+                <w:rFonts w:ascii="Consolas" w:hAnsi="Consolas"/>
+                <w:b w:val="0"/>
+                <w:color w:val="233C7D"/>
+                <w:sz w:val="19"/>
+              </w:rPr>
+              <w:t>idProperty</w:t>
+            </w:r>
+          </w:p>
+        </w:tc>
+        <w:tc>
+          <w:tcPr>
+            <w:tcW w:type="dxa" w:w="2608"/>
+          </w:tcPr>
+          <w:p>
+            <w:pPr>
+              <w:spacing w:after="0"/>
+            </w:pPr>
+            <w:r>
+              <w:rPr>
+                <w:rFonts w:ascii="Consolas" w:hAnsi="Consolas"/>
+                <w:b w:val="0"/>
+                <w:color w:val="233C7D"/>
+                <w:sz w:val="19"/>
+              </w:rPr>
+              <w:t>string (UUID)</w:t>
+            </w:r>
+          </w:p>
+        </w:tc>
+        <w:tc>
+          <w:tcPr>
+            <w:tcW w:type="dxa" w:w="4876"/>
+          </w:tcPr>
+          <w:p>
+            <w:pPr>
+              <w:spacing w:after="0"/>
+            </w:pPr>
+            <w:r>
+              <w:rPr>
+                <w:b w:val="0"/>
+                <w:sz w:val="19"/>
+              </w:rPr>
+              <w:t>Stabilimento dell'utente (da AuthUser.idProperty).</w:t>
+            </w:r>
+          </w:p>
+        </w:tc>
+      </w:tr>
+      <w:tr>
+        <w:trPr>
+          <w:cantSplit w:val="true"/>
+        </w:trPr>
+        <w:tc>
+          <w:tcPr>
+            <w:tcW w:type="dxa" w:w="2381"/>
+            <w:shd w:val="clear" w:color="auto" w:fill="F1F3F8"/>
+          </w:tcPr>
+          <w:p>
+            <w:pPr>
+              <w:spacing w:after="0"/>
+            </w:pPr>
+            <w:r>
+              <w:rPr>
+                <w:rFonts w:ascii="Consolas" w:hAnsi="Consolas"/>
+                <w:b w:val="0"/>
+                <w:color w:val="233C7D"/>
+                <w:sz w:val="19"/>
+              </w:rPr>
+              <w:t>senderMailAddress</w:t>
+            </w:r>
+          </w:p>
+        </w:tc>
+        <w:tc>
+          <w:tcPr>
+            <w:tcW w:type="dxa" w:w="2608"/>
+            <w:shd w:val="clear" w:color="auto" w:fill="F1F3F8"/>
+          </w:tcPr>
+          <w:p>
+            <w:pPr>
+              <w:spacing w:after="0"/>
+            </w:pPr>
+            <w:r>
+              <w:rPr>
+                <w:rFonts w:ascii="Consolas" w:hAnsi="Consolas"/>
+                <w:b w:val="0"/>
+                <w:color w:val="233C7D"/>
+                <w:sz w:val="19"/>
+              </w:rPr>
+              <w:t>string</w:t>
+            </w:r>
+          </w:p>
+        </w:tc>
+        <w:tc>
+          <w:tcPr>
+            <w:tcW w:type="dxa" w:w="4876"/>
+            <w:shd w:val="clear" w:color="auto" w:fill="F1F3F8"/>
+          </w:tcPr>
+          <w:p>
+            <w:pPr>
+              <w:spacing w:after="0"/>
+            </w:pPr>
+            <w:r>
+              <w:rPr>
+                <w:b w:val="0"/>
+                <w:sz w:val="19"/>
+              </w:rPr>
+              <w:t>Indirizzo email mittente scritto nel campo (from_email).</w:t>
+            </w:r>
+          </w:p>
+        </w:tc>
+      </w:tr>
+      <w:tr>
+        <w:trPr>
+          <w:cantSplit w:val="true"/>
+        </w:trPr>
+        <w:tc>
+          <w:tcPr>
+            <w:tcW w:type="dxa" w:w="2381"/>
+          </w:tcPr>
+          <w:p>
+            <w:pPr>
+              <w:spacing w:after="0"/>
+            </w:pPr>
+            <w:r>
+              <w:rPr>
+                <w:rFonts w:ascii="Consolas" w:hAnsi="Consolas"/>
+                <w:b w:val="0"/>
+                <w:color w:val="233C7D"/>
+                <w:sz w:val="19"/>
+              </w:rPr>
+              <w:t>senderName</w:t>
+            </w:r>
+          </w:p>
+        </w:tc>
+        <w:tc>
+          <w:tcPr>
+            <w:tcW w:type="dxa" w:w="2608"/>
+          </w:tcPr>
+          <w:p>
+            <w:pPr>
+              <w:spacing w:after="0"/>
+            </w:pPr>
+            <w:r>
+              <w:rPr>
+                <w:rFonts w:ascii="Consolas" w:hAnsi="Consolas"/>
+                <w:b w:val="0"/>
+                <w:color w:val="233C7D"/>
+                <w:sz w:val="19"/>
+              </w:rPr>
+              <w:t>string</w:t>
+            </w:r>
+          </w:p>
+        </w:tc>
+        <w:tc>
+          <w:tcPr>
+            <w:tcW w:type="dxa" w:w="4876"/>
+          </w:tcPr>
+          <w:p>
+            <w:pPr>
+              <w:spacing w:after="0"/>
+            </w:pPr>
+            <w:r>
+              <w:rPr>
+                <w:b w:val="0"/>
+                <w:sz w:val="19"/>
+              </w:rPr>
+              <w:t>Nome mittente scritto nel campo (from_name).</w:t>
+            </w:r>
+          </w:p>
+        </w:tc>
+      </w:tr>
+      <w:tr>
+        <w:trPr>
+          <w:cantSplit w:val="true"/>
+        </w:trPr>
+        <w:tc>
+          <w:tcPr>
+            <w:tcW w:type="dxa" w:w="2381"/>
+            <w:shd w:val="clear" w:color="auto" w:fill="F1F3F8"/>
+          </w:tcPr>
+          <w:p>
+            <w:pPr>
+              <w:spacing w:after="0"/>
+            </w:pPr>
+            <w:r>
+              <w:rPr>
+                <w:rFonts w:ascii="Consolas" w:hAnsi="Consolas"/>
+                <w:b w:val="0"/>
+                <w:color w:val="233C7D"/>
+                <w:sz w:val="19"/>
+              </w:rPr>
+              <w:t>smtpServerAddress</w:t>
+            </w:r>
+          </w:p>
+        </w:tc>
+        <w:tc>
+          <w:tcPr>
+            <w:tcW w:type="dxa" w:w="2608"/>
+            <w:shd w:val="clear" w:color="auto" w:fill="F1F3F8"/>
+          </w:tcPr>
+          <w:p>
+            <w:pPr>
+              <w:spacing w:after="0"/>
+            </w:pPr>
+            <w:r>
+              <w:rPr>
+                <w:rFonts w:ascii="Consolas" w:hAnsi="Consolas"/>
+                <w:b w:val="0"/>
+                <w:color w:val="233C7D"/>
+                <w:sz w:val="19"/>
+              </w:rPr>
+              <w:t>string</w:t>
+            </w:r>
+          </w:p>
+        </w:tc>
+        <w:tc>
+          <w:tcPr>
+            <w:tcW w:type="dxa" w:w="4876"/>
+            <w:shd w:val="clear" w:color="auto" w:fill="F1F3F8"/>
+          </w:tcPr>
+          <w:p>
+            <w:pPr>
+              <w:spacing w:after="0"/>
+            </w:pPr>
+            <w:r>
+              <w:rPr>
+                <w:b w:val="0"/>
+                <w:sz w:val="19"/>
+              </w:rPr>
+              <w:t>Server SMTP scritto nel campo (smtp_server).</w:t>
+            </w:r>
+          </w:p>
+        </w:tc>
+      </w:tr>
+      <w:tr>
+        <w:trPr>
+          <w:cantSplit w:val="true"/>
+        </w:trPr>
+        <w:tc>
+          <w:tcPr>
+            <w:tcW w:type="dxa" w:w="2381"/>
+          </w:tcPr>
+          <w:p>
+            <w:pPr>
+              <w:spacing w:after="0"/>
+            </w:pPr>
+            <w:r>
+              <w:rPr>
+                <w:rFonts w:ascii="Consolas" w:hAnsi="Consolas"/>
+                <w:b w:val="0"/>
+                <w:color w:val="233C7D"/>
+                <w:sz w:val="19"/>
+              </w:rPr>
+              <w:t>smtpPort</w:t>
+            </w:r>
+          </w:p>
+        </w:tc>
+        <w:tc>
+          <w:tcPr>
+            <w:tcW w:type="dxa" w:w="2608"/>
+          </w:tcPr>
+          <w:p>
+            <w:pPr>
+              <w:spacing w:after="0"/>
+            </w:pPr>
+            <w:r>
+              <w:rPr>
+                <w:rFonts w:ascii="Consolas" w:hAnsi="Consolas"/>
+                <w:b w:val="0"/>
+                <w:color w:val="233C7D"/>
+                <w:sz w:val="19"/>
+              </w:rPr>
+              <w:t>number (intero) | null</w:t>
+            </w:r>
+          </w:p>
+        </w:tc>
+        <w:tc>
+          <w:tcPr>
+            <w:tcW w:type="dxa" w:w="4876"/>
+          </w:tcPr>
+          <w:p>
+            <w:pPr>
+              <w:spacing w:after="0"/>
+            </w:pPr>
+            <w:r>
+              <w:rPr>
+                <w:b w:val="0"/>
+                <w:sz w:val="19"/>
+              </w:rPr>
+              <w:t>Porta scritta nel campo (smtp_port); null se il campo non contiene un numero intero.</w:t>
+            </w:r>
+          </w:p>
+        </w:tc>
+      </w:tr>
+      <w:tr>
+        <w:trPr>
+          <w:cantSplit w:val="true"/>
+        </w:trPr>
+        <w:tc>
+          <w:tcPr>
+            <w:tcW w:type="dxa" w:w="2381"/>
+            <w:shd w:val="clear" w:color="auto" w:fill="F1F3F8"/>
+          </w:tcPr>
+          <w:p>
+            <w:pPr>
+              <w:spacing w:after="0"/>
+            </w:pPr>
+            <w:r>
+              <w:rPr>
+                <w:rFonts w:ascii="Consolas" w:hAnsi="Consolas"/>
+                <w:b w:val="0"/>
+                <w:color w:val="233C7D"/>
+                <w:sz w:val="19"/>
+              </w:rPr>
+              <w:t>smtpUsername</w:t>
+            </w:r>
+          </w:p>
+        </w:tc>
+        <w:tc>
+          <w:tcPr>
+            <w:tcW w:type="dxa" w:w="2608"/>
+            <w:shd w:val="clear" w:color="auto" w:fill="F1F3F8"/>
+          </w:tcPr>
+          <w:p>
+            <w:pPr>
+              <w:spacing w:after="0"/>
+            </w:pPr>
+            <w:r>
+              <w:rPr>
+                <w:rFonts w:ascii="Consolas" w:hAnsi="Consolas"/>
+                <w:b w:val="0"/>
+                <w:color w:val="233C7D"/>
+                <w:sz w:val="19"/>
+              </w:rPr>
+              <w:t>string</w:t>
+            </w:r>
+          </w:p>
+        </w:tc>
+        <w:tc>
+          <w:tcPr>
+            <w:tcW w:type="dxa" w:w="4876"/>
+            <w:shd w:val="clear" w:color="auto" w:fill="F1F3F8"/>
+          </w:tcPr>
+          <w:p>
+            <w:pPr>
+              <w:spacing w:after="0"/>
+            </w:pPr>
+            <w:r>
+              <w:rPr>
+                <w:b w:val="0"/>
+                <w:sz w:val="19"/>
+              </w:rPr>
+              <w:t>Nome utente scritto nel campo (smtp_username).</w:t>
+            </w:r>
+          </w:p>
+        </w:tc>
+      </w:tr>
+      <w:tr>
+        <w:trPr>
+          <w:cantSplit w:val="true"/>
+        </w:trPr>
+        <w:tc>
+          <w:tcPr>
+            <w:tcW w:type="dxa" w:w="2381"/>
+          </w:tcPr>
+          <w:p>
+            <w:pPr>
+              <w:spacing w:after="0"/>
+            </w:pPr>
+            <w:r>
+              <w:rPr>
+                <w:rFonts w:ascii="Consolas" w:hAnsi="Consolas"/>
+                <w:b w:val="0"/>
+                <w:color w:val="233C7D"/>
+                <w:sz w:val="19"/>
+              </w:rPr>
+              <w:t>smtpPassword</w:t>
+            </w:r>
+          </w:p>
+        </w:tc>
+        <w:tc>
+          <w:tcPr>
+            <w:tcW w:type="dxa" w:w="2608"/>
+          </w:tcPr>
+          <w:p>
+            <w:pPr>
+              <w:spacing w:after="0"/>
+            </w:pPr>
+            <w:r>
+              <w:rPr>
+                <w:rFonts w:ascii="Consolas" w:hAnsi="Consolas"/>
+                <w:b w:val="0"/>
+                <w:color w:val="233C7D"/>
+                <w:sz w:val="19"/>
+              </w:rPr>
+              <w:t>string</w:t>
+            </w:r>
+          </w:p>
+        </w:tc>
+        <w:tc>
+          <w:tcPr>
+            <w:tcW w:type="dxa" w:w="4876"/>
+          </w:tcPr>
+          <w:p>
+            <w:pPr>
+              <w:spacing w:after="0"/>
+            </w:pPr>
+            <w:r>
+              <w:rPr>
+                <w:b w:val="0"/>
+                <w:sz w:val="19"/>
+              </w:rPr>
+              <w:t>Password scritta nel campo (smtp_password).</w:t>
+            </w:r>
+          </w:p>
+        </w:tc>
+      </w:tr>
+      <w:tr>
+        <w:trPr>
+          <w:cantSplit w:val="true"/>
+        </w:trPr>
+        <w:tc>
+          <w:tcPr>
+            <w:tcW w:type="dxa" w:w="2381"/>
+            <w:shd w:val="clear" w:color="auto" w:fill="F1F3F8"/>
+          </w:tcPr>
+          <w:p>
+            <w:pPr>
+              <w:spacing w:after="0"/>
+            </w:pPr>
+            <w:r>
+              <w:rPr>
+                <w:rFonts w:ascii="Consolas" w:hAnsi="Consolas"/>
+                <w:b w:val="0"/>
+                <w:color w:val="233C7D"/>
+                <w:sz w:val="19"/>
+              </w:rPr>
+              <w:t>smtpSecurity</w:t>
+            </w:r>
+          </w:p>
+        </w:tc>
+        <w:tc>
+          <w:tcPr>
+            <w:tcW w:type="dxa" w:w="2608"/>
+            <w:shd w:val="clear" w:color="auto" w:fill="F1F3F8"/>
+          </w:tcPr>
+          <w:p>
+            <w:pPr>
+              <w:spacing w:after="0"/>
+            </w:pPr>
+            <w:r>
+              <w:rPr>
+                <w:rFonts w:ascii="Consolas" w:hAnsi="Consolas"/>
+                <w:b w:val="0"/>
+                <w:color w:val="233C7D"/>
+                <w:sz w:val="19"/>
+              </w:rPr>
+              <w:t>string (enum SmtpSecurity) | null</w:t>
+            </w:r>
+          </w:p>
+        </w:tc>
+        <w:tc>
+          <w:tcPr>
+            <w:tcW w:type="dxa" w:w="4876"/>
+            <w:shd w:val="clear" w:color="auto" w:fill="F1F3F8"/>
+          </w:tcPr>
+          <w:p>
+            <w:pPr>
+              <w:spacing w:after="0"/>
+            </w:pPr>
+            <w:r>
+              <w:rPr>
+                <w:b w:val="0"/>
+                <w:sz w:val="19"/>
+              </w:rPr>
+              <w:t>Tipo di sicurezza scelto: None, Ssl o Tls; null se non scelto.</w:t>
+            </w:r>
+          </w:p>
+        </w:tc>
+      </w:tr>
+    </w:tbl>
+    <w:p>
+      <w:pPr>
+        <w:spacing w:after="40"/>
+      </w:pPr>
+    </w:p>
+    <w:p>
+      <w:pPr>
+        <w:pStyle w:val="Heading3"/>
+      </w:pPr>
+      <w:r>
+        <w:t>Esempio di richiesta (JSON)</w:t>
+      </w:r>
+    </w:p>
+    <w:p>
+      <w:pPr>
+        <w:keepNext/>
+        <w:spacing w:after="0"/>
+        <w:shd w:val="clear" w:color="auto" w:fill="F1F3F8"/>
+      </w:pPr>
+      <w:r>
+        <w:rPr>
+          <w:rFonts w:ascii="Consolas" w:hAnsi="Consolas"/>
+          <w:b w:val="0"/>
+          <w:color w:val="233C7D"/>
+          <w:sz w:val="19"/>
+        </w:rPr>
+        <w:t>{</w:t>
+      </w:r>
+    </w:p>
+    <w:p>
+      <w:pPr>
+        <w:keepNext/>
+        <w:spacing w:after="0"/>
+        <w:shd w:val="clear" w:color="auto" w:fill="F1F3F8"/>
+      </w:pPr>
+      <w:r>
+        <w:rPr>
+          <w:rFonts w:ascii="Consolas" w:hAnsi="Consolas"/>
+          <w:b w:val="0"/>
+          <w:color w:val="233C7D"/>
+          <w:sz w:val="19"/>
+        </w:rPr>
+        <w:t xml:space="preserve">  "idProperty": "5b1f3c7e-2d4a-4e8b-9c1d-7a6e5f4b3c2d",</w:t>
+      </w:r>
+    </w:p>
+    <w:p>
+      <w:pPr>
+        <w:keepNext/>
+        <w:spacing w:after="0"/>
+        <w:shd w:val="clear" w:color="auto" w:fill="F1F3F8"/>
+      </w:pPr>
+      <w:r>
+        <w:rPr>
+          <w:rFonts w:ascii="Consolas" w:hAnsi="Consolas"/>
+          <w:b w:val="0"/>
+          <w:color w:val="233C7D"/>
+          <w:sz w:val="19"/>
+        </w:rPr>
+        <w:t xml:space="preserve">  "senderMailAddress": "prenotazioni@lido-demo.example",</w:t>
+      </w:r>
+    </w:p>
+    <w:p>
+      <w:pPr>
+        <w:keepNext/>
+        <w:spacing w:after="0"/>
+        <w:shd w:val="clear" w:color="auto" w:fill="F1F3F8"/>
+      </w:pPr>
+      <w:r>
+        <w:rPr>
+          <w:rFonts w:ascii="Consolas" w:hAnsi="Consolas"/>
+          <w:b w:val="0"/>
+          <w:color w:val="233C7D"/>
+          <w:sz w:val="19"/>
+        </w:rPr>
+        <w:t xml:space="preserve">  "senderName": "Lido Demo",</w:t>
+      </w:r>
+    </w:p>
+    <w:p>
+      <w:pPr>
+        <w:keepNext/>
+        <w:spacing w:after="0"/>
+        <w:shd w:val="clear" w:color="auto" w:fill="F1F3F8"/>
+      </w:pPr>
+      <w:r>
+        <w:rPr>
+          <w:rFonts w:ascii="Consolas" w:hAnsi="Consolas"/>
+          <w:b w:val="0"/>
+          <w:color w:val="233C7D"/>
+          <w:sz w:val="19"/>
+        </w:rPr>
+        <w:t xml:space="preserve">  "smtpServerAddress": "smtp.lido-demo.example",</w:t>
+      </w:r>
+    </w:p>
+    <w:p>
+      <w:pPr>
+        <w:keepNext/>
+        <w:spacing w:after="0"/>
+        <w:shd w:val="clear" w:color="auto" w:fill="F1F3F8"/>
+      </w:pPr>
+      <w:r>
+        <w:rPr>
+          <w:rFonts w:ascii="Consolas" w:hAnsi="Consolas"/>
+          <w:b w:val="0"/>
+          <w:color w:val="233C7D"/>
+          <w:sz w:val="19"/>
+        </w:rPr>
+        <w:t xml:space="preserve">  "smtpPort": 587,</w:t>
+      </w:r>
+    </w:p>
+    <w:p>
+      <w:pPr>
+        <w:keepNext/>
+        <w:spacing w:after="0"/>
+        <w:shd w:val="clear" w:color="auto" w:fill="F1F3F8"/>
+      </w:pPr>
+      <w:r>
+        <w:rPr>
+          <w:rFonts w:ascii="Consolas" w:hAnsi="Consolas"/>
+          <w:b w:val="0"/>
+          <w:color w:val="233C7D"/>
+          <w:sz w:val="19"/>
+        </w:rPr>
+        <w:t xml:space="preserve">  "smtpUsername": "prenotazioni@lido-demo.example",</w:t>
+      </w:r>
+    </w:p>
+    <w:p>
+      <w:pPr>
+        <w:keepNext/>
+        <w:spacing w:after="0"/>
+        <w:shd w:val="clear" w:color="auto" w:fill="F1F3F8"/>
+      </w:pPr>
+      <w:r>
+        <w:rPr>
+          <w:rFonts w:ascii="Consolas" w:hAnsi="Consolas"/>
+          <w:b w:val="0"/>
+          <w:color w:val="233C7D"/>
+          <w:sz w:val="19"/>
+        </w:rPr>
+        <w:t xml:space="preserve">  "smtpPassword": "password-di-esempio",</w:t>
+      </w:r>
+    </w:p>
+    <w:p>
+      <w:pPr>
+        <w:keepNext/>
+        <w:spacing w:after="0"/>
+        <w:shd w:val="clear" w:color="auto" w:fill="F1F3F8"/>
+      </w:pPr>
+      <w:r>
+        <w:rPr>
+          <w:rFonts w:ascii="Consolas" w:hAnsi="Consolas"/>
+          <w:b w:val="0"/>
+          <w:color w:val="233C7D"/>
+          <w:sz w:val="19"/>
+        </w:rPr>
+        <w:t xml:space="preserve">  "smtpSecurity": "Tls"</w:t>
+      </w:r>
+    </w:p>
+    <w:p>
+      <w:pPr>
+        <w:keepNext w:val="0"/>
+        <w:spacing w:after="120"/>
+        <w:shd w:val="clear" w:color="auto" w:fill="F1F3F8"/>
+      </w:pPr>
+      <w:r>
+        <w:rPr>
+          <w:rFonts w:ascii="Consolas" w:hAnsi="Consolas"/>
+          <w:b w:val="0"/>
+          <w:color w:val="233C7D"/>
+          <w:sz w:val="19"/>
+        </w:rPr>
+        <w:t>}</w:t>
+      </w:r>
+    </w:p>
+    <w:p>
+      <w:pPr>
+        <w:pStyle w:val="Heading2"/>
+      </w:pPr>
+      <w:r>
+        <w:t>Risposta attesa dal server</w:t>
+      </w:r>
+    </w:p>
+    <w:p>
+      <w:pPr>
+        <w:spacing w:after="40"/>
+      </w:pPr>
+      <w:r>
+        <w:rPr>
+          <w:b/>
+        </w:rPr>
+        <w:t xml:space="preserve">Stato: </w:t>
+      </w:r>
+      <w:r>
+        <w:rPr>
+          <w:b w:val="0"/>
+        </w:rPr>
+        <w:t>204 No Content (nessun corpo)</w:t>
+      </w:r>
+    </w:p>
+    <w:p>
+      <w:r>
+        <w:t>Nessun corpo nella risposta, quindi nessun JSON.</w:t>
+      </w:r>
+    </w:p>
+    <w:p>
+      <w:pPr>
+        <w:pStyle w:val="Heading2"/>
+      </w:pPr>
+      <w:r>
+        <w:t>Errori possibili</w:t>
+      </w:r>
+    </w:p>
+    <w:tbl>
+      <w:tblPr>
+        <w:tblW w:type="auto" w:w="0"/>
+        <w:jc w:val="center"/>
+        <w:tblLayout w:type="fixed"/>
+        <w:tblLook w:firstColumn="1" w:firstRow="1" w:lastColumn="0" w:lastRow="0" w:noHBand="0" w:noVBand="1" w:val="04A0"/>
+        <w:tblBorders>
+          <w:top w:val="single" w:sz="4" w:color="C9CED8"/>
+          <w:left w:val="single" w:sz="4" w:color="C9CED8"/>
+          <w:bottom w:val="single" w:sz="4" w:color="C9CED8"/>
+          <w:right w:val="single" w:sz="4" w:color="C9CED8"/>
+          <w:insideH w:val="single" w:sz="4" w:color="C9CED8"/>
+          <w:insideV w:val="single" w:sz="4" w:color="C9CED8"/>
+        </w:tblBorders>
+      </w:tblPr>
+      <w:tblGrid>
+        <w:gridCol w:w="3289"/>
+        <w:gridCol w:w="3289"/>
+        <w:gridCol w:w="3289"/>
+      </w:tblGrid>
+      <w:tr>
+        <w:trPr>
+          <w:cantSplit w:val="true"/>
+          <w:tblHeader w:val="true"/>
+        </w:trPr>
+        <w:tc>
+          <w:tcPr>
+            <w:tcW w:type="dxa" w:w="907"/>
+            <w:shd w:val="clear" w:color="auto" w:fill="233C7D"/>
+          </w:tcPr>
+          <w:p>
+            <w:pPr>
+              <w:spacing w:after="0"/>
+            </w:pPr>
+            <w:r>
+              <w:rPr>
+                <w:b/>
+                <w:color w:val="FFFFFF"/>
+                <w:sz w:val="20"/>
+              </w:rPr>
+              <w:t>Status</w:t>
+            </w:r>
+          </w:p>
+        </w:tc>
+        <w:tc>
+          <w:tcPr>
+            <w:tcW w:type="dxa" w:w="3061"/>
+            <w:shd w:val="clear" w:color="auto" w:fill="233C7D"/>
+          </w:tcPr>
+          <w:p>
+            <w:pPr>
+              <w:spacing w:after="0"/>
+            </w:pPr>
+            <w:r>
+              <w:rPr>
+                <w:b/>
+                <w:color w:val="FFFFFF"/>
+                <w:sz w:val="20"/>
+              </w:rPr>
+              <w:t>Codice</w:t>
+            </w:r>
+          </w:p>
+        </w:tc>
+        <w:tc>
+          <w:tcPr>
+            <w:tcW w:type="dxa" w:w="5896"/>
+            <w:shd w:val="clear" w:color="auto" w:fill="233C7D"/>
+          </w:tcPr>
+          <w:p>
+            <w:pPr>
+              <w:spacing w:after="0"/>
+            </w:pPr>
+            <w:r>
+              <w:rPr>
+                <w:b/>
+                <w:color w:val="FFFFFF"/>
+                <w:sz w:val="20"/>
+              </w:rPr>
+              <w:t>Quando</w:t>
+            </w:r>
+          </w:p>
+        </w:tc>
+      </w:tr>
+      <w:tr>
+        <w:trPr>
+          <w:cantSplit w:val="true"/>
+        </w:trPr>
+        <w:tc>
+          <w:tcPr>
+            <w:tcW w:type="dxa" w:w="907"/>
+          </w:tcPr>
+          <w:p>
+            <w:pPr>
+              <w:spacing w:after="0"/>
+            </w:pPr>
+            <w:r>
+              <w:rPr>
+                <w:rFonts w:ascii="Consolas" w:hAnsi="Consolas"/>
+                <w:b w:val="0"/>
+                <w:color w:val="233C7D"/>
+                <w:sz w:val="19"/>
+              </w:rPr>
+              <w:t>400</w:t>
+            </w:r>
+          </w:p>
+        </w:tc>
+        <w:tc>
+          <w:tcPr>
+            <w:tcW w:type="dxa" w:w="3061"/>
+          </w:tcPr>
+          <w:p>
+            <w:pPr>
+              <w:spacing w:after="0"/>
+            </w:pPr>
+            <w:r>
+              <w:rPr>
+                <w:rFonts w:ascii="Consolas" w:hAnsi="Consolas"/>
+                <w:b w:val="0"/>
+                <w:color w:val="233C7D"/>
+                <w:sz w:val="19"/>
+              </w:rPr>
+              <w:t>validation.invalid_request</w:t>
+            </w:r>
+          </w:p>
+        </w:tc>
+        <w:tc>
+          <w:tcPr>
+            <w:tcW w:type="dxa" w:w="5896"/>
+          </w:tcPr>
+          <w:p>
+            <w:pPr>
+              <w:spacing w:after="0"/>
+            </w:pPr>
+            <w:r>
+              <w:rPr>
+                <w:b w:val="0"/>
+                <w:sz w:val="19"/>
+              </w:rPr>
+              <w:t>Campi mancanti o non validi (indirizzo mittente, server, nome utente vuoti; porta assente o fuori da 1-65535; sicurezza non valida): in errors[] validation.invalid_value per ognuno.</w:t>
+            </w:r>
+          </w:p>
+        </w:tc>
+      </w:tr>
+      <w:tr>
+        <w:trPr>
+          <w:cantSplit w:val="true"/>
+        </w:trPr>
+        <w:tc>
+          <w:tcPr>
+            <w:tcW w:type="dxa" w:w="907"/>
+            <w:shd w:val="clear" w:color="auto" w:fill="F1F3F8"/>
+          </w:tcPr>
+          <w:p>
+            <w:pPr>
+              <w:spacing w:after="0"/>
+            </w:pPr>
+            <w:r>
+              <w:rPr>
+                <w:rFonts w:ascii="Consolas" w:hAnsi="Consolas"/>
+                <w:b w:val="0"/>
+                <w:color w:val="233C7D"/>
+                <w:sz w:val="19"/>
+              </w:rPr>
+              <w:t>401</w:t>
+            </w:r>
+          </w:p>
+        </w:tc>
+        <w:tc>
+          <w:tcPr>
+            <w:tcW w:type="dxa" w:w="3061"/>
+            <w:shd w:val="clear" w:color="auto" w:fill="F1F3F8"/>
+          </w:tcPr>
+          <w:p>
+            <w:pPr>
+              <w:spacing w:after="0"/>
+            </w:pPr>
+            <w:r>
+              <w:rPr>
+                <w:rFonts w:ascii="Consolas" w:hAnsi="Consolas"/>
+                <w:b w:val="0"/>
+                <w:color w:val="233C7D"/>
+                <w:sz w:val="19"/>
+              </w:rPr>
+              <w:t>auth.invalid_token</w:t>
+            </w:r>
+          </w:p>
+        </w:tc>
+        <w:tc>
+          <w:tcPr>
+            <w:tcW w:type="dxa" w:w="5896"/>
+            <w:shd w:val="clear" w:color="auto" w:fill="F1F3F8"/>
+          </w:tcPr>
+          <w:p>
+            <w:pPr>
+              <w:spacing w:after="0"/>
+            </w:pPr>
+            <w:r>
+              <w:rPr>
+                <w:b w:val="0"/>
+                <w:sz w:val="19"/>
+              </w:rPr>
+              <w:t>Access token assente, scaduto o non valido: il frontend rinnova il token e ripete la chiamata una volta.</w:t>
+            </w:r>
+          </w:p>
+        </w:tc>
+      </w:tr>
+      <w:tr>
+        <w:trPr>
+          <w:cantSplit w:val="true"/>
+        </w:trPr>
+        <w:tc>
+          <w:tcPr>
+            <w:tcW w:type="dxa" w:w="907"/>
+          </w:tcPr>
+          <w:p>
+            <w:pPr>
+              <w:spacing w:after="0"/>
+            </w:pPr>
+            <w:r>
+              <w:rPr>
+                <w:rFonts w:ascii="Consolas" w:hAnsi="Consolas"/>
+                <w:b w:val="0"/>
+                <w:color w:val="233C7D"/>
+                <w:sz w:val="19"/>
+              </w:rPr>
+              <w:t>500</w:t>
+            </w:r>
+          </w:p>
+        </w:tc>
+        <w:tc>
+          <w:tcPr>
+            <w:tcW w:type="dxa" w:w="3061"/>
+          </w:tcPr>
+          <w:p>
+            <w:pPr>
+              <w:spacing w:after="0"/>
+            </w:pPr>
+            <w:r>
+              <w:rPr>
+                <w:rFonts w:ascii="Consolas" w:hAnsi="Consolas"/>
+                <w:b w:val="0"/>
+                <w:color w:val="233C7D"/>
+                <w:sz w:val="19"/>
+              </w:rPr>
+              <w:t>server.unexpected</w:t>
+            </w:r>
+          </w:p>
+        </w:tc>
+        <w:tc>
+          <w:tcPr>
+            <w:tcW w:type="dxa" w:w="5896"/>
+          </w:tcPr>
+          <w:p>
+            <w:pPr>
+              <w:spacing w:after="0"/>
+            </w:pPr>
+            <w:r>
+              <w:rPr>
+                <w:b w:val="0"/>
+                <w:sz w:val="19"/>
+              </w:rPr>
+              <w:t>Errore non gestito del server (vale per ogni API).</w:t>
+            </w:r>
+          </w:p>
+        </w:tc>
+      </w:tr>
+    </w:tbl>
+    <w:p>
+      <w:pPr>
+        <w:spacing w:after="40"/>
+      </w:pPr>
+    </w:p>
+    <w:p>
+      <w:pPr>
+        <w:pStyle w:val="Heading3"/>
+      </w:pPr>
+      <w:r>
+        <w:t>Esempio di errore (JSON)</w:t>
+      </w:r>
+    </w:p>
+    <w:p>
+      <w:pPr>
+        <w:keepNext/>
+      </w:pPr>
+      <w:r>
+        <w:t>Risposta a una richiesta con la porta non valida:</w:t>
+      </w:r>
+    </w:p>
+    <w:p>
+      <w:pPr>
+        <w:keepNext/>
+        <w:spacing w:after="0"/>
+        <w:shd w:val="clear" w:color="auto" w:fill="F1F3F8"/>
+      </w:pPr>
+      <w:r>
+        <w:rPr>
+          <w:rFonts w:ascii="Consolas" w:hAnsi="Consolas"/>
+          <w:b w:val="0"/>
+          <w:color w:val="233C7D"/>
+          <w:sz w:val="19"/>
+        </w:rPr>
+        <w:t>{</w:t>
+      </w:r>
+    </w:p>
+    <w:p>
+      <w:pPr>
+        <w:keepNext/>
+        <w:spacing w:after="0"/>
+        <w:shd w:val="clear" w:color="auto" w:fill="F1F3F8"/>
+      </w:pPr>
+      <w:r>
+        <w:rPr>
+          <w:rFonts w:ascii="Consolas" w:hAnsi="Consolas"/>
+          <w:b w:val="0"/>
+          <w:color w:val="233C7D"/>
+          <w:sz w:val="19"/>
+        </w:rPr>
+        <w:t xml:space="preserve">  "type": "https://errors.summerbooking/validation/invalid-request",</w:t>
+      </w:r>
+    </w:p>
+    <w:p>
+      <w:pPr>
+        <w:keepNext/>
+        <w:spacing w:after="0"/>
+        <w:shd w:val="clear" w:color="auto" w:fill="F1F3F8"/>
+      </w:pPr>
+      <w:r>
+        <w:rPr>
+          <w:rFonts w:ascii="Consolas" w:hAnsi="Consolas"/>
+          <w:b w:val="0"/>
+          <w:color w:val="233C7D"/>
+          <w:sz w:val="19"/>
+        </w:rPr>
+        <w:t xml:space="preserve">  "status": 400,</w:t>
+      </w:r>
+    </w:p>
+    <w:p>
+      <w:pPr>
+        <w:keepNext/>
+        <w:spacing w:after="0"/>
+        <w:shd w:val="clear" w:color="auto" w:fill="F1F3F8"/>
+      </w:pPr>
+      <w:r>
+        <w:rPr>
+          <w:rFonts w:ascii="Consolas" w:hAnsi="Consolas"/>
+          <w:b w:val="0"/>
+          <w:color w:val="233C7D"/>
+          <w:sz w:val="19"/>
+        </w:rPr>
+        <w:t xml:space="preserve">  "code": "validation.invalid_request",</w:t>
+      </w:r>
+    </w:p>
+    <w:p>
+      <w:pPr>
+        <w:keepNext/>
+        <w:spacing w:after="0"/>
+        <w:shd w:val="clear" w:color="auto" w:fill="F1F3F8"/>
+      </w:pPr>
+      <w:r>
+        <w:rPr>
+          <w:rFonts w:ascii="Consolas" w:hAnsi="Consolas"/>
+          <w:b w:val="0"/>
+          <w:color w:val="233C7D"/>
+          <w:sz w:val="19"/>
+        </w:rPr>
+        <w:t xml:space="preserve">  "title": "Invalid request",</w:t>
+      </w:r>
+    </w:p>
+    <w:p>
+      <w:pPr>
+        <w:keepNext/>
+        <w:spacing w:after="0"/>
+        <w:shd w:val="clear" w:color="auto" w:fill="F1F3F8"/>
+      </w:pPr>
+      <w:r>
+        <w:rPr>
+          <w:rFonts w:ascii="Consolas" w:hAnsi="Consolas"/>
+          <w:b w:val="0"/>
+          <w:color w:val="233C7D"/>
+          <w:sz w:val="19"/>
+        </w:rPr>
+        <w:t xml:space="preserve">  "errors": [</w:t>
+      </w:r>
+    </w:p>
+    <w:p>
+      <w:pPr>
+        <w:keepNext/>
+        <w:spacing w:after="0"/>
+        <w:shd w:val="clear" w:color="auto" w:fill="F1F3F8"/>
+      </w:pPr>
+      <w:r>
+        <w:rPr>
+          <w:rFonts w:ascii="Consolas" w:hAnsi="Consolas"/>
+          <w:b w:val="0"/>
+          <w:color w:val="233C7D"/>
+          <w:sz w:val="19"/>
+        </w:rPr>
+        <w:t xml:space="preserve">    {</w:t>
+      </w:r>
+    </w:p>
+    <w:p>
+      <w:pPr>
+        <w:keepNext/>
+        <w:spacing w:after="0"/>
+        <w:shd w:val="clear" w:color="auto" w:fill="F1F3F8"/>
+      </w:pPr>
+      <w:r>
+        <w:rPr>
+          <w:rFonts w:ascii="Consolas" w:hAnsi="Consolas"/>
+          <w:b w:val="0"/>
+          <w:color w:val="233C7D"/>
+          <w:sz w:val="19"/>
+        </w:rPr>
+        <w:t xml:space="preserve">      "field": "smtpPort",</w:t>
+      </w:r>
+    </w:p>
+    <w:p>
+      <w:pPr>
+        <w:keepNext/>
+        <w:spacing w:after="0"/>
+        <w:shd w:val="clear" w:color="auto" w:fill="F1F3F8"/>
+      </w:pPr>
+      <w:r>
+        <w:rPr>
+          <w:rFonts w:ascii="Consolas" w:hAnsi="Consolas"/>
+          <w:b w:val="0"/>
+          <w:color w:val="233C7D"/>
+          <w:sz w:val="19"/>
+        </w:rPr>
+        <w:t xml:space="preserve">      "code": "validation.invalid_value"</w:t>
+      </w:r>
+    </w:p>
+    <w:p>
+      <w:pPr>
+        <w:keepNext/>
+        <w:spacing w:after="0"/>
+        <w:shd w:val="clear" w:color="auto" w:fill="F1F3F8"/>
+      </w:pPr>
+      <w:r>
+        <w:rPr>
+          <w:rFonts w:ascii="Consolas" w:hAnsi="Consolas"/>
+          <w:b w:val="0"/>
+          <w:color w:val="233C7D"/>
+          <w:sz w:val="19"/>
+        </w:rPr>
+        <w:t xml:space="preserve">    }</w:t>
+      </w:r>
+    </w:p>
+    <w:p>
+      <w:pPr>
+        <w:keepNext/>
+        <w:spacing w:after="0"/>
+        <w:shd w:val="clear" w:color="auto" w:fill="F1F3F8"/>
+      </w:pPr>
+      <w:r>
+        <w:rPr>
+          <w:rFonts w:ascii="Consolas" w:hAnsi="Consolas"/>
+          <w:b w:val="0"/>
+          <w:color w:val="233C7D"/>
+          <w:sz w:val="19"/>
+        </w:rPr>
+        <w:t xml:space="preserve">  ],</w:t>
+      </w:r>
+    </w:p>
+    <w:p>
+      <w:pPr>
+        <w:keepNext/>
+        <w:spacing w:after="0"/>
+        <w:shd w:val="clear" w:color="auto" w:fill="F1F3F8"/>
+      </w:pPr>
+      <w:r>
+        <w:rPr>
+          <w:rFonts w:ascii="Consolas" w:hAnsi="Consolas"/>
+          <w:b w:val="0"/>
+          <w:color w:val="233C7D"/>
+          <w:sz w:val="19"/>
+        </w:rPr>
+        <w:t xml:space="preserve">  "traceId": "00-4bf92f3577b34da6a3ce929d0e0e4736-00f067aa0ba902b7-01"</w:t>
+      </w:r>
+    </w:p>
+    <w:p>
+      <w:pPr>
+        <w:keepNext w:val="0"/>
+        <w:spacing w:after="120"/>
+        <w:shd w:val="clear" w:color="auto" w:fill="F1F3F8"/>
+      </w:pPr>
+      <w:r>
+        <w:rPr>
+          <w:rFonts w:ascii="Consolas" w:hAnsi="Consolas"/>
+          <w:b w:val="0"/>
+          <w:color w:val="233C7D"/>
+          <w:sz w:val="19"/>
+        </w:rPr>
+        <w:t>}</w:t>
+      </w:r>
+    </w:p>
+    <w:p>
+      <w:pPr>
+        <w:pStyle w:val="Heading1"/>
+        <w:pageBreakBefore/>
+      </w:pPr>
+      <w:r>
+        <w:rPr>
+          <w:b w:val="0"/>
+        </w:rPr>
+        <w:t xml:space="preserve">POST </w:t>
+      </w:r>
+      <w:r>
+        <w:rPr>
+          <w:rFonts w:ascii="Consolas" w:hAnsi="Consolas"/>
+          <w:b w:val="0"/>
+        </w:rPr>
+        <w:t>/api/system/save-email-configuration</w:t>
+      </w:r>
+    </w:p>
+    <w:p>
+      <w:r>
+        <w:t>Configurazione email: salvataggio</w:t>
+      </w:r>
+    </w:p>
+    <w:p>
+      <w:pPr>
+        <w:spacing w:after="40"/>
+      </w:pPr>
+      <w:r>
+        <w:rPr>
+          <w:b/>
+        </w:rPr>
+        <w:t xml:space="preserve">Metodo: </w:t>
+      </w:r>
+      <w:r>
+        <w:rPr>
+          <w:rFonts w:ascii="Consolas" w:hAnsi="Consolas"/>
+          <w:b w:val="0"/>
+          <w:color w:val="233C7D"/>
+        </w:rPr>
+        <w:t>POST</w:t>
+      </w:r>
+    </w:p>
+    <w:p>
+      <w:pPr>
+        <w:spacing w:after="40"/>
+      </w:pPr>
+      <w:r>
+        <w:rPr>
+          <w:b/>
+        </w:rPr>
+        <w:t xml:space="preserve">Route: </w:t>
+      </w:r>
+      <w:r>
+        <w:rPr>
+          <w:rFonts w:ascii="Consolas" w:hAnsi="Consolas"/>
+          <w:b w:val="0"/>
+          <w:color w:val="233C7D"/>
+        </w:rPr>
+        <w:t>/api/system/save-email-configuration</w:t>
+      </w:r>
+    </w:p>
+    <w:p>
+      <w:pPr>
+        <w:spacing w:after="40"/>
+      </w:pPr>
+      <w:r>
+        <w:rPr>
+          <w:b/>
+        </w:rPr>
+        <w:t xml:space="preserve">Nel frontend: </w:t>
+      </w:r>
+      <w:r>
+        <w:rPr>
+          <w:rFonts w:ascii="Consolas" w:hAnsi="Consolas"/>
+          <w:b w:val="0"/>
+          <w:color w:val="233C7D"/>
+        </w:rPr>
+        <w:t>SystemService.saveEmailConfiguration</w:t>
+      </w:r>
+    </w:p>
+    <w:p>
+      <w:pPr>
+        <w:spacing w:after="40"/>
+      </w:pPr>
+      <w:r>
+        <w:rPr>
+          <w:b/>
+        </w:rPr>
+        <w:t xml:space="preserve">Autenticazione: </w:t>
+      </w:r>
+      <w:r>
+        <w:rPr>
+          <w:b w:val="0"/>
+        </w:rPr>
+        <w:t>Header Authorization: Bearer &lt;accessToken&gt;.</w:t>
+      </w:r>
+    </w:p>
+    <w:p>
+      <w:pPr>
+        <w:pStyle w:val="ListBullet"/>
+      </w:pPr>
+      <w:r>
+        <w:t>La chiama il bottone "Salva" della pagina Configurazione email, con i valori presenti nei campi in quel momento. Il corpo è lo stesso dell'invio di prova.</w:t>
+      </w:r>
+    </w:p>
+    <w:p>
+      <w:pPr>
+        <w:pStyle w:val="ListBullet"/>
+      </w:pPr>
+      <w:r>
+        <w:t>Dopo il salvataggio la lettura (GET system/email-configuration, anche con il bottone Reset) deve restituire i valori salvati.</w:t>
+      </w:r>
+    </w:p>
+    <w:p>
+      <w:pPr>
+        <w:pStyle w:val="ListBullet"/>
+      </w:pPr>
+      <w:r>
+        <w:t>Durante la chiamata il bottone mostra lo spinner e gli altri due bottoni sono disattivi; se riesce compare il popup "Configurazione salvata", se fallisce il messaggio del code sotto il riquadro.</w:t>
+      </w:r>
+    </w:p>
+    <w:p>
+      <w:pPr>
+        <w:pStyle w:val="ListBullet"/>
+      </w:pPr>
+      <w:r>
+        <w:t>Sicurezza: vedi la nota della lettura sulla password SMTP (proposta: inviarla solo se cambiata).</w:t>
+      </w:r>
+    </w:p>
+    <w:p>
+      <w:pPr>
+        <w:pStyle w:val="ListBullet"/>
+      </w:pPr>
+      <w:r>
+        <w:t>Metodo POST e risposta 204 senza corpo sono una proposta del frontend, da confermare col backend.</w:t>
+      </w:r>
+    </w:p>
+    <w:p>
+      <w:pPr>
+        <w:pStyle w:val="Heading2"/>
+      </w:pPr>
+      <w:r>
+        <w:t>Payload inviato al backend</w:t>
+      </w:r>
+    </w:p>
+    <w:p>
+      <w:pPr>
+        <w:pStyle w:val="Heading3"/>
+      </w:pPr>
+      <w:r>
+        <w:rPr>
+          <w:b w:val="0"/>
+        </w:rPr>
+        <w:t xml:space="preserve">Corpo JSON: </w:t>
+      </w:r>
+      <w:r>
+        <w:rPr>
+          <w:rFonts w:ascii="Consolas" w:hAnsi="Consolas"/>
+          <w:b w:val="0"/>
+        </w:rPr>
+        <w:t>EmailConfigurationRequest</w:t>
+      </w:r>
+    </w:p>
+    <w:tbl>
+      <w:tblPr>
+        <w:tblW w:type="auto" w:w="0"/>
+        <w:jc w:val="center"/>
+        <w:tblLayout w:type="fixed"/>
+        <w:tblLook w:firstColumn="1" w:firstRow="1" w:lastColumn="0" w:lastRow="0" w:noHBand="0" w:noVBand="1" w:val="04A0"/>
+        <w:tblBorders>
+          <w:top w:val="single" w:sz="4" w:color="C9CED8"/>
+          <w:left w:val="single" w:sz="4" w:color="C9CED8"/>
+          <w:bottom w:val="single" w:sz="4" w:color="C9CED8"/>
+          <w:right w:val="single" w:sz="4" w:color="C9CED8"/>
+          <w:insideH w:val="single" w:sz="4" w:color="C9CED8"/>
+          <w:insideV w:val="single" w:sz="4" w:color="C9CED8"/>
+        </w:tblBorders>
+      </w:tblPr>
+      <w:tblGrid>
+        <w:gridCol w:w="3289"/>
+        <w:gridCol w:w="3289"/>
+        <w:gridCol w:w="3289"/>
+      </w:tblGrid>
+      <w:tr>
+        <w:trPr>
+          <w:cantSplit w:val="true"/>
+          <w:tblHeader w:val="true"/>
+        </w:trPr>
+        <w:tc>
+          <w:tcPr>
+            <w:tcW w:type="dxa" w:w="2381"/>
+            <w:shd w:val="clear" w:color="auto" w:fill="233C7D"/>
+          </w:tcPr>
+          <w:p>
+            <w:pPr>
+              <w:spacing w:after="0"/>
+            </w:pPr>
+            <w:r>
+              <w:rPr>
+                <w:b/>
+                <w:color w:val="FFFFFF"/>
+                <w:sz w:val="20"/>
+              </w:rPr>
+              <w:t>Parametro</w:t>
+            </w:r>
+          </w:p>
+        </w:tc>
+        <w:tc>
+          <w:tcPr>
+            <w:tcW w:type="dxa" w:w="2608"/>
+            <w:shd w:val="clear" w:color="auto" w:fill="233C7D"/>
+          </w:tcPr>
+          <w:p>
+            <w:pPr>
+              <w:spacing w:after="0"/>
+            </w:pPr>
+            <w:r>
+              <w:rPr>
+                <w:b/>
+                <w:color w:val="FFFFFF"/>
+                <w:sz w:val="20"/>
+              </w:rPr>
+              <w:t>Tipo</w:t>
+            </w:r>
+          </w:p>
+        </w:tc>
+        <w:tc>
+          <w:tcPr>
+            <w:tcW w:type="dxa" w:w="4876"/>
+            <w:shd w:val="clear" w:color="auto" w:fill="233C7D"/>
+          </w:tcPr>
+          <w:p>
+            <w:pPr>
+              <w:spacing w:after="0"/>
+            </w:pPr>
+            <w:r>
+              <w:rPr>
+                <w:b/>
+                <w:color w:val="FFFFFF"/>
+                <w:sz w:val="20"/>
+              </w:rPr>
+              <w:t>Descrizione</w:t>
+            </w:r>
+          </w:p>
+        </w:tc>
+      </w:tr>
+      <w:tr>
+        <w:trPr>
+          <w:cantSplit w:val="true"/>
+        </w:trPr>
+        <w:tc>
+          <w:tcPr>
+            <w:tcW w:type="dxa" w:w="2381"/>
+          </w:tcPr>
+          <w:p>
+            <w:pPr>
+              <w:spacing w:after="0"/>
+            </w:pPr>
+            <w:r>
+              <w:rPr>
+                <w:rFonts w:ascii="Consolas" w:hAnsi="Consolas"/>
+                <w:b w:val="0"/>
+                <w:color w:val="233C7D"/>
+                <w:sz w:val="19"/>
+              </w:rPr>
+              <w:t>idProperty</w:t>
+            </w:r>
+          </w:p>
+        </w:tc>
+        <w:tc>
+          <w:tcPr>
+            <w:tcW w:type="dxa" w:w="2608"/>
+          </w:tcPr>
+          <w:p>
+            <w:pPr>
+              <w:spacing w:after="0"/>
+            </w:pPr>
+            <w:r>
+              <w:rPr>
+                <w:rFonts w:ascii="Consolas" w:hAnsi="Consolas"/>
+                <w:b w:val="0"/>
+                <w:color w:val="233C7D"/>
+                <w:sz w:val="19"/>
+              </w:rPr>
+              <w:t>string (UUID)</w:t>
+            </w:r>
+          </w:p>
+        </w:tc>
+        <w:tc>
+          <w:tcPr>
+            <w:tcW w:type="dxa" w:w="4876"/>
+          </w:tcPr>
+          <w:p>
+            <w:pPr>
+              <w:spacing w:after="0"/>
+            </w:pPr>
+            <w:r>
+              <w:rPr>
+                <w:b w:val="0"/>
+                <w:sz w:val="19"/>
+              </w:rPr>
+              <w:t>Stabilimento dell'utente (da AuthUser.idProperty).</w:t>
+            </w:r>
+          </w:p>
+        </w:tc>
+      </w:tr>
+      <w:tr>
+        <w:trPr>
+          <w:cantSplit w:val="true"/>
+        </w:trPr>
+        <w:tc>
+          <w:tcPr>
+            <w:tcW w:type="dxa" w:w="2381"/>
+            <w:shd w:val="clear" w:color="auto" w:fill="F1F3F8"/>
+          </w:tcPr>
+          <w:p>
+            <w:pPr>
+              <w:spacing w:after="0"/>
+            </w:pPr>
+            <w:r>
+              <w:rPr>
+                <w:rFonts w:ascii="Consolas" w:hAnsi="Consolas"/>
+                <w:b w:val="0"/>
+                <w:color w:val="233C7D"/>
+                <w:sz w:val="19"/>
+              </w:rPr>
+              <w:t>senderMailAddress</w:t>
+            </w:r>
+          </w:p>
+        </w:tc>
+        <w:tc>
+          <w:tcPr>
+            <w:tcW w:type="dxa" w:w="2608"/>
+            <w:shd w:val="clear" w:color="auto" w:fill="F1F3F8"/>
+          </w:tcPr>
+          <w:p>
+            <w:pPr>
+              <w:spacing w:after="0"/>
+            </w:pPr>
+            <w:r>
+              <w:rPr>
+                <w:rFonts w:ascii="Consolas" w:hAnsi="Consolas"/>
+                <w:b w:val="0"/>
+                <w:color w:val="233C7D"/>
+                <w:sz w:val="19"/>
+              </w:rPr>
+              <w:t>string</w:t>
+            </w:r>
+          </w:p>
+        </w:tc>
+        <w:tc>
+          <w:tcPr>
+            <w:tcW w:type="dxa" w:w="4876"/>
+            <w:shd w:val="clear" w:color="auto" w:fill="F1F3F8"/>
+          </w:tcPr>
+          <w:p>
+            <w:pPr>
+              <w:spacing w:after="0"/>
+            </w:pPr>
+            <w:r>
+              <w:rPr>
+                <w:b w:val="0"/>
+                <w:sz w:val="19"/>
+              </w:rPr>
+              <w:t>Indirizzo email mittente scritto nel campo (from_email).</w:t>
+            </w:r>
+          </w:p>
+        </w:tc>
+      </w:tr>
+      <w:tr>
+        <w:trPr>
+          <w:cantSplit w:val="true"/>
+        </w:trPr>
+        <w:tc>
+          <w:tcPr>
+            <w:tcW w:type="dxa" w:w="2381"/>
+          </w:tcPr>
+          <w:p>
+            <w:pPr>
+              <w:spacing w:after="0"/>
+            </w:pPr>
+            <w:r>
+              <w:rPr>
+                <w:rFonts w:ascii="Consolas" w:hAnsi="Consolas"/>
+                <w:b w:val="0"/>
+                <w:color w:val="233C7D"/>
+                <w:sz w:val="19"/>
+              </w:rPr>
+              <w:t>senderName</w:t>
+            </w:r>
+          </w:p>
+        </w:tc>
+        <w:tc>
+          <w:tcPr>
+            <w:tcW w:type="dxa" w:w="2608"/>
+          </w:tcPr>
+          <w:p>
+            <w:pPr>
+              <w:spacing w:after="0"/>
+            </w:pPr>
+            <w:r>
+              <w:rPr>
+                <w:rFonts w:ascii="Consolas" w:hAnsi="Consolas"/>
+                <w:b w:val="0"/>
+                <w:color w:val="233C7D"/>
+                <w:sz w:val="19"/>
+              </w:rPr>
+              <w:t>string</w:t>
+            </w:r>
+          </w:p>
+        </w:tc>
+        <w:tc>
+          <w:tcPr>
+            <w:tcW w:type="dxa" w:w="4876"/>
+          </w:tcPr>
+          <w:p>
+            <w:pPr>
+              <w:spacing w:after="0"/>
+            </w:pPr>
+            <w:r>
+              <w:rPr>
+                <w:b w:val="0"/>
+                <w:sz w:val="19"/>
+              </w:rPr>
+              <w:t>Nome mittente scritto nel campo (from_name).</w:t>
+            </w:r>
+          </w:p>
+        </w:tc>
+      </w:tr>
+      <w:tr>
+        <w:trPr>
+          <w:cantSplit w:val="true"/>
+        </w:trPr>
+        <w:tc>
+          <w:tcPr>
+            <w:tcW w:type="dxa" w:w="2381"/>
+            <w:shd w:val="clear" w:color="auto" w:fill="F1F3F8"/>
+          </w:tcPr>
+          <w:p>
+            <w:pPr>
+              <w:spacing w:after="0"/>
+            </w:pPr>
+            <w:r>
+              <w:rPr>
+                <w:rFonts w:ascii="Consolas" w:hAnsi="Consolas"/>
+                <w:b w:val="0"/>
+                <w:color w:val="233C7D"/>
+                <w:sz w:val="19"/>
+              </w:rPr>
+              <w:t>smtpServerAddress</w:t>
+            </w:r>
+          </w:p>
+        </w:tc>
+        <w:tc>
+          <w:tcPr>
+            <w:tcW w:type="dxa" w:w="2608"/>
+            <w:shd w:val="clear" w:color="auto" w:fill="F1F3F8"/>
+          </w:tcPr>
+          <w:p>
+            <w:pPr>
+              <w:spacing w:after="0"/>
+            </w:pPr>
+            <w:r>
+              <w:rPr>
+                <w:rFonts w:ascii="Consolas" w:hAnsi="Consolas"/>
+                <w:b w:val="0"/>
+                <w:color w:val="233C7D"/>
+                <w:sz w:val="19"/>
+              </w:rPr>
+              <w:t>string</w:t>
+            </w:r>
+          </w:p>
+        </w:tc>
+        <w:tc>
+          <w:tcPr>
+            <w:tcW w:type="dxa" w:w="4876"/>
+            <w:shd w:val="clear" w:color="auto" w:fill="F1F3F8"/>
+          </w:tcPr>
+          <w:p>
+            <w:pPr>
+              <w:spacing w:after="0"/>
+            </w:pPr>
+            <w:r>
+              <w:rPr>
+                <w:b w:val="0"/>
+                <w:sz w:val="19"/>
+              </w:rPr>
+              <w:t>Server SMTP scritto nel campo (smtp_server).</w:t>
+            </w:r>
+          </w:p>
+        </w:tc>
+      </w:tr>
+      <w:tr>
+        <w:trPr>
+          <w:cantSplit w:val="true"/>
+        </w:trPr>
+        <w:tc>
+          <w:tcPr>
+            <w:tcW w:type="dxa" w:w="2381"/>
+          </w:tcPr>
+          <w:p>
+            <w:pPr>
+              <w:spacing w:after="0"/>
+            </w:pPr>
+            <w:r>
+              <w:rPr>
+                <w:rFonts w:ascii="Consolas" w:hAnsi="Consolas"/>
+                <w:b w:val="0"/>
+                <w:color w:val="233C7D"/>
+                <w:sz w:val="19"/>
+              </w:rPr>
+              <w:t>smtpPort</w:t>
+            </w:r>
+          </w:p>
+        </w:tc>
+        <w:tc>
+          <w:tcPr>
+            <w:tcW w:type="dxa" w:w="2608"/>
+          </w:tcPr>
+          <w:p>
+            <w:pPr>
+              <w:spacing w:after="0"/>
+            </w:pPr>
+            <w:r>
+              <w:rPr>
+                <w:rFonts w:ascii="Consolas" w:hAnsi="Consolas"/>
+                <w:b w:val="0"/>
+                <w:color w:val="233C7D"/>
+                <w:sz w:val="19"/>
+              </w:rPr>
+              <w:t>number (intero) | null</w:t>
+            </w:r>
+          </w:p>
+        </w:tc>
+        <w:tc>
+          <w:tcPr>
+            <w:tcW w:type="dxa" w:w="4876"/>
+          </w:tcPr>
+          <w:p>
+            <w:pPr>
+              <w:spacing w:after="0"/>
+            </w:pPr>
+            <w:r>
+              <w:rPr>
+                <w:b w:val="0"/>
+                <w:sz w:val="19"/>
+              </w:rPr>
+              <w:t>Porta scritta nel campo (smtp_port); null se il campo non contiene un numero intero.</w:t>
+            </w:r>
+          </w:p>
+        </w:tc>
+      </w:tr>
+      <w:tr>
+        <w:trPr>
+          <w:cantSplit w:val="true"/>
+        </w:trPr>
+        <w:tc>
+          <w:tcPr>
+            <w:tcW w:type="dxa" w:w="2381"/>
+            <w:shd w:val="clear" w:color="auto" w:fill="F1F3F8"/>
+          </w:tcPr>
+          <w:p>
+            <w:pPr>
+              <w:spacing w:after="0"/>
+            </w:pPr>
+            <w:r>
+              <w:rPr>
+                <w:rFonts w:ascii="Consolas" w:hAnsi="Consolas"/>
+                <w:b w:val="0"/>
+                <w:color w:val="233C7D"/>
+                <w:sz w:val="19"/>
+              </w:rPr>
+              <w:t>smtpUsername</w:t>
+            </w:r>
+          </w:p>
+        </w:tc>
+        <w:tc>
+          <w:tcPr>
+            <w:tcW w:type="dxa" w:w="2608"/>
+            <w:shd w:val="clear" w:color="auto" w:fill="F1F3F8"/>
+          </w:tcPr>
+          <w:p>
+            <w:pPr>
+              <w:spacing w:after="0"/>
+            </w:pPr>
+            <w:r>
+              <w:rPr>
+                <w:rFonts w:ascii="Consolas" w:hAnsi="Consolas"/>
+                <w:b w:val="0"/>
+                <w:color w:val="233C7D"/>
+                <w:sz w:val="19"/>
+              </w:rPr>
+              <w:t>string</w:t>
+            </w:r>
+          </w:p>
+        </w:tc>
+        <w:tc>
+          <w:tcPr>
+            <w:tcW w:type="dxa" w:w="4876"/>
+            <w:shd w:val="clear" w:color="auto" w:fill="F1F3F8"/>
+          </w:tcPr>
+          <w:p>
+            <w:pPr>
+              <w:spacing w:after="0"/>
+            </w:pPr>
+            <w:r>
+              <w:rPr>
+                <w:b w:val="0"/>
+                <w:sz w:val="19"/>
+              </w:rPr>
+              <w:t>Nome utente scritto nel campo (smtp_username).</w:t>
+            </w:r>
+          </w:p>
+        </w:tc>
+      </w:tr>
+      <w:tr>
+        <w:trPr>
+          <w:cantSplit w:val="true"/>
+        </w:trPr>
+        <w:tc>
+          <w:tcPr>
+            <w:tcW w:type="dxa" w:w="2381"/>
+          </w:tcPr>
+          <w:p>
+            <w:pPr>
+              <w:spacing w:after="0"/>
+            </w:pPr>
+            <w:r>
+              <w:rPr>
+                <w:rFonts w:ascii="Consolas" w:hAnsi="Consolas"/>
+                <w:b w:val="0"/>
+                <w:color w:val="233C7D"/>
+                <w:sz w:val="19"/>
+              </w:rPr>
+              <w:t>smtpPassword</w:t>
+            </w:r>
+          </w:p>
+        </w:tc>
+        <w:tc>
+          <w:tcPr>
+            <w:tcW w:type="dxa" w:w="2608"/>
+          </w:tcPr>
+          <w:p>
+            <w:pPr>
+              <w:spacing w:after="0"/>
+            </w:pPr>
+            <w:r>
+              <w:rPr>
+                <w:rFonts w:ascii="Consolas" w:hAnsi="Consolas"/>
+                <w:b w:val="0"/>
+                <w:color w:val="233C7D"/>
+                <w:sz w:val="19"/>
+              </w:rPr>
+              <w:t>string</w:t>
+            </w:r>
+          </w:p>
+        </w:tc>
+        <w:tc>
+          <w:tcPr>
+            <w:tcW w:type="dxa" w:w="4876"/>
+          </w:tcPr>
+          <w:p>
+            <w:pPr>
+              <w:spacing w:after="0"/>
+            </w:pPr>
+            <w:r>
+              <w:rPr>
+                <w:b w:val="0"/>
+                <w:sz w:val="19"/>
+              </w:rPr>
+              <w:t>Password scritta nel campo (smtp_password).</w:t>
+            </w:r>
+          </w:p>
+        </w:tc>
+      </w:tr>
+      <w:tr>
+        <w:trPr>
+          <w:cantSplit w:val="true"/>
+        </w:trPr>
+        <w:tc>
+          <w:tcPr>
+            <w:tcW w:type="dxa" w:w="2381"/>
+            <w:shd w:val="clear" w:color="auto" w:fill="F1F3F8"/>
+          </w:tcPr>
+          <w:p>
+            <w:pPr>
+              <w:spacing w:after="0"/>
+            </w:pPr>
+            <w:r>
+              <w:rPr>
+                <w:rFonts w:ascii="Consolas" w:hAnsi="Consolas"/>
+                <w:b w:val="0"/>
+                <w:color w:val="233C7D"/>
+                <w:sz w:val="19"/>
+              </w:rPr>
+              <w:t>smtpSecurity</w:t>
+            </w:r>
+          </w:p>
+        </w:tc>
+        <w:tc>
+          <w:tcPr>
+            <w:tcW w:type="dxa" w:w="2608"/>
+            <w:shd w:val="clear" w:color="auto" w:fill="F1F3F8"/>
+          </w:tcPr>
+          <w:p>
+            <w:pPr>
+              <w:spacing w:after="0"/>
+            </w:pPr>
+            <w:r>
+              <w:rPr>
+                <w:rFonts w:ascii="Consolas" w:hAnsi="Consolas"/>
+                <w:b w:val="0"/>
+                <w:color w:val="233C7D"/>
+                <w:sz w:val="19"/>
+              </w:rPr>
+              <w:t>string (enum SmtpSecurity) | null</w:t>
+            </w:r>
+          </w:p>
+        </w:tc>
+        <w:tc>
+          <w:tcPr>
+            <w:tcW w:type="dxa" w:w="4876"/>
+            <w:shd w:val="clear" w:color="auto" w:fill="F1F3F8"/>
+          </w:tcPr>
+          <w:p>
+            <w:pPr>
+              <w:spacing w:after="0"/>
+            </w:pPr>
+            <w:r>
+              <w:rPr>
+                <w:b w:val="0"/>
+                <w:sz w:val="19"/>
+              </w:rPr>
+              <w:t>Tipo di sicurezza scelto: None, Ssl o Tls; null se non scelto.</w:t>
+            </w:r>
+          </w:p>
+        </w:tc>
+      </w:tr>
+    </w:tbl>
+    <w:p>
+      <w:pPr>
+        <w:spacing w:after="40"/>
+      </w:pPr>
+    </w:p>
+    <w:p>
+      <w:pPr>
+        <w:pStyle w:val="Heading3"/>
+      </w:pPr>
+      <w:r>
+        <w:t>Esempio di richiesta (JSON)</w:t>
+      </w:r>
+    </w:p>
+    <w:p>
+      <w:pPr>
+        <w:keepNext/>
+        <w:spacing w:after="0"/>
+        <w:shd w:val="clear" w:color="auto" w:fill="F1F3F8"/>
+      </w:pPr>
+      <w:r>
+        <w:rPr>
+          <w:rFonts w:ascii="Consolas" w:hAnsi="Consolas"/>
+          <w:b w:val="0"/>
+          <w:color w:val="233C7D"/>
+          <w:sz w:val="19"/>
+        </w:rPr>
+        <w:t>{</w:t>
+      </w:r>
+    </w:p>
+    <w:p>
+      <w:pPr>
+        <w:keepNext/>
+        <w:spacing w:after="0"/>
+        <w:shd w:val="clear" w:color="auto" w:fill="F1F3F8"/>
+      </w:pPr>
+      <w:r>
+        <w:rPr>
+          <w:rFonts w:ascii="Consolas" w:hAnsi="Consolas"/>
+          <w:b w:val="0"/>
+          <w:color w:val="233C7D"/>
+          <w:sz w:val="19"/>
+        </w:rPr>
+        <w:t xml:space="preserve">  "idProperty": "5b1f3c7e-2d4a-4e8b-9c1d-7a6e5f4b3c2d",</w:t>
+      </w:r>
+    </w:p>
+    <w:p>
+      <w:pPr>
+        <w:keepNext/>
+        <w:spacing w:after="0"/>
+        <w:shd w:val="clear" w:color="auto" w:fill="F1F3F8"/>
+      </w:pPr>
+      <w:r>
+        <w:rPr>
+          <w:rFonts w:ascii="Consolas" w:hAnsi="Consolas"/>
+          <w:b w:val="0"/>
+          <w:color w:val="233C7D"/>
+          <w:sz w:val="19"/>
+        </w:rPr>
+        <w:t xml:space="preserve">  "senderMailAddress": "prenotazioni@lido-demo.example",</w:t>
+      </w:r>
+    </w:p>
+    <w:p>
+      <w:pPr>
+        <w:keepNext/>
+        <w:spacing w:after="0"/>
+        <w:shd w:val="clear" w:color="auto" w:fill="F1F3F8"/>
+      </w:pPr>
+      <w:r>
+        <w:rPr>
+          <w:rFonts w:ascii="Consolas" w:hAnsi="Consolas"/>
+          <w:b w:val="0"/>
+          <w:color w:val="233C7D"/>
+          <w:sz w:val="19"/>
+        </w:rPr>
+        <w:t xml:space="preserve">  "senderName": "Lido Demo",</w:t>
+      </w:r>
+    </w:p>
+    <w:p>
+      <w:pPr>
+        <w:keepNext/>
+        <w:spacing w:after="0"/>
+        <w:shd w:val="clear" w:color="auto" w:fill="F1F3F8"/>
+      </w:pPr>
+      <w:r>
+        <w:rPr>
+          <w:rFonts w:ascii="Consolas" w:hAnsi="Consolas"/>
+          <w:b w:val="0"/>
+          <w:color w:val="233C7D"/>
+          <w:sz w:val="19"/>
+        </w:rPr>
+        <w:t xml:space="preserve">  "smtpServerAddress": "smtp.lido-demo.example",</w:t>
+      </w:r>
+    </w:p>
+    <w:p>
+      <w:pPr>
+        <w:keepNext/>
+        <w:spacing w:after="0"/>
+        <w:shd w:val="clear" w:color="auto" w:fill="F1F3F8"/>
+      </w:pPr>
+      <w:r>
+        <w:rPr>
+          <w:rFonts w:ascii="Consolas" w:hAnsi="Consolas"/>
+          <w:b w:val="0"/>
+          <w:color w:val="233C7D"/>
+          <w:sz w:val="19"/>
+        </w:rPr>
+        <w:t xml:space="preserve">  "smtpPort": 465,</w:t>
+      </w:r>
+    </w:p>
+    <w:p>
+      <w:pPr>
+        <w:keepNext/>
+        <w:spacing w:after="0"/>
+        <w:shd w:val="clear" w:color="auto" w:fill="F1F3F8"/>
+      </w:pPr>
+      <w:r>
+        <w:rPr>
+          <w:rFonts w:ascii="Consolas" w:hAnsi="Consolas"/>
+          <w:b w:val="0"/>
+          <w:color w:val="233C7D"/>
+          <w:sz w:val="19"/>
+        </w:rPr>
+        <w:t xml:space="preserve">  "smtpUsername": "prenotazioni@lido-demo.example",</w:t>
+      </w:r>
+    </w:p>
+    <w:p>
+      <w:pPr>
+        <w:keepNext/>
+        <w:spacing w:after="0"/>
+        <w:shd w:val="clear" w:color="auto" w:fill="F1F3F8"/>
+      </w:pPr>
+      <w:r>
+        <w:rPr>
+          <w:rFonts w:ascii="Consolas" w:hAnsi="Consolas"/>
+          <w:b w:val="0"/>
+          <w:color w:val="233C7D"/>
+          <w:sz w:val="19"/>
+        </w:rPr>
+        <w:t xml:space="preserve">  "smtpPassword": "password-di-esempio",</w:t>
+      </w:r>
+    </w:p>
+    <w:p>
+      <w:pPr>
+        <w:keepNext/>
+        <w:spacing w:after="0"/>
+        <w:shd w:val="clear" w:color="auto" w:fill="F1F3F8"/>
+      </w:pPr>
+      <w:r>
+        <w:rPr>
+          <w:rFonts w:ascii="Consolas" w:hAnsi="Consolas"/>
+          <w:b w:val="0"/>
+          <w:color w:val="233C7D"/>
+          <w:sz w:val="19"/>
+        </w:rPr>
+        <w:t xml:space="preserve">  "smtpSecurity": "Ssl"</w:t>
+      </w:r>
+    </w:p>
+    <w:p>
+      <w:pPr>
+        <w:keepNext w:val="0"/>
+        <w:spacing w:after="120"/>
+        <w:shd w:val="clear" w:color="auto" w:fill="F1F3F8"/>
+      </w:pPr>
+      <w:r>
+        <w:rPr>
+          <w:rFonts w:ascii="Consolas" w:hAnsi="Consolas"/>
+          <w:b w:val="0"/>
+          <w:color w:val="233C7D"/>
+          <w:sz w:val="19"/>
+        </w:rPr>
+        <w:t>}</w:t>
+      </w:r>
+    </w:p>
+    <w:p>
+      <w:pPr>
+        <w:pStyle w:val="Heading2"/>
+      </w:pPr>
+      <w:r>
+        <w:t>Risposta attesa dal server</w:t>
+      </w:r>
+    </w:p>
+    <w:p>
+      <w:pPr>
+        <w:spacing w:after="40"/>
+      </w:pPr>
+      <w:r>
+        <w:rPr>
+          <w:b/>
+        </w:rPr>
+        <w:t xml:space="preserve">Stato: </w:t>
+      </w:r>
+      <w:r>
+        <w:rPr>
+          <w:b w:val="0"/>
+        </w:rPr>
+        <w:t>204 No Content (nessun corpo)</w:t>
+      </w:r>
+    </w:p>
+    <w:p>
+      <w:r>
+        <w:t>Nessun corpo nella risposta, quindi nessun JSON.</w:t>
+      </w:r>
+    </w:p>
+    <w:p>
+      <w:pPr>
+        <w:pStyle w:val="Heading2"/>
+      </w:pPr>
+      <w:r>
+        <w:t>Errori possibili</w:t>
+      </w:r>
+    </w:p>
+    <w:tbl>
+      <w:tblPr>
+        <w:tblW w:type="auto" w:w="0"/>
+        <w:jc w:val="center"/>
+        <w:tblLayout w:type="fixed"/>
+        <w:tblLook w:firstColumn="1" w:firstRow="1" w:lastColumn="0" w:lastRow="0" w:noHBand="0" w:noVBand="1" w:val="04A0"/>
+        <w:tblBorders>
+          <w:top w:val="single" w:sz="4" w:color="C9CED8"/>
+          <w:left w:val="single" w:sz="4" w:color="C9CED8"/>
+          <w:bottom w:val="single" w:sz="4" w:color="C9CED8"/>
+          <w:right w:val="single" w:sz="4" w:color="C9CED8"/>
+          <w:insideH w:val="single" w:sz="4" w:color="C9CED8"/>
+          <w:insideV w:val="single" w:sz="4" w:color="C9CED8"/>
+        </w:tblBorders>
+      </w:tblPr>
+      <w:tblGrid>
+        <w:gridCol w:w="3289"/>
+        <w:gridCol w:w="3289"/>
+        <w:gridCol w:w="3289"/>
+      </w:tblGrid>
+      <w:tr>
+        <w:trPr>
+          <w:cantSplit w:val="true"/>
+          <w:tblHeader w:val="true"/>
+        </w:trPr>
+        <w:tc>
+          <w:tcPr>
+            <w:tcW w:type="dxa" w:w="907"/>
+            <w:shd w:val="clear" w:color="auto" w:fill="233C7D"/>
+          </w:tcPr>
+          <w:p>
+            <w:pPr>
+              <w:spacing w:after="0"/>
+            </w:pPr>
+            <w:r>
+              <w:rPr>
+                <w:b/>
+                <w:color w:val="FFFFFF"/>
+                <w:sz w:val="20"/>
+              </w:rPr>
+              <w:t>Status</w:t>
+            </w:r>
+          </w:p>
+        </w:tc>
+        <w:tc>
+          <w:tcPr>
+            <w:tcW w:type="dxa" w:w="3061"/>
+            <w:shd w:val="clear" w:color="auto" w:fill="233C7D"/>
+          </w:tcPr>
+          <w:p>
+            <w:pPr>
+              <w:spacing w:after="0"/>
+            </w:pPr>
+            <w:r>
+              <w:rPr>
+                <w:b/>
+                <w:color w:val="FFFFFF"/>
+                <w:sz w:val="20"/>
+              </w:rPr>
+              <w:t>Codice</w:t>
+            </w:r>
+          </w:p>
+        </w:tc>
+        <w:tc>
+          <w:tcPr>
+            <w:tcW w:type="dxa" w:w="5896"/>
+            <w:shd w:val="clear" w:color="auto" w:fill="233C7D"/>
+          </w:tcPr>
+          <w:p>
+            <w:pPr>
+              <w:spacing w:after="0"/>
+            </w:pPr>
+            <w:r>
+              <w:rPr>
+                <w:b/>
+                <w:color w:val="FFFFFF"/>
+                <w:sz w:val="20"/>
+              </w:rPr>
+              <w:t>Quando</w:t>
+            </w:r>
+          </w:p>
+        </w:tc>
+      </w:tr>
+      <w:tr>
+        <w:trPr>
+          <w:cantSplit w:val="true"/>
+        </w:trPr>
+        <w:tc>
+          <w:tcPr>
+            <w:tcW w:type="dxa" w:w="907"/>
+          </w:tcPr>
+          <w:p>
+            <w:pPr>
+              <w:spacing w:after="0"/>
+            </w:pPr>
+            <w:r>
+              <w:rPr>
+                <w:rFonts w:ascii="Consolas" w:hAnsi="Consolas"/>
+                <w:b w:val="0"/>
+                <w:color w:val="233C7D"/>
+                <w:sz w:val="19"/>
+              </w:rPr>
+              <w:t>400</w:t>
+            </w:r>
+          </w:p>
+        </w:tc>
+        <w:tc>
+          <w:tcPr>
+            <w:tcW w:type="dxa" w:w="3061"/>
+          </w:tcPr>
+          <w:p>
+            <w:pPr>
+              <w:spacing w:after="0"/>
+            </w:pPr>
+            <w:r>
+              <w:rPr>
+                <w:rFonts w:ascii="Consolas" w:hAnsi="Consolas"/>
+                <w:b w:val="0"/>
+                <w:color w:val="233C7D"/>
+                <w:sz w:val="19"/>
+              </w:rPr>
+              <w:t>validation.invalid_request</w:t>
+            </w:r>
+          </w:p>
+        </w:tc>
+        <w:tc>
+          <w:tcPr>
+            <w:tcW w:type="dxa" w:w="5896"/>
+          </w:tcPr>
+          <w:p>
+            <w:pPr>
+              <w:spacing w:after="0"/>
+            </w:pPr>
+            <w:r>
+              <w:rPr>
+                <w:b w:val="0"/>
+                <w:sz w:val="19"/>
+              </w:rPr>
+              <w:t>Campi mancanti o non validi (indirizzo mittente, server, nome utente vuoti; porta assente o fuori da 1-65535; sicurezza non valida): in errors[] validation.invalid_value per ognuno. Non viene salvato nulla.</w:t>
+            </w:r>
+          </w:p>
+        </w:tc>
+      </w:tr>
+      <w:tr>
+        <w:trPr>
+          <w:cantSplit w:val="true"/>
+        </w:trPr>
+        <w:tc>
+          <w:tcPr>
+            <w:tcW w:type="dxa" w:w="907"/>
+            <w:shd w:val="clear" w:color="auto" w:fill="F1F3F8"/>
+          </w:tcPr>
+          <w:p>
+            <w:pPr>
+              <w:spacing w:after="0"/>
+            </w:pPr>
+            <w:r>
+              <w:rPr>
+                <w:rFonts w:ascii="Consolas" w:hAnsi="Consolas"/>
+                <w:b w:val="0"/>
+                <w:color w:val="233C7D"/>
+                <w:sz w:val="19"/>
+              </w:rPr>
+              <w:t>401</w:t>
+            </w:r>
+          </w:p>
+        </w:tc>
+        <w:tc>
+          <w:tcPr>
+            <w:tcW w:type="dxa" w:w="3061"/>
+            <w:shd w:val="clear" w:color="auto" w:fill="F1F3F8"/>
+          </w:tcPr>
+          <w:p>
+            <w:pPr>
+              <w:spacing w:after="0"/>
+            </w:pPr>
+            <w:r>
+              <w:rPr>
+                <w:rFonts w:ascii="Consolas" w:hAnsi="Consolas"/>
+                <w:b w:val="0"/>
+                <w:color w:val="233C7D"/>
+                <w:sz w:val="19"/>
+              </w:rPr>
+              <w:t>auth.invalid_token</w:t>
+            </w:r>
+          </w:p>
+        </w:tc>
+        <w:tc>
+          <w:tcPr>
+            <w:tcW w:type="dxa" w:w="5896"/>
+            <w:shd w:val="clear" w:color="auto" w:fill="F1F3F8"/>
+          </w:tcPr>
+          <w:p>
+            <w:pPr>
+              <w:spacing w:after="0"/>
+            </w:pPr>
+            <w:r>
+              <w:rPr>
+                <w:b w:val="0"/>
+                <w:sz w:val="19"/>
+              </w:rPr>
+              <w:t>Access token assente, scaduto o non valido: il frontend rinnova il token e ripete la chiamata una volta.</w:t>
+            </w:r>
+          </w:p>
+        </w:tc>
+      </w:tr>
+      <w:tr>
+        <w:trPr>
+          <w:cantSplit w:val="true"/>
+        </w:trPr>
+        <w:tc>
+          <w:tcPr>
+            <w:tcW w:type="dxa" w:w="907"/>
+          </w:tcPr>
+          <w:p>
+            <w:pPr>
+              <w:spacing w:after="0"/>
+            </w:pPr>
+            <w:r>
+              <w:rPr>
+                <w:rFonts w:ascii="Consolas" w:hAnsi="Consolas"/>
+                <w:b w:val="0"/>
+                <w:color w:val="233C7D"/>
+                <w:sz w:val="19"/>
+              </w:rPr>
+              <w:t>500</w:t>
+            </w:r>
+          </w:p>
+        </w:tc>
+        <w:tc>
+          <w:tcPr>
+            <w:tcW w:type="dxa" w:w="3061"/>
+          </w:tcPr>
+          <w:p>
+            <w:pPr>
+              <w:spacing w:after="0"/>
+            </w:pPr>
+            <w:r>
+              <w:rPr>
+                <w:rFonts w:ascii="Consolas" w:hAnsi="Consolas"/>
+                <w:b w:val="0"/>
+                <w:color w:val="233C7D"/>
+                <w:sz w:val="19"/>
+              </w:rPr>
+              <w:t>server.unexpected</w:t>
+            </w:r>
+          </w:p>
+        </w:tc>
+        <w:tc>
+          <w:tcPr>
+            <w:tcW w:type="dxa" w:w="5896"/>
+          </w:tcPr>
+          <w:p>
+            <w:pPr>
+              <w:spacing w:after="0"/>
+            </w:pPr>
+            <w:r>
+              <w:rPr>
+                <w:b w:val="0"/>
+                <w:sz w:val="19"/>
+              </w:rPr>
+              <w:t>Errore non gestito del server (vale per ogni API).</w:t>
+            </w:r>
+          </w:p>
+        </w:tc>
+      </w:tr>
+    </w:tbl>
+    <w:p>
+      <w:pPr>
+        <w:spacing w:after="40"/>
+      </w:pPr>
+    </w:p>
+    <w:p>
+      <w:pPr>
+        <w:pStyle w:val="Heading3"/>
+      </w:pPr>
+      <w:r>
+        <w:t>Esempio di errore (JSON)</w:t>
+      </w:r>
+    </w:p>
+    <w:p>
+      <w:pPr>
+        <w:keepNext/>
+      </w:pPr>
+      <w:r>
+        <w:t>Risposta a una richiesta senza tipo di sicurezza:</w:t>
+      </w:r>
+    </w:p>
+    <w:p>
+      <w:pPr>
+        <w:keepNext/>
+        <w:spacing w:after="0"/>
+        <w:shd w:val="clear" w:color="auto" w:fill="F1F3F8"/>
+      </w:pPr>
+      <w:r>
+        <w:rPr>
+          <w:rFonts w:ascii="Consolas" w:hAnsi="Consolas"/>
+          <w:b w:val="0"/>
+          <w:color w:val="233C7D"/>
+          <w:sz w:val="19"/>
+        </w:rPr>
+        <w:t>{</w:t>
+      </w:r>
+    </w:p>
+    <w:p>
+      <w:pPr>
+        <w:keepNext/>
+        <w:spacing w:after="0"/>
+        <w:shd w:val="clear" w:color="auto" w:fill="F1F3F8"/>
+      </w:pPr>
+      <w:r>
+        <w:rPr>
+          <w:rFonts w:ascii="Consolas" w:hAnsi="Consolas"/>
+          <w:b w:val="0"/>
+          <w:color w:val="233C7D"/>
+          <w:sz w:val="19"/>
+        </w:rPr>
+        <w:t xml:space="preserve">  "type": "https://errors.summerbooking/validation/invalid-request",</w:t>
+      </w:r>
+    </w:p>
+    <w:p>
+      <w:pPr>
+        <w:keepNext/>
+        <w:spacing w:after="0"/>
+        <w:shd w:val="clear" w:color="auto" w:fill="F1F3F8"/>
+      </w:pPr>
+      <w:r>
+        <w:rPr>
+          <w:rFonts w:ascii="Consolas" w:hAnsi="Consolas"/>
+          <w:b w:val="0"/>
+          <w:color w:val="233C7D"/>
+          <w:sz w:val="19"/>
+        </w:rPr>
+        <w:t xml:space="preserve">  "status": 400,</w:t>
+      </w:r>
+    </w:p>
+    <w:p>
+      <w:pPr>
+        <w:keepNext/>
+        <w:spacing w:after="0"/>
+        <w:shd w:val="clear" w:color="auto" w:fill="F1F3F8"/>
+      </w:pPr>
+      <w:r>
+        <w:rPr>
+          <w:rFonts w:ascii="Consolas" w:hAnsi="Consolas"/>
+          <w:b w:val="0"/>
+          <w:color w:val="233C7D"/>
+          <w:sz w:val="19"/>
+        </w:rPr>
+        <w:t xml:space="preserve">  "code": "validation.invalid_request",</w:t>
+      </w:r>
+    </w:p>
+    <w:p>
+      <w:pPr>
+        <w:keepNext/>
+        <w:spacing w:after="0"/>
+        <w:shd w:val="clear" w:color="auto" w:fill="F1F3F8"/>
+      </w:pPr>
+      <w:r>
+        <w:rPr>
+          <w:rFonts w:ascii="Consolas" w:hAnsi="Consolas"/>
+          <w:b w:val="0"/>
+          <w:color w:val="233C7D"/>
+          <w:sz w:val="19"/>
+        </w:rPr>
+        <w:t xml:space="preserve">  "title": "Invalid request",</w:t>
+      </w:r>
+    </w:p>
+    <w:p>
+      <w:pPr>
+        <w:keepNext/>
+        <w:spacing w:after="0"/>
+        <w:shd w:val="clear" w:color="auto" w:fill="F1F3F8"/>
+      </w:pPr>
+      <w:r>
+        <w:rPr>
+          <w:rFonts w:ascii="Consolas" w:hAnsi="Consolas"/>
+          <w:b w:val="0"/>
+          <w:color w:val="233C7D"/>
+          <w:sz w:val="19"/>
+        </w:rPr>
+        <w:t xml:space="preserve">  "errors": [</w:t>
+      </w:r>
+    </w:p>
+    <w:p>
+      <w:pPr>
+        <w:keepNext/>
+        <w:spacing w:after="0"/>
+        <w:shd w:val="clear" w:color="auto" w:fill="F1F3F8"/>
+      </w:pPr>
+      <w:r>
+        <w:rPr>
+          <w:rFonts w:ascii="Consolas" w:hAnsi="Consolas"/>
+          <w:b w:val="0"/>
+          <w:color w:val="233C7D"/>
+          <w:sz w:val="19"/>
+        </w:rPr>
+        <w:t xml:space="preserve">    {</w:t>
+      </w:r>
+    </w:p>
+    <w:p>
+      <w:pPr>
+        <w:keepNext/>
+        <w:spacing w:after="0"/>
+        <w:shd w:val="clear" w:color="auto" w:fill="F1F3F8"/>
+      </w:pPr>
+      <w:r>
+        <w:rPr>
+          <w:rFonts w:ascii="Consolas" w:hAnsi="Consolas"/>
+          <w:b w:val="0"/>
+          <w:color w:val="233C7D"/>
+          <w:sz w:val="19"/>
+        </w:rPr>
+        <w:t xml:space="preserve">      "field": "smtpSecurity",</w:t>
       </w:r>
     </w:p>
     <w:p>

</xml_diff>

<commit_message>
Last review on configuration email page
</commit_message>
<xml_diff>
--- a/frontend/summer-booking-front-office/docs/API_CONTRACTS.docx
+++ b/frontend/summer-booking-front-office/docs/API_CONTRACTS.docx
@@ -17829,7 +17829,7 @@
                 <w:color w:val="233C7D"/>
                 <w:sz w:val="19"/>
               </w:rPr>
-              <w:t>number (intero) | null</w:t>
+              <w:t>number (intero 1–65535)</w:t>
             </w:r>
           </w:p>
         </w:tc>
@@ -17846,7 +17846,7 @@
                 <w:b w:val="0"/>
                 <w:sz w:val="19"/>
               </w:rPr>
-              <w:t>Porta scritta nel campo (smtp_port); null se il campo non contiene un numero intero.</w:t>
+              <w:t>Porta scritta nel campo (smtp_port): la pagina la controlla (obbligatoria, da 1 a 65535) e non invia altro.</w:t>
             </w:r>
           </w:p>
         </w:tc>
@@ -19276,7 +19276,7 @@
                 <w:color w:val="233C7D"/>
                 <w:sz w:val="19"/>
               </w:rPr>
-              <w:t>number (intero) | null</w:t>
+              <w:t>number (intero 1–65535)</w:t>
             </w:r>
           </w:p>
         </w:tc>
@@ -19293,7 +19293,7 @@
                 <w:b w:val="0"/>
                 <w:sz w:val="19"/>
               </w:rPr>
-              <w:t>Porta scritta nel campo (smtp_port); null se il campo non contiene un numero intero.</w:t>
+              <w:t>Porta scritta nel campo (smtp_port): la pagina la controlla (obbligatoria, da 1 a 65535) e non invia altro.</w:t>
             </w:r>
           </w:p>
         </w:tc>

</xml_diff>

<commit_message>
Fixed Q04 regression and completes S02
</commit_message>
<xml_diff>
--- a/frontend/summer-booking-front-office/docs/API_CONTRACTS.docx
+++ b/frontend/summer-booking-front-office/docs/API_CONTRACTS.docx
@@ -15912,7 +15912,7 @@
         <w:pStyle w:val="ListBullet"/>
       </w:pPr>
       <w:r>
-        <w:t>Sicurezza: restituire smtpPassword in chiaro la rende leggibile nel browser (strumenti per sviluppatori, cache, estensioni) anche se il campo la nasconde. Proposta del frontend, da decidere col backend: non restituirla mai (es. null o un indicatore "impostata") e, al salvataggio, inviarla solo se l'utente la cambia.</w:t>
+        <w:t>Sicurezza (decisa il 07/10/2026): la password SMTP non viene mai restituita, nemmeno nascosta, perché è il segreto di un sistema esterno (la casella email del lido) e nel browser sarebbe leggibile. La risposta dice solo se è salvata (hasSmtpPassword). Il campo della pagina parte vuoto con "Password impostata: scrivi per cambiarla" oppure "Nessuna password impostata"; se l'utente l'ha dimenticata la reimposta presso il fornitore email e scrive qui quella nuova.</w:t>
       </w:r>
     </w:p>
     <w:p>
@@ -16541,7 +16541,7 @@
                 <w:color w:val="233C7D"/>
                 <w:sz w:val="19"/>
               </w:rPr>
-              <w:t>smtpPassword</w:t>
+              <w:t>hasSmtpPassword</w:t>
             </w:r>
           </w:p>
         </w:tc>
@@ -16561,7 +16561,7 @@
                 <w:color w:val="233C7D"/>
                 <w:sz w:val="19"/>
               </w:rPr>
-              <w:t>string</w:t>
+              <w:t>boolean</w:t>
             </w:r>
           </w:p>
         </w:tc>
@@ -16579,7 +16579,7 @@
                 <w:b w:val="0"/>
                 <w:sz w:val="19"/>
               </w:rPr>
-              <w:t>Password del server SMTP (smtp_password). Vedi la nota di sicurezza.</w:t>
+              <w:t>true se il server ha una password SMTP salvata. La password non viene mai restituita (segreto di un sistema esterno): vedi la nota di sicurezza.</w:t>
             </w:r>
           </w:p>
         </w:tc>
@@ -16767,7 +16767,7 @@
           <w:color w:val="233C7D"/>
           <w:sz w:val="19"/>
         </w:rPr>
-        <w:t xml:space="preserve">  "smtpPassword": "password-di-esempio",</w:t>
+        <w:t xml:space="preserve">  "hasSmtpPassword": true,</w:t>
       </w:r>
     </w:p>
     <w:p>
@@ -17409,7 +17409,7 @@
         <w:pStyle w:val="ListBullet"/>
       </w:pPr>
       <w:r>
-        <w:t>La chiama il bottone "Invia email test" della pagina Configurazione email, con i valori presenti nei campi in quel momento, anche se non ancora salvati: serve a provare una configurazione prima di salvarla.</w:t>
+        <w:t>La chiama il bottone "Invia email test" della pagina Configurazione email, con i valori presenti nei campi in quel momento, anche se non ancora salvati: serve a provare una configurazione prima di salvarla. Con smtpPassword null il server prova con la password salvata (solo se server, porta, nome utente e sicurezza sono quelli salvati, come per il salvataggio), con un testo prova quella nuova.</w:t>
       </w:r>
     </w:p>
     <w:p>
@@ -17952,7 +17952,7 @@
                 <w:color w:val="233C7D"/>
                 <w:sz w:val="19"/>
               </w:rPr>
-              <w:t>string</w:t>
+              <w:t>string | null</w:t>
             </w:r>
           </w:p>
         </w:tc>
@@ -17969,7 +17969,7 @@
                 <w:b w:val="0"/>
                 <w:sz w:val="19"/>
               </w:rPr>
-              <w:t>Password scritta nel campo (smtp_password).</w:t>
+              <w:t>Nuova password scritta dall'utente (smtp_password); null = il server usa quella già salvata, ma solo se smtpServerAddress, smtpPort, smtpUsername e smtpSecurity sono quelli salvati: altrimenti 400 con errors[] validation.invalid_value su smtpPassword, perché la password salvata non deve mai andare a un altro server, a un altro utente o su una connessione meno sicura. Il server la salva cifrata (non con un hash: deve poterla usare per collegarsi al server SMTP) e non la restituisce mai.</w:t>
             </w:r>
           </w:p>
         </w:tc>
@@ -18176,7 +18176,7 @@
           <w:color w:val="233C7D"/>
           <w:sz w:val="19"/>
         </w:rPr>
-        <w:t xml:space="preserve">  "smtpPassword": "password-di-esempio",</w:t>
+        <w:t xml:space="preserve">  "smtpPassword": null,</w:t>
       </w:r>
     </w:p>
     <w:p>
@@ -18872,7 +18872,7 @@
         <w:pStyle w:val="ListBullet"/>
       </w:pPr>
       <w:r>
-        <w:t>Sicurezza: vedi la nota della lettura sulla password SMTP (proposta: inviarla solo se cambiata).</w:t>
+        <w:t>Password SMTP: smtpPassword null mantiene quella salvata; un testo la sostituisce. Se cambiano server, porta, nome utente o sicurezza serve la password (null è un errore): la password salvata non deve poter essere mandata a un altro server. La pagina lo impedisce già ("Hai cambiato i parametri di connessione: riscrivi la password o inseriscine una nuova."), il server deve controllarlo comunque. Il server la salva cifrata e non la restituisce mai (vedi la nota della lettura).</w:t>
       </w:r>
     </w:p>
     <w:p>
@@ -19399,7 +19399,7 @@
                 <w:color w:val="233C7D"/>
                 <w:sz w:val="19"/>
               </w:rPr>
-              <w:t>string</w:t>
+              <w:t>string | null</w:t>
             </w:r>
           </w:p>
         </w:tc>
@@ -19416,7 +19416,7 @@
                 <w:b w:val="0"/>
                 <w:sz w:val="19"/>
               </w:rPr>
-              <w:t>Password scritta nel campo (smtp_password).</w:t>
+              <w:t>Nuova password scritta dall'utente (smtp_password); null = il server usa quella già salvata, ma solo se smtpServerAddress, smtpPort, smtpUsername e smtpSecurity sono quelli salvati: altrimenti 400 con errors[] validation.invalid_value su smtpPassword, perché la password salvata non deve mai andare a un altro server, a un altro utente o su una connessione meno sicura. Il server la salva cifrata (non con un hash: deve poterla usare per collegarsi al server SMTP) e non la restituisce mai.</w:t>
             </w:r>
           </w:p>
         </w:tc>
@@ -19623,7 +19623,7 @@
           <w:color w:val="233C7D"/>
           <w:sz w:val="19"/>
         </w:rPr>
-        <w:t xml:space="preserve">  "smtpPassword": "password-di-esempio",</w:t>
+        <w:t xml:space="preserve">  "smtpPassword": null,</w:t>
       </w:r>
     </w:p>
     <w:p>

</xml_diff>

<commit_message>
Closed last security issues
</commit_message>
<xml_diff>
--- a/frontend/summer-booking-front-office/docs/API_CONTRACTS.docx
+++ b/frontend/summer-booking-front-office/docs/API_CONTRACTS.docx
@@ -10216,7 +10216,7 @@
                 <w:b w:val="0"/>
                 <w:sz w:val="19"/>
               </w:rPr>
-              <w:t>Stabilimento dell'utente (da AuthUser.idProperty): la risposta contiene solo i suoi articoli.</w:t>
+              <w:t>Stabilimento dell'utente (da AuthUser.idProperty).</w:t>
             </w:r>
           </w:p>
         </w:tc>
@@ -11361,7 +11361,7 @@
         <w:pStyle w:val="ListBullet"/>
       </w:pPr>
       <w:r>
-        <w:t>Durante la chiamata il bottone mostra uno spinner e il popup non si può modificare né chiudere. Se la chiamata riesce, il popup si chiude e la tabella rifà warehouse/list; se fallisce, il popup resta aperto con i dati inseriti e mostra il messaggio del code.</w:t>
+        <w:t>Durante la chiamata il bottone mostra uno spinner e il popup non si può modificare né chiudere. Se la chiamata riesce, il popup si chiude e la tabella rifà warehouse/list; se fallisce, il popup resta aperto con i dati inseriti: un errore in errors[] compare sotto il suo campo, gli altri (403, 404, rete) sopra i bottoni.</w:t>
       </w:r>
     </w:p>
     <w:p>
@@ -12844,7 +12844,7 @@
         <w:pStyle w:val="ListBullet"/>
       </w:pPr>
       <w:r>
-        <w:t>Durante la chiamata il bottone mostra uno spinner e il popup non si può modificare né chiudere. Se la chiamata riesce, il popup si chiude e la tabella rifà warehouse/list; se fallisce, il popup resta aperto con i dati inseriti e mostra il messaggio del code.</w:t>
+        <w:t>Durante la chiamata il bottone mostra uno spinner e il popup non si può modificare né chiudere. Se la chiamata riesce, il popup si chiude e la tabella rifà warehouse/list; se fallisce, il popup resta aperto con i dati inseriti: un errore in errors[] compare sotto il suo campo, gli altri (403, 404, rete) sopra i bottoni.</w:t>
       </w:r>
     </w:p>
     <w:p>
@@ -17722,7 +17722,7 @@
         <w:pStyle w:val="ListBullet"/>
       </w:pPr>
       <w:r>
-        <w:t>Durante la chiamata il bottone mostra lo spinner; se riesce compare il popup "Email di test inviata", se fallisce il messaggio del code sotto il riquadro.</w:t>
+        <w:t>Durante la chiamata il bottone mostra lo spinner; se riesce compare il popup "Email di test inviata"; se fallisce, l'errore di un campo compare sotto quel campo, gli altri sotto il riquadro.</w:t>
       </w:r>
     </w:p>
     <w:p>
@@ -19224,7 +19224,7 @@
         <w:pStyle w:val="ListBullet"/>
       </w:pPr>
       <w:r>
-        <w:t>Durante la chiamata il bottone mostra lo spinner e gli altri due bottoni sono disattivi; se riesce compare il popup "Configurazione salvata", se fallisce il messaggio del code sotto il riquadro.</w:t>
+        <w:t>Durante la chiamata il bottone mostra lo spinner e gli altri due bottoni sono disattivi; se riesce compare il popup "Configurazione salvata"; se fallisce, l'errore di un campo compare sotto quel campo, gli altri sotto il riquadro.</w:t>
       </w:r>
     </w:p>
     <w:p>
@@ -20901,7 +20901,7 @@
                 <w:b w:val="0"/>
                 <w:sz w:val="19"/>
               </w:rPr>
-              <w:t>Stabilimento dell'utente (da AuthUser.idProperty): la risposta contiene solo i suoi articoli.</w:t>
+              <w:t>Stabilimento dell'utente (da AuthUser.idProperty).</w:t>
             </w:r>
           </w:p>
         </w:tc>
@@ -21962,7 +21962,7 @@
         <w:pStyle w:val="ListBullet"/>
       </w:pPr>
       <w:r>
-        <w:t>Se la chiamata riesce, il form si svuota e compare il popup "Messaggio inviato con successo"; se fallisce, i dati restano e compare il messaggio del code.</w:t>
+        <w:t>Se la chiamata riesce, il form si svuota e compare il popup "Messaggio inviato con successo"; se fallisce, i dati restano: l'errore di un campo compare sotto il campo, gli altri sopra il bottone. Il frontend toglie gli spazi ai lati di tutti i testi; un testo vuoto diventa null.</w:t>
       </w:r>
     </w:p>
     <w:p>

</xml_diff>

<commit_message>
Added francese, spagnolo, tedesco
</commit_message>
<xml_diff>
--- a/frontend/summer-booking-front-office/docs/API_CONTRACTS.docx
+++ b/frontend/summer-booking-front-office/docs/API_CONTRACTS.docx
@@ -20,7 +20,7 @@
     </w:p>
     <w:p>
       <w:r>
-        <w:t>Aggiornato al 08/10/2026 (nuove API taxation/printer-list e taxation/electronic-receipt per la pagina Fiscalizzazione). Prima, il 07/10/2026 (un id non valido non è mai un errore di campo in errors[]: idProperty dà 403 operation.not_allowed e un articolo inesistente 404 resource.not_found, due codici nuovi, e l'operazione è annullata; warehouse/add-warehouse-item e warehouse/edit-warehouse-item: il corpo è una riga di warehouse/list (WarehouseItem) con idProperty; nella modifica idArticle e totalQuantity sostituiscono idItem e articleQuantity, nell'aggiunta totalQuantity sostituisce articleQuantity; system/email-configuration non restituisce mai la password SMTP ma solo hasSmtpPassword, e in salvataggio e invio di prova smtpPassword null mantiene quella salvata). Prima, il 06/10/2026 (nuova API system/save-email-configuration per il bottone Salva, stesso corpo dell'invio di prova (EmailConfigurationRequest); nuova API system/send-test-email per il bottone Invia email test; nuova API GET system/email-configuration per la pagina Configurazione email; nuova API system/info-support con telefono, email e orari della pagina Assistenza e guide). Prima, il 05/10/2026 (nuova API system/contact-support per il form della pagina Assistenza e guide; nuova API warehouse/duplicate-warehouse-item, stessa forma dell'eliminazione, nomi delle copie scelti dal backend; nuova API warehouse/delete-warehouse-item, un solo id o più id insieme, tutto o niente; in warehouse/list i campi delle quantità finiscono con Quantity: totalQuantity, availableQuantity e thresholdQuantity, prima total, available e thresholdNumber; nuova API warehouse/edit-warehouse-item per il popup "Modifica articolo" e, in warehouse/list, nuovo campo isThresholdWarningActive; quantità sempre maggiore di 0; nuova API warehouse/add-warehouse-item per il bottone Aggiungi del popup "Aggiungi articolo"; nuova API warehouse/combobox-list per la tendina degli articoli; in warehouse/list availableQuantity e thresholdQuantity sempre presenti). Prima, il 01/10/2026 (errori: formato Problem Details con code, errori possibili per API e catalogo dei codici; header Accept-Language; formato dei valori in args). Oggi tutte le API sono simulate dai mock del frontend (services/mocks).</w:t>
+        <w:t>Aggiornato al 08/10/2026 (Accept-Language può valere anche fr, es, de; nuove API taxation/printer-list e taxation/electronic-receipt per la pagina Fiscalizzazione). Prima, il 07/10/2026 (un id non valido non è mai un errore di campo in errors[]: idProperty dà 403 operation.not_allowed e un articolo inesistente 404 resource.not_found, due codici nuovi, e l'operazione è annullata; warehouse/add-warehouse-item e warehouse/edit-warehouse-item: il corpo è una riga di warehouse/list (WarehouseItem) con idProperty; nella modifica idArticle e totalQuantity sostituiscono idItem e articleQuantity, nell'aggiunta totalQuantity sostituisce articleQuantity; system/email-configuration non restituisce mai la password SMTP ma solo hasSmtpPassword, e in salvataggio e invio di prova smtpPassword null mantiene quella salvata). Prima, il 06/10/2026 (nuova API system/save-email-configuration per il bottone Salva, stesso corpo dell'invio di prova (EmailConfigurationRequest); nuova API system/send-test-email per il bottone Invia email test; nuova API GET system/email-configuration per la pagina Configurazione email; nuova API system/info-support con telefono, email e orari della pagina Assistenza e guide). Prima, il 05/10/2026 (nuova API system/contact-support per il form della pagina Assistenza e guide; nuova API warehouse/duplicate-warehouse-item, stessa forma dell'eliminazione, nomi delle copie scelti dal backend; nuova API warehouse/delete-warehouse-item, un solo id o più id insieme, tutto o niente; in warehouse/list i campi delle quantità finiscono con Quantity: totalQuantity, availableQuantity e thresholdQuantity, prima total, available e thresholdNumber; nuova API warehouse/edit-warehouse-item per il popup "Modifica articolo" e, in warehouse/list, nuovo campo isThresholdWarningActive; quantità sempre maggiore di 0; nuova API warehouse/add-warehouse-item per il bottone Aggiungi del popup "Aggiungi articolo"; nuova API warehouse/combobox-list per la tendina degli articoli; in warehouse/list availableQuantity e thresholdQuantity sempre presenti). Prima, il 01/10/2026 (errori: formato Problem Details con code, errori possibili per API e catalogo dei codici; header Accept-Language; formato dei valori in args). Oggi tutte le API sono simulate dai mock del frontend (services/mocks).</w:t>
       </w:r>
     </w:p>
     <w:p>
@@ -342,7 +342,7 @@
                 <w:b w:val="0"/>
                 <w:sz w:val="19"/>
               </w:rPr>
-              <w:t>Lingua scelta nell'app (it, en), non quella del browser. In ogni chiamata alle nostre API: serve al backend solo se deve scrivere testi; gli errori li traduce il frontend dal code.</w:t>
+              <w:t>Lingua scelta nell'app (it, en, fr, es, de), non quella del browser. In ogni chiamata alle nostre API: serve al backend solo se deve scrivere testi; gli errori li traduce il frontend dal code.</w:t>
             </w:r>
           </w:p>
         </w:tc>

</xml_diff>

<commit_message>
Added arabic and chinese
</commit_message>
<xml_diff>
--- a/frontend/summer-booking-front-office/docs/API_CONTRACTS.docx
+++ b/frontend/summer-booking-front-office/docs/API_CONTRACTS.docx
@@ -20,7 +20,7 @@
     </w:p>
     <w:p>
       <w:r>
-        <w:t>Aggiornato al 08/10/2026 (Accept-Language può valere anche fr, es, de; nuove API taxation/printer-list e taxation/electronic-receipt per la pagina Fiscalizzazione). Prima, il 07/10/2026 (un id non valido non è mai un errore di campo in errors[]: idProperty dà 403 operation.not_allowed e un articolo inesistente 404 resource.not_found, due codici nuovi, e l'operazione è annullata; warehouse/add-warehouse-item e warehouse/edit-warehouse-item: il corpo è una riga di warehouse/list (WarehouseItem) con idProperty; nella modifica idArticle e totalQuantity sostituiscono idItem e articleQuantity, nell'aggiunta totalQuantity sostituisce articleQuantity; system/email-configuration non restituisce mai la password SMTP ma solo hasSmtpPassword, e in salvataggio e invio di prova smtpPassword null mantiene quella salvata). Prima, il 06/10/2026 (nuova API system/save-email-configuration per il bottone Salva, stesso corpo dell'invio di prova (EmailConfigurationRequest); nuova API system/send-test-email per il bottone Invia email test; nuova API GET system/email-configuration per la pagina Configurazione email; nuova API system/info-support con telefono, email e orari della pagina Assistenza e guide). Prima, il 05/10/2026 (nuova API system/contact-support per il form della pagina Assistenza e guide; nuova API warehouse/duplicate-warehouse-item, stessa forma dell'eliminazione, nomi delle copie scelti dal backend; nuova API warehouse/delete-warehouse-item, un solo id o più id insieme, tutto o niente; in warehouse/list i campi delle quantità finiscono con Quantity: totalQuantity, availableQuantity e thresholdQuantity, prima total, available e thresholdNumber; nuova API warehouse/edit-warehouse-item per il popup "Modifica articolo" e, in warehouse/list, nuovo campo isThresholdWarningActive; quantità sempre maggiore di 0; nuova API warehouse/add-warehouse-item per il bottone Aggiungi del popup "Aggiungi articolo"; nuova API warehouse/combobox-list per la tendina degli articoli; in warehouse/list availableQuantity e thresholdQuantity sempre presenti). Prima, il 01/10/2026 (errori: formato Problem Details con code, errori possibili per API e catalogo dei codici; header Accept-Language; formato dei valori in args). Oggi tutte le API sono simulate dai mock del frontend (services/mocks).</w:t>
+        <w:t>Aggiornato al 09/10/2026 (Accept-Language può valere anche zh, cinese semplificato, e ar, arabo). Prima, il 08/10/2026 (Accept-Language può valere anche fr, es, de; nuove API taxation/printer-list e taxation/electronic-receipt per la pagina Fiscalizzazione). Prima, il 07/10/2026 (un id non valido non è mai un errore di campo in errors[]: idProperty dà 403 operation.not_allowed e un articolo inesistente 404 resource.not_found, due codici nuovi, e l'operazione è annullata; warehouse/add-warehouse-item e warehouse/edit-warehouse-item: il corpo è una riga di warehouse/list (WarehouseItem) con idProperty; nella modifica idArticle e totalQuantity sostituiscono idItem e articleQuantity, nell'aggiunta totalQuantity sostituisce articleQuantity; system/email-configuration non restituisce mai la password SMTP ma solo hasSmtpPassword, e in salvataggio e invio di prova smtpPassword null mantiene quella salvata). Prima, il 06/10/2026 (nuova API system/save-email-configuration per il bottone Salva, stesso corpo dell'invio di prova (EmailConfigurationRequest); nuova API system/send-test-email per il bottone Invia email test; nuova API GET system/email-configuration per la pagina Configurazione email; nuova API system/info-support con telefono, email e orari della pagina Assistenza e guide). Prima, il 05/10/2026 (nuova API system/contact-support per il form della pagina Assistenza e guide; nuova API warehouse/duplicate-warehouse-item, stessa forma dell'eliminazione, nomi delle copie scelti dal backend; nuova API warehouse/delete-warehouse-item, un solo id o più id insieme, tutto o niente; in warehouse/list i campi delle quantità finiscono con Quantity: totalQuantity, availableQuantity e thresholdQuantity, prima total, available e thresholdNumber; nuova API warehouse/edit-warehouse-item per il popup "Modifica articolo" e, in warehouse/list, nuovo campo isThresholdWarningActive; quantità sempre maggiore di 0; nuova API warehouse/add-warehouse-item per il bottone Aggiungi del popup "Aggiungi articolo"; nuova API warehouse/combobox-list per la tendina degli articoli; in warehouse/list availableQuantity e thresholdQuantity sempre presenti). Prima, il 01/10/2026 (errori: formato Problem Details con code, errori possibili per API e catalogo dei codici; header Accept-Language; formato dei valori in args). Oggi tutte le API sono simulate dai mock del frontend (services/mocks).</w:t>
       </w:r>
     </w:p>
     <w:p>
@@ -342,7 +342,7 @@
                 <w:b w:val="0"/>
                 <w:sz w:val="19"/>
               </w:rPr>
-              <w:t>Lingua scelta nell'app (it, en, fr, es, de), non quella del browser. In ogni chiamata alle nostre API: serve al backend solo se deve scrivere testi; gli errori li traduce il frontend dal code.</w:t>
+              <w:t>Lingua scelta nell'app (it, en, fr, es, de, zh, ar), non quella del browser. In ogni chiamata alle nostre API: serve al backend solo se deve scrivere testi; gli errori li traduce il frontend dal code.</w:t>
             </w:r>
           </w:p>
         </w:tc>

</xml_diff>

<commit_message>
Completed taxation step 3
</commit_message>
<xml_diff>
--- a/frontend/summer-booking-front-office/docs/API_CONTRACTS.docx
+++ b/frontend/summer-booking-front-office/docs/API_CONTRACTS.docx
@@ -20,7 +20,7 @@
     </w:p>
     <w:p>
       <w:r>
-        <w:t>Aggiornato al 09/10/2026 (Accept-Language può valere anche zh, cinese semplificato, e ar, arabo). Prima, il 08/10/2026 (Accept-Language può valere anche fr, es, de; nuove API taxation/printer-list e taxation/electronic-receipt per la pagina Fiscalizzazione). Prima, il 07/10/2026 (un id non valido non è mai un errore di campo in errors[]: idProperty dà 403 operation.not_allowed e un articolo inesistente 404 resource.not_found, due codici nuovi, e l'operazione è annullata; warehouse/add-warehouse-item e warehouse/edit-warehouse-item: il corpo è una riga di warehouse/list (WarehouseItem) con idProperty; nella modifica idArticle e totalQuantity sostituiscono idItem e articleQuantity, nell'aggiunta totalQuantity sostituisce articleQuantity; system/email-configuration non restituisce mai la password SMTP ma solo hasSmtpPassword, e in salvataggio e invio di prova smtpPassword null mantiene quella salvata). Prima, il 06/10/2026 (nuova API system/save-email-configuration per il bottone Salva, stesso corpo dell'invio di prova (EmailConfigurationRequest); nuova API system/send-test-email per il bottone Invia email test; nuova API GET system/email-configuration per la pagina Configurazione email; nuova API system/info-support con telefono, email e orari della pagina Assistenza e guide). Prima, il 05/10/2026 (nuova API system/contact-support per il form della pagina Assistenza e guide; nuova API warehouse/duplicate-warehouse-item, stessa forma dell'eliminazione, nomi delle copie scelti dal backend; nuova API warehouse/delete-warehouse-item, un solo id o più id insieme, tutto o niente; in warehouse/list i campi delle quantità finiscono con Quantity: totalQuantity, availableQuantity e thresholdQuantity, prima total, available e thresholdNumber; nuova API warehouse/edit-warehouse-item per il popup "Modifica articolo" e, in warehouse/list, nuovo campo isThresholdWarningActive; quantità sempre maggiore di 0; nuova API warehouse/add-warehouse-item per il bottone Aggiungi del popup "Aggiungi articolo"; nuova API warehouse/combobox-list per la tendina degli articoli; in warehouse/list availableQuantity e thresholdQuantity sempre presenti). Prima, il 01/10/2026 (errori: formato Problem Details con code, errori possibili per API e catalogo dei codici; header Accept-Language; formato dei valori in args). Oggi tutte le API sono simulate dai mock del frontend (services/mocks).</w:t>
+        <w:t>Aggiornato al 09/10/2026 (nuova API taxation/download-guide-electronic-receipt, il bottone "Scarica la guida" scarica un file; nuove API taxation/set-is-active, interruttore di una stampante, e taxation/delete-printer, cestino di una stampante; Accept-Language può valere anche zh, cinese semplificato, e ar, arabo). Prima, il 08/10/2026 (Accept-Language può valere anche fr, es, de; nuove API taxation/printer-list e taxation/electronic-receipt per la pagina Fiscalizzazione). Prima, il 07/10/2026 (un id non valido non è mai un errore di campo in errors[]: idProperty dà 403 operation.not_allowed e un articolo inesistente 404 resource.not_found, due codici nuovi, e l'operazione è annullata; warehouse/add-warehouse-item e warehouse/edit-warehouse-item: il corpo è una riga di warehouse/list (WarehouseItem) con idProperty; nella modifica idArticle e totalQuantity sostituiscono idItem e articleQuantity, nell'aggiunta totalQuantity sostituisce articleQuantity; system/email-configuration non restituisce mai la password SMTP ma solo hasSmtpPassword, e in salvataggio e invio di prova smtpPassword null mantiene quella salvata). Prima, il 06/10/2026 (nuova API system/save-email-configuration per il bottone Salva, stesso corpo dell'invio di prova (EmailConfigurationRequest); nuova API system/send-test-email per il bottone Invia email test; nuova API GET system/email-configuration per la pagina Configurazione email; nuova API system/info-support con telefono, email e orari della pagina Assistenza e guide). Prima, il 05/10/2026 (nuova API system/contact-support per il form della pagina Assistenza e guide; nuova API warehouse/duplicate-warehouse-item, stessa forma dell'eliminazione, nomi delle copie scelti dal backend; nuova API warehouse/delete-warehouse-item, un solo id o più id insieme, tutto o niente; in warehouse/list i campi delle quantità finiscono con Quantity: totalQuantity, availableQuantity e thresholdQuantity, prima total, available e thresholdNumber; nuova API warehouse/edit-warehouse-item per il popup "Modifica articolo" e, in warehouse/list, nuovo campo isThresholdWarningActive; quantità sempre maggiore di 0; nuova API warehouse/add-warehouse-item per il bottone Aggiungi del popup "Aggiungi articolo"; nuova API warehouse/combobox-list per la tendina degli articoli; in warehouse/list availableQuantity e thresholdQuantity sempre presenti). Prima, il 01/10/2026 (errori: formato Problem Details con code, errori possibili per API e catalogo dei codici; header Accept-Language; formato dei valori in args). Oggi tutte le API sono simulate dai mock del frontend (services/mocks).</w:t>
       </w:r>
     </w:p>
     <w:p>
@@ -2860,7 +2860,7 @@
                 <w:color w:val="233C7D"/>
                 <w:sz w:val="19"/>
               </w:rPr>
-              <w:t>GET</w:t>
+              <w:t>POST</w:t>
             </w:r>
           </w:p>
         </w:tc>
@@ -2880,7 +2880,7 @@
                 <w:color w:val="233C7D"/>
                 <w:sz w:val="19"/>
               </w:rPr>
-              <w:t>/api/taxation/electronic-receipt?idProperty={idProperty}</w:t>
+              <w:t>/api/taxation/set-is-active</w:t>
             </w:r>
           </w:p>
         </w:tc>
@@ -2888,6 +2888,189 @@
           <w:tcPr>
             <w:tcW w:type="dxa" w:w="4876"/>
             <w:shd w:val="clear" w:color="auto" w:fill="F1F3F8"/>
+          </w:tcPr>
+          <w:p>
+            <w:pPr>
+              <w:spacing w:after="0"/>
+            </w:pPr>
+            <w:r>
+              <w:rPr>
+                <w:b w:val="0"/>
+                <w:sz w:val="19"/>
+              </w:rPr>
+              <w:t>Fiscalizzazione: attivazione di una stampante</w:t>
+            </w:r>
+          </w:p>
+        </w:tc>
+      </w:tr>
+      <w:tr>
+        <w:trPr>
+          <w:cantSplit w:val="true"/>
+        </w:trPr>
+        <w:tc>
+          <w:tcPr>
+            <w:tcW w:type="dxa" w:w="2381"/>
+          </w:tcPr>
+          <w:p>
+            <w:pPr>
+              <w:spacing w:after="0"/>
+            </w:pPr>
+            <w:r>
+              <w:rPr>
+                <w:rFonts w:ascii="Consolas" w:hAnsi="Consolas"/>
+                <w:b w:val="0"/>
+                <w:color w:val="233C7D"/>
+                <w:sz w:val="19"/>
+              </w:rPr>
+              <w:t>POST</w:t>
+            </w:r>
+          </w:p>
+        </w:tc>
+        <w:tc>
+          <w:tcPr>
+            <w:tcW w:type="dxa" w:w="2608"/>
+          </w:tcPr>
+          <w:p>
+            <w:pPr>
+              <w:spacing w:after="0"/>
+            </w:pPr>
+            <w:r>
+              <w:rPr>
+                <w:rFonts w:ascii="Consolas" w:hAnsi="Consolas"/>
+                <w:b w:val="0"/>
+                <w:color w:val="233C7D"/>
+                <w:sz w:val="19"/>
+              </w:rPr>
+              <w:t>/api/taxation/delete-printer</w:t>
+            </w:r>
+          </w:p>
+        </w:tc>
+        <w:tc>
+          <w:tcPr>
+            <w:tcW w:type="dxa" w:w="4876"/>
+          </w:tcPr>
+          <w:p>
+            <w:pPr>
+              <w:spacing w:after="0"/>
+            </w:pPr>
+            <w:r>
+              <w:rPr>
+                <w:b w:val="0"/>
+                <w:sz w:val="19"/>
+              </w:rPr>
+              <w:t>Fiscalizzazione: eliminazione di una stampante</w:t>
+            </w:r>
+          </w:p>
+        </w:tc>
+      </w:tr>
+      <w:tr>
+        <w:trPr>
+          <w:cantSplit w:val="true"/>
+        </w:trPr>
+        <w:tc>
+          <w:tcPr>
+            <w:tcW w:type="dxa" w:w="2381"/>
+            <w:shd w:val="clear" w:color="auto" w:fill="F1F3F8"/>
+          </w:tcPr>
+          <w:p>
+            <w:pPr>
+              <w:spacing w:after="0"/>
+            </w:pPr>
+            <w:r>
+              <w:rPr>
+                <w:rFonts w:ascii="Consolas" w:hAnsi="Consolas"/>
+                <w:b w:val="0"/>
+                <w:color w:val="233C7D"/>
+                <w:sz w:val="19"/>
+              </w:rPr>
+              <w:t>POST</w:t>
+            </w:r>
+          </w:p>
+        </w:tc>
+        <w:tc>
+          <w:tcPr>
+            <w:tcW w:type="dxa" w:w="2608"/>
+            <w:shd w:val="clear" w:color="auto" w:fill="F1F3F8"/>
+          </w:tcPr>
+          <w:p>
+            <w:pPr>
+              <w:spacing w:after="0"/>
+            </w:pPr>
+            <w:r>
+              <w:rPr>
+                <w:rFonts w:ascii="Consolas" w:hAnsi="Consolas"/>
+                <w:b w:val="0"/>
+                <w:color w:val="233C7D"/>
+                <w:sz w:val="19"/>
+              </w:rPr>
+              <w:t>/api/taxation/download-guide-electronic-receipt</w:t>
+            </w:r>
+          </w:p>
+        </w:tc>
+        <w:tc>
+          <w:tcPr>
+            <w:tcW w:type="dxa" w:w="4876"/>
+            <w:shd w:val="clear" w:color="auto" w:fill="F1F3F8"/>
+          </w:tcPr>
+          <w:p>
+            <w:pPr>
+              <w:spacing w:after="0"/>
+            </w:pPr>
+            <w:r>
+              <w:rPr>
+                <w:b w:val="0"/>
+                <w:sz w:val="19"/>
+              </w:rPr>
+              <w:t>Fiscalizzazione: guida dello scontrino elettronico</w:t>
+            </w:r>
+          </w:p>
+        </w:tc>
+      </w:tr>
+      <w:tr>
+        <w:trPr>
+          <w:cantSplit w:val="true"/>
+        </w:trPr>
+        <w:tc>
+          <w:tcPr>
+            <w:tcW w:type="dxa" w:w="2381"/>
+          </w:tcPr>
+          <w:p>
+            <w:pPr>
+              <w:spacing w:after="0"/>
+            </w:pPr>
+            <w:r>
+              <w:rPr>
+                <w:rFonts w:ascii="Consolas" w:hAnsi="Consolas"/>
+                <w:b w:val="0"/>
+                <w:color w:val="233C7D"/>
+                <w:sz w:val="19"/>
+              </w:rPr>
+              <w:t>GET</w:t>
+            </w:r>
+          </w:p>
+        </w:tc>
+        <w:tc>
+          <w:tcPr>
+            <w:tcW w:type="dxa" w:w="2608"/>
+          </w:tcPr>
+          <w:p>
+            <w:pPr>
+              <w:spacing w:after="0"/>
+            </w:pPr>
+            <w:r>
+              <w:rPr>
+                <w:rFonts w:ascii="Consolas" w:hAnsi="Consolas"/>
+                <w:b w:val="0"/>
+                <w:color w:val="233C7D"/>
+                <w:sz w:val="19"/>
+              </w:rPr>
+              <w:t>/api/taxation/electronic-receipt?idProperty={idProperty}</w:t>
+            </w:r>
+          </w:p>
+        </w:tc>
+        <w:tc>
+          <w:tcPr>
+            <w:tcW w:type="dxa" w:w="4876"/>
           </w:tcPr>
           <w:p>
             <w:pPr>
@@ -14458,7 +14641,7 @@
         <w:pStyle w:val="ListBullet"/>
       </w:pPr>
       <w:r>
-        <w:t>Se la chiamata riesce, il popup si chiude, gli id eliminati escono dalla selezione e la tabella rifà warehouse/list; se fallisce, il popup resta aperto con il messaggio del code.</w:t>
+        <w:t>Appena l'utente conferma, il popup di conferma si chiude e la pagina è coperta da uno spinner fino alla risposta. Se la chiamata riesce, gli id eliminati escono dalla selezione e la tabella rifà warehouse/list; se fallisce, il messaggio del code compare in un popup ("Operazione non riuscita").</w:t>
       </w:r>
     </w:p>
     <w:p>
@@ -15455,7 +15638,7 @@
         <w:pStyle w:val="ListBullet"/>
       </w:pPr>
       <w:r>
-        <w:t>Se la chiamata riesce, il popup si chiude, dopo "Duplica selezione" la selezione si svuota e la tabella rifà warehouse/list; se fallisce, il popup resta aperto con il messaggio del code.</w:t>
+        <w:t>Appena l'utente conferma, il popup di conferma si chiude e la pagina è coperta da uno spinner fino alla risposta. Se la chiamata riesce, dopo "Duplica selezione" la selezione si svuota e la tabella rifà warehouse/list; se fallisce, il messaggio del code compare in un popup ("Operazione non riuscita").</w:t>
       </w:r>
     </w:p>
     <w:p>
@@ -23416,7 +23599,7 @@
         <w:pStyle w:val="ListBullet"/>
       </w:pPr>
       <w:r>
-        <w:t>La pagina Fiscalizzazione (/settings/taxation) la chiama all'apertura e mostra le stampanti nel riquadro "Stampante", sotto "Stampanti aggiunte": nome, indirizzo IP, interruttore e cestino.</w:t>
+        <w:t>La pagina Fiscalizzazione (/settings/taxation) la chiama all'apertura e mostra le stampanti nel riquadro "Stampante", sotto "Stampanti aggiunte", in una tabella di 5 righe per pagina: nome, indirizzo IP e, nella colonna Azioni, interruttore (isEnabled) e cestino.</w:t>
       </w:r>
     </w:p>
     <w:p>
@@ -23432,7 +23615,7 @@
         <w:pStyle w:val="ListBullet"/>
       </w:pPr>
       <w:r>
-        <w:t>Se la chiamata fallisce il messaggio del code compare nel riquadro.</w:t>
+        <w:t>Se la chiamata fallisce compare il popup "Errore" con Chiudi e Riprova, come per le altre tabelle.</w:t>
       </w:r>
     </w:p>
     <w:p>
@@ -24636,19 +24819,19 @@
         <w:rPr>
           <w:b w:val="0"/>
         </w:rPr>
-        <w:t xml:space="preserve">GET </w:t>
+        <w:t xml:space="preserve">POST </w:t>
       </w:r>
       <w:r>
         <w:rPr>
           <w:rFonts w:ascii="Consolas" w:hAnsi="Consolas"/>
           <w:b w:val="0"/>
         </w:rPr>
-        <w:t>/api/taxation/electronic-receipt?idProperty={idProperty}</w:t>
-      </w:r>
-    </w:p>
-    <w:p>
-      <w:r>
-        <w:t>Fiscalizzazione: scontrino elettronico</w:t>
+        <w:t>/api/taxation/set-is-active</w:t>
+      </w:r>
+    </w:p>
+    <w:p>
+      <w:r>
+        <w:t>Fiscalizzazione: attivazione di una stampante</w:t>
       </w:r>
     </w:p>
     <w:p>
@@ -24667,7 +24850,7 @@
           <w:b w:val="0"/>
           <w:color w:val="233C7D"/>
         </w:rPr>
-        <w:t>GET</w:t>
+        <w:t>POST</w:t>
       </w:r>
     </w:p>
     <w:p>
@@ -24686,7 +24869,7 @@
           <w:b w:val="0"/>
           <w:color w:val="233C7D"/>
         </w:rPr>
-        <w:t>/api/taxation/electronic-receipt?idProperty={idProperty}</w:t>
+        <w:t>/api/taxation/set-is-active</w:t>
       </w:r>
     </w:p>
     <w:p>
@@ -24705,7 +24888,7 @@
           <w:b w:val="0"/>
           <w:color w:val="233C7D"/>
         </w:rPr>
-        <w:t>TaxationService.electronicReceipt</w:t>
+        <w:t>TaxationService.setPrinterIsActive</w:t>
       </w:r>
     </w:p>
     <w:p>
@@ -24730,7 +24913,7 @@
         <w:pStyle w:val="ListBullet"/>
       </w:pPr>
       <w:r>
-        <w:t>La pagina Fiscalizzazione la chiama all'apertura, e di nuovo quando l'utente cambia lingua, e mostra il testo nel riquadro "Scontrino elettronico", sotto "Termini e condizioni".</w:t>
+        <w:t>La chiama l'interruttore di una riga della tabella delle stampanti (pagina Fiscalizzazione), con il nuovo stato scelto dall'utente.</w:t>
       </w:r>
     </w:p>
     <w:p>
@@ -24738,7 +24921,7 @@
         <w:pStyle w:val="ListBullet"/>
       </w:pPr>
       <w:r>
-        <w:t>Il testo arriva in HTML (titoli, paragrafi, elenchi, link) e il frontend lo ripulisce prima di mostrarlo: script, attributi di evento e link javascript: vengono tolti. Il backend deve comunque mandare solo HTML fidato.</w:t>
+        <w:t>Durante la chiamata la pagina è coperta da uno spinner e non si può fare altro. Alla fine, riuscita o no, la tabella rifà taxation/printer-list: l'interruttore mostra sempre lo stato del server. Se fallisce, il messaggio del code compare in un popup ("Operazione non riuscita").</w:t>
       </w:r>
     </w:p>
     <w:p>
@@ -24746,15 +24929,7 @@
         <w:pStyle w:val="ListBullet"/>
       </w:pPr>
       <w:r>
-        <w:t>È una GET: lo stabilimento viaggia nella query string. Rotta, metodo e nome del campo termsAndConditions sono una proposta del frontend, da confermare col backend.</w:t>
-      </w:r>
-    </w:p>
-    <w:p>
-      <w:pPr>
-        <w:pStyle w:val="ListBullet"/>
-      </w:pPr>
-      <w:r>
-        <w:t>Se la chiamata fallisce il messaggio del code compare al posto del testo.</w:t>
+        <w:t>Risposta 204 senza corpo: proposta del frontend, da confermare col backend.</w:t>
       </w:r>
     </w:p>
     <w:p>
@@ -24766,16 +24941,21 @@
       </w:r>
     </w:p>
     <w:p>
-      <w:r>
-        <w:t>Nessun payload: corpo vuoto, quindi nessun JSON.</w:t>
-      </w:r>
-    </w:p>
-    <w:p>
       <w:pPr>
         <w:pStyle w:val="Heading3"/>
       </w:pPr>
       <w:r>
-        <w:t>Inviato insieme alla richiesta</w:t>
+        <w:rPr>
+          <w:b w:val="0"/>
+        </w:rPr>
+        <w:t xml:space="preserve">Corpo JSON: </w:t>
+      </w:r>
+      <w:r>
+        <w:rPr>
+          <w:rFonts w:ascii="Consolas" w:hAnsi="Consolas"/>
+          <w:b w:val="0"/>
+        </w:rPr>
+        <w:t>SetPrinterIsActiveRequest</w:t>
       </w:r>
     </w:p>
     <w:tbl>
@@ -24818,7 +24998,7 @@
                 <w:color w:val="FFFFFF"/>
                 <w:sz w:val="20"/>
               </w:rPr>
-              <w:t>Nome</w:t>
+              <w:t>Parametro</w:t>
             </w:r>
           </w:p>
         </w:tc>
@@ -24875,10 +25055,12 @@
             </w:pPr>
             <w:r>
               <w:rPr>
-                <w:b w:val="0"/>
-                <w:sz w:val="19"/>
-              </w:rPr>
-              <w:t>idProperty (query string)</w:t>
+                <w:rFonts w:ascii="Consolas" w:hAnsi="Consolas"/>
+                <w:b w:val="0"/>
+                <w:color w:val="233C7D"/>
+                <w:sz w:val="19"/>
+              </w:rPr>
+              <w:t>idProperty</w:t>
             </w:r>
           </w:p>
         </w:tc>
@@ -24892,7 +25074,9 @@
             </w:pPr>
             <w:r>
               <w:rPr>
-                <w:b w:val="0"/>
+                <w:rFonts w:ascii="Consolas" w:hAnsi="Consolas"/>
+                <w:b w:val="0"/>
+                <w:color w:val="233C7D"/>
                 <w:sz w:val="19"/>
               </w:rPr>
               <w:t>string (UUID)</w:t>
@@ -24913,6 +25097,129 @@
                 <w:sz w:val="19"/>
               </w:rPr>
               <w:t>Stabilimento dell'utente (da AuthUser.idProperty).</w:t>
+            </w:r>
+          </w:p>
+        </w:tc>
+      </w:tr>
+      <w:tr>
+        <w:trPr>
+          <w:cantSplit w:val="true"/>
+        </w:trPr>
+        <w:tc>
+          <w:tcPr>
+            <w:tcW w:type="dxa" w:w="2381"/>
+            <w:shd w:val="clear" w:color="auto" w:fill="F1F3F8"/>
+          </w:tcPr>
+          <w:p>
+            <w:pPr>
+              <w:spacing w:after="0"/>
+            </w:pPr>
+            <w:r>
+              <w:rPr>
+                <w:rFonts w:ascii="Consolas" w:hAnsi="Consolas"/>
+                <w:b w:val="0"/>
+                <w:color w:val="233C7D"/>
+                <w:sz w:val="19"/>
+              </w:rPr>
+              <w:t>idPrinter</w:t>
+            </w:r>
+          </w:p>
+        </w:tc>
+        <w:tc>
+          <w:tcPr>
+            <w:tcW w:type="dxa" w:w="2608"/>
+            <w:shd w:val="clear" w:color="auto" w:fill="F1F3F8"/>
+          </w:tcPr>
+          <w:p>
+            <w:pPr>
+              <w:spacing w:after="0"/>
+            </w:pPr>
+            <w:r>
+              <w:rPr>
+                <w:rFonts w:ascii="Consolas" w:hAnsi="Consolas"/>
+                <w:b w:val="0"/>
+                <w:color w:val="233C7D"/>
+                <w:sz w:val="19"/>
+              </w:rPr>
+              <w:t>string (UUID)</w:t>
+            </w:r>
+          </w:p>
+        </w:tc>
+        <w:tc>
+          <w:tcPr>
+            <w:tcW w:type="dxa" w:w="4876"/>
+            <w:shd w:val="clear" w:color="auto" w:fill="F1F3F8"/>
+          </w:tcPr>
+          <w:p>
+            <w:pPr>
+              <w:spacing w:after="0"/>
+            </w:pPr>
+            <w:r>
+              <w:rPr>
+                <w:b w:val="0"/>
+                <w:sz w:val="19"/>
+              </w:rPr>
+              <w:t>Stampante della riga: idPrinter di taxation/printer-list.</w:t>
+            </w:r>
+          </w:p>
+        </w:tc>
+      </w:tr>
+      <w:tr>
+        <w:trPr>
+          <w:cantSplit w:val="true"/>
+        </w:trPr>
+        <w:tc>
+          <w:tcPr>
+            <w:tcW w:type="dxa" w:w="2381"/>
+          </w:tcPr>
+          <w:p>
+            <w:pPr>
+              <w:spacing w:after="0"/>
+            </w:pPr>
+            <w:r>
+              <w:rPr>
+                <w:rFonts w:ascii="Consolas" w:hAnsi="Consolas"/>
+                <w:b w:val="0"/>
+                <w:color w:val="233C7D"/>
+                <w:sz w:val="19"/>
+              </w:rPr>
+              <w:t>isEnabled</w:t>
+            </w:r>
+          </w:p>
+        </w:tc>
+        <w:tc>
+          <w:tcPr>
+            <w:tcW w:type="dxa" w:w="2608"/>
+          </w:tcPr>
+          <w:p>
+            <w:pPr>
+              <w:spacing w:after="0"/>
+            </w:pPr>
+            <w:r>
+              <w:rPr>
+                <w:rFonts w:ascii="Consolas" w:hAnsi="Consolas"/>
+                <w:b w:val="0"/>
+                <w:color w:val="233C7D"/>
+                <w:sz w:val="19"/>
+              </w:rPr>
+              <w:t>boolean</w:t>
+            </w:r>
+          </w:p>
+        </w:tc>
+        <w:tc>
+          <w:tcPr>
+            <w:tcW w:type="dxa" w:w="4876"/>
+          </w:tcPr>
+          <w:p>
+            <w:pPr>
+              <w:spacing w:after="0"/>
+            </w:pPr>
+            <w:r>
+              <w:rPr>
+                <w:b w:val="0"/>
+                <w:sz w:val="19"/>
+              </w:rPr>
+              <w:t>Nuovo stato scelto con l'interruttore: true accesa, false spenta.</w:t>
             </w:r>
           </w:p>
         </w:tc>
@@ -24925,6 +25232,94 @@
     </w:p>
     <w:p>
       <w:pPr>
+        <w:pStyle w:val="Heading3"/>
+      </w:pPr>
+      <w:r>
+        <w:t>Esempio di richiesta (JSON)</w:t>
+      </w:r>
+    </w:p>
+    <w:p>
+      <w:pPr>
+        <w:keepNext/>
+        <w:spacing w:after="0"/>
+        <w:shd w:val="clear" w:color="auto" w:fill="F1F3F8"/>
+      </w:pPr>
+      <w:r>
+        <w:rPr>
+          <w:rFonts w:ascii="Consolas" w:hAnsi="Consolas"/>
+          <w:b w:val="0"/>
+          <w:color w:val="233C7D"/>
+          <w:sz w:val="19"/>
+        </w:rPr>
+        <w:t>{</w:t>
+      </w:r>
+    </w:p>
+    <w:p>
+      <w:pPr>
+        <w:keepNext/>
+        <w:spacing w:after="0"/>
+        <w:shd w:val="clear" w:color="auto" w:fill="F1F3F8"/>
+      </w:pPr>
+      <w:r>
+        <w:rPr>
+          <w:rFonts w:ascii="Consolas" w:hAnsi="Consolas"/>
+          <w:b w:val="0"/>
+          <w:color w:val="233C7D"/>
+          <w:sz w:val="19"/>
+        </w:rPr>
+        <w:t xml:space="preserve">  "idProperty": "5b1f3c7e-2d4a-4e8b-9c1d-7a6e5f4b3c2d",</w:t>
+      </w:r>
+    </w:p>
+    <w:p>
+      <w:pPr>
+        <w:keepNext/>
+        <w:spacing w:after="0"/>
+        <w:shd w:val="clear" w:color="auto" w:fill="F1F3F8"/>
+      </w:pPr>
+      <w:r>
+        <w:rPr>
+          <w:rFonts w:ascii="Consolas" w:hAnsi="Consolas"/>
+          <w:b w:val="0"/>
+          <w:color w:val="233C7D"/>
+          <w:sz w:val="19"/>
+        </w:rPr>
+        <w:t xml:space="preserve">  "idPrinter": "5f0c2a1e-8b3d-4c6f-9a2e-1d7b3c4e5f60",</w:t>
+      </w:r>
+    </w:p>
+    <w:p>
+      <w:pPr>
+        <w:keepNext/>
+        <w:spacing w:after="0"/>
+        <w:shd w:val="clear" w:color="auto" w:fill="F1F3F8"/>
+      </w:pPr>
+      <w:r>
+        <w:rPr>
+          <w:rFonts w:ascii="Consolas" w:hAnsi="Consolas"/>
+          <w:b w:val="0"/>
+          <w:color w:val="233C7D"/>
+          <w:sz w:val="19"/>
+        </w:rPr>
+        <w:t xml:space="preserve">  "isEnabled": true</w:t>
+      </w:r>
+    </w:p>
+    <w:p>
+      <w:pPr>
+        <w:keepNext w:val="0"/>
+        <w:spacing w:after="120"/>
+        <w:shd w:val="clear" w:color="auto" w:fill="F1F3F8"/>
+      </w:pPr>
+      <w:r>
+        <w:rPr>
+          <w:rFonts w:ascii="Consolas" w:hAnsi="Consolas"/>
+          <w:b w:val="0"/>
+          <w:color w:val="233C7D"/>
+          <w:sz w:val="19"/>
+        </w:rPr>
+        <w:t>}</w:t>
+      </w:r>
+    </w:p>
+    <w:p>
+      <w:pPr>
         <w:pStyle w:val="Heading2"/>
       </w:pPr>
       <w:r>
@@ -24945,25 +25340,20 @@
         <w:rPr>
           <w:b w:val="0"/>
         </w:rPr>
-        <w:t>200 OK</w:t>
-      </w:r>
-    </w:p>
-    <w:p>
-      <w:pPr>
-        <w:pStyle w:val="Heading3"/>
-      </w:pPr>
-      <w:r>
-        <w:rPr>
-          <w:b w:val="0"/>
-        </w:rPr>
-        <w:t xml:space="preserve">Corpo JSON: </w:t>
-      </w:r>
-      <w:r>
-        <w:rPr>
-          <w:rFonts w:ascii="Consolas" w:hAnsi="Consolas"/>
-          <w:b w:val="0"/>
-        </w:rPr>
-        <w:t>ElectronicReceiptResponse</w:t>
+        <w:t>204 No Content (nessun corpo)</w:t>
+      </w:r>
+    </w:p>
+    <w:p>
+      <w:r>
+        <w:t>Nessun corpo nella risposta, quindi nessun JSON.</w:t>
+      </w:r>
+    </w:p>
+    <w:p>
+      <w:pPr>
+        <w:pStyle w:val="Heading2"/>
+      </w:pPr>
+      <w:r>
+        <w:t>Errori possibili</w:t>
       </w:r>
     </w:p>
     <w:tbl>
@@ -24993,7 +25383,7 @@
         </w:trPr>
         <w:tc>
           <w:tcPr>
-            <w:tcW w:type="dxa" w:w="2381"/>
+            <w:tcW w:type="dxa" w:w="907"/>
             <w:shd w:val="clear" w:color="auto" w:fill="233C7D"/>
           </w:tcPr>
           <w:p>
@@ -25006,13 +25396,13 @@
                 <w:color w:val="FFFFFF"/>
                 <w:sz w:val="20"/>
               </w:rPr>
-              <w:t>Parametro</w:t>
-            </w:r>
-          </w:p>
-        </w:tc>
-        <w:tc>
-          <w:tcPr>
-            <w:tcW w:type="dxa" w:w="2608"/>
+              <w:t>Status</w:t>
+            </w:r>
+          </w:p>
+        </w:tc>
+        <w:tc>
+          <w:tcPr>
+            <w:tcW w:type="dxa" w:w="3061"/>
             <w:shd w:val="clear" w:color="auto" w:fill="233C7D"/>
           </w:tcPr>
           <w:p>
@@ -25025,13 +25415,13 @@
                 <w:color w:val="FFFFFF"/>
                 <w:sz w:val="20"/>
               </w:rPr>
-              <w:t>Tipo</w:t>
-            </w:r>
-          </w:p>
-        </w:tc>
-        <w:tc>
-          <w:tcPr>
-            <w:tcW w:type="dxa" w:w="4876"/>
+              <w:t>Codice</w:t>
+            </w:r>
+          </w:p>
+        </w:tc>
+        <w:tc>
+          <w:tcPr>
+            <w:tcW w:type="dxa" w:w="5896"/>
             <w:shd w:val="clear" w:color="auto" w:fill="233C7D"/>
           </w:tcPr>
           <w:p>
@@ -25044,7 +25434,7 @@
                 <w:color w:val="FFFFFF"/>
                 <w:sz w:val="20"/>
               </w:rPr>
-              <w:t>Descrizione</w:t>
+              <w:t>Quando</w:t>
             </w:r>
           </w:p>
         </w:tc>
@@ -25055,7 +25445,7 @@
         </w:trPr>
         <w:tc>
           <w:tcPr>
-            <w:tcW w:type="dxa" w:w="2381"/>
+            <w:tcW w:type="dxa" w:w="907"/>
           </w:tcPr>
           <w:p>
             <w:pPr>
@@ -25068,13 +25458,13 @@
                 <w:color w:val="233C7D"/>
                 <w:sz w:val="19"/>
               </w:rPr>
-              <w:t>termsAndConditions</w:t>
-            </w:r>
-          </w:p>
-        </w:tc>
-        <w:tc>
-          <w:tcPr>
-            <w:tcW w:type="dxa" w:w="2608"/>
+              <w:t>403</w:t>
+            </w:r>
+          </w:p>
+        </w:tc>
+        <w:tc>
+          <w:tcPr>
+            <w:tcW w:type="dxa" w:w="3061"/>
           </w:tcPr>
           <w:p>
             <w:pPr>
@@ -25087,24 +25477,210 @@
                 <w:color w:val="233C7D"/>
                 <w:sz w:val="19"/>
               </w:rPr>
-              <w:t>string (HTML)</w:t>
-            </w:r>
-          </w:p>
-        </w:tc>
-        <w:tc>
-          <w:tcPr>
-            <w:tcW w:type="dxa" w:w="4876"/>
-          </w:tcPr>
-          <w:p>
-            <w:pPr>
-              <w:spacing w:after="0"/>
-            </w:pPr>
-            <w:r>
-              <w:rPr>
-                <w:b w:val="0"/>
-                <w:sz w:val="19"/>
-              </w:rPr>
-              <w:t>Termini e condizioni dello scontrino elettronico, già formattati in HTML, nella lingua di Accept-Language. Il frontend li mostra ripuliti (niente script, attributi di evento o link javascript:).</w:t>
+              <w:t>operation.not_allowed</w:t>
+            </w:r>
+          </w:p>
+        </w:tc>
+        <w:tc>
+          <w:tcPr>
+            <w:tcW w:type="dxa" w:w="5896"/>
+          </w:tcPr>
+          <w:p>
+            <w:pPr>
+              <w:spacing w:after="0"/>
+            </w:pPr>
+            <w:r>
+              <w:rPr>
+                <w:b w:val="0"/>
+                <w:sz w:val="19"/>
+              </w:rPr>
+              <w:t>idProperty assente, sconosciuto o non dell'utente: l'operazione è annullata, senza errors[].</w:t>
+            </w:r>
+          </w:p>
+        </w:tc>
+      </w:tr>
+      <w:tr>
+        <w:trPr>
+          <w:cantSplit w:val="true"/>
+        </w:trPr>
+        <w:tc>
+          <w:tcPr>
+            <w:tcW w:type="dxa" w:w="907"/>
+            <w:shd w:val="clear" w:color="auto" w:fill="F1F3F8"/>
+          </w:tcPr>
+          <w:p>
+            <w:pPr>
+              <w:spacing w:after="0"/>
+            </w:pPr>
+            <w:r>
+              <w:rPr>
+                <w:rFonts w:ascii="Consolas" w:hAnsi="Consolas"/>
+                <w:b w:val="0"/>
+                <w:color w:val="233C7D"/>
+                <w:sz w:val="19"/>
+              </w:rPr>
+              <w:t>404</w:t>
+            </w:r>
+          </w:p>
+        </w:tc>
+        <w:tc>
+          <w:tcPr>
+            <w:tcW w:type="dxa" w:w="3061"/>
+            <w:shd w:val="clear" w:color="auto" w:fill="F1F3F8"/>
+          </w:tcPr>
+          <w:p>
+            <w:pPr>
+              <w:spacing w:after="0"/>
+            </w:pPr>
+            <w:r>
+              <w:rPr>
+                <w:rFonts w:ascii="Consolas" w:hAnsi="Consolas"/>
+                <w:b w:val="0"/>
+                <w:color w:val="233C7D"/>
+                <w:sz w:val="19"/>
+              </w:rPr>
+              <w:t>resource.not_found</w:t>
+            </w:r>
+          </w:p>
+        </w:tc>
+        <w:tc>
+          <w:tcPr>
+            <w:tcW w:type="dxa" w:w="5896"/>
+            <w:shd w:val="clear" w:color="auto" w:fill="F1F3F8"/>
+          </w:tcPr>
+          <w:p>
+            <w:pPr>
+              <w:spacing w:after="0"/>
+            </w:pPr>
+            <w:r>
+              <w:rPr>
+                <w:b w:val="0"/>
+                <w:sz w:val="19"/>
+              </w:rPr>
+              <w:t>idPrinter non è una stampante dello stabilimento: l'operazione è annullata, senza errors[].</w:t>
+            </w:r>
+          </w:p>
+        </w:tc>
+      </w:tr>
+      <w:tr>
+        <w:trPr>
+          <w:cantSplit w:val="true"/>
+        </w:trPr>
+        <w:tc>
+          <w:tcPr>
+            <w:tcW w:type="dxa" w:w="907"/>
+          </w:tcPr>
+          <w:p>
+            <w:pPr>
+              <w:spacing w:after="0"/>
+            </w:pPr>
+            <w:r>
+              <w:rPr>
+                <w:rFonts w:ascii="Consolas" w:hAnsi="Consolas"/>
+                <w:b w:val="0"/>
+                <w:color w:val="233C7D"/>
+                <w:sz w:val="19"/>
+              </w:rPr>
+              <w:t>401</w:t>
+            </w:r>
+          </w:p>
+        </w:tc>
+        <w:tc>
+          <w:tcPr>
+            <w:tcW w:type="dxa" w:w="3061"/>
+          </w:tcPr>
+          <w:p>
+            <w:pPr>
+              <w:spacing w:after="0"/>
+            </w:pPr>
+            <w:r>
+              <w:rPr>
+                <w:rFonts w:ascii="Consolas" w:hAnsi="Consolas"/>
+                <w:b w:val="0"/>
+                <w:color w:val="233C7D"/>
+                <w:sz w:val="19"/>
+              </w:rPr>
+              <w:t>auth.invalid_token</w:t>
+            </w:r>
+          </w:p>
+        </w:tc>
+        <w:tc>
+          <w:tcPr>
+            <w:tcW w:type="dxa" w:w="5896"/>
+          </w:tcPr>
+          <w:p>
+            <w:pPr>
+              <w:spacing w:after="0"/>
+            </w:pPr>
+            <w:r>
+              <w:rPr>
+                <w:b w:val="0"/>
+                <w:sz w:val="19"/>
+              </w:rPr>
+              <w:t>Access token assente, scaduto o non valido: il frontend rinnova il token e ripete la chiamata una volta.</w:t>
+            </w:r>
+          </w:p>
+        </w:tc>
+      </w:tr>
+      <w:tr>
+        <w:trPr>
+          <w:cantSplit w:val="true"/>
+        </w:trPr>
+        <w:tc>
+          <w:tcPr>
+            <w:tcW w:type="dxa" w:w="907"/>
+            <w:shd w:val="clear" w:color="auto" w:fill="F1F3F8"/>
+          </w:tcPr>
+          <w:p>
+            <w:pPr>
+              <w:spacing w:after="0"/>
+            </w:pPr>
+            <w:r>
+              <w:rPr>
+                <w:rFonts w:ascii="Consolas" w:hAnsi="Consolas"/>
+                <w:b w:val="0"/>
+                <w:color w:val="233C7D"/>
+                <w:sz w:val="19"/>
+              </w:rPr>
+              <w:t>500</w:t>
+            </w:r>
+          </w:p>
+        </w:tc>
+        <w:tc>
+          <w:tcPr>
+            <w:tcW w:type="dxa" w:w="3061"/>
+            <w:shd w:val="clear" w:color="auto" w:fill="F1F3F8"/>
+          </w:tcPr>
+          <w:p>
+            <w:pPr>
+              <w:spacing w:after="0"/>
+            </w:pPr>
+            <w:r>
+              <w:rPr>
+                <w:rFonts w:ascii="Consolas" w:hAnsi="Consolas"/>
+                <w:b w:val="0"/>
+                <w:color w:val="233C7D"/>
+                <w:sz w:val="19"/>
+              </w:rPr>
+              <w:t>server.unexpected</w:t>
+            </w:r>
+          </w:p>
+        </w:tc>
+        <w:tc>
+          <w:tcPr>
+            <w:tcW w:type="dxa" w:w="5896"/>
+            <w:shd w:val="clear" w:color="auto" w:fill="F1F3F8"/>
+          </w:tcPr>
+          <w:p>
+            <w:pPr>
+              <w:spacing w:after="0"/>
+            </w:pPr>
+            <w:r>
+              <w:rPr>
+                <w:b w:val="0"/>
+                <w:sz w:val="19"/>
+              </w:rPr>
+              <w:t>Errore non gestito del server (vale per ogni API).</w:t>
             </w:r>
           </w:p>
         </w:tc>
@@ -25120,7 +25696,15 @@
         <w:pStyle w:val="Heading3"/>
       </w:pPr>
       <w:r>
-        <w:t>Esempio di risposta (JSON)</w:t>
+        <w:t>Esempio di errore (JSON)</w:t>
+      </w:r>
+    </w:p>
+    <w:p>
+      <w:pPr>
+        <w:keepNext/>
+      </w:pPr>
+      <w:r>
+        <w:t>Risposta a una richiesta con un idPrinter che non è una stampante dello stabilimento:</w:t>
       </w:r>
     </w:p>
     <w:p>
@@ -25152,7 +25736,71 @@
           <w:color w:val="233C7D"/>
           <w:sz w:val="19"/>
         </w:rPr>
-        <w:t xml:space="preserve">  "termsAndConditions": "&lt;h4&gt;Generale&lt;/h4&gt;&lt;p&gt;Testo dei termini e condizioni…&lt;/p&gt;"</w:t>
+        <w:t xml:space="preserve">  "type": "https://errors.summerbooking/resource/not-found",</w:t>
+      </w:r>
+    </w:p>
+    <w:p>
+      <w:pPr>
+        <w:keepNext/>
+        <w:spacing w:after="0"/>
+        <w:shd w:val="clear" w:color="auto" w:fill="F1F3F8"/>
+      </w:pPr>
+      <w:r>
+        <w:rPr>
+          <w:rFonts w:ascii="Consolas" w:hAnsi="Consolas"/>
+          <w:b w:val="0"/>
+          <w:color w:val="233C7D"/>
+          <w:sz w:val="19"/>
+        </w:rPr>
+        <w:t xml:space="preserve">  "status": 404,</w:t>
+      </w:r>
+    </w:p>
+    <w:p>
+      <w:pPr>
+        <w:keepNext/>
+        <w:spacing w:after="0"/>
+        <w:shd w:val="clear" w:color="auto" w:fill="F1F3F8"/>
+      </w:pPr>
+      <w:r>
+        <w:rPr>
+          <w:rFonts w:ascii="Consolas" w:hAnsi="Consolas"/>
+          <w:b w:val="0"/>
+          <w:color w:val="233C7D"/>
+          <w:sz w:val="19"/>
+        </w:rPr>
+        <w:t xml:space="preserve">  "code": "resource.not_found",</w:t>
+      </w:r>
+    </w:p>
+    <w:p>
+      <w:pPr>
+        <w:keepNext/>
+        <w:spacing w:after="0"/>
+        <w:shd w:val="clear" w:color="auto" w:fill="F1F3F8"/>
+      </w:pPr>
+      <w:r>
+        <w:rPr>
+          <w:rFonts w:ascii="Consolas" w:hAnsi="Consolas"/>
+          <w:b w:val="0"/>
+          <w:color w:val="233C7D"/>
+          <w:sz w:val="19"/>
+        </w:rPr>
+        <w:t xml:space="preserve">  "title": "Resource not found",</w:t>
+      </w:r>
+    </w:p>
+    <w:p>
+      <w:pPr>
+        <w:keepNext/>
+        <w:spacing w:after="0"/>
+        <w:shd w:val="clear" w:color="auto" w:fill="F1F3F8"/>
+      </w:pPr>
+      <w:r>
+        <w:rPr>
+          <w:rFonts w:ascii="Consolas" w:hAnsi="Consolas"/>
+          <w:b w:val="0"/>
+          <w:color w:val="233C7D"/>
+          <w:sz w:val="19"/>
+        </w:rPr>
+        <w:t xml:space="preserve">  "traceId": "00-4bf92f3577b34da6a3ce929d0e0e4736-00f067aa0ba902b7-01"</w:t>
       </w:r>
     </w:p>
     <w:p>
@@ -25173,10 +25821,150 @@
     </w:p>
     <w:p>
       <w:pPr>
+        <w:pStyle w:val="Heading1"/>
+        <w:pageBreakBefore/>
+      </w:pPr>
+      <w:r>
+        <w:rPr>
+          <w:b w:val="0"/>
+        </w:rPr>
+        <w:t xml:space="preserve">POST </w:t>
+      </w:r>
+      <w:r>
+        <w:rPr>
+          <w:rFonts w:ascii="Consolas" w:hAnsi="Consolas"/>
+          <w:b w:val="0"/>
+        </w:rPr>
+        <w:t>/api/taxation/delete-printer</w:t>
+      </w:r>
+    </w:p>
+    <w:p>
+      <w:r>
+        <w:t>Fiscalizzazione: eliminazione di una stampante</w:t>
+      </w:r>
+    </w:p>
+    <w:p>
+      <w:pPr>
+        <w:spacing w:after="40"/>
+      </w:pPr>
+      <w:r>
+        <w:rPr>
+          <w:b/>
+        </w:rPr>
+        <w:t xml:space="preserve">Metodo: </w:t>
+      </w:r>
+      <w:r>
+        <w:rPr>
+          <w:rFonts w:ascii="Consolas" w:hAnsi="Consolas"/>
+          <w:b w:val="0"/>
+          <w:color w:val="233C7D"/>
+        </w:rPr>
+        <w:t>POST</w:t>
+      </w:r>
+    </w:p>
+    <w:p>
+      <w:pPr>
+        <w:spacing w:after="40"/>
+      </w:pPr>
+      <w:r>
+        <w:rPr>
+          <w:b/>
+        </w:rPr>
+        <w:t xml:space="preserve">Route: </w:t>
+      </w:r>
+      <w:r>
+        <w:rPr>
+          <w:rFonts w:ascii="Consolas" w:hAnsi="Consolas"/>
+          <w:b w:val="0"/>
+          <w:color w:val="233C7D"/>
+        </w:rPr>
+        <w:t>/api/taxation/delete-printer</w:t>
+      </w:r>
+    </w:p>
+    <w:p>
+      <w:pPr>
+        <w:spacing w:after="40"/>
+      </w:pPr>
+      <w:r>
+        <w:rPr>
+          <w:b/>
+        </w:rPr>
+        <w:t xml:space="preserve">Nel frontend: </w:t>
+      </w:r>
+      <w:r>
+        <w:rPr>
+          <w:rFonts w:ascii="Consolas" w:hAnsi="Consolas"/>
+          <w:b w:val="0"/>
+          <w:color w:val="233C7D"/>
+        </w:rPr>
+        <w:t>TaxationService.deletePrinter</w:t>
+      </w:r>
+    </w:p>
+    <w:p>
+      <w:pPr>
+        <w:spacing w:after="40"/>
+      </w:pPr>
+      <w:r>
+        <w:rPr>
+          <w:b/>
+        </w:rPr>
+        <w:t xml:space="preserve">Autenticazione: </w:t>
+      </w:r>
+      <w:r>
+        <w:rPr>
+          <w:b w:val="0"/>
+        </w:rPr>
+        <w:t>Header Authorization: Bearer &lt;accessToken&gt;.</w:t>
+      </w:r>
+    </w:p>
+    <w:p>
+      <w:pPr>
+        <w:pStyle w:val="ListBullet"/>
+      </w:pPr>
+      <w:r>
+        <w:t>La chiama il cestino di una riga della tabella delle stampanti (pagina Fiscalizzazione), dopo la conferma dell'utente ("Vuoi eliminare la stampante EPSON - 1?").</w:t>
+      </w:r>
+    </w:p>
+    <w:p>
+      <w:pPr>
+        <w:pStyle w:val="ListBullet"/>
+      </w:pPr>
+      <w:r>
+        <w:t>Durante la chiamata la pagina è coperta da uno spinner e non si può fare altro. Alla fine, riuscita o no, la tabella rifà taxation/printer-list. Se fallisce, il messaggio del code compare in un popup ("Operazione non riuscita").</w:t>
+      </w:r>
+    </w:p>
+    <w:p>
+      <w:pPr>
+        <w:pStyle w:val="ListBullet"/>
+      </w:pPr>
+      <w:r>
+        <w:t>Risposta 204 senza corpo: proposta del frontend, da confermare col backend.</w:t>
+      </w:r>
+    </w:p>
+    <w:p>
+      <w:pPr>
         <w:pStyle w:val="Heading2"/>
       </w:pPr>
       <w:r>
-        <w:t>Errori possibili</w:t>
+        <w:t>Payload inviato al backend</w:t>
+      </w:r>
+    </w:p>
+    <w:p>
+      <w:pPr>
+        <w:pStyle w:val="Heading3"/>
+      </w:pPr>
+      <w:r>
+        <w:rPr>
+          <w:b w:val="0"/>
+        </w:rPr>
+        <w:t xml:space="preserve">Corpo JSON: </w:t>
+      </w:r>
+      <w:r>
+        <w:rPr>
+          <w:rFonts w:ascii="Consolas" w:hAnsi="Consolas"/>
+          <w:b w:val="0"/>
+        </w:rPr>
+        <w:t>DeletePrinterRequest</w:t>
       </w:r>
     </w:p>
     <w:tbl>
@@ -25206,7 +25994,7 @@
         </w:trPr>
         <w:tc>
           <w:tcPr>
-            <w:tcW w:type="dxa" w:w="907"/>
+            <w:tcW w:type="dxa" w:w="2381"/>
             <w:shd w:val="clear" w:color="auto" w:fill="233C7D"/>
           </w:tcPr>
           <w:p>
@@ -25219,13 +26007,13 @@
                 <w:color w:val="FFFFFF"/>
                 <w:sz w:val="20"/>
               </w:rPr>
-              <w:t>Status</w:t>
-            </w:r>
-          </w:p>
-        </w:tc>
-        <w:tc>
-          <w:tcPr>
-            <w:tcW w:type="dxa" w:w="3061"/>
+              <w:t>Parametro</w:t>
+            </w:r>
+          </w:p>
+        </w:tc>
+        <w:tc>
+          <w:tcPr>
+            <w:tcW w:type="dxa" w:w="2608"/>
             <w:shd w:val="clear" w:color="auto" w:fill="233C7D"/>
           </w:tcPr>
           <w:p>
@@ -25238,13 +26026,13 @@
                 <w:color w:val="FFFFFF"/>
                 <w:sz w:val="20"/>
               </w:rPr>
-              <w:t>Codice</w:t>
-            </w:r>
-          </w:p>
-        </w:tc>
-        <w:tc>
-          <w:tcPr>
-            <w:tcW w:type="dxa" w:w="5896"/>
+              <w:t>Tipo</w:t>
+            </w:r>
+          </w:p>
+        </w:tc>
+        <w:tc>
+          <w:tcPr>
+            <w:tcW w:type="dxa" w:w="4876"/>
             <w:shd w:val="clear" w:color="auto" w:fill="233C7D"/>
           </w:tcPr>
           <w:p>
@@ -25257,7 +26045,7 @@
                 <w:color w:val="FFFFFF"/>
                 <w:sz w:val="20"/>
               </w:rPr>
-              <w:t>Quando</w:t>
+              <w:t>Descrizione</w:t>
             </w:r>
           </w:p>
         </w:tc>
@@ -25268,7 +26056,7 @@
         </w:trPr>
         <w:tc>
           <w:tcPr>
-            <w:tcW w:type="dxa" w:w="907"/>
+            <w:tcW w:type="dxa" w:w="2381"/>
           </w:tcPr>
           <w:p>
             <w:pPr>
@@ -25281,13 +26069,13 @@
                 <w:color w:val="233C7D"/>
                 <w:sz w:val="19"/>
               </w:rPr>
-              <w:t>403</w:t>
-            </w:r>
-          </w:p>
-        </w:tc>
-        <w:tc>
-          <w:tcPr>
-            <w:tcW w:type="dxa" w:w="3061"/>
+              <w:t>idProperty</w:t>
+            </w:r>
+          </w:p>
+        </w:tc>
+        <w:tc>
+          <w:tcPr>
+            <w:tcW w:type="dxa" w:w="2608"/>
           </w:tcPr>
           <w:p>
             <w:pPr>
@@ -25300,24 +26088,24 @@
                 <w:color w:val="233C7D"/>
                 <w:sz w:val="19"/>
               </w:rPr>
-              <w:t>operation.not_allowed</w:t>
-            </w:r>
-          </w:p>
-        </w:tc>
-        <w:tc>
-          <w:tcPr>
-            <w:tcW w:type="dxa" w:w="5896"/>
-          </w:tcPr>
-          <w:p>
-            <w:pPr>
-              <w:spacing w:after="0"/>
-            </w:pPr>
-            <w:r>
-              <w:rPr>
-                <w:b w:val="0"/>
-                <w:sz w:val="19"/>
-              </w:rPr>
-              <w:t>idProperty assente, sconosciuto o non dell'utente: l'operazione è annullata, senza errors[].</w:t>
+              <w:t>string (UUID)</w:t>
+            </w:r>
+          </w:p>
+        </w:tc>
+        <w:tc>
+          <w:tcPr>
+            <w:tcW w:type="dxa" w:w="4876"/>
+          </w:tcPr>
+          <w:p>
+            <w:pPr>
+              <w:spacing w:after="0"/>
+            </w:pPr>
+            <w:r>
+              <w:rPr>
+                <w:b w:val="0"/>
+                <w:sz w:val="19"/>
+              </w:rPr>
+              <w:t>Stabilimento dell'utente (da AuthUser.idProperty).</w:t>
             </w:r>
           </w:p>
         </w:tc>
@@ -25328,7 +26116,7 @@
         </w:trPr>
         <w:tc>
           <w:tcPr>
-            <w:tcW w:type="dxa" w:w="907"/>
+            <w:tcW w:type="dxa" w:w="2381"/>
             <w:shd w:val="clear" w:color="auto" w:fill="F1F3F8"/>
           </w:tcPr>
           <w:p>
@@ -25342,13 +26130,13 @@
                 <w:color w:val="233C7D"/>
                 <w:sz w:val="19"/>
               </w:rPr>
-              <w:t>401</w:t>
-            </w:r>
-          </w:p>
-        </w:tc>
-        <w:tc>
-          <w:tcPr>
-            <w:tcW w:type="dxa" w:w="3061"/>
+              <w:t>idPrinter</w:t>
+            </w:r>
+          </w:p>
+        </w:tc>
+        <w:tc>
+          <w:tcPr>
+            <w:tcW w:type="dxa" w:w="2608"/>
             <w:shd w:val="clear" w:color="auto" w:fill="F1F3F8"/>
           </w:tcPr>
           <w:p>
@@ -25362,13 +26150,13 @@
                 <w:color w:val="233C7D"/>
                 <w:sz w:val="19"/>
               </w:rPr>
-              <w:t>auth.invalid_token</w:t>
-            </w:r>
-          </w:p>
-        </w:tc>
-        <w:tc>
-          <w:tcPr>
-            <w:tcW w:type="dxa" w:w="5896"/>
+              <w:t>string (UUID)</w:t>
+            </w:r>
+          </w:p>
+        </w:tc>
+        <w:tc>
+          <w:tcPr>
+            <w:tcW w:type="dxa" w:w="4876"/>
             <w:shd w:val="clear" w:color="auto" w:fill="F1F3F8"/>
           </w:tcPr>
           <w:p>
@@ -25380,67 +26168,7 @@
                 <w:b w:val="0"/>
                 <w:sz w:val="19"/>
               </w:rPr>
-              <w:t>Access token assente, scaduto o non valido: il frontend rinnova il token e ripete la chiamata una volta.</w:t>
-            </w:r>
-          </w:p>
-        </w:tc>
-      </w:tr>
-      <w:tr>
-        <w:trPr>
-          <w:cantSplit w:val="true"/>
-        </w:trPr>
-        <w:tc>
-          <w:tcPr>
-            <w:tcW w:type="dxa" w:w="907"/>
-          </w:tcPr>
-          <w:p>
-            <w:pPr>
-              <w:spacing w:after="0"/>
-            </w:pPr>
-            <w:r>
-              <w:rPr>
-                <w:rFonts w:ascii="Consolas" w:hAnsi="Consolas"/>
-                <w:b w:val="0"/>
-                <w:color w:val="233C7D"/>
-                <w:sz w:val="19"/>
-              </w:rPr>
-              <w:t>500</w:t>
-            </w:r>
-          </w:p>
-        </w:tc>
-        <w:tc>
-          <w:tcPr>
-            <w:tcW w:type="dxa" w:w="3061"/>
-          </w:tcPr>
-          <w:p>
-            <w:pPr>
-              <w:spacing w:after="0"/>
-            </w:pPr>
-            <w:r>
-              <w:rPr>
-                <w:rFonts w:ascii="Consolas" w:hAnsi="Consolas"/>
-                <w:b w:val="0"/>
-                <w:color w:val="233C7D"/>
-                <w:sz w:val="19"/>
-              </w:rPr>
-              <w:t>server.unexpected</w:t>
-            </w:r>
-          </w:p>
-        </w:tc>
-        <w:tc>
-          <w:tcPr>
-            <w:tcW w:type="dxa" w:w="5896"/>
-          </w:tcPr>
-          <w:p>
-            <w:pPr>
-              <w:spacing w:after="0"/>
-            </w:pPr>
-            <w:r>
-              <w:rPr>
-                <w:b w:val="0"/>
-                <w:sz w:val="19"/>
-              </w:rPr>
-              <w:t>Errore non gestito del server (vale per ogni API).</w:t>
+              <w:t>Stampante da eliminare: idPrinter di taxation/printer-list.</w:t>
             </w:r>
           </w:p>
         </w:tc>
@@ -25456,15 +26184,7 @@
         <w:pStyle w:val="Heading3"/>
       </w:pPr>
       <w:r>
-        <w:t>Esempio di errore (JSON)</w:t>
-      </w:r>
-    </w:p>
-    <w:p>
-      <w:pPr>
-        <w:keepNext/>
-      </w:pPr>
-      <w:r>
-        <w:t>Risposta a una richiesta con uno stabilimento non valido:</w:t>
+        <w:t>Esempio di richiesta (JSON)</w:t>
       </w:r>
     </w:p>
     <w:p>
@@ -25496,7 +26216,7 @@
           <w:color w:val="233C7D"/>
           <w:sz w:val="19"/>
         </w:rPr>
-        <w:t xml:space="preserve">  "type": "https://errors.summerbooking/operation/not-allowed",</w:t>
+        <w:t xml:space="preserve">  "idProperty": "5b1f3c7e-2d4a-4e8b-9c1d-7a6e5f4b3c2d",</w:t>
       </w:r>
     </w:p>
     <w:p>
@@ -25512,55 +26232,7 @@
           <w:color w:val="233C7D"/>
           <w:sz w:val="19"/>
         </w:rPr>
-        <w:t xml:space="preserve">  "status": 403,</w:t>
-      </w:r>
-    </w:p>
-    <w:p>
-      <w:pPr>
-        <w:keepNext/>
-        <w:spacing w:after="0"/>
-        <w:shd w:val="clear" w:color="auto" w:fill="F1F3F8"/>
-      </w:pPr>
-      <w:r>
-        <w:rPr>
-          <w:rFonts w:ascii="Consolas" w:hAnsi="Consolas"/>
-          <w:b w:val="0"/>
-          <w:color w:val="233C7D"/>
-          <w:sz w:val="19"/>
-        </w:rPr>
-        <w:t xml:space="preserve">  "code": "operation.not_allowed",</w:t>
-      </w:r>
-    </w:p>
-    <w:p>
-      <w:pPr>
-        <w:keepNext/>
-        <w:spacing w:after="0"/>
-        <w:shd w:val="clear" w:color="auto" w:fill="F1F3F8"/>
-      </w:pPr>
-      <w:r>
-        <w:rPr>
-          <w:rFonts w:ascii="Consolas" w:hAnsi="Consolas"/>
-          <w:b w:val="0"/>
-          <w:color w:val="233C7D"/>
-          <w:sz w:val="19"/>
-        </w:rPr>
-        <w:t xml:space="preserve">  "title": "Operation not allowed",</w:t>
-      </w:r>
-    </w:p>
-    <w:p>
-      <w:pPr>
-        <w:keepNext/>
-        <w:spacing w:after="0"/>
-        <w:shd w:val="clear" w:color="auto" w:fill="F1F3F8"/>
-      </w:pPr>
-      <w:r>
-        <w:rPr>
-          <w:rFonts w:ascii="Consolas" w:hAnsi="Consolas"/>
-          <w:b w:val="0"/>
-          <w:color w:val="233C7D"/>
-          <w:sz w:val="19"/>
-        </w:rPr>
-        <w:t xml:space="preserve">  "traceId": "00-4bf92f3577b34da6a3ce929d0e0e4736-00f067aa0ba902b7-01"</w:t>
+        <w:t xml:space="preserve">  "idPrinter": "5f0c2a1e-8b3d-4c6f-9a2e-1d7b3c4e5f60"</w:t>
       </w:r>
     </w:p>
     <w:p>
@@ -25581,16 +26253,40 @@
     </w:p>
     <w:p>
       <w:pPr>
-        <w:pStyle w:val="Heading1"/>
-        <w:pageBreakBefore/>
-      </w:pPr>
-      <w:r>
-        <w:t>Catalogo dei codici di errore</w:t>
-      </w:r>
-    </w:p>
-    <w:p>
-      <w:r>
-        <w:t>Tutti i codici che il frontend gestisce oggi. Ognuno è anche la chiave di traduzione error.&lt;codice&gt; nei file it.json ed en.json. Da confermare o correggere col backend: una volta rilasciati non cambiano. I codici marcati "dal frontend" non li invia il backend.</w:t>
+        <w:pStyle w:val="Heading2"/>
+      </w:pPr>
+      <w:r>
+        <w:t>Risposta attesa dal server</w:t>
+      </w:r>
+    </w:p>
+    <w:p>
+      <w:pPr>
+        <w:spacing w:after="40"/>
+      </w:pPr>
+      <w:r>
+        <w:rPr>
+          <w:b/>
+        </w:rPr>
+        <w:t xml:space="preserve">Stato: </w:t>
+      </w:r>
+      <w:r>
+        <w:rPr>
+          <w:b w:val="0"/>
+        </w:rPr>
+        <w:t>204 No Content (nessun corpo)</w:t>
+      </w:r>
+    </w:p>
+    <w:p>
+      <w:r>
+        <w:t>Nessun corpo nella risposta, quindi nessun JSON.</w:t>
+      </w:r>
+    </w:p>
+    <w:p>
+      <w:pPr>
+        <w:pStyle w:val="Heading2"/>
+      </w:pPr>
+      <w:r>
+        <w:t>Errori possibili</w:t>
       </w:r>
     </w:p>
     <w:tbl>
@@ -25620,7 +26316,7 @@
         </w:trPr>
         <w:tc>
           <w:tcPr>
-            <w:tcW w:type="dxa" w:w="3288"/>
+            <w:tcW w:type="dxa" w:w="907"/>
             <w:shd w:val="clear" w:color="auto" w:fill="233C7D"/>
           </w:tcPr>
           <w:p>
@@ -25633,13 +26329,13 @@
                 <w:color w:val="FFFFFF"/>
                 <w:sz w:val="20"/>
               </w:rPr>
-              <w:t>Codice</w:t>
-            </w:r>
-          </w:p>
-        </w:tc>
-        <w:tc>
-          <w:tcPr>
-            <w:tcW w:type="dxa" w:w="1928"/>
+              <w:t>Status</w:t>
+            </w:r>
+          </w:p>
+        </w:tc>
+        <w:tc>
+          <w:tcPr>
+            <w:tcW w:type="dxa" w:w="3061"/>
             <w:shd w:val="clear" w:color="auto" w:fill="233C7D"/>
           </w:tcPr>
           <w:p>
@@ -25652,13 +26348,13 @@
                 <w:color w:val="FFFFFF"/>
                 <w:sz w:val="20"/>
               </w:rPr>
-              <w:t>Status</w:t>
-            </w:r>
-          </w:p>
-        </w:tc>
-        <w:tc>
-          <w:tcPr>
-            <w:tcW w:type="dxa" w:w="4649"/>
+              <w:t>Codice</w:t>
+            </w:r>
+          </w:p>
+        </w:tc>
+        <w:tc>
+          <w:tcPr>
+            <w:tcW w:type="dxa" w:w="5896"/>
             <w:shd w:val="clear" w:color="auto" w:fill="233C7D"/>
           </w:tcPr>
           <w:p>
@@ -25671,7 +26367,7 @@
                 <w:color w:val="FFFFFF"/>
                 <w:sz w:val="20"/>
               </w:rPr>
-              <w:t>Significato</w:t>
+              <w:t>Quando</w:t>
             </w:r>
           </w:p>
         </w:tc>
@@ -25682,7 +26378,7 @@
         </w:trPr>
         <w:tc>
           <w:tcPr>
-            <w:tcW w:type="dxa" w:w="3288"/>
+            <w:tcW w:type="dxa" w:w="907"/>
           </w:tcPr>
           <w:p>
             <w:pPr>
@@ -25695,41 +26391,43 @@
                 <w:color w:val="233C7D"/>
                 <w:sz w:val="19"/>
               </w:rPr>
-              <w:t>auth.invalid_credentials</w:t>
-            </w:r>
-          </w:p>
-        </w:tc>
-        <w:tc>
-          <w:tcPr>
-            <w:tcW w:type="dxa" w:w="1928"/>
-          </w:tcPr>
-          <w:p>
-            <w:pPr>
-              <w:spacing w:after="0"/>
-            </w:pPr>
-            <w:r>
-              <w:rPr>
-                <w:b w:val="0"/>
-                <w:sz w:val="19"/>
-              </w:rPr>
-              <w:t>401</w:t>
-            </w:r>
-          </w:p>
-        </w:tc>
-        <w:tc>
-          <w:tcPr>
-            <w:tcW w:type="dxa" w:w="4649"/>
-          </w:tcPr>
-          <w:p>
-            <w:pPr>
-              <w:spacing w:after="0"/>
-            </w:pPr>
-            <w:r>
-              <w:rPr>
-                <w:b w:val="0"/>
-                <w:sz w:val="19"/>
-              </w:rPr>
-              <w:t>Email o password non corrette (signin).</w:t>
+              <w:t>403</w:t>
+            </w:r>
+          </w:p>
+        </w:tc>
+        <w:tc>
+          <w:tcPr>
+            <w:tcW w:type="dxa" w:w="3061"/>
+          </w:tcPr>
+          <w:p>
+            <w:pPr>
+              <w:spacing w:after="0"/>
+            </w:pPr>
+            <w:r>
+              <w:rPr>
+                <w:rFonts w:ascii="Consolas" w:hAnsi="Consolas"/>
+                <w:b w:val="0"/>
+                <w:color w:val="233C7D"/>
+                <w:sz w:val="19"/>
+              </w:rPr>
+              <w:t>operation.not_allowed</w:t>
+            </w:r>
+          </w:p>
+        </w:tc>
+        <w:tc>
+          <w:tcPr>
+            <w:tcW w:type="dxa" w:w="5896"/>
+          </w:tcPr>
+          <w:p>
+            <w:pPr>
+              <w:spacing w:after="0"/>
+            </w:pPr>
+            <w:r>
+              <w:rPr>
+                <w:b w:val="0"/>
+                <w:sz w:val="19"/>
+              </w:rPr>
+              <w:t>idProperty assente, sconosciuto o non dell'utente: l'operazione è annullata, senza errors[].</w:t>
             </w:r>
           </w:p>
         </w:tc>
@@ -25740,7 +26438,7 @@
         </w:trPr>
         <w:tc>
           <w:tcPr>
-            <w:tcW w:type="dxa" w:w="3288"/>
+            <w:tcW w:type="dxa" w:w="907"/>
             <w:shd w:val="clear" w:color="auto" w:fill="F1F3F8"/>
           </w:tcPr>
           <w:p>
@@ -25754,13 +26452,13 @@
                 <w:color w:val="233C7D"/>
                 <w:sz w:val="19"/>
               </w:rPr>
-              <w:t>auth.invalid_token</w:t>
-            </w:r>
-          </w:p>
-        </w:tc>
-        <w:tc>
-          <w:tcPr>
-            <w:tcW w:type="dxa" w:w="1928"/>
+              <w:t>404</w:t>
+            </w:r>
+          </w:p>
+        </w:tc>
+        <w:tc>
+          <w:tcPr>
+            <w:tcW w:type="dxa" w:w="3061"/>
             <w:shd w:val="clear" w:color="auto" w:fill="F1F3F8"/>
           </w:tcPr>
           <w:p>
@@ -25769,16 +26467,18 @@
             </w:pPr>
             <w:r>
               <w:rPr>
-                <w:b w:val="0"/>
-                <w:sz w:val="19"/>
-              </w:rPr>
-              <w:t>401</w:t>
-            </w:r>
-          </w:p>
-        </w:tc>
-        <w:tc>
-          <w:tcPr>
-            <w:tcW w:type="dxa" w:w="4649"/>
+                <w:rFonts w:ascii="Consolas" w:hAnsi="Consolas"/>
+                <w:b w:val="0"/>
+                <w:color w:val="233C7D"/>
+                <w:sz w:val="19"/>
+              </w:rPr>
+              <w:t>resource.not_found</w:t>
+            </w:r>
+          </w:p>
+        </w:tc>
+        <w:tc>
+          <w:tcPr>
+            <w:tcW w:type="dxa" w:w="5896"/>
             <w:shd w:val="clear" w:color="auto" w:fill="F1F3F8"/>
           </w:tcPr>
           <w:p>
@@ -25790,7 +26490,7 @@
                 <w:b w:val="0"/>
                 <w:sz w:val="19"/>
               </w:rPr>
-              <w:t>Access token assente, scaduto o non valido su un'API protetta.</w:t>
+              <w:t>idPrinter non è una stampante dello stabilimento: l'operazione è annullata, senza errors[].</w:t>
             </w:r>
           </w:p>
         </w:tc>
@@ -25801,7 +26501,7 @@
         </w:trPr>
         <w:tc>
           <w:tcPr>
-            <w:tcW w:type="dxa" w:w="3288"/>
+            <w:tcW w:type="dxa" w:w="907"/>
           </w:tcPr>
           <w:p>
             <w:pPr>
@@ -25814,41 +26514,43 @@
                 <w:color w:val="233C7D"/>
                 <w:sz w:val="19"/>
               </w:rPr>
-              <w:t>auth.session_expired</w:t>
-            </w:r>
-          </w:p>
-        </w:tc>
-        <w:tc>
-          <w:tcPr>
-            <w:tcW w:type="dxa" w:w="1928"/>
-          </w:tcPr>
-          <w:p>
-            <w:pPr>
-              <w:spacing w:after="0"/>
-            </w:pPr>
-            <w:r>
-              <w:rPr>
-                <w:b w:val="0"/>
-                <w:sz w:val="19"/>
-              </w:rPr>
               <w:t>401</w:t>
             </w:r>
           </w:p>
         </w:tc>
         <w:tc>
           <w:tcPr>
-            <w:tcW w:type="dxa" w:w="4649"/>
-          </w:tcPr>
-          <w:p>
-            <w:pPr>
-              <w:spacing w:after="0"/>
-            </w:pPr>
-            <w:r>
-              <w:rPr>
-                <w:b w:val="0"/>
-                <w:sz w:val="19"/>
-              </w:rPr>
-              <w:t>Nessuna sessione valida: cookie del refresh token assente, scaduto o revocato (refresh, logout).</w:t>
+            <w:tcW w:type="dxa" w:w="3061"/>
+          </w:tcPr>
+          <w:p>
+            <w:pPr>
+              <w:spacing w:after="0"/>
+            </w:pPr>
+            <w:r>
+              <w:rPr>
+                <w:rFonts w:ascii="Consolas" w:hAnsi="Consolas"/>
+                <w:b w:val="0"/>
+                <w:color w:val="233C7D"/>
+                <w:sz w:val="19"/>
+              </w:rPr>
+              <w:t>auth.invalid_token</w:t>
+            </w:r>
+          </w:p>
+        </w:tc>
+        <w:tc>
+          <w:tcPr>
+            <w:tcW w:type="dxa" w:w="5896"/>
+          </w:tcPr>
+          <w:p>
+            <w:pPr>
+              <w:spacing w:after="0"/>
+            </w:pPr>
+            <w:r>
+              <w:rPr>
+                <w:b w:val="0"/>
+                <w:sz w:val="19"/>
+              </w:rPr>
+              <w:t>Access token assente, scaduto o non valido: il frontend rinnova il token e ripete la chiamata una volta.</w:t>
             </w:r>
           </w:p>
         </w:tc>
@@ -25859,7 +26561,7 @@
         </w:trPr>
         <w:tc>
           <w:tcPr>
-            <w:tcW w:type="dxa" w:w="3288"/>
+            <w:tcW w:type="dxa" w:w="907"/>
             <w:shd w:val="clear" w:color="auto" w:fill="F1F3F8"/>
           </w:tcPr>
           <w:p>
@@ -25873,13 +26575,13 @@
                 <w:color w:val="233C7D"/>
                 <w:sz w:val="19"/>
               </w:rPr>
-              <w:t>validation.invalid_request</w:t>
-            </w:r>
-          </w:p>
-        </w:tc>
-        <w:tc>
-          <w:tcPr>
-            <w:tcW w:type="dxa" w:w="1928"/>
+              <w:t>500</w:t>
+            </w:r>
+          </w:p>
+        </w:tc>
+        <w:tc>
+          <w:tcPr>
+            <w:tcW w:type="dxa" w:w="3061"/>
             <w:shd w:val="clear" w:color="auto" w:fill="F1F3F8"/>
           </w:tcPr>
           <w:p>
@@ -25888,16 +26590,18 @@
             </w:pPr>
             <w:r>
               <w:rPr>
-                <w:b w:val="0"/>
-                <w:sz w:val="19"/>
-              </w:rPr>
-              <w:t>400</w:t>
-            </w:r>
-          </w:p>
-        </w:tc>
-        <w:tc>
-          <w:tcPr>
-            <w:tcW w:type="dxa" w:w="4649"/>
+                <w:rFonts w:ascii="Consolas" w:hAnsi="Consolas"/>
+                <w:b w:val="0"/>
+                <w:color w:val="233C7D"/>
+                <w:sz w:val="19"/>
+              </w:rPr>
+              <w:t>server.unexpected</w:t>
+            </w:r>
+          </w:p>
+        </w:tc>
+        <w:tc>
+          <w:tcPr>
+            <w:tcW w:type="dxa" w:w="5896"/>
             <w:shd w:val="clear" w:color="auto" w:fill="F1F3F8"/>
           </w:tcPr>
           <w:p>
@@ -25909,7 +26613,396 @@
                 <w:b w:val="0"/>
                 <w:sz w:val="19"/>
               </w:rPr>
-              <w:t>Corpo della richiesta non valido; il dettaglio per campo è in errors[].</w:t>
+              <w:t>Errore non gestito del server (vale per ogni API).</w:t>
+            </w:r>
+          </w:p>
+        </w:tc>
+      </w:tr>
+    </w:tbl>
+    <w:p>
+      <w:pPr>
+        <w:spacing w:after="40"/>
+      </w:pPr>
+    </w:p>
+    <w:p>
+      <w:pPr>
+        <w:pStyle w:val="Heading3"/>
+      </w:pPr>
+      <w:r>
+        <w:t>Esempio di errore (JSON)</w:t>
+      </w:r>
+    </w:p>
+    <w:p>
+      <w:pPr>
+        <w:keepNext/>
+      </w:pPr>
+      <w:r>
+        <w:t>Risposta a una richiesta con un idPrinter che non è una stampante dello stabilimento:</w:t>
+      </w:r>
+    </w:p>
+    <w:p>
+      <w:pPr>
+        <w:keepNext/>
+        <w:spacing w:after="0"/>
+        <w:shd w:val="clear" w:color="auto" w:fill="F1F3F8"/>
+      </w:pPr>
+      <w:r>
+        <w:rPr>
+          <w:rFonts w:ascii="Consolas" w:hAnsi="Consolas"/>
+          <w:b w:val="0"/>
+          <w:color w:val="233C7D"/>
+          <w:sz w:val="19"/>
+        </w:rPr>
+        <w:t>{</w:t>
+      </w:r>
+    </w:p>
+    <w:p>
+      <w:pPr>
+        <w:keepNext/>
+        <w:spacing w:after="0"/>
+        <w:shd w:val="clear" w:color="auto" w:fill="F1F3F8"/>
+      </w:pPr>
+      <w:r>
+        <w:rPr>
+          <w:rFonts w:ascii="Consolas" w:hAnsi="Consolas"/>
+          <w:b w:val="0"/>
+          <w:color w:val="233C7D"/>
+          <w:sz w:val="19"/>
+        </w:rPr>
+        <w:t xml:space="preserve">  "type": "https://errors.summerbooking/resource/not-found",</w:t>
+      </w:r>
+    </w:p>
+    <w:p>
+      <w:pPr>
+        <w:keepNext/>
+        <w:spacing w:after="0"/>
+        <w:shd w:val="clear" w:color="auto" w:fill="F1F3F8"/>
+      </w:pPr>
+      <w:r>
+        <w:rPr>
+          <w:rFonts w:ascii="Consolas" w:hAnsi="Consolas"/>
+          <w:b w:val="0"/>
+          <w:color w:val="233C7D"/>
+          <w:sz w:val="19"/>
+        </w:rPr>
+        <w:t xml:space="preserve">  "status": 404,</w:t>
+      </w:r>
+    </w:p>
+    <w:p>
+      <w:pPr>
+        <w:keepNext/>
+        <w:spacing w:after="0"/>
+        <w:shd w:val="clear" w:color="auto" w:fill="F1F3F8"/>
+      </w:pPr>
+      <w:r>
+        <w:rPr>
+          <w:rFonts w:ascii="Consolas" w:hAnsi="Consolas"/>
+          <w:b w:val="0"/>
+          <w:color w:val="233C7D"/>
+          <w:sz w:val="19"/>
+        </w:rPr>
+        <w:t xml:space="preserve">  "code": "resource.not_found",</w:t>
+      </w:r>
+    </w:p>
+    <w:p>
+      <w:pPr>
+        <w:keepNext/>
+        <w:spacing w:after="0"/>
+        <w:shd w:val="clear" w:color="auto" w:fill="F1F3F8"/>
+      </w:pPr>
+      <w:r>
+        <w:rPr>
+          <w:rFonts w:ascii="Consolas" w:hAnsi="Consolas"/>
+          <w:b w:val="0"/>
+          <w:color w:val="233C7D"/>
+          <w:sz w:val="19"/>
+        </w:rPr>
+        <w:t xml:space="preserve">  "title": "Resource not found",</w:t>
+      </w:r>
+    </w:p>
+    <w:p>
+      <w:pPr>
+        <w:keepNext/>
+        <w:spacing w:after="0"/>
+        <w:shd w:val="clear" w:color="auto" w:fill="F1F3F8"/>
+      </w:pPr>
+      <w:r>
+        <w:rPr>
+          <w:rFonts w:ascii="Consolas" w:hAnsi="Consolas"/>
+          <w:b w:val="0"/>
+          <w:color w:val="233C7D"/>
+          <w:sz w:val="19"/>
+        </w:rPr>
+        <w:t xml:space="preserve">  "traceId": "00-4bf92f3577b34da6a3ce929d0e0e4736-00f067aa0ba902b7-01"</w:t>
+      </w:r>
+    </w:p>
+    <w:p>
+      <w:pPr>
+        <w:keepNext w:val="0"/>
+        <w:spacing w:after="120"/>
+        <w:shd w:val="clear" w:color="auto" w:fill="F1F3F8"/>
+      </w:pPr>
+      <w:r>
+        <w:rPr>
+          <w:rFonts w:ascii="Consolas" w:hAnsi="Consolas"/>
+          <w:b w:val="0"/>
+          <w:color w:val="233C7D"/>
+          <w:sz w:val="19"/>
+        </w:rPr>
+        <w:t>}</w:t>
+      </w:r>
+    </w:p>
+    <w:p>
+      <w:pPr>
+        <w:pStyle w:val="Heading1"/>
+        <w:pageBreakBefore/>
+      </w:pPr>
+      <w:r>
+        <w:rPr>
+          <w:b w:val="0"/>
+        </w:rPr>
+        <w:t xml:space="preserve">POST </w:t>
+      </w:r>
+      <w:r>
+        <w:rPr>
+          <w:rFonts w:ascii="Consolas" w:hAnsi="Consolas"/>
+          <w:b w:val="0"/>
+        </w:rPr>
+        <w:t>/api/taxation/download-guide-electronic-receipt</w:t>
+      </w:r>
+    </w:p>
+    <w:p>
+      <w:r>
+        <w:t>Fiscalizzazione: guida dello scontrino elettronico</w:t>
+      </w:r>
+    </w:p>
+    <w:p>
+      <w:pPr>
+        <w:spacing w:after="40"/>
+      </w:pPr>
+      <w:r>
+        <w:rPr>
+          <w:b/>
+        </w:rPr>
+        <w:t xml:space="preserve">Metodo: </w:t>
+      </w:r>
+      <w:r>
+        <w:rPr>
+          <w:rFonts w:ascii="Consolas" w:hAnsi="Consolas"/>
+          <w:b w:val="0"/>
+          <w:color w:val="233C7D"/>
+        </w:rPr>
+        <w:t>POST</w:t>
+      </w:r>
+    </w:p>
+    <w:p>
+      <w:pPr>
+        <w:spacing w:after="40"/>
+      </w:pPr>
+      <w:r>
+        <w:rPr>
+          <w:b/>
+        </w:rPr>
+        <w:t xml:space="preserve">Route: </w:t>
+      </w:r>
+      <w:r>
+        <w:rPr>
+          <w:rFonts w:ascii="Consolas" w:hAnsi="Consolas"/>
+          <w:b w:val="0"/>
+          <w:color w:val="233C7D"/>
+        </w:rPr>
+        <w:t>/api/taxation/download-guide-electronic-receipt</w:t>
+      </w:r>
+    </w:p>
+    <w:p>
+      <w:pPr>
+        <w:spacing w:after="40"/>
+      </w:pPr>
+      <w:r>
+        <w:rPr>
+          <w:b/>
+        </w:rPr>
+        <w:t xml:space="preserve">Nel frontend: </w:t>
+      </w:r>
+      <w:r>
+        <w:rPr>
+          <w:rFonts w:ascii="Consolas" w:hAnsi="Consolas"/>
+          <w:b w:val="0"/>
+          <w:color w:val="233C7D"/>
+        </w:rPr>
+        <w:t>TaxationService.downloadGuideElectronicReceipt</w:t>
+      </w:r>
+    </w:p>
+    <w:p>
+      <w:pPr>
+        <w:spacing w:after="40"/>
+      </w:pPr>
+      <w:r>
+        <w:rPr>
+          <w:b/>
+        </w:rPr>
+        <w:t xml:space="preserve">Autenticazione: </w:t>
+      </w:r>
+      <w:r>
+        <w:rPr>
+          <w:b w:val="0"/>
+        </w:rPr>
+        <w:t>Header Authorization: Bearer &lt;accessToken&gt;.</w:t>
+      </w:r>
+    </w:p>
+    <w:p>
+      <w:pPr>
+        <w:pStyle w:val="ListBullet"/>
+      </w:pPr>
+      <w:r>
+        <w:t>La chiama il bottone "Scarica la guida" della pagina Fiscalizzazione: il file ricevuto viene salvato sul dispositivo dell'utente.</w:t>
+      </w:r>
+    </w:p>
+    <w:p>
+      <w:pPr>
+        <w:pStyle w:val="ListBullet"/>
+      </w:pPr>
+      <w:r>
+        <w:t>Il tipo del documento non è ancora deciso (PDF, Word…): il frontend salva qualsiasi file, con il nome dato dal server in Content-Disposition.</w:t>
+      </w:r>
+    </w:p>
+    <w:p>
+      <w:pPr>
+        <w:pStyle w:val="ListBullet"/>
+      </w:pPr>
+      <w:r>
+        <w:t>Il corpo contiene solo idProperty, lo stabilimento dell'utente.</w:t>
+      </w:r>
+    </w:p>
+    <w:p>
+      <w:pPr>
+        <w:pStyle w:val="ListBullet"/>
+      </w:pPr>
+      <w:r>
+        <w:t>Se il server non manda un nome, il file si chiama electronic-receipt-guide. Il nome del server viene ripulito: niente cartelle né caratteri non validi.</w:t>
+      </w:r>
+    </w:p>
+    <w:p>
+      <w:pPr>
+        <w:pStyle w:val="ListBullet"/>
+      </w:pPr>
+      <w:r>
+        <w:t>Gli errori arrivano come le altre API (Problem Details in JSON). Se la chiamata fallisce, il messaggio del code compare in un popup ("Operazione non riuscita"). Durante la chiamata il bottone mostra lo spinner.</w:t>
+      </w:r>
+    </w:p>
+    <w:p>
+      <w:pPr>
+        <w:pStyle w:val="ListBullet"/>
+      </w:pPr>
+      <w:r>
+        <w:t>Se il server sta su un dominio diverso da quello del frontend, deve esporre l'header con Access-Control-Expose-Headers: Content-Disposition, altrimenti il browser non lo fa leggere e il file prende il nome di riserva.</w:t>
+      </w:r>
+    </w:p>
+    <w:p>
+      <w:pPr>
+        <w:pStyle w:val="Heading2"/>
+      </w:pPr>
+      <w:r>
+        <w:t>Payload inviato al backend</w:t>
+      </w:r>
+    </w:p>
+    <w:p>
+      <w:pPr>
+        <w:pStyle w:val="Heading3"/>
+      </w:pPr>
+      <w:r>
+        <w:rPr>
+          <w:b w:val="0"/>
+        </w:rPr>
+        <w:t xml:space="preserve">Corpo JSON: </w:t>
+      </w:r>
+      <w:r>
+        <w:rPr>
+          <w:rFonts w:ascii="Consolas" w:hAnsi="Consolas"/>
+          <w:b w:val="0"/>
+        </w:rPr>
+        <w:t>DownloadGuideElectronicReceiptRequest</w:t>
+      </w:r>
+    </w:p>
+    <w:tbl>
+      <w:tblPr>
+        <w:tblW w:type="auto" w:w="0"/>
+        <w:jc w:val="center"/>
+        <w:tblLayout w:type="fixed"/>
+        <w:tblLook w:firstColumn="1" w:firstRow="1" w:lastColumn="0" w:lastRow="0" w:noHBand="0" w:noVBand="1" w:val="04A0"/>
+        <w:tblBorders>
+          <w:top w:val="single" w:sz="4" w:color="C9CED8"/>
+          <w:left w:val="single" w:sz="4" w:color="C9CED8"/>
+          <w:bottom w:val="single" w:sz="4" w:color="C9CED8"/>
+          <w:right w:val="single" w:sz="4" w:color="C9CED8"/>
+          <w:insideH w:val="single" w:sz="4" w:color="C9CED8"/>
+          <w:insideV w:val="single" w:sz="4" w:color="C9CED8"/>
+        </w:tblBorders>
+      </w:tblPr>
+      <w:tblGrid>
+        <w:gridCol w:w="3289"/>
+        <w:gridCol w:w="3289"/>
+        <w:gridCol w:w="3289"/>
+      </w:tblGrid>
+      <w:tr>
+        <w:trPr>
+          <w:cantSplit w:val="true"/>
+          <w:tblHeader w:val="true"/>
+        </w:trPr>
+        <w:tc>
+          <w:tcPr>
+            <w:tcW w:type="dxa" w:w="2381"/>
+            <w:shd w:val="clear" w:color="auto" w:fill="233C7D"/>
+          </w:tcPr>
+          <w:p>
+            <w:pPr>
+              <w:spacing w:after="0"/>
+            </w:pPr>
+            <w:r>
+              <w:rPr>
+                <w:b/>
+                <w:color w:val="FFFFFF"/>
+                <w:sz w:val="20"/>
+              </w:rPr>
+              <w:t>Parametro</w:t>
+            </w:r>
+          </w:p>
+        </w:tc>
+        <w:tc>
+          <w:tcPr>
+            <w:tcW w:type="dxa" w:w="2608"/>
+            <w:shd w:val="clear" w:color="auto" w:fill="233C7D"/>
+          </w:tcPr>
+          <w:p>
+            <w:pPr>
+              <w:spacing w:after="0"/>
+            </w:pPr>
+            <w:r>
+              <w:rPr>
+                <w:b/>
+                <w:color w:val="FFFFFF"/>
+                <w:sz w:val="20"/>
+              </w:rPr>
+              <w:t>Tipo</w:t>
+            </w:r>
+          </w:p>
+        </w:tc>
+        <w:tc>
+          <w:tcPr>
+            <w:tcW w:type="dxa" w:w="4876"/>
+            <w:shd w:val="clear" w:color="auto" w:fill="233C7D"/>
+          </w:tcPr>
+          <w:p>
+            <w:pPr>
+              <w:spacing w:after="0"/>
+            </w:pPr>
+            <w:r>
+              <w:rPr>
+                <w:b/>
+                <w:color w:val="FFFFFF"/>
+                <w:sz w:val="20"/>
+              </w:rPr>
+              <w:t>Descrizione</w:t>
             </w:r>
           </w:p>
         </w:tc>
@@ -25920,7 +27013,7 @@
         </w:trPr>
         <w:tc>
           <w:tcPr>
-            <w:tcW w:type="dxa" w:w="3288"/>
+            <w:tcW w:type="dxa" w:w="2381"/>
           </w:tcPr>
           <w:p>
             <w:pPr>
@@ -25933,41 +27026,226 @@
                 <w:color w:val="233C7D"/>
                 <w:sz w:val="19"/>
               </w:rPr>
-              <w:t>validation.invalid_date</w:t>
-            </w:r>
-          </w:p>
-        </w:tc>
-        <w:tc>
-          <w:tcPr>
-            <w:tcW w:type="dxa" w:w="1928"/>
-          </w:tcPr>
-          <w:p>
-            <w:pPr>
-              <w:spacing w:after="0"/>
-            </w:pPr>
-            <w:r>
-              <w:rPr>
-                <w:b w:val="0"/>
-                <w:sz w:val="19"/>
-              </w:rPr>
-              <w:t>400 (in errors[])</w:t>
-            </w:r>
-          </w:p>
-        </w:tc>
-        <w:tc>
-          <w:tcPr>
-            <w:tcW w:type="dxa" w:w="4649"/>
-          </w:tcPr>
-          <w:p>
-            <w:pPr>
-              <w:spacing w:after="0"/>
-            </w:pPr>
-            <w:r>
-              <w:rPr>
-                <w:b w:val="0"/>
-                <w:sz w:val="19"/>
-              </w:rPr>
-              <w:t>Data assente o non leggibile come ISO 8601.</w:t>
+              <w:t>idProperty</w:t>
+            </w:r>
+          </w:p>
+        </w:tc>
+        <w:tc>
+          <w:tcPr>
+            <w:tcW w:type="dxa" w:w="2608"/>
+          </w:tcPr>
+          <w:p>
+            <w:pPr>
+              <w:spacing w:after="0"/>
+            </w:pPr>
+            <w:r>
+              <w:rPr>
+                <w:rFonts w:ascii="Consolas" w:hAnsi="Consolas"/>
+                <w:b w:val="0"/>
+                <w:color w:val="233C7D"/>
+                <w:sz w:val="19"/>
+              </w:rPr>
+              <w:t>string (UUID)</w:t>
+            </w:r>
+          </w:p>
+        </w:tc>
+        <w:tc>
+          <w:tcPr>
+            <w:tcW w:type="dxa" w:w="4876"/>
+          </w:tcPr>
+          <w:p>
+            <w:pPr>
+              <w:spacing w:after="0"/>
+            </w:pPr>
+            <w:r>
+              <w:rPr>
+                <w:b w:val="0"/>
+                <w:sz w:val="19"/>
+              </w:rPr>
+              <w:t>Stabilimento dell'utente (da AuthUser.idProperty).</w:t>
+            </w:r>
+          </w:p>
+        </w:tc>
+      </w:tr>
+    </w:tbl>
+    <w:p>
+      <w:pPr>
+        <w:spacing w:after="40"/>
+      </w:pPr>
+    </w:p>
+    <w:p>
+      <w:pPr>
+        <w:pStyle w:val="Heading3"/>
+      </w:pPr>
+      <w:r>
+        <w:t>Esempio di richiesta (JSON)</w:t>
+      </w:r>
+    </w:p>
+    <w:p>
+      <w:pPr>
+        <w:keepNext/>
+        <w:spacing w:after="0"/>
+        <w:shd w:val="clear" w:color="auto" w:fill="F1F3F8"/>
+      </w:pPr>
+      <w:r>
+        <w:rPr>
+          <w:rFonts w:ascii="Consolas" w:hAnsi="Consolas"/>
+          <w:b w:val="0"/>
+          <w:color w:val="233C7D"/>
+          <w:sz w:val="19"/>
+        </w:rPr>
+        <w:t>{</w:t>
+      </w:r>
+    </w:p>
+    <w:p>
+      <w:pPr>
+        <w:keepNext/>
+        <w:spacing w:after="0"/>
+        <w:shd w:val="clear" w:color="auto" w:fill="F1F3F8"/>
+      </w:pPr>
+      <w:r>
+        <w:rPr>
+          <w:rFonts w:ascii="Consolas" w:hAnsi="Consolas"/>
+          <w:b w:val="0"/>
+          <w:color w:val="233C7D"/>
+          <w:sz w:val="19"/>
+        </w:rPr>
+        <w:t xml:space="preserve">  "idProperty": "5b1f3c7e-2d4a-4e8b-9c1d-7a6e5f4b3c2d"</w:t>
+      </w:r>
+    </w:p>
+    <w:p>
+      <w:pPr>
+        <w:keepNext w:val="0"/>
+        <w:spacing w:after="120"/>
+        <w:shd w:val="clear" w:color="auto" w:fill="F1F3F8"/>
+      </w:pPr>
+      <w:r>
+        <w:rPr>
+          <w:rFonts w:ascii="Consolas" w:hAnsi="Consolas"/>
+          <w:b w:val="0"/>
+          <w:color w:val="233C7D"/>
+          <w:sz w:val="19"/>
+        </w:rPr>
+        <w:t>}</w:t>
+      </w:r>
+    </w:p>
+    <w:p>
+      <w:pPr>
+        <w:pStyle w:val="Heading2"/>
+      </w:pPr>
+      <w:r>
+        <w:t>Risposta attesa dal server</w:t>
+      </w:r>
+    </w:p>
+    <w:p>
+      <w:pPr>
+        <w:spacing w:after="40"/>
+      </w:pPr>
+      <w:r>
+        <w:rPr>
+          <w:b/>
+        </w:rPr>
+        <w:t xml:space="preserve">Stato: </w:t>
+      </w:r>
+      <w:r>
+        <w:rPr>
+          <w:b w:val="0"/>
+        </w:rPr>
+        <w:t>200 OK</w:t>
+      </w:r>
+    </w:p>
+    <w:p>
+      <w:r>
+        <w:t>Il corpo è il file della guida (binario), non JSON.</w:t>
+      </w:r>
+    </w:p>
+    <w:p>
+      <w:pPr>
+        <w:pStyle w:val="Heading3"/>
+      </w:pPr>
+      <w:r>
+        <w:t>Header della risposta</w:t>
+      </w:r>
+    </w:p>
+    <w:tbl>
+      <w:tblPr>
+        <w:tblW w:type="auto" w:w="0"/>
+        <w:jc w:val="center"/>
+        <w:tblLayout w:type="fixed"/>
+        <w:tblLook w:firstColumn="1" w:firstRow="1" w:lastColumn="0" w:lastRow="0" w:noHBand="0" w:noVBand="1" w:val="04A0"/>
+        <w:tblBorders>
+          <w:top w:val="single" w:sz="4" w:color="C9CED8"/>
+          <w:left w:val="single" w:sz="4" w:color="C9CED8"/>
+          <w:bottom w:val="single" w:sz="4" w:color="C9CED8"/>
+          <w:right w:val="single" w:sz="4" w:color="C9CED8"/>
+          <w:insideH w:val="single" w:sz="4" w:color="C9CED8"/>
+          <w:insideV w:val="single" w:sz="4" w:color="C9CED8"/>
+        </w:tblBorders>
+      </w:tblPr>
+      <w:tblGrid>
+        <w:gridCol w:w="3289"/>
+        <w:gridCol w:w="3289"/>
+        <w:gridCol w:w="3289"/>
+      </w:tblGrid>
+      <w:tr>
+        <w:trPr>
+          <w:cantSplit w:val="true"/>
+          <w:tblHeader w:val="true"/>
+        </w:trPr>
+        <w:tc>
+          <w:tcPr>
+            <w:tcW w:type="dxa" w:w="2381"/>
+            <w:shd w:val="clear" w:color="auto" w:fill="233C7D"/>
+          </w:tcPr>
+          <w:p>
+            <w:pPr>
+              <w:spacing w:after="0"/>
+            </w:pPr>
+            <w:r>
+              <w:rPr>
+                <w:b/>
+                <w:color w:val="FFFFFF"/>
+                <w:sz w:val="20"/>
+              </w:rPr>
+              <w:t>Header</w:t>
+            </w:r>
+          </w:p>
+        </w:tc>
+        <w:tc>
+          <w:tcPr>
+            <w:tcW w:type="dxa" w:w="2608"/>
+            <w:shd w:val="clear" w:color="auto" w:fill="233C7D"/>
+          </w:tcPr>
+          <w:p>
+            <w:pPr>
+              <w:spacing w:after="0"/>
+            </w:pPr>
+            <w:r>
+              <w:rPr>
+                <w:b/>
+                <w:color w:val="FFFFFF"/>
+                <w:sz w:val="20"/>
+              </w:rPr>
+              <w:t>Valore</w:t>
+            </w:r>
+          </w:p>
+        </w:tc>
+        <w:tc>
+          <w:tcPr>
+            <w:tcW w:type="dxa" w:w="4876"/>
+            <w:shd w:val="clear" w:color="auto" w:fill="233C7D"/>
+          </w:tcPr>
+          <w:p>
+            <w:pPr>
+              <w:spacing w:after="0"/>
+            </w:pPr>
+            <w:r>
+              <w:rPr>
+                <w:b/>
+                <w:color w:val="FFFFFF"/>
+                <w:sz w:val="20"/>
+              </w:rPr>
+              <w:t>Descrizione</w:t>
             </w:r>
           </w:p>
         </w:tc>
@@ -25978,8 +27256,7 @@
         </w:trPr>
         <w:tc>
           <w:tcPr>
-            <w:tcW w:type="dxa" w:w="3288"/>
-            <w:shd w:val="clear" w:color="auto" w:fill="F1F3F8"/>
+            <w:tcW w:type="dxa" w:w="2381"/>
           </w:tcPr>
           <w:p>
             <w:pPr>
@@ -25992,43 +27269,43 @@
                 <w:color w:val="233C7D"/>
                 <w:sz w:val="19"/>
               </w:rPr>
-              <w:t>validation.end_before_start</w:t>
-            </w:r>
-          </w:p>
-        </w:tc>
-        <w:tc>
-          <w:tcPr>
-            <w:tcW w:type="dxa" w:w="1928"/>
-            <w:shd w:val="clear" w:color="auto" w:fill="F1F3F8"/>
-          </w:tcPr>
-          <w:p>
-            <w:pPr>
-              <w:spacing w:after="0"/>
-            </w:pPr>
-            <w:r>
-              <w:rPr>
-                <w:b w:val="0"/>
-                <w:sz w:val="19"/>
-              </w:rPr>
-              <w:t>400 (in errors[])</w:t>
-            </w:r>
-          </w:p>
-        </w:tc>
-        <w:tc>
-          <w:tcPr>
-            <w:tcW w:type="dxa" w:w="4649"/>
-            <w:shd w:val="clear" w:color="auto" w:fill="F1F3F8"/>
-          </w:tcPr>
-          <w:p>
-            <w:pPr>
-              <w:spacing w:after="0"/>
-            </w:pPr>
-            <w:r>
-              <w:rPr>
-                <w:b w:val="0"/>
-                <w:sz w:val="19"/>
-              </w:rPr>
-              <w:t>La data di fine viene prima di quella di inizio.</w:t>
+              <w:t>Content-Type</w:t>
+            </w:r>
+          </w:p>
+        </w:tc>
+        <w:tc>
+          <w:tcPr>
+            <w:tcW w:type="dxa" w:w="2608"/>
+          </w:tcPr>
+          <w:p>
+            <w:pPr>
+              <w:spacing w:after="0"/>
+            </w:pPr>
+            <w:r>
+              <w:rPr>
+                <w:rFonts w:ascii="Consolas" w:hAnsi="Consolas"/>
+                <w:b w:val="0"/>
+                <w:color w:val="233C7D"/>
+                <w:sz w:val="19"/>
+              </w:rPr>
+              <w:t>application/pdf</w:t>
+            </w:r>
+          </w:p>
+        </w:tc>
+        <w:tc>
+          <w:tcPr>
+            <w:tcW w:type="dxa" w:w="4876"/>
+          </w:tcPr>
+          <w:p>
+            <w:pPr>
+              <w:spacing w:after="0"/>
+            </w:pPr>
+            <w:r>
+              <w:rPr>
+                <w:b w:val="0"/>
+                <w:sz w:val="19"/>
+              </w:rPr>
+              <w:t>Tipo del file (esempio: il tipo non è ancora deciso).</w:t>
             </w:r>
           </w:p>
         </w:tc>
@@ -26039,7 +27316,8 @@
         </w:trPr>
         <w:tc>
           <w:tcPr>
-            <w:tcW w:type="dxa" w:w="3288"/>
+            <w:tcW w:type="dxa" w:w="2381"/>
+            <w:shd w:val="clear" w:color="auto" w:fill="F1F3F8"/>
           </w:tcPr>
           <w:p>
             <w:pPr>
@@ -26052,41 +27330,142 @@
                 <w:color w:val="233C7D"/>
                 <w:sz w:val="19"/>
               </w:rPr>
-              <w:t>validation.invalid_value</w:t>
-            </w:r>
-          </w:p>
-        </w:tc>
-        <w:tc>
-          <w:tcPr>
-            <w:tcW w:type="dxa" w:w="1928"/>
-          </w:tcPr>
-          <w:p>
-            <w:pPr>
-              <w:spacing w:after="0"/>
-            </w:pPr>
-            <w:r>
-              <w:rPr>
-                <w:b w:val="0"/>
-                <w:sz w:val="19"/>
-              </w:rPr>
-              <w:t>400 (in errors[])</w:t>
-            </w:r>
-          </w:p>
-        </w:tc>
-        <w:tc>
-          <w:tcPr>
-            <w:tcW w:type="dxa" w:w="4649"/>
-          </w:tcPr>
-          <w:p>
-            <w:pPr>
-              <w:spacing w:after="0"/>
-            </w:pPr>
-            <w:r>
-              <w:rPr>
-                <w:b w:val="0"/>
-                <w:sz w:val="19"/>
-              </w:rPr>
-              <w:t>Valore non ammesso o assente in un campo che l'utente compila (es. un bookingDayType inesistente, l'avviso di soglia acceso senza soglia maggiore di 0). Mai su un id: un id sbagliato annulla l'operazione con resource.not_found o operation.not_allowed.</w:t>
+              <w:t>Content-Disposition</w:t>
+            </w:r>
+          </w:p>
+        </w:tc>
+        <w:tc>
+          <w:tcPr>
+            <w:tcW w:type="dxa" w:w="2608"/>
+            <w:shd w:val="clear" w:color="auto" w:fill="F1F3F8"/>
+          </w:tcPr>
+          <w:p>
+            <w:pPr>
+              <w:spacing w:after="0"/>
+            </w:pPr>
+            <w:r>
+              <w:rPr>
+                <w:rFonts w:ascii="Consolas" w:hAnsi="Consolas"/>
+                <w:b w:val="0"/>
+                <w:color w:val="233C7D"/>
+                <w:sz w:val="19"/>
+              </w:rPr>
+              <w:t>attachment; filename="guida-scontrino-elettronico.pdf"</w:t>
+            </w:r>
+          </w:p>
+        </w:tc>
+        <w:tc>
+          <w:tcPr>
+            <w:tcW w:type="dxa" w:w="4876"/>
+            <w:shd w:val="clear" w:color="auto" w:fill="F1F3F8"/>
+          </w:tcPr>
+          <w:p>
+            <w:pPr>
+              <w:spacing w:after="0"/>
+            </w:pPr>
+            <w:r>
+              <w:rPr>
+                <w:b w:val="0"/>
+                <w:sz w:val="19"/>
+              </w:rPr>
+              <w:t>Nome del file; per nomi con lettere accentate anche filename*=UTF-8''…</w:t>
+            </w:r>
+          </w:p>
+        </w:tc>
+      </w:tr>
+    </w:tbl>
+    <w:p>
+      <w:pPr>
+        <w:spacing w:after="40"/>
+      </w:pPr>
+    </w:p>
+    <w:p>
+      <w:pPr>
+        <w:pStyle w:val="Heading2"/>
+      </w:pPr>
+      <w:r>
+        <w:t>Errori possibili</w:t>
+      </w:r>
+    </w:p>
+    <w:tbl>
+      <w:tblPr>
+        <w:tblW w:type="auto" w:w="0"/>
+        <w:jc w:val="center"/>
+        <w:tblLayout w:type="fixed"/>
+        <w:tblLook w:firstColumn="1" w:firstRow="1" w:lastColumn="0" w:lastRow="0" w:noHBand="0" w:noVBand="1" w:val="04A0"/>
+        <w:tblBorders>
+          <w:top w:val="single" w:sz="4" w:color="C9CED8"/>
+          <w:left w:val="single" w:sz="4" w:color="C9CED8"/>
+          <w:bottom w:val="single" w:sz="4" w:color="C9CED8"/>
+          <w:right w:val="single" w:sz="4" w:color="C9CED8"/>
+          <w:insideH w:val="single" w:sz="4" w:color="C9CED8"/>
+          <w:insideV w:val="single" w:sz="4" w:color="C9CED8"/>
+        </w:tblBorders>
+      </w:tblPr>
+      <w:tblGrid>
+        <w:gridCol w:w="3289"/>
+        <w:gridCol w:w="3289"/>
+        <w:gridCol w:w="3289"/>
+      </w:tblGrid>
+      <w:tr>
+        <w:trPr>
+          <w:cantSplit w:val="true"/>
+          <w:tblHeader w:val="true"/>
+        </w:trPr>
+        <w:tc>
+          <w:tcPr>
+            <w:tcW w:type="dxa" w:w="907"/>
+            <w:shd w:val="clear" w:color="auto" w:fill="233C7D"/>
+          </w:tcPr>
+          <w:p>
+            <w:pPr>
+              <w:spacing w:after="0"/>
+            </w:pPr>
+            <w:r>
+              <w:rPr>
+                <w:b/>
+                <w:color w:val="FFFFFF"/>
+                <w:sz w:val="20"/>
+              </w:rPr>
+              <w:t>Status</w:t>
+            </w:r>
+          </w:p>
+        </w:tc>
+        <w:tc>
+          <w:tcPr>
+            <w:tcW w:type="dxa" w:w="3061"/>
+            <w:shd w:val="clear" w:color="auto" w:fill="233C7D"/>
+          </w:tcPr>
+          <w:p>
+            <w:pPr>
+              <w:spacing w:after="0"/>
+            </w:pPr>
+            <w:r>
+              <w:rPr>
+                <w:b/>
+                <w:color w:val="FFFFFF"/>
+                <w:sz w:val="20"/>
+              </w:rPr>
+              <w:t>Codice</w:t>
+            </w:r>
+          </w:p>
+        </w:tc>
+        <w:tc>
+          <w:tcPr>
+            <w:tcW w:type="dxa" w:w="5896"/>
+            <w:shd w:val="clear" w:color="auto" w:fill="233C7D"/>
+          </w:tcPr>
+          <w:p>
+            <w:pPr>
+              <w:spacing w:after="0"/>
+            </w:pPr>
+            <w:r>
+              <w:rPr>
+                <w:b/>
+                <w:color w:val="FFFFFF"/>
+                <w:sz w:val="20"/>
+              </w:rPr>
+              <w:t>Quando</w:t>
             </w:r>
           </w:p>
         </w:tc>
@@ -26097,6 +27476,1430 @@
         </w:trPr>
         <w:tc>
           <w:tcPr>
+            <w:tcW w:type="dxa" w:w="907"/>
+          </w:tcPr>
+          <w:p>
+            <w:pPr>
+              <w:spacing w:after="0"/>
+            </w:pPr>
+            <w:r>
+              <w:rPr>
+                <w:rFonts w:ascii="Consolas" w:hAnsi="Consolas"/>
+                <w:b w:val="0"/>
+                <w:color w:val="233C7D"/>
+                <w:sz w:val="19"/>
+              </w:rPr>
+              <w:t>403</w:t>
+            </w:r>
+          </w:p>
+        </w:tc>
+        <w:tc>
+          <w:tcPr>
+            <w:tcW w:type="dxa" w:w="3061"/>
+          </w:tcPr>
+          <w:p>
+            <w:pPr>
+              <w:spacing w:after="0"/>
+            </w:pPr>
+            <w:r>
+              <w:rPr>
+                <w:rFonts w:ascii="Consolas" w:hAnsi="Consolas"/>
+                <w:b w:val="0"/>
+                <w:color w:val="233C7D"/>
+                <w:sz w:val="19"/>
+              </w:rPr>
+              <w:t>operation.not_allowed</w:t>
+            </w:r>
+          </w:p>
+        </w:tc>
+        <w:tc>
+          <w:tcPr>
+            <w:tcW w:type="dxa" w:w="5896"/>
+          </w:tcPr>
+          <w:p>
+            <w:pPr>
+              <w:spacing w:after="0"/>
+            </w:pPr>
+            <w:r>
+              <w:rPr>
+                <w:b w:val="0"/>
+                <w:sz w:val="19"/>
+              </w:rPr>
+              <w:t>idProperty assente, sconosciuto o non dell'utente: l'operazione è annullata, senza errors[].</w:t>
+            </w:r>
+          </w:p>
+        </w:tc>
+      </w:tr>
+      <w:tr>
+        <w:trPr>
+          <w:cantSplit w:val="true"/>
+        </w:trPr>
+        <w:tc>
+          <w:tcPr>
+            <w:tcW w:type="dxa" w:w="907"/>
+            <w:shd w:val="clear" w:color="auto" w:fill="F1F3F8"/>
+          </w:tcPr>
+          <w:p>
+            <w:pPr>
+              <w:spacing w:after="0"/>
+            </w:pPr>
+            <w:r>
+              <w:rPr>
+                <w:rFonts w:ascii="Consolas" w:hAnsi="Consolas"/>
+                <w:b w:val="0"/>
+                <w:color w:val="233C7D"/>
+                <w:sz w:val="19"/>
+              </w:rPr>
+              <w:t>401</w:t>
+            </w:r>
+          </w:p>
+        </w:tc>
+        <w:tc>
+          <w:tcPr>
+            <w:tcW w:type="dxa" w:w="3061"/>
+            <w:shd w:val="clear" w:color="auto" w:fill="F1F3F8"/>
+          </w:tcPr>
+          <w:p>
+            <w:pPr>
+              <w:spacing w:after="0"/>
+            </w:pPr>
+            <w:r>
+              <w:rPr>
+                <w:rFonts w:ascii="Consolas" w:hAnsi="Consolas"/>
+                <w:b w:val="0"/>
+                <w:color w:val="233C7D"/>
+                <w:sz w:val="19"/>
+              </w:rPr>
+              <w:t>auth.invalid_token</w:t>
+            </w:r>
+          </w:p>
+        </w:tc>
+        <w:tc>
+          <w:tcPr>
+            <w:tcW w:type="dxa" w:w="5896"/>
+            <w:shd w:val="clear" w:color="auto" w:fill="F1F3F8"/>
+          </w:tcPr>
+          <w:p>
+            <w:pPr>
+              <w:spacing w:after="0"/>
+            </w:pPr>
+            <w:r>
+              <w:rPr>
+                <w:b w:val="0"/>
+                <w:sz w:val="19"/>
+              </w:rPr>
+              <w:t>Access token assente, scaduto o non valido: il frontend rinnova il token e ripete la chiamata una volta.</w:t>
+            </w:r>
+          </w:p>
+        </w:tc>
+      </w:tr>
+      <w:tr>
+        <w:trPr>
+          <w:cantSplit w:val="true"/>
+        </w:trPr>
+        <w:tc>
+          <w:tcPr>
+            <w:tcW w:type="dxa" w:w="907"/>
+          </w:tcPr>
+          <w:p>
+            <w:pPr>
+              <w:spacing w:after="0"/>
+            </w:pPr>
+            <w:r>
+              <w:rPr>
+                <w:rFonts w:ascii="Consolas" w:hAnsi="Consolas"/>
+                <w:b w:val="0"/>
+                <w:color w:val="233C7D"/>
+                <w:sz w:val="19"/>
+              </w:rPr>
+              <w:t>500</w:t>
+            </w:r>
+          </w:p>
+        </w:tc>
+        <w:tc>
+          <w:tcPr>
+            <w:tcW w:type="dxa" w:w="3061"/>
+          </w:tcPr>
+          <w:p>
+            <w:pPr>
+              <w:spacing w:after="0"/>
+            </w:pPr>
+            <w:r>
+              <w:rPr>
+                <w:rFonts w:ascii="Consolas" w:hAnsi="Consolas"/>
+                <w:b w:val="0"/>
+                <w:color w:val="233C7D"/>
+                <w:sz w:val="19"/>
+              </w:rPr>
+              <w:t>server.unexpected</w:t>
+            </w:r>
+          </w:p>
+        </w:tc>
+        <w:tc>
+          <w:tcPr>
+            <w:tcW w:type="dxa" w:w="5896"/>
+          </w:tcPr>
+          <w:p>
+            <w:pPr>
+              <w:spacing w:after="0"/>
+            </w:pPr>
+            <w:r>
+              <w:rPr>
+                <w:b w:val="0"/>
+                <w:sz w:val="19"/>
+              </w:rPr>
+              <w:t>Errore non gestito del server (vale per ogni API).</w:t>
+            </w:r>
+          </w:p>
+        </w:tc>
+      </w:tr>
+    </w:tbl>
+    <w:p>
+      <w:pPr>
+        <w:spacing w:after="40"/>
+      </w:pPr>
+    </w:p>
+    <w:p>
+      <w:pPr>
+        <w:pStyle w:val="Heading3"/>
+      </w:pPr>
+      <w:r>
+        <w:t>Esempio di errore (JSON)</w:t>
+      </w:r>
+    </w:p>
+    <w:p>
+      <w:pPr>
+        <w:keepNext/>
+      </w:pPr>
+      <w:r>
+        <w:t>Risposta a una richiesta con uno stabilimento non valido:</w:t>
+      </w:r>
+    </w:p>
+    <w:p>
+      <w:pPr>
+        <w:keepNext/>
+        <w:spacing w:after="0"/>
+        <w:shd w:val="clear" w:color="auto" w:fill="F1F3F8"/>
+      </w:pPr>
+      <w:r>
+        <w:rPr>
+          <w:rFonts w:ascii="Consolas" w:hAnsi="Consolas"/>
+          <w:b w:val="0"/>
+          <w:color w:val="233C7D"/>
+          <w:sz w:val="19"/>
+        </w:rPr>
+        <w:t>{</w:t>
+      </w:r>
+    </w:p>
+    <w:p>
+      <w:pPr>
+        <w:keepNext/>
+        <w:spacing w:after="0"/>
+        <w:shd w:val="clear" w:color="auto" w:fill="F1F3F8"/>
+      </w:pPr>
+      <w:r>
+        <w:rPr>
+          <w:rFonts w:ascii="Consolas" w:hAnsi="Consolas"/>
+          <w:b w:val="0"/>
+          <w:color w:val="233C7D"/>
+          <w:sz w:val="19"/>
+        </w:rPr>
+        <w:t xml:space="preserve">  "type": "https://errors.summerbooking/operation/not-allowed",</w:t>
+      </w:r>
+    </w:p>
+    <w:p>
+      <w:pPr>
+        <w:keepNext/>
+        <w:spacing w:after="0"/>
+        <w:shd w:val="clear" w:color="auto" w:fill="F1F3F8"/>
+      </w:pPr>
+      <w:r>
+        <w:rPr>
+          <w:rFonts w:ascii="Consolas" w:hAnsi="Consolas"/>
+          <w:b w:val="0"/>
+          <w:color w:val="233C7D"/>
+          <w:sz w:val="19"/>
+        </w:rPr>
+        <w:t xml:space="preserve">  "status": 403,</w:t>
+      </w:r>
+    </w:p>
+    <w:p>
+      <w:pPr>
+        <w:keepNext/>
+        <w:spacing w:after="0"/>
+        <w:shd w:val="clear" w:color="auto" w:fill="F1F3F8"/>
+      </w:pPr>
+      <w:r>
+        <w:rPr>
+          <w:rFonts w:ascii="Consolas" w:hAnsi="Consolas"/>
+          <w:b w:val="0"/>
+          <w:color w:val="233C7D"/>
+          <w:sz w:val="19"/>
+        </w:rPr>
+        <w:t xml:space="preserve">  "code": "operation.not_allowed",</w:t>
+      </w:r>
+    </w:p>
+    <w:p>
+      <w:pPr>
+        <w:keepNext/>
+        <w:spacing w:after="0"/>
+        <w:shd w:val="clear" w:color="auto" w:fill="F1F3F8"/>
+      </w:pPr>
+      <w:r>
+        <w:rPr>
+          <w:rFonts w:ascii="Consolas" w:hAnsi="Consolas"/>
+          <w:b w:val="0"/>
+          <w:color w:val="233C7D"/>
+          <w:sz w:val="19"/>
+        </w:rPr>
+        <w:t xml:space="preserve">  "title": "Operation not allowed",</w:t>
+      </w:r>
+    </w:p>
+    <w:p>
+      <w:pPr>
+        <w:keepNext/>
+        <w:spacing w:after="0"/>
+        <w:shd w:val="clear" w:color="auto" w:fill="F1F3F8"/>
+      </w:pPr>
+      <w:r>
+        <w:rPr>
+          <w:rFonts w:ascii="Consolas" w:hAnsi="Consolas"/>
+          <w:b w:val="0"/>
+          <w:color w:val="233C7D"/>
+          <w:sz w:val="19"/>
+        </w:rPr>
+        <w:t xml:space="preserve">  "traceId": "00-4bf92f3577b34da6a3ce929d0e0e4736-00f067aa0ba902b7-01"</w:t>
+      </w:r>
+    </w:p>
+    <w:p>
+      <w:pPr>
+        <w:keepNext w:val="0"/>
+        <w:spacing w:after="120"/>
+        <w:shd w:val="clear" w:color="auto" w:fill="F1F3F8"/>
+      </w:pPr>
+      <w:r>
+        <w:rPr>
+          <w:rFonts w:ascii="Consolas" w:hAnsi="Consolas"/>
+          <w:b w:val="0"/>
+          <w:color w:val="233C7D"/>
+          <w:sz w:val="19"/>
+        </w:rPr>
+        <w:t>}</w:t>
+      </w:r>
+    </w:p>
+    <w:p>
+      <w:pPr>
+        <w:pStyle w:val="Heading1"/>
+        <w:pageBreakBefore/>
+      </w:pPr>
+      <w:r>
+        <w:rPr>
+          <w:b w:val="0"/>
+        </w:rPr>
+        <w:t xml:space="preserve">GET </w:t>
+      </w:r>
+      <w:r>
+        <w:rPr>
+          <w:rFonts w:ascii="Consolas" w:hAnsi="Consolas"/>
+          <w:b w:val="0"/>
+        </w:rPr>
+        <w:t>/api/taxation/electronic-receipt?idProperty={idProperty}</w:t>
+      </w:r>
+    </w:p>
+    <w:p>
+      <w:r>
+        <w:t>Fiscalizzazione: scontrino elettronico</w:t>
+      </w:r>
+    </w:p>
+    <w:p>
+      <w:pPr>
+        <w:spacing w:after="40"/>
+      </w:pPr>
+      <w:r>
+        <w:rPr>
+          <w:b/>
+        </w:rPr>
+        <w:t xml:space="preserve">Metodo: </w:t>
+      </w:r>
+      <w:r>
+        <w:rPr>
+          <w:rFonts w:ascii="Consolas" w:hAnsi="Consolas"/>
+          <w:b w:val="0"/>
+          <w:color w:val="233C7D"/>
+        </w:rPr>
+        <w:t>GET</w:t>
+      </w:r>
+    </w:p>
+    <w:p>
+      <w:pPr>
+        <w:spacing w:after="40"/>
+      </w:pPr>
+      <w:r>
+        <w:rPr>
+          <w:b/>
+        </w:rPr>
+        <w:t xml:space="preserve">Route: </w:t>
+      </w:r>
+      <w:r>
+        <w:rPr>
+          <w:rFonts w:ascii="Consolas" w:hAnsi="Consolas"/>
+          <w:b w:val="0"/>
+          <w:color w:val="233C7D"/>
+        </w:rPr>
+        <w:t>/api/taxation/electronic-receipt?idProperty={idProperty}</w:t>
+      </w:r>
+    </w:p>
+    <w:p>
+      <w:pPr>
+        <w:spacing w:after="40"/>
+      </w:pPr>
+      <w:r>
+        <w:rPr>
+          <w:b/>
+        </w:rPr>
+        <w:t xml:space="preserve">Nel frontend: </w:t>
+      </w:r>
+      <w:r>
+        <w:rPr>
+          <w:rFonts w:ascii="Consolas" w:hAnsi="Consolas"/>
+          <w:b w:val="0"/>
+          <w:color w:val="233C7D"/>
+        </w:rPr>
+        <w:t>TaxationService.electronicReceipt</w:t>
+      </w:r>
+    </w:p>
+    <w:p>
+      <w:pPr>
+        <w:spacing w:after="40"/>
+      </w:pPr>
+      <w:r>
+        <w:rPr>
+          <w:b/>
+        </w:rPr>
+        <w:t xml:space="preserve">Autenticazione: </w:t>
+      </w:r>
+      <w:r>
+        <w:rPr>
+          <w:b w:val="0"/>
+        </w:rPr>
+        <w:t>Header Authorization: Bearer &lt;accessToken&gt;.</w:t>
+      </w:r>
+    </w:p>
+    <w:p>
+      <w:pPr>
+        <w:pStyle w:val="ListBullet"/>
+      </w:pPr>
+      <w:r>
+        <w:t>La pagina Fiscalizzazione la chiama all'apertura, e di nuovo quando l'utente cambia lingua, e mostra il testo nel riquadro "Scontrino elettronico", sotto "Termini e condizioni".</w:t>
+      </w:r>
+    </w:p>
+    <w:p>
+      <w:pPr>
+        <w:pStyle w:val="ListBullet"/>
+      </w:pPr>
+      <w:r>
+        <w:t>Il testo arriva in HTML (titoli, paragrafi, elenchi, link) e il frontend lo ripulisce prima di mostrarlo: script, attributi di evento e link javascript: vengono tolti. Il backend deve comunque mandare solo HTML fidato.</w:t>
+      </w:r>
+    </w:p>
+    <w:p>
+      <w:pPr>
+        <w:pStyle w:val="ListBullet"/>
+      </w:pPr>
+      <w:r>
+        <w:t>È una GET: lo stabilimento viaggia nella query string. Rotta, metodo e nome del campo termsAndConditions sono una proposta del frontend, da confermare col backend.</w:t>
+      </w:r>
+    </w:p>
+    <w:p>
+      <w:pPr>
+        <w:pStyle w:val="ListBullet"/>
+      </w:pPr>
+      <w:r>
+        <w:t>Se la chiamata fallisce il messaggio del code compare al posto del testo.</w:t>
+      </w:r>
+    </w:p>
+    <w:p>
+      <w:pPr>
+        <w:pStyle w:val="Heading2"/>
+      </w:pPr>
+      <w:r>
+        <w:t>Payload inviato al backend</w:t>
+      </w:r>
+    </w:p>
+    <w:p>
+      <w:r>
+        <w:t>Nessun payload: corpo vuoto, quindi nessun JSON.</w:t>
+      </w:r>
+    </w:p>
+    <w:p>
+      <w:pPr>
+        <w:pStyle w:val="Heading3"/>
+      </w:pPr>
+      <w:r>
+        <w:t>Inviato insieme alla richiesta</w:t>
+      </w:r>
+    </w:p>
+    <w:tbl>
+      <w:tblPr>
+        <w:tblW w:type="auto" w:w="0"/>
+        <w:jc w:val="center"/>
+        <w:tblLayout w:type="fixed"/>
+        <w:tblLook w:firstColumn="1" w:firstRow="1" w:lastColumn="0" w:lastRow="0" w:noHBand="0" w:noVBand="1" w:val="04A0"/>
+        <w:tblBorders>
+          <w:top w:val="single" w:sz="4" w:color="C9CED8"/>
+          <w:left w:val="single" w:sz="4" w:color="C9CED8"/>
+          <w:bottom w:val="single" w:sz="4" w:color="C9CED8"/>
+          <w:right w:val="single" w:sz="4" w:color="C9CED8"/>
+          <w:insideH w:val="single" w:sz="4" w:color="C9CED8"/>
+          <w:insideV w:val="single" w:sz="4" w:color="C9CED8"/>
+        </w:tblBorders>
+      </w:tblPr>
+      <w:tblGrid>
+        <w:gridCol w:w="3289"/>
+        <w:gridCol w:w="3289"/>
+        <w:gridCol w:w="3289"/>
+      </w:tblGrid>
+      <w:tr>
+        <w:trPr>
+          <w:cantSplit w:val="true"/>
+          <w:tblHeader w:val="true"/>
+        </w:trPr>
+        <w:tc>
+          <w:tcPr>
+            <w:tcW w:type="dxa" w:w="2381"/>
+            <w:shd w:val="clear" w:color="auto" w:fill="233C7D"/>
+          </w:tcPr>
+          <w:p>
+            <w:pPr>
+              <w:spacing w:after="0"/>
+            </w:pPr>
+            <w:r>
+              <w:rPr>
+                <w:b/>
+                <w:color w:val="FFFFFF"/>
+                <w:sz w:val="20"/>
+              </w:rPr>
+              <w:t>Nome</w:t>
+            </w:r>
+          </w:p>
+        </w:tc>
+        <w:tc>
+          <w:tcPr>
+            <w:tcW w:type="dxa" w:w="2608"/>
+            <w:shd w:val="clear" w:color="auto" w:fill="233C7D"/>
+          </w:tcPr>
+          <w:p>
+            <w:pPr>
+              <w:spacing w:after="0"/>
+            </w:pPr>
+            <w:r>
+              <w:rPr>
+                <w:b/>
+                <w:color w:val="FFFFFF"/>
+                <w:sz w:val="20"/>
+              </w:rPr>
+              <w:t>Tipo</w:t>
+            </w:r>
+          </w:p>
+        </w:tc>
+        <w:tc>
+          <w:tcPr>
+            <w:tcW w:type="dxa" w:w="4876"/>
+            <w:shd w:val="clear" w:color="auto" w:fill="233C7D"/>
+          </w:tcPr>
+          <w:p>
+            <w:pPr>
+              <w:spacing w:after="0"/>
+            </w:pPr>
+            <w:r>
+              <w:rPr>
+                <w:b/>
+                <w:color w:val="FFFFFF"/>
+                <w:sz w:val="20"/>
+              </w:rPr>
+              <w:t>Descrizione</w:t>
+            </w:r>
+          </w:p>
+        </w:tc>
+      </w:tr>
+      <w:tr>
+        <w:trPr>
+          <w:cantSplit w:val="true"/>
+        </w:trPr>
+        <w:tc>
+          <w:tcPr>
+            <w:tcW w:type="dxa" w:w="2381"/>
+          </w:tcPr>
+          <w:p>
+            <w:pPr>
+              <w:spacing w:after="0"/>
+            </w:pPr>
+            <w:r>
+              <w:rPr>
+                <w:b w:val="0"/>
+                <w:sz w:val="19"/>
+              </w:rPr>
+              <w:t>idProperty (query string)</w:t>
+            </w:r>
+          </w:p>
+        </w:tc>
+        <w:tc>
+          <w:tcPr>
+            <w:tcW w:type="dxa" w:w="2608"/>
+          </w:tcPr>
+          <w:p>
+            <w:pPr>
+              <w:spacing w:after="0"/>
+            </w:pPr>
+            <w:r>
+              <w:rPr>
+                <w:b w:val="0"/>
+                <w:sz w:val="19"/>
+              </w:rPr>
+              <w:t>string (UUID)</w:t>
+            </w:r>
+          </w:p>
+        </w:tc>
+        <w:tc>
+          <w:tcPr>
+            <w:tcW w:type="dxa" w:w="4876"/>
+          </w:tcPr>
+          <w:p>
+            <w:pPr>
+              <w:spacing w:after="0"/>
+            </w:pPr>
+            <w:r>
+              <w:rPr>
+                <w:b w:val="0"/>
+                <w:sz w:val="19"/>
+              </w:rPr>
+              <w:t>Stabilimento dell'utente (da AuthUser.idProperty).</w:t>
+            </w:r>
+          </w:p>
+        </w:tc>
+      </w:tr>
+    </w:tbl>
+    <w:p>
+      <w:pPr>
+        <w:spacing w:after="40"/>
+      </w:pPr>
+    </w:p>
+    <w:p>
+      <w:pPr>
+        <w:pStyle w:val="Heading2"/>
+      </w:pPr>
+      <w:r>
+        <w:t>Risposta attesa dal server</w:t>
+      </w:r>
+    </w:p>
+    <w:p>
+      <w:pPr>
+        <w:spacing w:after="40"/>
+      </w:pPr>
+      <w:r>
+        <w:rPr>
+          <w:b/>
+        </w:rPr>
+        <w:t xml:space="preserve">Stato: </w:t>
+      </w:r>
+      <w:r>
+        <w:rPr>
+          <w:b w:val="0"/>
+        </w:rPr>
+        <w:t>200 OK</w:t>
+      </w:r>
+    </w:p>
+    <w:p>
+      <w:pPr>
+        <w:pStyle w:val="Heading3"/>
+      </w:pPr>
+      <w:r>
+        <w:rPr>
+          <w:b w:val="0"/>
+        </w:rPr>
+        <w:t xml:space="preserve">Corpo JSON: </w:t>
+      </w:r>
+      <w:r>
+        <w:rPr>
+          <w:rFonts w:ascii="Consolas" w:hAnsi="Consolas"/>
+          <w:b w:val="0"/>
+        </w:rPr>
+        <w:t>ElectronicReceiptResponse</w:t>
+      </w:r>
+    </w:p>
+    <w:tbl>
+      <w:tblPr>
+        <w:tblW w:type="auto" w:w="0"/>
+        <w:jc w:val="center"/>
+        <w:tblLayout w:type="fixed"/>
+        <w:tblLook w:firstColumn="1" w:firstRow="1" w:lastColumn="0" w:lastRow="0" w:noHBand="0" w:noVBand="1" w:val="04A0"/>
+        <w:tblBorders>
+          <w:top w:val="single" w:sz="4" w:color="C9CED8"/>
+          <w:left w:val="single" w:sz="4" w:color="C9CED8"/>
+          <w:bottom w:val="single" w:sz="4" w:color="C9CED8"/>
+          <w:right w:val="single" w:sz="4" w:color="C9CED8"/>
+          <w:insideH w:val="single" w:sz="4" w:color="C9CED8"/>
+          <w:insideV w:val="single" w:sz="4" w:color="C9CED8"/>
+        </w:tblBorders>
+      </w:tblPr>
+      <w:tblGrid>
+        <w:gridCol w:w="3289"/>
+        <w:gridCol w:w="3289"/>
+        <w:gridCol w:w="3289"/>
+      </w:tblGrid>
+      <w:tr>
+        <w:trPr>
+          <w:cantSplit w:val="true"/>
+          <w:tblHeader w:val="true"/>
+        </w:trPr>
+        <w:tc>
+          <w:tcPr>
+            <w:tcW w:type="dxa" w:w="2381"/>
+            <w:shd w:val="clear" w:color="auto" w:fill="233C7D"/>
+          </w:tcPr>
+          <w:p>
+            <w:pPr>
+              <w:spacing w:after="0"/>
+            </w:pPr>
+            <w:r>
+              <w:rPr>
+                <w:b/>
+                <w:color w:val="FFFFFF"/>
+                <w:sz w:val="20"/>
+              </w:rPr>
+              <w:t>Parametro</w:t>
+            </w:r>
+          </w:p>
+        </w:tc>
+        <w:tc>
+          <w:tcPr>
+            <w:tcW w:type="dxa" w:w="2608"/>
+            <w:shd w:val="clear" w:color="auto" w:fill="233C7D"/>
+          </w:tcPr>
+          <w:p>
+            <w:pPr>
+              <w:spacing w:after="0"/>
+            </w:pPr>
+            <w:r>
+              <w:rPr>
+                <w:b/>
+                <w:color w:val="FFFFFF"/>
+                <w:sz w:val="20"/>
+              </w:rPr>
+              <w:t>Tipo</w:t>
+            </w:r>
+          </w:p>
+        </w:tc>
+        <w:tc>
+          <w:tcPr>
+            <w:tcW w:type="dxa" w:w="4876"/>
+            <w:shd w:val="clear" w:color="auto" w:fill="233C7D"/>
+          </w:tcPr>
+          <w:p>
+            <w:pPr>
+              <w:spacing w:after="0"/>
+            </w:pPr>
+            <w:r>
+              <w:rPr>
+                <w:b/>
+                <w:color w:val="FFFFFF"/>
+                <w:sz w:val="20"/>
+              </w:rPr>
+              <w:t>Descrizione</w:t>
+            </w:r>
+          </w:p>
+        </w:tc>
+      </w:tr>
+      <w:tr>
+        <w:trPr>
+          <w:cantSplit w:val="true"/>
+        </w:trPr>
+        <w:tc>
+          <w:tcPr>
+            <w:tcW w:type="dxa" w:w="2381"/>
+          </w:tcPr>
+          <w:p>
+            <w:pPr>
+              <w:spacing w:after="0"/>
+            </w:pPr>
+            <w:r>
+              <w:rPr>
+                <w:rFonts w:ascii="Consolas" w:hAnsi="Consolas"/>
+                <w:b w:val="0"/>
+                <w:color w:val="233C7D"/>
+                <w:sz w:val="19"/>
+              </w:rPr>
+              <w:t>termsAndConditions</w:t>
+            </w:r>
+          </w:p>
+        </w:tc>
+        <w:tc>
+          <w:tcPr>
+            <w:tcW w:type="dxa" w:w="2608"/>
+          </w:tcPr>
+          <w:p>
+            <w:pPr>
+              <w:spacing w:after="0"/>
+            </w:pPr>
+            <w:r>
+              <w:rPr>
+                <w:rFonts w:ascii="Consolas" w:hAnsi="Consolas"/>
+                <w:b w:val="0"/>
+                <w:color w:val="233C7D"/>
+                <w:sz w:val="19"/>
+              </w:rPr>
+              <w:t>string (HTML)</w:t>
+            </w:r>
+          </w:p>
+        </w:tc>
+        <w:tc>
+          <w:tcPr>
+            <w:tcW w:type="dxa" w:w="4876"/>
+          </w:tcPr>
+          <w:p>
+            <w:pPr>
+              <w:spacing w:after="0"/>
+            </w:pPr>
+            <w:r>
+              <w:rPr>
+                <w:b w:val="0"/>
+                <w:sz w:val="19"/>
+              </w:rPr>
+              <w:t>Termini e condizioni dello scontrino elettronico, già formattati in HTML, nella lingua di Accept-Language. Il frontend li mostra ripuliti (niente script, attributi di evento o link javascript:).</w:t>
+            </w:r>
+          </w:p>
+        </w:tc>
+      </w:tr>
+    </w:tbl>
+    <w:p>
+      <w:pPr>
+        <w:spacing w:after="40"/>
+      </w:pPr>
+    </w:p>
+    <w:p>
+      <w:pPr>
+        <w:pStyle w:val="Heading3"/>
+      </w:pPr>
+      <w:r>
+        <w:t>Esempio di risposta (JSON)</w:t>
+      </w:r>
+    </w:p>
+    <w:p>
+      <w:pPr>
+        <w:keepNext/>
+        <w:spacing w:after="0"/>
+        <w:shd w:val="clear" w:color="auto" w:fill="F1F3F8"/>
+      </w:pPr>
+      <w:r>
+        <w:rPr>
+          <w:rFonts w:ascii="Consolas" w:hAnsi="Consolas"/>
+          <w:b w:val="0"/>
+          <w:color w:val="233C7D"/>
+          <w:sz w:val="19"/>
+        </w:rPr>
+        <w:t>{</w:t>
+      </w:r>
+    </w:p>
+    <w:p>
+      <w:pPr>
+        <w:keepNext/>
+        <w:spacing w:after="0"/>
+        <w:shd w:val="clear" w:color="auto" w:fill="F1F3F8"/>
+      </w:pPr>
+      <w:r>
+        <w:rPr>
+          <w:rFonts w:ascii="Consolas" w:hAnsi="Consolas"/>
+          <w:b w:val="0"/>
+          <w:color w:val="233C7D"/>
+          <w:sz w:val="19"/>
+        </w:rPr>
+        <w:t xml:space="preserve">  "termsAndConditions": "&lt;h4&gt;Generale&lt;/h4&gt;&lt;p&gt;Testo dei termini e condizioni…&lt;/p&gt;"</w:t>
+      </w:r>
+    </w:p>
+    <w:p>
+      <w:pPr>
+        <w:keepNext w:val="0"/>
+        <w:spacing w:after="120"/>
+        <w:shd w:val="clear" w:color="auto" w:fill="F1F3F8"/>
+      </w:pPr>
+      <w:r>
+        <w:rPr>
+          <w:rFonts w:ascii="Consolas" w:hAnsi="Consolas"/>
+          <w:b w:val="0"/>
+          <w:color w:val="233C7D"/>
+          <w:sz w:val="19"/>
+        </w:rPr>
+        <w:t>}</w:t>
+      </w:r>
+    </w:p>
+    <w:p>
+      <w:pPr>
+        <w:pStyle w:val="Heading2"/>
+      </w:pPr>
+      <w:r>
+        <w:t>Errori possibili</w:t>
+      </w:r>
+    </w:p>
+    <w:tbl>
+      <w:tblPr>
+        <w:tblW w:type="auto" w:w="0"/>
+        <w:jc w:val="center"/>
+        <w:tblLayout w:type="fixed"/>
+        <w:tblLook w:firstColumn="1" w:firstRow="1" w:lastColumn="0" w:lastRow="0" w:noHBand="0" w:noVBand="1" w:val="04A0"/>
+        <w:tblBorders>
+          <w:top w:val="single" w:sz="4" w:color="C9CED8"/>
+          <w:left w:val="single" w:sz="4" w:color="C9CED8"/>
+          <w:bottom w:val="single" w:sz="4" w:color="C9CED8"/>
+          <w:right w:val="single" w:sz="4" w:color="C9CED8"/>
+          <w:insideH w:val="single" w:sz="4" w:color="C9CED8"/>
+          <w:insideV w:val="single" w:sz="4" w:color="C9CED8"/>
+        </w:tblBorders>
+      </w:tblPr>
+      <w:tblGrid>
+        <w:gridCol w:w="3289"/>
+        <w:gridCol w:w="3289"/>
+        <w:gridCol w:w="3289"/>
+      </w:tblGrid>
+      <w:tr>
+        <w:trPr>
+          <w:cantSplit w:val="true"/>
+          <w:tblHeader w:val="true"/>
+        </w:trPr>
+        <w:tc>
+          <w:tcPr>
+            <w:tcW w:type="dxa" w:w="907"/>
+            <w:shd w:val="clear" w:color="auto" w:fill="233C7D"/>
+          </w:tcPr>
+          <w:p>
+            <w:pPr>
+              <w:spacing w:after="0"/>
+            </w:pPr>
+            <w:r>
+              <w:rPr>
+                <w:b/>
+                <w:color w:val="FFFFFF"/>
+                <w:sz w:val="20"/>
+              </w:rPr>
+              <w:t>Status</w:t>
+            </w:r>
+          </w:p>
+        </w:tc>
+        <w:tc>
+          <w:tcPr>
+            <w:tcW w:type="dxa" w:w="3061"/>
+            <w:shd w:val="clear" w:color="auto" w:fill="233C7D"/>
+          </w:tcPr>
+          <w:p>
+            <w:pPr>
+              <w:spacing w:after="0"/>
+            </w:pPr>
+            <w:r>
+              <w:rPr>
+                <w:b/>
+                <w:color w:val="FFFFFF"/>
+                <w:sz w:val="20"/>
+              </w:rPr>
+              <w:t>Codice</w:t>
+            </w:r>
+          </w:p>
+        </w:tc>
+        <w:tc>
+          <w:tcPr>
+            <w:tcW w:type="dxa" w:w="5896"/>
+            <w:shd w:val="clear" w:color="auto" w:fill="233C7D"/>
+          </w:tcPr>
+          <w:p>
+            <w:pPr>
+              <w:spacing w:after="0"/>
+            </w:pPr>
+            <w:r>
+              <w:rPr>
+                <w:b/>
+                <w:color w:val="FFFFFF"/>
+                <w:sz w:val="20"/>
+              </w:rPr>
+              <w:t>Quando</w:t>
+            </w:r>
+          </w:p>
+        </w:tc>
+      </w:tr>
+      <w:tr>
+        <w:trPr>
+          <w:cantSplit w:val="true"/>
+        </w:trPr>
+        <w:tc>
+          <w:tcPr>
+            <w:tcW w:type="dxa" w:w="907"/>
+          </w:tcPr>
+          <w:p>
+            <w:pPr>
+              <w:spacing w:after="0"/>
+            </w:pPr>
+            <w:r>
+              <w:rPr>
+                <w:rFonts w:ascii="Consolas" w:hAnsi="Consolas"/>
+                <w:b w:val="0"/>
+                <w:color w:val="233C7D"/>
+                <w:sz w:val="19"/>
+              </w:rPr>
+              <w:t>403</w:t>
+            </w:r>
+          </w:p>
+        </w:tc>
+        <w:tc>
+          <w:tcPr>
+            <w:tcW w:type="dxa" w:w="3061"/>
+          </w:tcPr>
+          <w:p>
+            <w:pPr>
+              <w:spacing w:after="0"/>
+            </w:pPr>
+            <w:r>
+              <w:rPr>
+                <w:rFonts w:ascii="Consolas" w:hAnsi="Consolas"/>
+                <w:b w:val="0"/>
+                <w:color w:val="233C7D"/>
+                <w:sz w:val="19"/>
+              </w:rPr>
+              <w:t>operation.not_allowed</w:t>
+            </w:r>
+          </w:p>
+        </w:tc>
+        <w:tc>
+          <w:tcPr>
+            <w:tcW w:type="dxa" w:w="5896"/>
+          </w:tcPr>
+          <w:p>
+            <w:pPr>
+              <w:spacing w:after="0"/>
+            </w:pPr>
+            <w:r>
+              <w:rPr>
+                <w:b w:val="0"/>
+                <w:sz w:val="19"/>
+              </w:rPr>
+              <w:t>idProperty assente, sconosciuto o non dell'utente: l'operazione è annullata, senza errors[].</w:t>
+            </w:r>
+          </w:p>
+        </w:tc>
+      </w:tr>
+      <w:tr>
+        <w:trPr>
+          <w:cantSplit w:val="true"/>
+        </w:trPr>
+        <w:tc>
+          <w:tcPr>
+            <w:tcW w:type="dxa" w:w="907"/>
+            <w:shd w:val="clear" w:color="auto" w:fill="F1F3F8"/>
+          </w:tcPr>
+          <w:p>
+            <w:pPr>
+              <w:spacing w:after="0"/>
+            </w:pPr>
+            <w:r>
+              <w:rPr>
+                <w:rFonts w:ascii="Consolas" w:hAnsi="Consolas"/>
+                <w:b w:val="0"/>
+                <w:color w:val="233C7D"/>
+                <w:sz w:val="19"/>
+              </w:rPr>
+              <w:t>401</w:t>
+            </w:r>
+          </w:p>
+        </w:tc>
+        <w:tc>
+          <w:tcPr>
+            <w:tcW w:type="dxa" w:w="3061"/>
+            <w:shd w:val="clear" w:color="auto" w:fill="F1F3F8"/>
+          </w:tcPr>
+          <w:p>
+            <w:pPr>
+              <w:spacing w:after="0"/>
+            </w:pPr>
+            <w:r>
+              <w:rPr>
+                <w:rFonts w:ascii="Consolas" w:hAnsi="Consolas"/>
+                <w:b w:val="0"/>
+                <w:color w:val="233C7D"/>
+                <w:sz w:val="19"/>
+              </w:rPr>
+              <w:t>auth.invalid_token</w:t>
+            </w:r>
+          </w:p>
+        </w:tc>
+        <w:tc>
+          <w:tcPr>
+            <w:tcW w:type="dxa" w:w="5896"/>
+            <w:shd w:val="clear" w:color="auto" w:fill="F1F3F8"/>
+          </w:tcPr>
+          <w:p>
+            <w:pPr>
+              <w:spacing w:after="0"/>
+            </w:pPr>
+            <w:r>
+              <w:rPr>
+                <w:b w:val="0"/>
+                <w:sz w:val="19"/>
+              </w:rPr>
+              <w:t>Access token assente, scaduto o non valido: il frontend rinnova il token e ripete la chiamata una volta.</w:t>
+            </w:r>
+          </w:p>
+        </w:tc>
+      </w:tr>
+      <w:tr>
+        <w:trPr>
+          <w:cantSplit w:val="true"/>
+        </w:trPr>
+        <w:tc>
+          <w:tcPr>
+            <w:tcW w:type="dxa" w:w="907"/>
+          </w:tcPr>
+          <w:p>
+            <w:pPr>
+              <w:spacing w:after="0"/>
+            </w:pPr>
+            <w:r>
+              <w:rPr>
+                <w:rFonts w:ascii="Consolas" w:hAnsi="Consolas"/>
+                <w:b w:val="0"/>
+                <w:color w:val="233C7D"/>
+                <w:sz w:val="19"/>
+              </w:rPr>
+              <w:t>500</w:t>
+            </w:r>
+          </w:p>
+        </w:tc>
+        <w:tc>
+          <w:tcPr>
+            <w:tcW w:type="dxa" w:w="3061"/>
+          </w:tcPr>
+          <w:p>
+            <w:pPr>
+              <w:spacing w:after="0"/>
+            </w:pPr>
+            <w:r>
+              <w:rPr>
+                <w:rFonts w:ascii="Consolas" w:hAnsi="Consolas"/>
+                <w:b w:val="0"/>
+                <w:color w:val="233C7D"/>
+                <w:sz w:val="19"/>
+              </w:rPr>
+              <w:t>server.unexpected</w:t>
+            </w:r>
+          </w:p>
+        </w:tc>
+        <w:tc>
+          <w:tcPr>
+            <w:tcW w:type="dxa" w:w="5896"/>
+          </w:tcPr>
+          <w:p>
+            <w:pPr>
+              <w:spacing w:after="0"/>
+            </w:pPr>
+            <w:r>
+              <w:rPr>
+                <w:b w:val="0"/>
+                <w:sz w:val="19"/>
+              </w:rPr>
+              <w:t>Errore non gestito del server (vale per ogni API).</w:t>
+            </w:r>
+          </w:p>
+        </w:tc>
+      </w:tr>
+    </w:tbl>
+    <w:p>
+      <w:pPr>
+        <w:spacing w:after="40"/>
+      </w:pPr>
+    </w:p>
+    <w:p>
+      <w:pPr>
+        <w:pStyle w:val="Heading3"/>
+      </w:pPr>
+      <w:r>
+        <w:t>Esempio di errore (JSON)</w:t>
+      </w:r>
+    </w:p>
+    <w:p>
+      <w:pPr>
+        <w:keepNext/>
+      </w:pPr>
+      <w:r>
+        <w:t>Risposta a una richiesta con uno stabilimento non valido:</w:t>
+      </w:r>
+    </w:p>
+    <w:p>
+      <w:pPr>
+        <w:keepNext/>
+        <w:spacing w:after="0"/>
+        <w:shd w:val="clear" w:color="auto" w:fill="F1F3F8"/>
+      </w:pPr>
+      <w:r>
+        <w:rPr>
+          <w:rFonts w:ascii="Consolas" w:hAnsi="Consolas"/>
+          <w:b w:val="0"/>
+          <w:color w:val="233C7D"/>
+          <w:sz w:val="19"/>
+        </w:rPr>
+        <w:t>{</w:t>
+      </w:r>
+    </w:p>
+    <w:p>
+      <w:pPr>
+        <w:keepNext/>
+        <w:spacing w:after="0"/>
+        <w:shd w:val="clear" w:color="auto" w:fill="F1F3F8"/>
+      </w:pPr>
+      <w:r>
+        <w:rPr>
+          <w:rFonts w:ascii="Consolas" w:hAnsi="Consolas"/>
+          <w:b w:val="0"/>
+          <w:color w:val="233C7D"/>
+          <w:sz w:val="19"/>
+        </w:rPr>
+        <w:t xml:space="preserve">  "type": "https://errors.summerbooking/operation/not-allowed",</w:t>
+      </w:r>
+    </w:p>
+    <w:p>
+      <w:pPr>
+        <w:keepNext/>
+        <w:spacing w:after="0"/>
+        <w:shd w:val="clear" w:color="auto" w:fill="F1F3F8"/>
+      </w:pPr>
+      <w:r>
+        <w:rPr>
+          <w:rFonts w:ascii="Consolas" w:hAnsi="Consolas"/>
+          <w:b w:val="0"/>
+          <w:color w:val="233C7D"/>
+          <w:sz w:val="19"/>
+        </w:rPr>
+        <w:t xml:space="preserve">  "status": 403,</w:t>
+      </w:r>
+    </w:p>
+    <w:p>
+      <w:pPr>
+        <w:keepNext/>
+        <w:spacing w:after="0"/>
+        <w:shd w:val="clear" w:color="auto" w:fill="F1F3F8"/>
+      </w:pPr>
+      <w:r>
+        <w:rPr>
+          <w:rFonts w:ascii="Consolas" w:hAnsi="Consolas"/>
+          <w:b w:val="0"/>
+          <w:color w:val="233C7D"/>
+          <w:sz w:val="19"/>
+        </w:rPr>
+        <w:t xml:space="preserve">  "code": "operation.not_allowed",</w:t>
+      </w:r>
+    </w:p>
+    <w:p>
+      <w:pPr>
+        <w:keepNext/>
+        <w:spacing w:after="0"/>
+        <w:shd w:val="clear" w:color="auto" w:fill="F1F3F8"/>
+      </w:pPr>
+      <w:r>
+        <w:rPr>
+          <w:rFonts w:ascii="Consolas" w:hAnsi="Consolas"/>
+          <w:b w:val="0"/>
+          <w:color w:val="233C7D"/>
+          <w:sz w:val="19"/>
+        </w:rPr>
+        <w:t xml:space="preserve">  "title": "Operation not allowed",</w:t>
+      </w:r>
+    </w:p>
+    <w:p>
+      <w:pPr>
+        <w:keepNext/>
+        <w:spacing w:after="0"/>
+        <w:shd w:val="clear" w:color="auto" w:fill="F1F3F8"/>
+      </w:pPr>
+      <w:r>
+        <w:rPr>
+          <w:rFonts w:ascii="Consolas" w:hAnsi="Consolas"/>
+          <w:b w:val="0"/>
+          <w:color w:val="233C7D"/>
+          <w:sz w:val="19"/>
+        </w:rPr>
+        <w:t xml:space="preserve">  "traceId": "00-4bf92f3577b34da6a3ce929d0e0e4736-00f067aa0ba902b7-01"</w:t>
+      </w:r>
+    </w:p>
+    <w:p>
+      <w:pPr>
+        <w:keepNext w:val="0"/>
+        <w:spacing w:after="120"/>
+        <w:shd w:val="clear" w:color="auto" w:fill="F1F3F8"/>
+      </w:pPr>
+      <w:r>
+        <w:rPr>
+          <w:rFonts w:ascii="Consolas" w:hAnsi="Consolas"/>
+          <w:b w:val="0"/>
+          <w:color w:val="233C7D"/>
+          <w:sz w:val="19"/>
+        </w:rPr>
+        <w:t>}</w:t>
+      </w:r>
+    </w:p>
+    <w:p>
+      <w:pPr>
+        <w:pStyle w:val="Heading1"/>
+        <w:pageBreakBefore/>
+      </w:pPr>
+      <w:r>
+        <w:t>Catalogo dei codici di errore</w:t>
+      </w:r>
+    </w:p>
+    <w:p>
+      <w:r>
+        <w:t>Tutti i codici che il frontend gestisce oggi. Ognuno è anche la chiave di traduzione error.&lt;codice&gt; nei file it.json ed en.json. Da confermare o correggere col backend: una volta rilasciati non cambiano. I codici marcati "dal frontend" non li invia il backend.</w:t>
+      </w:r>
+    </w:p>
+    <w:tbl>
+      <w:tblPr>
+        <w:tblW w:type="auto" w:w="0"/>
+        <w:jc w:val="center"/>
+        <w:tblLayout w:type="fixed"/>
+        <w:tblLook w:firstColumn="1" w:firstRow="1" w:lastColumn="0" w:lastRow="0" w:noHBand="0" w:noVBand="1" w:val="04A0"/>
+        <w:tblBorders>
+          <w:top w:val="single" w:sz="4" w:color="C9CED8"/>
+          <w:left w:val="single" w:sz="4" w:color="C9CED8"/>
+          <w:bottom w:val="single" w:sz="4" w:color="C9CED8"/>
+          <w:right w:val="single" w:sz="4" w:color="C9CED8"/>
+          <w:insideH w:val="single" w:sz="4" w:color="C9CED8"/>
+          <w:insideV w:val="single" w:sz="4" w:color="C9CED8"/>
+        </w:tblBorders>
+      </w:tblPr>
+      <w:tblGrid>
+        <w:gridCol w:w="3289"/>
+        <w:gridCol w:w="3289"/>
+        <w:gridCol w:w="3289"/>
+      </w:tblGrid>
+      <w:tr>
+        <w:trPr>
+          <w:cantSplit w:val="true"/>
+          <w:tblHeader w:val="true"/>
+        </w:trPr>
+        <w:tc>
+          <w:tcPr>
+            <w:tcW w:type="dxa" w:w="3288"/>
+            <w:shd w:val="clear" w:color="auto" w:fill="233C7D"/>
+          </w:tcPr>
+          <w:p>
+            <w:pPr>
+              <w:spacing w:after="0"/>
+            </w:pPr>
+            <w:r>
+              <w:rPr>
+                <w:b/>
+                <w:color w:val="FFFFFF"/>
+                <w:sz w:val="20"/>
+              </w:rPr>
+              <w:t>Codice</w:t>
+            </w:r>
+          </w:p>
+        </w:tc>
+        <w:tc>
+          <w:tcPr>
+            <w:tcW w:type="dxa" w:w="1928"/>
+            <w:shd w:val="clear" w:color="auto" w:fill="233C7D"/>
+          </w:tcPr>
+          <w:p>
+            <w:pPr>
+              <w:spacing w:after="0"/>
+            </w:pPr>
+            <w:r>
+              <w:rPr>
+                <w:b/>
+                <w:color w:val="FFFFFF"/>
+                <w:sz w:val="20"/>
+              </w:rPr>
+              <w:t>Status</w:t>
+            </w:r>
+          </w:p>
+        </w:tc>
+        <w:tc>
+          <w:tcPr>
+            <w:tcW w:type="dxa" w:w="4649"/>
+            <w:shd w:val="clear" w:color="auto" w:fill="233C7D"/>
+          </w:tcPr>
+          <w:p>
+            <w:pPr>
+              <w:spacing w:after="0"/>
+            </w:pPr>
+            <w:r>
+              <w:rPr>
+                <w:b/>
+                <w:color w:val="FFFFFF"/>
+                <w:sz w:val="20"/>
+              </w:rPr>
+              <w:t>Significato</w:t>
+            </w:r>
+          </w:p>
+        </w:tc>
+      </w:tr>
+      <w:tr>
+        <w:trPr>
+          <w:cantSplit w:val="true"/>
+        </w:trPr>
+        <w:tc>
+          <w:tcPr>
+            <w:tcW w:type="dxa" w:w="3288"/>
+          </w:tcPr>
+          <w:p>
+            <w:pPr>
+              <w:spacing w:after="0"/>
+            </w:pPr>
+            <w:r>
+              <w:rPr>
+                <w:rFonts w:ascii="Consolas" w:hAnsi="Consolas"/>
+                <w:b w:val="0"/>
+                <w:color w:val="233C7D"/>
+                <w:sz w:val="19"/>
+              </w:rPr>
+              <w:t>auth.invalid_credentials</w:t>
+            </w:r>
+          </w:p>
+        </w:tc>
+        <w:tc>
+          <w:tcPr>
+            <w:tcW w:type="dxa" w:w="1928"/>
+          </w:tcPr>
+          <w:p>
+            <w:pPr>
+              <w:spacing w:after="0"/>
+            </w:pPr>
+            <w:r>
+              <w:rPr>
+                <w:b w:val="0"/>
+                <w:sz w:val="19"/>
+              </w:rPr>
+              <w:t>401</w:t>
+            </w:r>
+          </w:p>
+        </w:tc>
+        <w:tc>
+          <w:tcPr>
+            <w:tcW w:type="dxa" w:w="4649"/>
+          </w:tcPr>
+          <w:p>
+            <w:pPr>
+              <w:spacing w:after="0"/>
+            </w:pPr>
+            <w:r>
+              <w:rPr>
+                <w:b w:val="0"/>
+                <w:sz w:val="19"/>
+              </w:rPr>
+              <w:t>Email o password non corrette (signin).</w:t>
+            </w:r>
+          </w:p>
+        </w:tc>
+      </w:tr>
+      <w:tr>
+        <w:trPr>
+          <w:cantSplit w:val="true"/>
+        </w:trPr>
+        <w:tc>
+          <w:tcPr>
             <w:tcW w:type="dxa" w:w="3288"/>
             <w:shd w:val="clear" w:color="auto" w:fill="F1F3F8"/>
           </w:tcPr>
@@ -26111,7 +28914,7 @@
                 <w:color w:val="233C7D"/>
                 <w:sz w:val="19"/>
               </w:rPr>
-              <w:t>resource.not_found</w:t>
+              <w:t>auth.invalid_token</w:t>
             </w:r>
           </w:p>
         </w:tc>
@@ -26129,7 +28932,7 @@
                 <w:b w:val="0"/>
                 <w:sz w:val="19"/>
               </w:rPr>
-              <w:t>404</w:t>
+              <w:t>401</w:t>
             </w:r>
           </w:p>
         </w:tc>
@@ -26147,7 +28950,364 @@
                 <w:b w:val="0"/>
                 <w:sz w:val="19"/>
               </w:rPr>
-              <w:t>Un id che non indica un elemento esistente e attivo dello stabilimento (es. idArticle, un id di idItems): l'operazione è annullata, senza errors[].</w:t>
+              <w:t>Access token assente, scaduto o non valido su un'API protetta.</w:t>
+            </w:r>
+          </w:p>
+        </w:tc>
+      </w:tr>
+      <w:tr>
+        <w:trPr>
+          <w:cantSplit w:val="true"/>
+        </w:trPr>
+        <w:tc>
+          <w:tcPr>
+            <w:tcW w:type="dxa" w:w="3288"/>
+          </w:tcPr>
+          <w:p>
+            <w:pPr>
+              <w:spacing w:after="0"/>
+            </w:pPr>
+            <w:r>
+              <w:rPr>
+                <w:rFonts w:ascii="Consolas" w:hAnsi="Consolas"/>
+                <w:b w:val="0"/>
+                <w:color w:val="233C7D"/>
+                <w:sz w:val="19"/>
+              </w:rPr>
+              <w:t>auth.session_expired</w:t>
+            </w:r>
+          </w:p>
+        </w:tc>
+        <w:tc>
+          <w:tcPr>
+            <w:tcW w:type="dxa" w:w="1928"/>
+          </w:tcPr>
+          <w:p>
+            <w:pPr>
+              <w:spacing w:after="0"/>
+            </w:pPr>
+            <w:r>
+              <w:rPr>
+                <w:b w:val="0"/>
+                <w:sz w:val="19"/>
+              </w:rPr>
+              <w:t>401</w:t>
+            </w:r>
+          </w:p>
+        </w:tc>
+        <w:tc>
+          <w:tcPr>
+            <w:tcW w:type="dxa" w:w="4649"/>
+          </w:tcPr>
+          <w:p>
+            <w:pPr>
+              <w:spacing w:after="0"/>
+            </w:pPr>
+            <w:r>
+              <w:rPr>
+                <w:b w:val="0"/>
+                <w:sz w:val="19"/>
+              </w:rPr>
+              <w:t>Nessuna sessione valida: cookie del refresh token assente, scaduto o revocato (refresh, logout).</w:t>
+            </w:r>
+          </w:p>
+        </w:tc>
+      </w:tr>
+      <w:tr>
+        <w:trPr>
+          <w:cantSplit w:val="true"/>
+        </w:trPr>
+        <w:tc>
+          <w:tcPr>
+            <w:tcW w:type="dxa" w:w="3288"/>
+            <w:shd w:val="clear" w:color="auto" w:fill="F1F3F8"/>
+          </w:tcPr>
+          <w:p>
+            <w:pPr>
+              <w:spacing w:after="0"/>
+            </w:pPr>
+            <w:r>
+              <w:rPr>
+                <w:rFonts w:ascii="Consolas" w:hAnsi="Consolas"/>
+                <w:b w:val="0"/>
+                <w:color w:val="233C7D"/>
+                <w:sz w:val="19"/>
+              </w:rPr>
+              <w:t>validation.invalid_request</w:t>
+            </w:r>
+          </w:p>
+        </w:tc>
+        <w:tc>
+          <w:tcPr>
+            <w:tcW w:type="dxa" w:w="1928"/>
+            <w:shd w:val="clear" w:color="auto" w:fill="F1F3F8"/>
+          </w:tcPr>
+          <w:p>
+            <w:pPr>
+              <w:spacing w:after="0"/>
+            </w:pPr>
+            <w:r>
+              <w:rPr>
+                <w:b w:val="0"/>
+                <w:sz w:val="19"/>
+              </w:rPr>
+              <w:t>400</w:t>
+            </w:r>
+          </w:p>
+        </w:tc>
+        <w:tc>
+          <w:tcPr>
+            <w:tcW w:type="dxa" w:w="4649"/>
+            <w:shd w:val="clear" w:color="auto" w:fill="F1F3F8"/>
+          </w:tcPr>
+          <w:p>
+            <w:pPr>
+              <w:spacing w:after="0"/>
+            </w:pPr>
+            <w:r>
+              <w:rPr>
+                <w:b w:val="0"/>
+                <w:sz w:val="19"/>
+              </w:rPr>
+              <w:t>Corpo della richiesta non valido; il dettaglio per campo è in errors[].</w:t>
+            </w:r>
+          </w:p>
+        </w:tc>
+      </w:tr>
+      <w:tr>
+        <w:trPr>
+          <w:cantSplit w:val="true"/>
+        </w:trPr>
+        <w:tc>
+          <w:tcPr>
+            <w:tcW w:type="dxa" w:w="3288"/>
+          </w:tcPr>
+          <w:p>
+            <w:pPr>
+              <w:spacing w:after="0"/>
+            </w:pPr>
+            <w:r>
+              <w:rPr>
+                <w:rFonts w:ascii="Consolas" w:hAnsi="Consolas"/>
+                <w:b w:val="0"/>
+                <w:color w:val="233C7D"/>
+                <w:sz w:val="19"/>
+              </w:rPr>
+              <w:t>validation.invalid_date</w:t>
+            </w:r>
+          </w:p>
+        </w:tc>
+        <w:tc>
+          <w:tcPr>
+            <w:tcW w:type="dxa" w:w="1928"/>
+          </w:tcPr>
+          <w:p>
+            <w:pPr>
+              <w:spacing w:after="0"/>
+            </w:pPr>
+            <w:r>
+              <w:rPr>
+                <w:b w:val="0"/>
+                <w:sz w:val="19"/>
+              </w:rPr>
+              <w:t>400 (in errors[])</w:t>
+            </w:r>
+          </w:p>
+        </w:tc>
+        <w:tc>
+          <w:tcPr>
+            <w:tcW w:type="dxa" w:w="4649"/>
+          </w:tcPr>
+          <w:p>
+            <w:pPr>
+              <w:spacing w:after="0"/>
+            </w:pPr>
+            <w:r>
+              <w:rPr>
+                <w:b w:val="0"/>
+                <w:sz w:val="19"/>
+              </w:rPr>
+              <w:t>Data assente o non leggibile come ISO 8601.</w:t>
+            </w:r>
+          </w:p>
+        </w:tc>
+      </w:tr>
+      <w:tr>
+        <w:trPr>
+          <w:cantSplit w:val="true"/>
+        </w:trPr>
+        <w:tc>
+          <w:tcPr>
+            <w:tcW w:type="dxa" w:w="3288"/>
+            <w:shd w:val="clear" w:color="auto" w:fill="F1F3F8"/>
+          </w:tcPr>
+          <w:p>
+            <w:pPr>
+              <w:spacing w:after="0"/>
+            </w:pPr>
+            <w:r>
+              <w:rPr>
+                <w:rFonts w:ascii="Consolas" w:hAnsi="Consolas"/>
+                <w:b w:val="0"/>
+                <w:color w:val="233C7D"/>
+                <w:sz w:val="19"/>
+              </w:rPr>
+              <w:t>validation.end_before_start</w:t>
+            </w:r>
+          </w:p>
+        </w:tc>
+        <w:tc>
+          <w:tcPr>
+            <w:tcW w:type="dxa" w:w="1928"/>
+            <w:shd w:val="clear" w:color="auto" w:fill="F1F3F8"/>
+          </w:tcPr>
+          <w:p>
+            <w:pPr>
+              <w:spacing w:after="0"/>
+            </w:pPr>
+            <w:r>
+              <w:rPr>
+                <w:b w:val="0"/>
+                <w:sz w:val="19"/>
+              </w:rPr>
+              <w:t>400 (in errors[])</w:t>
+            </w:r>
+          </w:p>
+        </w:tc>
+        <w:tc>
+          <w:tcPr>
+            <w:tcW w:type="dxa" w:w="4649"/>
+            <w:shd w:val="clear" w:color="auto" w:fill="F1F3F8"/>
+          </w:tcPr>
+          <w:p>
+            <w:pPr>
+              <w:spacing w:after="0"/>
+            </w:pPr>
+            <w:r>
+              <w:rPr>
+                <w:b w:val="0"/>
+                <w:sz w:val="19"/>
+              </w:rPr>
+              <w:t>La data di fine viene prima di quella di inizio.</w:t>
+            </w:r>
+          </w:p>
+        </w:tc>
+      </w:tr>
+      <w:tr>
+        <w:trPr>
+          <w:cantSplit w:val="true"/>
+        </w:trPr>
+        <w:tc>
+          <w:tcPr>
+            <w:tcW w:type="dxa" w:w="3288"/>
+          </w:tcPr>
+          <w:p>
+            <w:pPr>
+              <w:spacing w:after="0"/>
+            </w:pPr>
+            <w:r>
+              <w:rPr>
+                <w:rFonts w:ascii="Consolas" w:hAnsi="Consolas"/>
+                <w:b w:val="0"/>
+                <w:color w:val="233C7D"/>
+                <w:sz w:val="19"/>
+              </w:rPr>
+              <w:t>validation.invalid_value</w:t>
+            </w:r>
+          </w:p>
+        </w:tc>
+        <w:tc>
+          <w:tcPr>
+            <w:tcW w:type="dxa" w:w="1928"/>
+          </w:tcPr>
+          <w:p>
+            <w:pPr>
+              <w:spacing w:after="0"/>
+            </w:pPr>
+            <w:r>
+              <w:rPr>
+                <w:b w:val="0"/>
+                <w:sz w:val="19"/>
+              </w:rPr>
+              <w:t>400 (in errors[])</w:t>
+            </w:r>
+          </w:p>
+        </w:tc>
+        <w:tc>
+          <w:tcPr>
+            <w:tcW w:type="dxa" w:w="4649"/>
+          </w:tcPr>
+          <w:p>
+            <w:pPr>
+              <w:spacing w:after="0"/>
+            </w:pPr>
+            <w:r>
+              <w:rPr>
+                <w:b w:val="0"/>
+                <w:sz w:val="19"/>
+              </w:rPr>
+              <w:t>Valore non ammesso o assente in un campo che l'utente compila (es. un bookingDayType inesistente, l'avviso di soglia acceso senza soglia maggiore di 0). Mai su un id: un id sbagliato annulla l'operazione con resource.not_found o operation.not_allowed.</w:t>
+            </w:r>
+          </w:p>
+        </w:tc>
+      </w:tr>
+      <w:tr>
+        <w:trPr>
+          <w:cantSplit w:val="true"/>
+        </w:trPr>
+        <w:tc>
+          <w:tcPr>
+            <w:tcW w:type="dxa" w:w="3288"/>
+            <w:shd w:val="clear" w:color="auto" w:fill="F1F3F8"/>
+          </w:tcPr>
+          <w:p>
+            <w:pPr>
+              <w:spacing w:after="0"/>
+            </w:pPr>
+            <w:r>
+              <w:rPr>
+                <w:rFonts w:ascii="Consolas" w:hAnsi="Consolas"/>
+                <w:b w:val="0"/>
+                <w:color w:val="233C7D"/>
+                <w:sz w:val="19"/>
+              </w:rPr>
+              <w:t>resource.not_found</w:t>
+            </w:r>
+          </w:p>
+        </w:tc>
+        <w:tc>
+          <w:tcPr>
+            <w:tcW w:type="dxa" w:w="1928"/>
+            <w:shd w:val="clear" w:color="auto" w:fill="F1F3F8"/>
+          </w:tcPr>
+          <w:p>
+            <w:pPr>
+              <w:spacing w:after="0"/>
+            </w:pPr>
+            <w:r>
+              <w:rPr>
+                <w:b w:val="0"/>
+                <w:sz w:val="19"/>
+              </w:rPr>
+              <w:t>404</w:t>
+            </w:r>
+          </w:p>
+        </w:tc>
+        <w:tc>
+          <w:tcPr>
+            <w:tcW w:type="dxa" w:w="4649"/>
+            <w:shd w:val="clear" w:color="auto" w:fill="F1F3F8"/>
+          </w:tcPr>
+          <w:p>
+            <w:pPr>
+              <w:spacing w:after="0"/>
+            </w:pPr>
+            <w:r>
+              <w:rPr>
+                <w:b w:val="0"/>
+                <w:sz w:val="19"/>
+              </w:rPr>
+              <w:t>Un id che non indica un elemento esistente e attivo dello stabilimento (es. idArticle, un id di idItems, idPrinter): l'operazione è annullata, senza errors[].</w:t>
             </w:r>
           </w:p>
         </w:tc>

</xml_diff>